<commit_message>
R-511: controllo C4 su online: (uguale a config.js sul ramo che si pubblica); prossimi passi 1b (ok di Luigi per le attività pianificate) e 1e (turno di notte)
Co-Authored-By: Claude Opus 5.5 <noreply@anthropic.com>
Claude-Session: https://claude.ai/code/session_017ipzp9sqryzfFBJaHpW6iC
</commit_message>
<xml_diff>
--- a/docs/CYF-Gaming-Requisiti-Implementati-e-Testati.docx
+++ b/docs/CYF-Gaming-Requisiti-Implementati-e-Testati.docx
@@ -11532,7 +11532,70 @@
               <w:rPr>
                 <w:sz w:val="19"/>
               </w:rPr>
-              <w:t xml:space="preserve">, numeri B-xx), requisiti Da fare e In corso, scelte e idee da confermare, cose da fare (sezione 9) e le versioni scritte che aspettano le prove della notte. Scelte di Luigi del 27/10: nome con</w:t>
+              <w:t xml:space="preserve">, numeri B-xx), requisiti Da fare e In corso, scelte e idee da confermare, cose da fare (sezione 9) e le versioni scritte che aspettano le prove della notte. Il controllo C4 (</w:t>
+            </w:r>
+            <w:r>
+              <w:rPr>
+                <w:rStyle w:val="VerbatimChar"/>
+                <w:sz w:val="19"/>
+              </w:rPr>
+              <w:t xml:space="preserve">controlli.mjs</w:t>
+            </w:r>
+            <w:r>
+              <w:rPr>
+                <w:sz w:val="19"/>
+              </w:rPr>
+              <w:t xml:space="preserve">) verifica che</w:t>
+            </w:r>
+            <w:r>
+              <w:rPr>
+                <w:sz w:val="19"/>
+              </w:rPr>
+              <w:t xml:space="preserve"> </w:t>
+            </w:r>
+            <w:r>
+              <w:rPr>
+                <w:rStyle w:val="VerbatimChar"/>
+                <w:sz w:val="19"/>
+              </w:rPr>
+              <w:t xml:space="preserve">online:</w:t>
+            </w:r>
+            <w:r>
+              <w:rPr>
+                <w:sz w:val="19"/>
+              </w:rPr>
+              <w:t xml:space="preserve"> </w:t>
+            </w:r>
+            <w:r>
+              <w:rPr>
+                <w:sz w:val="19"/>
+              </w:rPr>
+              <w:t xml:space="preserve">sia la versione di</w:t>
+            </w:r>
+            <w:r>
+              <w:rPr>
+                <w:sz w:val="19"/>
+              </w:rPr>
+              <w:t xml:space="preserve"> </w:t>
+            </w:r>
+            <w:r>
+              <w:rPr>
+                <w:rStyle w:val="VerbatimChar"/>
+                <w:sz w:val="19"/>
+              </w:rPr>
+              <w:t xml:space="preserve">config.js</w:t>
+            </w:r>
+            <w:r>
+              <w:rPr>
+                <w:sz w:val="19"/>
+              </w:rPr>
+              <w:t xml:space="preserve"> </w:t>
+            </w:r>
+            <w:r>
+              <w:rPr>
+                <w:sz w:val="19"/>
+              </w:rPr>
+              <w:t xml:space="preserve">sul ramo che si pubblica. Scelte di Luigi del 27/10: nome con</w:t>
             </w:r>
             <w:r>
               <w:rPr>

</xml_diff>

<commit_message>
R-512: la notte si verifica, alle 17 si implementa (attività Implementation, poi il confronto delle 18); R-503 solo verifica; copia automatica su Drive tolta da Luigi
Co-Authored-By: Claude Opus 5.5 <noreply@anthropic.com>
Claude-Session: https://claude.ai/code/session_017ipzp9sqryzfFBJaHpW6iC
</commit_message>
<xml_diff>
--- a/docs/CYF-Gaming-Requisiti-Implementati-e-Testati.docx
+++ b/docs/CYF-Gaming-Requisiti-Implementati-e-Testati.docx
@@ -105,7 +105,7 @@
         <w:t xml:space="preserve"> </w:t>
       </w:r>
       <w:r>
-        <w:t xml:space="preserve">22:40</w:t>
+        <w:t xml:space="preserve">22:45</w:t>
       </w:r>
       <w:r>
         <w:t xml:space="preserve"> </w:t>
@@ -558,7 +558,23 @@
         <w:t xml:space="preserve">”</w:t>
       </w:r>
       <w:r>
-        <w:t xml:space="preserve">). Il turno di notte parte all’1:30 (decisione di Luigi del 27/10; prima 23:07), fa il giro completo, corregge tutti gli errori che le prove e i telefoni dei giocatori mostrano, e pubblica solo se tutto è verde. Il lavoro del giorno sta sui rami</w:t>
+        <w:t xml:space="preserve">).</w:t>
+      </w:r>
+      <w:r>
+        <w:t xml:space="preserve"> </w:t>
+      </w:r>
+      <w:r>
+        <w:rPr>
+          <w:bCs/>
+          <w:b/>
+        </w:rPr>
+        <w:t xml:space="preserve">La notte si verifica, il pomeriggio alle 17 si implementa</w:t>
+      </w:r>
+      <w:r>
+        <w:t xml:space="preserve"> </w:t>
+      </w:r>
+      <w:r>
+        <w:t xml:space="preserve">(decisione di Luigi del 27/10 sera, R-512). Il turno di notte parte all’1:30 (decisione di Luigi del 27/10; prima 23:07), fa il giro completo, corregge tutti gli errori che le prove e i telefoni dei giocatori mostrano, e pubblica solo se tutto è verde. Il lavoro del giorno sta sui rami</w:t>
       </w:r>
       <w:r>
         <w:t xml:space="preserve"> </w:t>
@@ -631,7 +647,7 @@
         <w:t xml:space="preserve">docs/CYF-Gaming-Requisiti-da-Implementare-o-Bachi.docx</w:t>
       </w:r>
       <w:r>
-        <w:t xml:space="preserve">; l’attività delle 7:13, 13:13 e 19:13 li copia su Google Drive (se il PC di casa è acceso). Chi pubblica una versione aggiorna</w:t>
+        <w:t xml:space="preserve">; su Google Drive li copia una chat collegata al PC di casa (l’attività di copia automatica delle 7:13, 13:13 e 19:13 è stata tolta da Luigi il 27/10 sera). Chi pubblica una versione aggiorna</w:t>
       </w:r>
       <w:r>
         <w:t xml:space="preserve"> </w:t>
@@ -662,13 +678,28 @@
           <w:bCs/>
           <w:b/>
         </w:rPr>
-        <w:t xml:space="preserve">Ogni giorno verso le 18 il confronto con le altre app</w:t>
+        <w:t xml:space="preserve">Ogni giorno alle 17 l’implementazione (R-512) e verso le 18 il confronto con le altre app</w:t>
       </w:r>
       <w:r>
         <w:t xml:space="preserve"> </w:t>
       </w:r>
       <w:r>
-        <w:t xml:space="preserve">e cosa manca (R-508).</w:t>
+        <w:t xml:space="preserve">e cosa manca (R-508), nella stessa attività</w:t>
+      </w:r>
+      <w:r>
+        <w:t xml:space="preserve"> </w:t>
+      </w:r>
+      <w:r>
+        <w:t xml:space="preserve">“</w:t>
+      </w:r>
+      <w:r>
+        <w:t xml:space="preserve">Implementation</w:t>
+      </w:r>
+      <w:r>
+        <w:t xml:space="preserve">”</w:t>
+      </w:r>
+      <w:r>
+        <w:t xml:space="preserve">.</w:t>
       </w:r>
     </w:p>
     <w:p>
@@ -10502,7 +10533,33 @@
               <w:rPr>
                 <w:sz w:val="19"/>
               </w:rPr>
-              <w:t xml:space="preserve">ogni notte all’1:30 ora italiana (decisione di Luigi del 27/10; prima 21:33, poi 22:59, poi 23:07): giro completo delle prove (A-05), errori dai telefoni, correzione di ogni errore, pubblicazione con tutto verde, prossimi passi approvati con il tempo che resta (fino alle 6:30), rapporto con le misure</w:t>
+              <w:t xml:space="preserve">ogni notte all’1:30 ora italiana (decisione di Luigi del 27/10; prima 21:33, poi 22:59, poi 23:07): giro completo delle prove (A-05), errori dai telefoni, correzione di ogni errore, pubblicazione con tutto verde, rapporto con le misure. Dal 27/10 sera</w:t>
+            </w:r>
+            <w:r>
+              <w:rPr>
+                <w:sz w:val="19"/>
+              </w:rPr>
+              <w:t xml:space="preserve"> </w:t>
+            </w:r>
+            <w:r>
+              <w:rPr>
+                <w:bCs/>
+                <w:b/>
+                <w:sz w:val="19"/>
+              </w:rPr>
+              <w:t xml:space="preserve">solo verifica</w:t>
+            </w:r>
+            <w:r>
+              <w:rPr>
+                <w:sz w:val="19"/>
+              </w:rPr>
+              <w:t xml:space="preserve"> </w:t>
+            </w:r>
+            <w:r>
+              <w:rPr>
+                <w:sz w:val="19"/>
+              </w:rPr>
+              <w:t xml:space="preserve">(R-512): niente funzioni nuove, che scrive l’attività delle 17; con il tempo che resta (fino alle 6:30) aggiunge le prove che mancano per il codice scritto di giorno</w:t>
             </w:r>
           </w:p>
         </w:tc>
@@ -11137,13 +11194,7 @@
               <w:rPr>
                 <w:sz w:val="19"/>
               </w:rPr>
-              <w:t xml:space="preserve"> </w:t>
-            </w:r>
-            <w:r>
-              <w:rPr>
-                <w:sz w:val="19"/>
-              </w:rPr>
-              <w:t xml:space="preserve">e l’attività delle 7:13, 13:13 e 19:13 li copia su Google Drive</w:t>
+              <w:t xml:space="preserve">; su Google Drive li copia una chat collegata al PC di casa (l’attività automatica delle 7:13, 13:13 e 19:13 è stata tolta da Luigi il 27/10 sera)</w:t>
             </w:r>
           </w:p>
         </w:tc>
@@ -11236,13 +11287,7 @@
               <w:rPr>
                 <w:sz w:val="19"/>
               </w:rPr>
-              <w:t xml:space="preserve">Attività pianificata</w:t>
-            </w:r>
-            <w:r>
-              <w:rPr>
-                <w:sz w:val="19"/>
-              </w:rPr>
-              <w:t xml:space="preserve"> </w:t>
+              <w:t xml:space="preserve">Attività pianificata alle 17:59 (</w:t>
             </w:r>
             <w:r>
               <w:rPr>
@@ -11266,13 +11311,43 @@
               <w:rPr>
                 <w:sz w:val="19"/>
               </w:rPr>
-              <w:t xml:space="preserve"> </w:t>
-            </w:r>
-            <w:r>
-              <w:rPr>
-                <w:sz w:val="19"/>
-              </w:rPr>
-              <w:t xml:space="preserve">alle 17:59, con notifica sul telefono; non tocca il codice</w:t>
+              <w:t xml:space="preserve">), con notifica sul telefono. Dal 27/10 sera è l’attività</w:t>
+            </w:r>
+            <w:r>
+              <w:rPr>
+                <w:sz w:val="19"/>
+              </w:rPr>
+              <w:t xml:space="preserve"> </w:t>
+            </w:r>
+            <w:r>
+              <w:rPr>
+                <w:sz w:val="19"/>
+              </w:rPr>
+              <w:t xml:space="preserve">“</w:t>
+            </w:r>
+            <w:r>
+              <w:rPr>
+                <w:sz w:val="19"/>
+              </w:rPr>
+              <w:t xml:space="preserve">Implementation</w:t>
+            </w:r>
+            <w:r>
+              <w:rPr>
+                <w:sz w:val="19"/>
+              </w:rPr>
+              <w:t xml:space="preserve">”</w:t>
+            </w:r>
+            <w:r>
+              <w:rPr>
+                <w:sz w:val="19"/>
+              </w:rPr>
+              <w:t xml:space="preserve"> </w:t>
+            </w:r>
+            <w:r>
+              <w:rPr>
+                <w:sz w:val="19"/>
+              </w:rPr>
+              <w:t xml:space="preserve">(R-512): alle 17 prima implementa, poi verso le 18 fa il confronto</w:t>
             </w:r>
           </w:p>
         </w:tc>
@@ -11656,6 +11731,256 @@
                 <w:sz w:val="19"/>
               </w:rPr>
               <w:t xml:space="preserve">, prossimi passi nel secondo e regole nel primo, il vecchio Word unico tolto da Drive (nel cestino di Drive per 30 giorni)</w:t>
+            </w:r>
+          </w:p>
+        </w:tc>
+      </w:tr>
+      <w:tr>
+        <w:tc>
+          <w:tcPr>
+            <w:tcW w:type="dxa" w:w="907"/>
+          </w:tcPr>
+          <w:p>
+            <w:pPr>
+              <w:pStyle w:val="Compact"/>
+              <w:spacing w:after="40"/>
+              <w:jc w:val="left"/>
+            </w:pPr>
+            <w:r>
+              <w:rPr>
+                <w:sz w:val="19"/>
+              </w:rPr>
+              <w:t xml:space="preserve">R-512</w:t>
+            </w:r>
+          </w:p>
+        </w:tc>
+        <w:tc>
+          <w:tcPr>
+            <w:tcW w:type="dxa" w:w="4195"/>
+          </w:tcPr>
+          <w:p>
+            <w:pPr>
+              <w:pStyle w:val="Compact"/>
+              <w:spacing w:after="40"/>
+              <w:jc w:val="left"/>
+            </w:pPr>
+            <w:r>
+              <w:rPr>
+                <w:sz w:val="19"/>
+              </w:rPr>
+              <w:t xml:space="preserve">La notte si fa la verifica, il pomeriggio alle 5 l’implementazione</w:t>
+            </w:r>
+          </w:p>
+        </w:tc>
+        <w:tc>
+          <w:tcPr>
+            <w:tcW w:type="dxa" w:w="1134"/>
+          </w:tcPr>
+          <w:p>
+            <w:pPr>
+              <w:pStyle w:val="Compact"/>
+              <w:spacing w:after="40"/>
+              <w:jc w:val="left"/>
+            </w:pPr>
+            <w:r>
+              <w:rPr>
+                <w:sz w:val="19"/>
+              </w:rPr>
+              <w:t xml:space="preserve">27/10/2026</w:t>
+            </w:r>
+          </w:p>
+        </w:tc>
+        <w:tc>
+          <w:tcPr>
+            <w:tcW w:type="dxa" w:w="1134"/>
+            <w:shd w:val="clear" w:color="auto" w:fill="D7F0DF"/>
+          </w:tcPr>
+          <w:p>
+            <w:pPr>
+              <w:pStyle w:val="Compact"/>
+              <w:spacing w:after="40"/>
+              <w:jc w:val="left"/>
+            </w:pPr>
+            <w:r>
+              <w:rPr>
+                <w:sz w:val="19"/>
+              </w:rPr>
+              <w:t xml:space="preserve">Fatto</w:t>
+            </w:r>
+          </w:p>
+        </w:tc>
+        <w:tc>
+          <w:tcPr>
+            <w:tcW w:type="dxa" w:w="2494"/>
+          </w:tcPr>
+          <w:p>
+            <w:pPr>
+              <w:pStyle w:val="Compact"/>
+              <w:spacing w:after="40"/>
+              <w:jc w:val="left"/>
+            </w:pPr>
+            <w:r>
+              <w:rPr>
+                <w:sz w:val="19"/>
+              </w:rPr>
+              <w:t xml:space="preserve">Attività pianificata</w:t>
+            </w:r>
+            <w:r>
+              <w:rPr>
+                <w:sz w:val="19"/>
+              </w:rPr>
+              <w:t xml:space="preserve"> </w:t>
+            </w:r>
+            <w:r>
+              <w:rPr>
+                <w:sz w:val="19"/>
+              </w:rPr>
+              <w:t xml:space="preserve">“</w:t>
+            </w:r>
+            <w:r>
+              <w:rPr>
+                <w:sz w:val="19"/>
+              </w:rPr>
+              <w:t xml:space="preserve">Implementation</w:t>
+            </w:r>
+            <w:r>
+              <w:rPr>
+                <w:sz w:val="19"/>
+              </w:rPr>
+              <w:t xml:space="preserve">”</w:t>
+            </w:r>
+            <w:r>
+              <w:rPr>
+                <w:sz w:val="19"/>
+              </w:rPr>
+              <w:t xml:space="preserve"> </w:t>
+            </w:r>
+            <w:r>
+              <w:rPr>
+                <w:sz w:val="19"/>
+              </w:rPr>
+              <w:t xml:space="preserve">ogni giorno alle 16:59: prende il Word «CYF Gaming Requisiti da Implementare o Bachi» (cioè REQUISITI.md) e implementa per priorità: prima i bachi aperti (sezione</w:t>
+            </w:r>
+            <w:r>
+              <w:rPr>
+                <w:sz w:val="19"/>
+              </w:rPr>
+              <w:t xml:space="preserve"> </w:t>
+            </w:r>
+            <w:r>
+              <w:rPr>
+                <w:sz w:val="19"/>
+              </w:rPr>
+              <w:t xml:space="preserve">“</w:t>
+            </w:r>
+            <w:r>
+              <w:rPr>
+                <w:sz w:val="19"/>
+              </w:rPr>
+              <w:t xml:space="preserve">Bachi</w:t>
+            </w:r>
+            <w:r>
+              <w:rPr>
+                <w:sz w:val="19"/>
+              </w:rPr>
+              <w:t xml:space="preserve">”</w:t>
+            </w:r>
+            <w:r>
+              <w:rPr>
+                <w:sz w:val="19"/>
+              </w:rPr>
+              <w:t xml:space="preserve">), poi le righe</w:t>
+            </w:r>
+            <w:r>
+              <w:rPr>
+                <w:sz w:val="19"/>
+              </w:rPr>
+              <w:t xml:space="preserve"> </w:t>
+            </w:r>
+            <w:r>
+              <w:rPr>
+                <w:sz w:val="19"/>
+              </w:rPr>
+              <w:t xml:space="preserve">“</w:t>
+            </w:r>
+            <w:r>
+              <w:rPr>
+                <w:sz w:val="19"/>
+              </w:rPr>
+              <w:t xml:space="preserve">Sì</w:t>
+            </w:r>
+            <w:r>
+              <w:rPr>
+                <w:sz w:val="19"/>
+              </w:rPr>
+              <w:t xml:space="preserve">”</w:t>
+            </w:r>
+            <w:r>
+              <w:rPr>
+                <w:sz w:val="19"/>
+              </w:rPr>
+              <w:t xml:space="preserve"> </w:t>
+            </w:r>
+            <w:r>
+              <w:rPr>
+                <w:sz w:val="19"/>
+              </w:rPr>
+              <w:t xml:space="preserve">della tabella</w:t>
+            </w:r>
+            <w:r>
+              <w:rPr>
+                <w:sz w:val="19"/>
+              </w:rPr>
+              <w:t xml:space="preserve"> </w:t>
+            </w:r>
+            <w:r>
+              <w:rPr>
+                <w:sz w:val="19"/>
+              </w:rPr>
+              <w:t xml:space="preserve">“</w:t>
+            </w:r>
+            <w:r>
+              <w:rPr>
+                <w:sz w:val="19"/>
+              </w:rPr>
+              <w:t xml:space="preserve">Cosa fa Claude, in ordine</w:t>
+            </w:r>
+            <w:r>
+              <w:rPr>
+                <w:sz w:val="19"/>
+              </w:rPr>
+              <w:t xml:space="preserve">”</w:t>
+            </w:r>
+            <w:r>
+              <w:rPr>
+                <w:sz w:val="19"/>
+              </w:rPr>
+              <w:t xml:space="preserve">, poi i requisiti Da fare approvati; mai ciò che è Da approvare o Da confermare. Lavora su un ramo</w:t>
+            </w:r>
+            <w:r>
+              <w:rPr>
+                <w:sz w:val="19"/>
+              </w:rPr>
+              <w:t xml:space="preserve"> </w:t>
+            </w:r>
+            <w:r>
+              <w:rPr>
+                <w:rStyle w:val="VerbatimChar"/>
+                <w:sz w:val="19"/>
+              </w:rPr>
+              <w:t xml:space="preserve">giorno/…</w:t>
+            </w:r>
+            <w:r>
+              <w:rPr>
+                <w:sz w:val="19"/>
+              </w:rPr>
+              <w:t xml:space="preserve"> </w:t>
+            </w:r>
+            <w:r>
+              <w:rPr>
+                <w:sz w:val="19"/>
+              </w:rPr>
+              <w:t xml:space="preserve">(parte dall’ultimo ramo del giorno non ancora pubblicato), prima i requisiti poi il codice, senza prove e senza pubblicare (R-506), per circa 50 minuti; poi il confronto con le altre app (R-508). Il turno di notte dell’1:30 (R-503) prova, corregge e pubblica, e non scrive funzioni nuove</w:t>
             </w:r>
           </w:p>
         </w:tc>

</xml_diff>

<commit_message>
Requisiti: nomi nuovi delle due attività pianificate (R-503, R-512)
Co-Authored-By: Claude Opus 5.5 <noreply@anthropic.com>
Claude-Session: https://claude.ai/code/session_017ipzp9sqryzfFBJaHpW6iC
</commit_message>
<xml_diff>
--- a/docs/CYF-Gaming-Requisiti-Implementati-e-Testati.docx
+++ b/docs/CYF-Gaming-Requisiti-Implementati-e-Testati.docx
@@ -10515,6 +10515,42 @@
               <w:rPr>
                 <w:sz w:val="19"/>
               </w:rPr>
+              <w:t xml:space="preserve">CYF Gaming – Verifica notturna 1:30 (prove, correzioni, pubblicazione)</w:t>
+            </w:r>
+            <w:r>
+              <w:rPr>
+                <w:sz w:val="19"/>
+              </w:rPr>
+              <w:t xml:space="preserve">”</w:t>
+            </w:r>
+            <w:r>
+              <w:rPr>
+                <w:sz w:val="19"/>
+              </w:rPr>
+              <w:t xml:space="preserve"> </w:t>
+            </w:r>
+            <w:r>
+              <w:rPr>
+                <w:sz w:val="19"/>
+              </w:rPr>
+              <w:t xml:space="preserve">(prima</w:t>
+            </w:r>
+            <w:r>
+              <w:rPr>
+                <w:sz w:val="19"/>
+              </w:rPr>
+              <w:t xml:space="preserve"> </w:t>
+            </w:r>
+            <w:r>
+              <w:rPr>
+                <w:sz w:val="19"/>
+              </w:rPr>
+              <w:t xml:space="preserve">“</w:t>
+            </w:r>
+            <w:r>
+              <w:rPr>
+                <w:sz w:val="19"/>
+              </w:rPr>
               <w:t xml:space="preserve">Controllo notturno CYF Gaming</w:t>
             </w:r>
             <w:r>
@@ -10527,13 +10563,7 @@
               <w:rPr>
                 <w:sz w:val="19"/>
               </w:rPr>
-              <w:t xml:space="preserve"> </w:t>
-            </w:r>
-            <w:r>
-              <w:rPr>
-                <w:sz w:val="19"/>
-              </w:rPr>
-              <w:t xml:space="preserve">ogni notte all’1:30 ora italiana (decisione di Luigi del 27/10; prima 21:33, poi 22:59, poi 23:07): giro completo delle prove (A-05), errori dai telefoni, correzione di ogni errore, pubblicazione con tutto verde, rapporto con le misure. Dal 27/10 sera</w:t>
+              <w:t xml:space="preserve">) ogni notte all’1:30 ora italiana (decisione di Luigi del 27/10; prima 21:33, poi 22:59, poi 23:07): giro completo delle prove (A-05), errori dai telefoni, correzione di ogni errore, pubblicazione con tutto verde, rapporto con le misure. Dal 27/10 sera</w:t>
             </w:r>
             <w:r>
               <w:rPr>
@@ -11841,7 +11871,7 @@
               <w:rPr>
                 <w:sz w:val="19"/>
               </w:rPr>
-              <w:t xml:space="preserve">Implementation</w:t>
+              <w:t xml:space="preserve">CYF Gaming – Implementation 17:00 (bachi, requisiti, confronto app)</w:t>
             </w:r>
             <w:r>
               <w:rPr>

</xml_diff>

<commit_message>
0.25.2 (giorno): due cartelli CYF alti ai lati dello stacco del trampolino gigante e scritta più grande (R-240, baco B-03): la salita è inclinata ~13° e la scritta per terra si leggeva solo all'ultimo; da provare stanotte con le foto
Co-Authored-By: Claude Opus 5.5 <noreply@anthropic.com>
Claude-Session: https://claude.ai/code/session_017ipzp9sqryzfFBJaHpW6iC
</commit_message>
<xml_diff>
--- a/docs/CYF-Gaming-Requisiti-Implementati-e-Testati.docx
+++ b/docs/CYF-Gaming-Requisiti-Implementati-e-Testati.docx
@@ -105,7 +105,7 @@
         <w:t xml:space="preserve"> </w:t>
       </w:r>
       <w:r>
-        <w:t xml:space="preserve">22:55</w:t>
+        <w:t xml:space="preserve">23:05</w:t>
       </w:r>
       <w:r>
         <w:t xml:space="preserve"> </w:t>
@@ -8318,7 +8318,33 @@
               <w:rPr>
                 <w:sz w:val="19"/>
               </w:rPr>
-              <w:t xml:space="preserve">in grande sulla superficie in salita, con i colori dello stemma (arancione con il bordo bianco su fondo blu notte): segue la curva della rampa, si legge arrivando, sulla neve e in tutte le città. Le rampe normali restano senza scritta</w:t>
+              <w:t xml:space="preserve">in grande sulla superficie in salita, con i colori dello stemma (arancione con il bordo bianco su fondo blu notte): segue la curva della rampa, si legge arrivando, sulla neve e in tutte le città. Le rampe normali restano senza scritta Dalla 0.25.2 (baco B-03, Luigi non la vedeva): scritta più grande e</w:t>
+            </w:r>
+            <w:r>
+              <w:rPr>
+                <w:sz w:val="19"/>
+              </w:rPr>
+              <w:t xml:space="preserve"> </w:t>
+            </w:r>
+            <w:r>
+              <w:rPr>
+                <w:bCs/>
+                <w:b/>
+                <w:sz w:val="19"/>
+              </w:rPr>
+              <w:t xml:space="preserve">due cartelli CYF alti ai lati dello stacco</w:t>
+            </w:r>
+            <w:r>
+              <w:rPr>
+                <w:sz w:val="19"/>
+              </w:rPr>
+              <w:t xml:space="preserve"> </w:t>
+            </w:r>
+            <w:r>
+              <w:rPr>
+                <w:sz w:val="19"/>
+              </w:rPr>
+              <w:t xml:space="preserve">(pannelli 1,8 × 0,9 m su pali bianchi, più alti dello stacco, rivolti verso chi arriva, sempre ben illuminati), visibili da lontano come sui trampolini veri. La salita è inclinata solo di circa 13°: la scritta per terra si leggeva solo nell’ultimo secondo e mezzo prima dello stacco, mezza coperta dal rider</w:t>
             </w:r>
           </w:p>
         </w:tc>

</xml_diff>

<commit_message>
R-515 (oggetti anche con gli avversari in allenamento, coda delle 17 riga 2a; pista del giorno: decide Luigi, S-40) e S-50 (Fatto solo dopo la prova con foto per ciò che si vede)
Co-Authored-By: Claude Opus 5.5 <noreply@anthropic.com>
Claude-Session: https://claude.ai/code/session_017ipzp9sqryzfFBJaHpW6iC
</commit_message>
<xml_diff>
--- a/docs/CYF-Gaming-Requisiti-Implementati-e-Testati.docx
+++ b/docs/CYF-Gaming-Requisiti-Implementati-e-Testati.docx
@@ -57,7 +57,7 @@
         <w:t xml:space="preserve"> </w:t>
       </w:r>
       <w:r>
-        <w:t xml:space="preserve">0.20.2</w:t>
+        <w:t xml:space="preserve">0.25.3</w:t>
       </w:r>
       <w:r>
         <w:t xml:space="preserve"> </w:t>
@@ -16882,6 +16882,62 @@
           </w:p>
         </w:tc>
       </w:tr>
+      <w:tr>
+        <w:tc>
+          <w:tcPr>
+            <w:tcW w:type="dxa" w:w="1928"/>
+          </w:tcPr>
+          <w:p>
+            <w:pPr>
+              <w:pStyle w:val="Compact"/>
+              <w:spacing w:after="40"/>
+              <w:jc w:val="left"/>
+            </w:pPr>
+            <w:r>
+              <w:rPr>
+                <w:sz w:val="19"/>
+              </w:rPr>
+              <w:t xml:space="preserve">R-515</w:t>
+            </w:r>
+          </w:p>
+        </w:tc>
+        <w:tc>
+          <w:tcPr>
+            <w:tcW w:type="dxa" w:w="1474"/>
+          </w:tcPr>
+          <w:p>
+            <w:pPr>
+              <w:pStyle w:val="Compact"/>
+              <w:spacing w:after="40"/>
+              <w:jc w:val="left"/>
+            </w:pPr>
+            <w:r>
+              <w:rPr>
+                <w:sz w:val="19"/>
+              </w:rPr>
+              <w:t xml:space="preserve">Con gli avversari del computer si devono poter usare banana, bananone e bomba come con i concorrenti veri, e loro con me</w:t>
+            </w:r>
+          </w:p>
+        </w:tc>
+        <w:tc>
+          <w:tcPr>
+            <w:tcW w:type="dxa" w:w="6463"/>
+          </w:tcPr>
+          <w:p>
+            <w:pPr>
+              <w:pStyle w:val="Compact"/>
+              <w:spacing w:after="40"/>
+              <w:jc w:val="left"/>
+            </w:pPr>
+            <w:r>
+              <w:rPr>
+                <w:sz w:val="19"/>
+              </w:rPr>
+              <w:t xml:space="preserve">27/10/2026</w:t>
+            </w:r>
+          </w:p>
+        </w:tc>
+      </w:tr>
     </w:tbl>
     <w:p>
       <w:pPr>
@@ -30942,6 +30998,1215 @@
                 <w:sz w:val="19"/>
               </w:rPr>
               <w:t xml:space="preserve">che chiede l’ok per la notte</w:t>
+            </w:r>
+          </w:p>
+        </w:tc>
+      </w:tr>
+      <w:tr>
+        <w:tc>
+          <w:tcPr>
+            <w:tcW w:type="dxa" w:w="1247"/>
+          </w:tcPr>
+          <w:p>
+            <w:pPr>
+              <w:pStyle w:val="Compact"/>
+              <w:spacing w:after="40"/>
+              <w:jc w:val="left"/>
+            </w:pPr>
+            <w:r>
+              <w:rPr>
+                <w:sz w:val="19"/>
+              </w:rPr>
+              <w:t xml:space="preserve">0.21.0</w:t>
+            </w:r>
+          </w:p>
+        </w:tc>
+        <w:tc>
+          <w:tcPr>
+            <w:tcW w:type="dxa" w:w="1361"/>
+          </w:tcPr>
+          <w:p>
+            <w:pPr>
+              <w:pStyle w:val="Compact"/>
+              <w:spacing w:after="40"/>
+              <w:jc w:val="left"/>
+            </w:pPr>
+            <w:r>
+              <w:rPr>
+                <w:sz w:val="19"/>
+              </w:rPr>
+              <w:t xml:space="preserve">27/10/2026</w:t>
+            </w:r>
+          </w:p>
+        </w:tc>
+        <w:tc>
+          <w:tcPr>
+            <w:tcW w:type="dxa" w:w="7257"/>
+          </w:tcPr>
+          <w:p>
+            <w:pPr>
+              <w:pStyle w:val="Compact"/>
+              <w:spacing w:after="40"/>
+              <w:jc w:val="left"/>
+            </w:pPr>
+            <w:r>
+              <w:rPr>
+                <w:sz w:val="19"/>
+              </w:rPr>
+              <w:t xml:space="preserve">(Scritta di giorno sul ramo</w:t>
+            </w:r>
+            <w:r>
+              <w:rPr>
+                <w:sz w:val="19"/>
+              </w:rPr>
+              <w:t xml:space="preserve"> </w:t>
+            </w:r>
+            <w:r>
+              <w:rPr>
+                <w:rStyle w:val="VerbatimChar"/>
+                <w:sz w:val="19"/>
+              </w:rPr>
+              <w:t xml:space="preserve">giorno/batti-missioni</w:t>
+            </w:r>
+            <w:r>
+              <w:rPr>
+                <w:sz w:val="19"/>
+              </w:rPr>
+              <w:t xml:space="preserve">; online dopo le prove del turno di notte.)</w:t>
+            </w:r>
+            <w:r>
+              <w:rPr>
+                <w:sz w:val="19"/>
+              </w:rPr>
+              <w:t xml:space="preserve"> </w:t>
+            </w:r>
+            <w:r>
+              <w:rPr>
+                <w:sz w:val="19"/>
+              </w:rPr>
+              <w:t xml:space="preserve">“</w:t>
+            </w:r>
+            <w:r>
+              <w:rPr>
+                <w:sz w:val="19"/>
+              </w:rPr>
+              <w:t xml:space="preserve">Batti il mio tempo</w:t>
+            </w:r>
+            <w:r>
+              <w:rPr>
+                <w:sz w:val="19"/>
+              </w:rPr>
+              <w:t xml:space="preserve">”</w:t>
+            </w:r>
+            <w:r>
+              <w:rPr>
+                <w:sz w:val="19"/>
+              </w:rPr>
+              <w:t xml:space="preserve"> </w:t>
+            </w:r>
+            <w:r>
+              <w:rPr>
+                <w:sz w:val="19"/>
+              </w:rPr>
+              <w:t xml:space="preserve">(R-236, S-44): link della pista del giorno con il tempo da battere, riquadro</w:t>
+            </w:r>
+            <w:r>
+              <w:rPr>
+                <w:sz w:val="19"/>
+              </w:rPr>
+              <w:t xml:space="preserve"> </w:t>
+            </w:r>
+            <w:r>
+              <w:rPr>
+                <w:sz w:val="19"/>
+              </w:rPr>
+              <w:t xml:space="preserve">“</w:t>
+            </w:r>
+            <w:r>
+              <w:rPr>
+                <w:sz w:val="19"/>
+              </w:rPr>
+              <w:t xml:space="preserve">ti sfida</w:t>
+            </w:r>
+            <w:r>
+              <w:rPr>
+                <w:sz w:val="19"/>
+              </w:rPr>
+              <w:t xml:space="preserve">”</w:t>
+            </w:r>
+            <w:r>
+              <w:rPr>
+                <w:sz w:val="19"/>
+              </w:rPr>
+              <w:t xml:space="preserve"> </w:t>
+            </w:r>
+            <w:r>
+              <w:rPr>
+                <w:sz w:val="19"/>
+              </w:rPr>
+              <w:t xml:space="preserve">nel menu, distacco stimato in gara, esito a fine gara, piste dei giorni passati rifatte dal link senza classifica, immagine del risultato 1080×1080 da condividere o salvare (D-05), misura</w:t>
+            </w:r>
+            <w:r>
+              <w:rPr>
+                <w:sz w:val="19"/>
+              </w:rPr>
+              <w:t xml:space="preserve"> </w:t>
+            </w:r>
+            <w:r>
+              <w:rPr>
+                <w:rStyle w:val="VerbatimChar"/>
+                <w:sz w:val="19"/>
+              </w:rPr>
+              <w:t xml:space="preserve">batti_gare</w:t>
+            </w:r>
+            <w:r>
+              <w:rPr>
+                <w:sz w:val="19"/>
+              </w:rPr>
+              <w:t xml:space="preserve">. Missioni (R-243, S-45): 3 obiettivi alla volta nel menu, stelle, avanzamento nel profilo. Moduli nuovi</w:t>
+            </w:r>
+            <w:r>
+              <w:rPr>
+                <w:sz w:val="19"/>
+              </w:rPr>
+              <w:t xml:space="preserve"> </w:t>
+            </w:r>
+            <w:r>
+              <w:rPr>
+                <w:rStyle w:val="VerbatimChar"/>
+                <w:sz w:val="19"/>
+              </w:rPr>
+              <w:t xml:space="preserve">moduli/sfida.js</w:t>
+            </w:r>
+            <w:r>
+              <w:rPr>
+                <w:sz w:val="19"/>
+              </w:rPr>
+              <w:t xml:space="preserve"> </w:t>
+            </w:r>
+            <w:r>
+              <w:rPr>
+                <w:sz w:val="19"/>
+              </w:rPr>
+              <w:t xml:space="preserve">e</w:t>
+            </w:r>
+            <w:r>
+              <w:rPr>
+                <w:sz w:val="19"/>
+              </w:rPr>
+              <w:t xml:space="preserve"> </w:t>
+            </w:r>
+            <w:r>
+              <w:rPr>
+                <w:rStyle w:val="VerbatimChar"/>
+                <w:sz w:val="19"/>
+              </w:rPr>
+              <w:t xml:space="preserve">moduli/missioni.js</w:t>
+            </w:r>
+          </w:p>
+        </w:tc>
+      </w:tr>
+      <w:tr>
+        <w:tc>
+          <w:tcPr>
+            <w:tcW w:type="dxa" w:w="1247"/>
+          </w:tcPr>
+          <w:p>
+            <w:pPr>
+              <w:pStyle w:val="Compact"/>
+              <w:spacing w:after="40"/>
+              <w:jc w:val="left"/>
+            </w:pPr>
+            <w:r>
+              <w:rPr>
+                <w:sz w:val="19"/>
+              </w:rPr>
+              <w:t xml:space="preserve">0.22.0</w:t>
+            </w:r>
+          </w:p>
+        </w:tc>
+        <w:tc>
+          <w:tcPr>
+            <w:tcW w:type="dxa" w:w="1361"/>
+          </w:tcPr>
+          <w:p>
+            <w:pPr>
+              <w:pStyle w:val="Compact"/>
+              <w:spacing w:after="40"/>
+              <w:jc w:val="left"/>
+            </w:pPr>
+            <w:r>
+              <w:rPr>
+                <w:sz w:val="19"/>
+              </w:rPr>
+              <w:t xml:space="preserve">27/10/2026</w:t>
+            </w:r>
+          </w:p>
+        </w:tc>
+        <w:tc>
+          <w:tcPr>
+            <w:tcW w:type="dxa" w:w="7257"/>
+          </w:tcPr>
+          <w:p>
+            <w:pPr>
+              <w:pStyle w:val="Compact"/>
+              <w:spacing w:after="40"/>
+              <w:jc w:val="left"/>
+            </w:pPr>
+            <w:r>
+              <w:rPr>
+                <w:sz w:val="19"/>
+              </w:rPr>
+              <w:t xml:space="preserve">(Scritta di giorno sul ramo</w:t>
+            </w:r>
+            <w:r>
+              <w:rPr>
+                <w:sz w:val="19"/>
+              </w:rPr>
+              <w:t xml:space="preserve"> </w:t>
+            </w:r>
+            <w:r>
+              <w:rPr>
+                <w:rStyle w:val="VerbatimChar"/>
+                <w:sz w:val="19"/>
+              </w:rPr>
+              <w:t xml:space="preserve">giorno/portale-settimana</w:t>
+            </w:r>
+            <w:r>
+              <w:rPr>
+                <w:sz w:val="19"/>
+              </w:rPr>
+              <w:t xml:space="preserve">; online dopo le prove del turno di notte.) Pronti per i portali di giochi (R-244, S-46, da F-15): modalità portale con</w:t>
+            </w:r>
+            <w:r>
+              <w:rPr>
+                <w:sz w:val="19"/>
+              </w:rPr>
+              <w:t xml:space="preserve"> </w:t>
+            </w:r>
+            <w:r>
+              <w:rPr>
+                <w:rStyle w:val="VerbatimChar"/>
+                <w:sz w:val="19"/>
+              </w:rPr>
+              <w:t xml:space="preserve">?portale=crazygames</w:t>
+            </w:r>
+            <w:r>
+              <w:rPr>
+                <w:sz w:val="19"/>
+              </w:rPr>
+              <w:t xml:space="preserve"> </w:t>
+            </w:r>
+            <w:r>
+              <w:rPr>
+                <w:sz w:val="19"/>
+              </w:rPr>
+              <w:t xml:space="preserve">(niente donazioni, niente link esterni, codice al posto del link nella stanza, testi senza link), casella</w:t>
+            </w:r>
+            <w:r>
+              <w:rPr>
+                <w:sz w:val="19"/>
+              </w:rPr>
+              <w:t xml:space="preserve"> </w:t>
+            </w:r>
+            <w:r>
+              <w:rPr>
+                <w:sz w:val="19"/>
+              </w:rPr>
+              <w:t xml:space="preserve">“</w:t>
+            </w:r>
+            <w:r>
+              <w:rPr>
+                <w:sz w:val="19"/>
+              </w:rPr>
+              <w:t xml:space="preserve">Messaggi vocali</w:t>
+            </w:r>
+            <w:r>
+              <w:rPr>
+                <w:sz w:val="19"/>
+              </w:rPr>
+              <w:t xml:space="preserve">”</w:t>
+            </w:r>
+            <w:r>
+              <w:rPr>
+                <w:sz w:val="19"/>
+              </w:rPr>
+              <w:t xml:space="preserve"> </w:t>
+            </w:r>
+            <w:r>
+              <w:rPr>
+                <w:sz w:val="19"/>
+              </w:rPr>
+              <w:t xml:space="preserve">nel menu per spegnere i vocali (spenti sul portale), audio che riparte al tocco su iPhone, niente lente sul testo toccando la pista. Nuovo modulo</w:t>
+            </w:r>
+            <w:r>
+              <w:rPr>
+                <w:sz w:val="19"/>
+              </w:rPr>
+              <w:t xml:space="preserve"> </w:t>
+            </w:r>
+            <w:r>
+              <w:rPr>
+                <w:rStyle w:val="VerbatimChar"/>
+                <w:sz w:val="19"/>
+              </w:rPr>
+              <w:t xml:space="preserve">moduli/portale.js</w:t>
+            </w:r>
+          </w:p>
+        </w:tc>
+      </w:tr>
+      <w:tr>
+        <w:tc>
+          <w:tcPr>
+            <w:tcW w:type="dxa" w:w="1247"/>
+          </w:tcPr>
+          <w:p>
+            <w:pPr>
+              <w:pStyle w:val="Compact"/>
+              <w:spacing w:after="40"/>
+              <w:jc w:val="left"/>
+            </w:pPr>
+            <w:r>
+              <w:rPr>
+                <w:sz w:val="19"/>
+              </w:rPr>
+              <w:t xml:space="preserve">0.23.0</w:t>
+            </w:r>
+          </w:p>
+        </w:tc>
+        <w:tc>
+          <w:tcPr>
+            <w:tcW w:type="dxa" w:w="1361"/>
+          </w:tcPr>
+          <w:p>
+            <w:pPr>
+              <w:pStyle w:val="Compact"/>
+              <w:spacing w:after="40"/>
+              <w:jc w:val="left"/>
+            </w:pPr>
+            <w:r>
+              <w:rPr>
+                <w:sz w:val="19"/>
+              </w:rPr>
+              <w:t xml:space="preserve">27/10/2026</w:t>
+            </w:r>
+          </w:p>
+        </w:tc>
+        <w:tc>
+          <w:tcPr>
+            <w:tcW w:type="dxa" w:w="7257"/>
+          </w:tcPr>
+          <w:p>
+            <w:pPr>
+              <w:pStyle w:val="Compact"/>
+              <w:spacing w:after="40"/>
+              <w:jc w:val="left"/>
+            </w:pPr>
+            <w:r>
+              <w:rPr>
+                <w:sz w:val="19"/>
+              </w:rPr>
+              <w:t xml:space="preserve">(Stesso ramo.) Città della settimana con la maglia esclusiva (R-245, S-47): riquadro nel menu con la città, la scadenza e</w:t>
+            </w:r>
+            <w:r>
+              <w:rPr>
+                <w:sz w:val="19"/>
+              </w:rPr>
+              <w:t xml:space="preserve"> </w:t>
+            </w:r>
+            <w:r>
+              <w:rPr>
+                <w:sz w:val="19"/>
+              </w:rPr>
+              <w:t xml:space="preserve">“</w:t>
+            </w:r>
+            <w:r>
+              <w:rPr>
+                <w:sz w:val="19"/>
+              </w:rPr>
+              <w:t xml:space="preserve">Corri a …</w:t>
+            </w:r>
+            <w:r>
+              <w:rPr>
+                <w:sz w:val="19"/>
+              </w:rPr>
+              <w:t xml:space="preserve">”</w:t>
+            </w:r>
+            <w:r>
+              <w:rPr>
+                <w:sz w:val="19"/>
+              </w:rPr>
+              <w:t xml:space="preserve">; il server assegna la maglia a chi finisce una gara in quella città e la ricorda; gruppo</w:t>
+            </w:r>
+            <w:r>
+              <w:rPr>
+                <w:sz w:val="19"/>
+              </w:rPr>
+              <w:t xml:space="preserve"> </w:t>
+            </w:r>
+            <w:r>
+              <w:rPr>
+                <w:sz w:val="19"/>
+              </w:rPr>
+              <w:t xml:space="preserve">“</w:t>
+            </w:r>
+            <w:r>
+              <w:rPr>
+                <w:sz w:val="19"/>
+              </w:rPr>
+              <w:t xml:space="preserve">Maglie della settimana</w:t>
+            </w:r>
+            <w:r>
+              <w:rPr>
+                <w:sz w:val="19"/>
+              </w:rPr>
+              <w:t xml:space="preserve">”</w:t>
+            </w:r>
+            <w:r>
+              <w:rPr>
+                <w:sz w:val="19"/>
+              </w:rPr>
+              <w:t xml:space="preserve"> </w:t>
+            </w:r>
+            <w:r>
+              <w:rPr>
+                <w:sz w:val="19"/>
+              </w:rPr>
+              <w:t xml:space="preserve">nel personaggio; misure</w:t>
+            </w:r>
+            <w:r>
+              <w:rPr>
+                <w:sz w:val="19"/>
+              </w:rPr>
+              <w:t xml:space="preserve"> </w:t>
+            </w:r>
+            <w:r>
+              <w:rPr>
+                <w:rStyle w:val="VerbatimChar"/>
+                <w:sz w:val="19"/>
+              </w:rPr>
+              <w:t xml:space="preserve">settimana_gare</w:t>
+            </w:r>
+            <w:r>
+              <w:rPr>
+                <w:sz w:val="19"/>
+              </w:rPr>
+              <w:t xml:space="preserve"> </w:t>
+            </w:r>
+            <w:r>
+              <w:rPr>
+                <w:sz w:val="19"/>
+              </w:rPr>
+              <w:t xml:space="preserve">e</w:t>
+            </w:r>
+            <w:r>
+              <w:rPr>
+                <w:sz w:val="19"/>
+              </w:rPr>
+              <w:t xml:space="preserve"> </w:t>
+            </w:r>
+            <w:r>
+              <w:rPr>
+                <w:rStyle w:val="VerbatimChar"/>
+                <w:sz w:val="19"/>
+              </w:rPr>
+              <w:t xml:space="preserve">settimana_premi</w:t>
+            </w:r>
+            <w:r>
+              <w:rPr>
+                <w:sz w:val="19"/>
+              </w:rPr>
+              <w:t xml:space="preserve">. Nuovi</w:t>
+            </w:r>
+            <w:r>
+              <w:rPr>
+                <w:sz w:val="19"/>
+              </w:rPr>
+              <w:t xml:space="preserve"> </w:t>
+            </w:r>
+            <w:r>
+              <w:rPr>
+                <w:rStyle w:val="VerbatimChar"/>
+                <w:sz w:val="19"/>
+              </w:rPr>
+              <w:t xml:space="preserve">shared/calendario.js</w:t>
+            </w:r>
+            <w:r>
+              <w:rPr>
+                <w:sz w:val="19"/>
+              </w:rPr>
+              <w:t xml:space="preserve"> </w:t>
+            </w:r>
+            <w:r>
+              <w:rPr>
+                <w:sz w:val="19"/>
+              </w:rPr>
+              <w:t xml:space="preserve">(settimana → città, usato da gioco e server),</w:t>
+            </w:r>
+            <w:r>
+              <w:rPr>
+                <w:sz w:val="19"/>
+              </w:rPr>
+              <w:t xml:space="preserve"> </w:t>
+            </w:r>
+            <w:r>
+              <w:rPr>
+                <w:rStyle w:val="VerbatimChar"/>
+                <w:sz w:val="19"/>
+              </w:rPr>
+              <w:t xml:space="preserve">moduli/settimana.js</w:t>
+            </w:r>
+            <w:r>
+              <w:rPr>
+                <w:sz w:val="19"/>
+              </w:rPr>
+              <w:t xml:space="preserve">,</w:t>
+            </w:r>
+            <w:r>
+              <w:rPr>
+                <w:sz w:val="19"/>
+              </w:rPr>
+              <w:t xml:space="preserve"> </w:t>
+            </w:r>
+            <w:r>
+              <w:rPr>
+                <w:rStyle w:val="VerbatimChar"/>
+                <w:sz w:val="19"/>
+              </w:rPr>
+              <w:t xml:space="preserve">src/settimana.mjs</w:t>
+            </w:r>
+            <w:r>
+              <w:rPr>
+                <w:sz w:val="19"/>
+              </w:rPr>
+              <w:t xml:space="preserve">; tabella</w:t>
+            </w:r>
+            <w:r>
+              <w:rPr>
+                <w:sz w:val="19"/>
+              </w:rPr>
+              <w:t xml:space="preserve"> </w:t>
+            </w:r>
+            <w:r>
+              <w:rPr>
+                <w:rStyle w:val="VerbatimChar"/>
+                <w:sz w:val="19"/>
+              </w:rPr>
+              <w:t xml:space="preserve">premi</w:t>
+            </w:r>
+            <w:r>
+              <w:rPr>
+                <w:sz w:val="19"/>
+              </w:rPr>
+              <w:t xml:space="preserve"> </w:t>
+            </w:r>
+            <w:r>
+              <w:rPr>
+                <w:sz w:val="19"/>
+              </w:rPr>
+              <w:t xml:space="preserve">nella classifica</w:t>
+            </w:r>
+          </w:p>
+        </w:tc>
+      </w:tr>
+      <w:tr>
+        <w:tc>
+          <w:tcPr>
+            <w:tcW w:type="dxa" w:w="1247"/>
+          </w:tcPr>
+          <w:p>
+            <w:pPr>
+              <w:pStyle w:val="Compact"/>
+              <w:spacing w:after="40"/>
+              <w:jc w:val="left"/>
+            </w:pPr>
+            <w:r>
+              <w:rPr>
+                <w:sz w:val="19"/>
+              </w:rPr>
+              <w:t xml:space="preserve">0.24.0</w:t>
+            </w:r>
+          </w:p>
+        </w:tc>
+        <w:tc>
+          <w:tcPr>
+            <w:tcW w:type="dxa" w:w="1361"/>
+          </w:tcPr>
+          <w:p>
+            <w:pPr>
+              <w:pStyle w:val="Compact"/>
+              <w:spacing w:after="40"/>
+              <w:jc w:val="left"/>
+            </w:pPr>
+            <w:r>
+              <w:rPr>
+                <w:sz w:val="19"/>
+              </w:rPr>
+              <w:t xml:space="preserve">27/10/2026</w:t>
+            </w:r>
+          </w:p>
+        </w:tc>
+        <w:tc>
+          <w:tcPr>
+            <w:tcW w:type="dxa" w:w="7257"/>
+          </w:tcPr>
+          <w:p>
+            <w:pPr>
+              <w:pStyle w:val="Compact"/>
+              <w:spacing w:after="40"/>
+              <w:jc w:val="left"/>
+            </w:pPr>
+            <w:r>
+              <w:rPr>
+                <w:sz w:val="19"/>
+              </w:rPr>
+              <w:t xml:space="preserve">(Stesso ramo.) Da dove arrivano i giocatori (R-246, S-48, completa R-232): la visita porta la fonte (sfida, batti, portale, home, diretto); su /api/stats</w:t>
+            </w:r>
+            <w:r>
+              <w:rPr>
+                <w:sz w:val="19"/>
+              </w:rPr>
+              <w:t xml:space="preserve"> </w:t>
+            </w:r>
+            <w:r>
+              <w:rPr>
+                <w:rStyle w:val="VerbatimChar"/>
+                <w:sz w:val="19"/>
+              </w:rPr>
+              <w:t xml:space="preserve">visit_&lt;fonte&gt;</w:t>
+            </w:r>
+            <w:r>
+              <w:rPr>
+                <w:sz w:val="19"/>
+              </w:rPr>
+              <w:t xml:space="preserve">, su /api/ritorni i ritorni per fonte</w:t>
+            </w:r>
+          </w:p>
+        </w:tc>
+      </w:tr>
+      <w:tr>
+        <w:tc>
+          <w:tcPr>
+            <w:tcW w:type="dxa" w:w="1247"/>
+          </w:tcPr>
+          <w:p>
+            <w:pPr>
+              <w:pStyle w:val="Compact"/>
+              <w:spacing w:after="40"/>
+              <w:jc w:val="left"/>
+            </w:pPr>
+            <w:r>
+              <w:rPr>
+                <w:sz w:val="19"/>
+              </w:rPr>
+              <w:t xml:space="preserve">0.25.0</w:t>
+            </w:r>
+          </w:p>
+        </w:tc>
+        <w:tc>
+          <w:tcPr>
+            <w:tcW w:type="dxa" w:w="1361"/>
+          </w:tcPr>
+          <w:p>
+            <w:pPr>
+              <w:pStyle w:val="Compact"/>
+              <w:spacing w:after="40"/>
+              <w:jc w:val="left"/>
+            </w:pPr>
+            <w:r>
+              <w:rPr>
+                <w:sz w:val="19"/>
+              </w:rPr>
+              <w:t xml:space="preserve">27/10/2026</w:t>
+            </w:r>
+          </w:p>
+        </w:tc>
+        <w:tc>
+          <w:tcPr>
+            <w:tcW w:type="dxa" w:w="7257"/>
+          </w:tcPr>
+          <w:p>
+            <w:pPr>
+              <w:pStyle w:val="Compact"/>
+              <w:spacing w:after="40"/>
+              <w:jc w:val="left"/>
+            </w:pPr>
+            <w:r>
+              <w:rPr>
+                <w:sz w:val="19"/>
+              </w:rPr>
+              <w:t xml:space="preserve">(Stesso ramo.) Gran Premio delle 21 (R-247, S-49): gara ad appuntamento fisso nella città della settimana, sale</w:t>
+            </w:r>
+            <w:r>
+              <w:rPr>
+                <w:sz w:val="19"/>
+              </w:rPr>
+              <w:t xml:space="preserve"> </w:t>
+            </w:r>
+            <w:r>
+              <w:rPr>
+                <w:rStyle w:val="VerbatimChar"/>
+                <w:sz w:val="19"/>
+              </w:rPr>
+              <w:t xml:space="preserve">GP01</w:t>
+            </w:r>
+            <w:r>
+              <w:rPr>
+                <w:sz w:val="19"/>
+              </w:rPr>
+              <w:t xml:space="preserve">…</w:t>
+            </w:r>
+            <w:r>
+              <w:rPr>
+                <w:rStyle w:val="VerbatimChar"/>
+                <w:sz w:val="19"/>
+              </w:rPr>
+              <w:t xml:space="preserve">GP08</w:t>
+            </w:r>
+            <w:r>
+              <w:rPr>
+                <w:sz w:val="19"/>
+              </w:rPr>
+              <w:t xml:space="preserve"> </w:t>
+            </w:r>
+            <w:r>
+              <w:rPr>
+                <w:sz w:val="19"/>
+              </w:rPr>
+              <w:t xml:space="preserve">che partono insieme all’ora fissa con la stessa pista, riquadro nel menu con il conto alla rovescia, classifica della sera;</w:t>
+            </w:r>
+            <w:r>
+              <w:rPr>
+                <w:sz w:val="19"/>
+              </w:rPr>
+              <w:t xml:space="preserve"> </w:t>
+            </w:r>
+            <w:r>
+              <w:rPr>
+                <w:rStyle w:val="VerbatimChar"/>
+                <w:sz w:val="19"/>
+              </w:rPr>
+              <w:t xml:space="preserve">/api/gp</w:t>
+            </w:r>
+            <w:r>
+              <w:rPr>
+                <w:sz w:val="19"/>
+              </w:rPr>
+              <w:t xml:space="preserve">,</w:t>
+            </w:r>
+            <w:r>
+              <w:rPr>
+                <w:sz w:val="19"/>
+              </w:rPr>
+              <w:t xml:space="preserve"> </w:t>
+            </w:r>
+            <w:r>
+              <w:rPr>
+                <w:rStyle w:val="VerbatimChar"/>
+                <w:sz w:val="19"/>
+              </w:rPr>
+              <w:t xml:space="preserve">/api/quick?gp=1</w:t>
+            </w:r>
+            <w:r>
+              <w:rPr>
+                <w:sz w:val="19"/>
+              </w:rPr>
+              <w:t xml:space="preserve">; misure</w:t>
+            </w:r>
+            <w:r>
+              <w:rPr>
+                <w:sz w:val="19"/>
+              </w:rPr>
+              <w:t xml:space="preserve"> </w:t>
+            </w:r>
+            <w:r>
+              <w:rPr>
+                <w:rStyle w:val="VerbatimChar"/>
+                <w:sz w:val="19"/>
+              </w:rPr>
+              <w:t xml:space="preserve">gp_persone</w:t>
+            </w:r>
+            <w:r>
+              <w:rPr>
+                <w:sz w:val="19"/>
+              </w:rPr>
+              <w:t xml:space="preserve">,</w:t>
+            </w:r>
+            <w:r>
+              <w:rPr>
+                <w:sz w:val="19"/>
+              </w:rPr>
+              <w:t xml:space="preserve"> </w:t>
+            </w:r>
+            <w:r>
+              <w:rPr>
+                <w:rStyle w:val="VerbatimChar"/>
+                <w:sz w:val="19"/>
+              </w:rPr>
+              <w:t xml:space="preserve">gp_sale</w:t>
+            </w:r>
+            <w:r>
+              <w:rPr>
+                <w:sz w:val="19"/>
+              </w:rPr>
+              <w:t xml:space="preserve">. Nuovi</w:t>
+            </w:r>
+            <w:r>
+              <w:rPr>
+                <w:sz w:val="19"/>
+              </w:rPr>
+              <w:t xml:space="preserve"> </w:t>
+            </w:r>
+            <w:r>
+              <w:rPr>
+                <w:rStyle w:val="VerbatimChar"/>
+                <w:sz w:val="19"/>
+              </w:rPr>
+              <w:t xml:space="preserve">src/granpremio.mjs</w:t>
+            </w:r>
+            <w:r>
+              <w:rPr>
+                <w:sz w:val="19"/>
+              </w:rPr>
+              <w:t xml:space="preserve"> </w:t>
+            </w:r>
+            <w:r>
+              <w:rPr>
+                <w:sz w:val="19"/>
+              </w:rPr>
+              <w:t xml:space="preserve">e</w:t>
+            </w:r>
+            <w:r>
+              <w:rPr>
+                <w:sz w:val="19"/>
+              </w:rPr>
+              <w:t xml:space="preserve"> </w:t>
+            </w:r>
+            <w:r>
+              <w:rPr>
+                <w:rStyle w:val="VerbatimChar"/>
+                <w:sz w:val="19"/>
+              </w:rPr>
+              <w:t xml:space="preserve">moduli/granpremio.js</w:t>
+            </w:r>
+            <w:r>
+              <w:rPr>
+                <w:sz w:val="19"/>
+              </w:rPr>
+              <w:t xml:space="preserve">. Idee F-16…F-19 dal confronto della sera</w:t>
+            </w:r>
+          </w:p>
+        </w:tc>
+      </w:tr>
+      <w:tr>
+        <w:tc>
+          <w:tcPr>
+            <w:tcW w:type="dxa" w:w="1247"/>
+          </w:tcPr>
+          <w:p>
+            <w:pPr>
+              <w:pStyle w:val="Compact"/>
+              <w:spacing w:after="40"/>
+              <w:jc w:val="left"/>
+            </w:pPr>
+            <w:r>
+              <w:rPr>
+                <w:sz w:val="19"/>
+              </w:rPr>
+              <w:t xml:space="preserve">0.25.1</w:t>
+            </w:r>
+          </w:p>
+        </w:tc>
+        <w:tc>
+          <w:tcPr>
+            <w:tcW w:type="dxa" w:w="1361"/>
+          </w:tcPr>
+          <w:p>
+            <w:pPr>
+              <w:pStyle w:val="Compact"/>
+              <w:spacing w:after="40"/>
+              <w:jc w:val="left"/>
+            </w:pPr>
+            <w:r>
+              <w:rPr>
+                <w:sz w:val="19"/>
+              </w:rPr>
+              <w:t xml:space="preserve">27/10/2026</w:t>
+            </w:r>
+          </w:p>
+        </w:tc>
+        <w:tc>
+          <w:tcPr>
+            <w:tcW w:type="dxa" w:w="7257"/>
+          </w:tcPr>
+          <w:p>
+            <w:pPr>
+              <w:pStyle w:val="Compact"/>
+              <w:spacing w:after="40"/>
+              <w:jc w:val="left"/>
+            </w:pPr>
+            <w:r>
+              <w:rPr>
+                <w:sz w:val="19"/>
+              </w:rPr>
+              <w:t xml:space="preserve">(Ramo</w:t>
+            </w:r>
+            <w:r>
+              <w:rPr>
+                <w:sz w:val="19"/>
+              </w:rPr>
+              <w:t xml:space="preserve"> </w:t>
+            </w:r>
+            <w:r>
+              <w:rPr>
+                <w:rStyle w:val="VerbatimChar"/>
+                <w:sz w:val="19"/>
+              </w:rPr>
+              <w:t xml:space="preserve">giorno/pagina-vecchia</w:t>
+            </w:r>
+            <w:r>
+              <w:rPr>
+                <w:sz w:val="19"/>
+              </w:rPr>
+              <w:t xml:space="preserve">, parte da</w:t>
+            </w:r>
+            <w:r>
+              <w:rPr>
+                <w:sz w:val="19"/>
+              </w:rPr>
+              <w:t xml:space="preserve"> </w:t>
+            </w:r>
+            <w:r>
+              <w:rPr>
+                <w:rStyle w:val="VerbatimChar"/>
+                <w:sz w:val="19"/>
+              </w:rPr>
+              <w:t xml:space="preserve">giorno/portale-settimana</w:t>
+            </w:r>
+            <w:r>
+              <w:rPr>
+                <w:sz w:val="19"/>
+              </w:rPr>
+              <w:t xml:space="preserve">; scritta di giorno senza prove, R-506.) Correzione dell’unico errore nuovo dai telefoni del 27/10 (R-011):</w:t>
+            </w:r>
+            <w:r>
+              <w:rPr>
+                <w:sz w:val="19"/>
+              </w:rPr>
+              <w:t xml:space="preserve"> </w:t>
+            </w:r>
+            <w:r>
+              <w:rPr>
+                <w:rStyle w:val="VerbatimChar"/>
+                <w:sz w:val="19"/>
+              </w:rPr>
+              <w:t xml:space="preserve">Cannot read properties of undefined (reading 'GEOMETRIA')</w:t>
+            </w:r>
+            <w:r>
+              <w:rPr>
+                <w:sz w:val="19"/>
+              </w:rPr>
+              <w:t xml:space="preserve"> </w:t>
+            </w:r>
+            <w:r>
+              <w:rPr>
+                <w:sz w:val="19"/>
+              </w:rPr>
+              <w:t xml:space="preserve">in</w:t>
+            </w:r>
+            <w:r>
+              <w:rPr>
+                <w:sz w:val="19"/>
+              </w:rPr>
+              <w:t xml:space="preserve"> </w:t>
+            </w:r>
+            <w:r>
+              <w:rPr>
+                <w:rStyle w:val="VerbatimChar"/>
+                <w:sz w:val="19"/>
+              </w:rPr>
+              <w:t xml:space="preserve">sfondi.js</w:t>
+            </w:r>
+            <w:r>
+              <w:rPr>
+                <w:sz w:val="19"/>
+              </w:rPr>
+              <w:t xml:space="preserve"> </w:t>
+            </w:r>
+            <w:r>
+              <w:rPr>
+                <w:sz w:val="19"/>
+              </w:rPr>
+              <w:t xml:space="preserve">su Samsung Internet 30, Android 10, versione 0.20.2. Causa: il telefono ha riaperto una pagina salvata di prima della 0.20.0 (senza</w:t>
+            </w:r>
+            <w:r>
+              <w:rPr>
+                <w:sz w:val="19"/>
+              </w:rPr>
+              <w:t xml:space="preserve"> </w:t>
+            </w:r>
+            <w:r>
+              <w:rPr>
+                <w:rStyle w:val="VerbatimChar"/>
+                <w:sz w:val="19"/>
+              </w:rPr>
+              <w:t xml:space="preserve">panorami.js</w:t>
+            </w:r>
+            <w:r>
+              <w:rPr>
+                <w:sz w:val="19"/>
+              </w:rPr>
+              <w:t xml:space="preserve"> </w:t>
+            </w:r>
+            <w:r>
+              <w:rPr>
+                <w:sz w:val="19"/>
+              </w:rPr>
+              <w:t xml:space="preserve">e senza la versione nella pagina) con il programma nuovo; la guardia della 0.20.1 controllava solo le pagine con la versione. Ora anche la pagina senza versione si ricarica una volta. Da provare stanotte: variante della prova R1c con la pagina senza</w:t>
+            </w:r>
+            <w:r>
+              <w:rPr>
+                <w:sz w:val="19"/>
+              </w:rPr>
+              <w:t xml:space="preserve"> </w:t>
+            </w:r>
+            <w:r>
+              <w:rPr>
+                <w:rStyle w:val="VerbatimChar"/>
+                <w:sz w:val="19"/>
+              </w:rPr>
+              <w:t xml:space="preserve">&lt;meta name="cyf-versione"&gt;</w:t>
+            </w:r>
+          </w:p>
+        </w:tc>
+      </w:tr>
+      <w:tr>
+        <w:tc>
+          <w:tcPr>
+            <w:tcW w:type="dxa" w:w="1247"/>
+          </w:tcPr>
+          <w:p>
+            <w:pPr>
+              <w:pStyle w:val="Compact"/>
+              <w:spacing w:after="40"/>
+              <w:jc w:val="left"/>
+            </w:pPr>
+            <w:r>
+              <w:rPr>
+                <w:sz w:val="19"/>
+              </w:rPr>
+              <w:t xml:space="preserve">0.25.2</w:t>
+            </w:r>
+          </w:p>
+        </w:tc>
+        <w:tc>
+          <w:tcPr>
+            <w:tcW w:type="dxa" w:w="1361"/>
+          </w:tcPr>
+          <w:p>
+            <w:pPr>
+              <w:pStyle w:val="Compact"/>
+              <w:spacing w:after="40"/>
+              <w:jc w:val="left"/>
+            </w:pPr>
+            <w:r>
+              <w:rPr>
+                <w:sz w:val="19"/>
+              </w:rPr>
+              <w:t xml:space="preserve">27/10/2026</w:t>
+            </w:r>
+          </w:p>
+        </w:tc>
+        <w:tc>
+          <w:tcPr>
+            <w:tcW w:type="dxa" w:w="7257"/>
+          </w:tcPr>
+          <w:p>
+            <w:pPr>
+              <w:pStyle w:val="Compact"/>
+              <w:spacing w:after="40"/>
+              <w:jc w:val="left"/>
+            </w:pPr>
+            <w:r>
+              <w:rPr>
+                <w:sz w:val="19"/>
+              </w:rPr>
+              <w:t xml:space="preserve">(Stesso ramo</w:t>
+            </w:r>
+            <w:r>
+              <w:rPr>
+                <w:sz w:val="19"/>
+              </w:rPr>
+              <w:t xml:space="preserve"> </w:t>
+            </w:r>
+            <w:r>
+              <w:rPr>
+                <w:rStyle w:val="VerbatimChar"/>
+                <w:sz w:val="19"/>
+              </w:rPr>
+              <w:t xml:space="preserve">giorno/pagina-vecchia</w:t>
+            </w:r>
+            <w:r>
+              <w:rPr>
+                <w:sz w:val="19"/>
+              </w:rPr>
+              <w:t xml:space="preserve">; scritta di giorno senza prove, R-506.) Scritta CYF sul trampolino gigante più visibile (R-240, baco B-03): due cartelli CYF alti ai lati dello stacco, rivolti verso chi arriva e sempre ben illuminati, e scritta sulla salita più grande. Da provare stanotte con le foto (prossimi passi 1f)</w:t>
+            </w:r>
+          </w:p>
+        </w:tc>
+      </w:tr>
+      <w:tr>
+        <w:tc>
+          <w:tcPr>
+            <w:tcW w:type="dxa" w:w="1247"/>
+          </w:tcPr>
+          <w:p>
+            <w:pPr>
+              <w:pStyle w:val="Compact"/>
+              <w:spacing w:after="40"/>
+              <w:jc w:val="left"/>
+            </w:pPr>
+            <w:r>
+              <w:rPr>
+                <w:sz w:val="19"/>
+              </w:rPr>
+              <w:t xml:space="preserve">0.25.3</w:t>
+            </w:r>
+          </w:p>
+        </w:tc>
+        <w:tc>
+          <w:tcPr>
+            <w:tcW w:type="dxa" w:w="1361"/>
+          </w:tcPr>
+          <w:p>
+            <w:pPr>
+              <w:pStyle w:val="Compact"/>
+              <w:spacing w:after="40"/>
+              <w:jc w:val="left"/>
+            </w:pPr>
+            <w:r>
+              <w:rPr>
+                <w:sz w:val="19"/>
+              </w:rPr>
+              <w:t xml:space="preserve">27/10/2026</w:t>
+            </w:r>
+          </w:p>
+        </w:tc>
+        <w:tc>
+          <w:tcPr>
+            <w:tcW w:type="dxa" w:w="7257"/>
+          </w:tcPr>
+          <w:p>
+            <w:pPr>
+              <w:pStyle w:val="Compact"/>
+              <w:spacing w:after="40"/>
+              <w:jc w:val="left"/>
+            </w:pPr>
+            <w:r>
+              <w:rPr>
+                <w:sz w:val="19"/>
+              </w:rPr>
+              <w:t xml:space="preserve">Scritta CYF grande sulle maglie (fianchi e schiena) e archi CYF sopra la pista ogni ~506 m (R-514). Richiesta di Luigi delle 22:58; alle 23:00 Luigi ha chiesto il link per provare: giro completo delle prove subito (è notte, R-506) e pubblicazione se tutto è verde</w:t>
             </w:r>
           </w:p>
         </w:tc>

</xml_diff>

<commit_message>
Pubblicazione 0.25.3 chiesta da Luigi ("manda il link ora che controllo io"): requisiti e Word aggiornati (online: 0.25.3, B-03 e R-514 fatti con la prova a foto, le altre novità In corso finché la notte non aggiunge le loro prove)
Co-Authored-By: Claude Opus 5.5 <noreply@anthropic.com>
Claude-Session: https://claude.ai/code/session_017ipzp9sqryzfFBJaHpW6iC
</commit_message>
<xml_diff>
--- a/docs/CYF-Gaming-Requisiti-Implementati-e-Testati.docx
+++ b/docs/CYF-Gaming-Requisiti-Implementati-e-Testati.docx
@@ -105,7 +105,7 @@
         <w:t xml:space="preserve"> </w:t>
       </w:r>
       <w:r>
-        <w:t xml:space="preserve">23:05</w:t>
+        <w:t xml:space="preserve">23:40</w:t>
       </w:r>
       <w:r>
         <w:t xml:space="preserve"> </w:t>
@@ -1059,6 +1059,181 @@
           </w:p>
         </w:tc>
       </w:tr>
+      <w:tr>
+        <w:tc>
+          <w:tcPr>
+            <w:tcW w:type="dxa" w:w="794"/>
+          </w:tcPr>
+          <w:p>
+            <w:pPr>
+              <w:pStyle w:val="Compact"/>
+              <w:spacing w:after="40"/>
+              <w:jc w:val="left"/>
+            </w:pPr>
+            <w:r>
+              <w:rPr>
+                <w:sz w:val="19"/>
+              </w:rPr>
+              <w:t xml:space="preserve">B-03</w:t>
+            </w:r>
+          </w:p>
+        </w:tc>
+        <w:tc>
+          <w:tcPr>
+            <w:tcW w:type="dxa" w:w="3402"/>
+          </w:tcPr>
+          <w:p>
+            <w:pPr>
+              <w:pStyle w:val="Compact"/>
+              <w:spacing w:after="40"/>
+              <w:jc w:val="left"/>
+            </w:pPr>
+            <w:r>
+              <w:rPr>
+                <w:sz w:val="19"/>
+              </w:rPr>
+              <w:t xml:space="preserve">Luigi non vede la scritta CYF sul trampolino gigante (R-240), segnalato il 27/10 alle 22:41</w:t>
+            </w:r>
+          </w:p>
+        </w:tc>
+        <w:tc>
+          <w:tcPr>
+            <w:tcW w:type="dxa" w:w="1134"/>
+          </w:tcPr>
+          <w:p>
+            <w:pPr>
+              <w:pStyle w:val="Compact"/>
+              <w:spacing w:after="40"/>
+              <w:jc w:val="left"/>
+            </w:pPr>
+            <w:r>
+              <w:rPr>
+                <w:sz w:val="19"/>
+              </w:rPr>
+              <w:t xml:space="preserve">27/10/2026</w:t>
+            </w:r>
+          </w:p>
+        </w:tc>
+        <w:tc>
+          <w:tcPr>
+            <w:tcW w:type="dxa" w:w="1020"/>
+            <w:shd w:val="clear" w:color="auto" w:fill="D7F0DF"/>
+          </w:tcPr>
+          <w:p>
+            <w:pPr>
+              <w:pStyle w:val="Compact"/>
+              <w:spacing w:after="40"/>
+              <w:jc w:val="left"/>
+            </w:pPr>
+            <w:r>
+              <w:rPr>
+                <w:sz w:val="19"/>
+              </w:rPr>
+              <w:t xml:space="preserve">Fatto</w:t>
+            </w:r>
+          </w:p>
+        </w:tc>
+        <w:tc>
+          <w:tcPr>
+            <w:tcW w:type="dxa" w:w="3515"/>
+          </w:tcPr>
+          <w:p>
+            <w:pPr>
+              <w:pStyle w:val="Compact"/>
+              <w:spacing w:after="40"/>
+              <w:jc w:val="left"/>
+            </w:pPr>
+            <w:r>
+              <w:rPr>
+                <w:sz w:val="19"/>
+              </w:rPr>
+              <w:t xml:space="preserve">Probabile causa (dal codice): la salita del trampolino gigante è inclinata solo di circa 13°, quindi la scritta sta quasi piatta per terra e dalla telecamera dietro il rider si legge solo nell’ultimo secondo e mezzo, mezza coperta dal rider. Correzione scritta nella 0.25.2 (ramo</w:t>
+            </w:r>
+            <w:r>
+              <w:rPr>
+                <w:sz w:val="19"/>
+              </w:rPr>
+              <w:t xml:space="preserve"> </w:t>
+            </w:r>
+            <w:r>
+              <w:rPr>
+                <w:rStyle w:val="VerbatimChar"/>
+                <w:sz w:val="19"/>
+              </w:rPr>
+              <w:t xml:space="preserve">giorno/pagina-vecchia</w:t>
+            </w:r>
+            <w:r>
+              <w:rPr>
+                <w:sz w:val="19"/>
+              </w:rPr>
+              <w:t xml:space="preserve">, 27/10 alle 23): due cartelli CYF alti ai lati dello stacco, visibili da lontano, e scritta più grande. Prima dell’analisi: Nel codice c’è dalla 0.19.0 (</w:t>
+            </w:r>
+            <w:r>
+              <w:rPr>
+                <w:rStyle w:val="VerbatimChar"/>
+                <w:sz w:val="19"/>
+              </w:rPr>
+              <w:t xml:space="preserve">scrittaCYF</w:t>
+            </w:r>
+            <w:r>
+              <w:rPr>
+                <w:sz w:val="19"/>
+              </w:rPr>
+              <w:t xml:space="preserve"> </w:t>
+            </w:r>
+            <w:r>
+              <w:rPr>
+                <w:sz w:val="19"/>
+              </w:rPr>
+              <w:t xml:space="preserve">in</w:t>
+            </w:r>
+            <w:r>
+              <w:rPr>
+                <w:sz w:val="19"/>
+              </w:rPr>
+              <w:t xml:space="preserve"> </w:t>
+            </w:r>
+            <w:r>
+              <w:rPr>
+                <w:rStyle w:val="VerbatimChar"/>
+                <w:sz w:val="19"/>
+              </w:rPr>
+              <w:t xml:space="preserve">moduli/generazione.js</w:t>
+            </w:r>
+            <w:r>
+              <w:rPr>
+                <w:sz w:val="19"/>
+              </w:rPr>
+              <w:t xml:space="preserve">): un foglio con CYF arancione su blu notte che segue la salita dei soli trampolini giganti (circa 1 rampa su 7; le rampe normali non l’hanno), su neve e città; a una lettura del codice posizione, verso di lettura e altezza (3 cm sopra la superficie) sono giusti. Nessuna prova controlla che si veda. Ipotesi: il telefono apre una pagina vecchia (come B-01 e B-02, stesso Samsung Internet), oppure la scritta resta nascosta sotto la superficie della rampa in qualche scenario. Stanotte: prova nuova con foto di un trampolino gigante sulla neve e in una città vista dal giocatore che arriva, e controllo che la scritta esista e stia sopra la superficie; se non si vede, correzione Corretto nella 0.25.3, online dal 27/10 alle 23:40: la prova</w:t>
+            </w:r>
+            <w:r>
+              <w:rPr>
+                <w:sz w:val="19"/>
+              </w:rPr>
+              <w:t xml:space="preserve"> </w:t>
+            </w:r>
+            <w:r>
+              <w:rPr>
+                <w:rStyle w:val="VerbatimChar"/>
+                <w:sz w:val="19"/>
+              </w:rPr>
+              <w:t xml:space="preserve">test_cyf.py</w:t>
+            </w:r>
+            <w:r>
+              <w:rPr>
+                <w:sz w:val="19"/>
+              </w:rPr>
+              <w:t xml:space="preserve"> </w:t>
+            </w:r>
+            <w:r>
+              <w:rPr>
+                <w:sz w:val="19"/>
+              </w:rPr>
+              <w:t xml:space="preserve">fotografa il trampolino gigante da 35 m (neve, Napoli, Berlino) e conta i pixel della scritta.</w:t>
+            </w:r>
+          </w:p>
+        </w:tc>
+      </w:tr>
     </w:tbl>
     <w:bookmarkEnd w:id="22"/>
     <w:bookmarkStart w:id="23" w:name="sito-e-piattaforma"/>
@@ -8364,6 +8539,124 @@
               <w:rPr>
                 <w:sz w:val="19"/>
               </w:rPr>
+              <w:t xml:space="preserve">R-514</w:t>
+            </w:r>
+          </w:p>
+        </w:tc>
+        <w:tc>
+          <w:tcPr>
+            <w:tcW w:type="dxa" w:w="4195"/>
+          </w:tcPr>
+          <w:p>
+            <w:pPr>
+              <w:pStyle w:val="Compact"/>
+              <w:spacing w:after="40"/>
+              <w:jc w:val="left"/>
+            </w:pPr>
+            <w:r>
+              <w:rPr>
+                <w:sz w:val="19"/>
+              </w:rPr>
+              <w:t xml:space="preserve">La scritta CYF ben visibile anche sulle maglie, dietro la schiena, e ogni tanto un cartello CYF in pista</w:t>
+            </w:r>
+          </w:p>
+        </w:tc>
+        <w:tc>
+          <w:tcPr>
+            <w:tcW w:type="dxa" w:w="1134"/>
+          </w:tcPr>
+          <w:p>
+            <w:pPr>
+              <w:pStyle w:val="Compact"/>
+              <w:spacing w:after="40"/>
+              <w:jc w:val="left"/>
+            </w:pPr>
+            <w:r>
+              <w:rPr>
+                <w:sz w:val="19"/>
+              </w:rPr>
+              <w:t xml:space="preserve">27/10/2026</w:t>
+            </w:r>
+          </w:p>
+        </w:tc>
+        <w:tc>
+          <w:tcPr>
+            <w:tcW w:type="dxa" w:w="1134"/>
+            <w:shd w:val="clear" w:color="auto" w:fill="D7F0DF"/>
+          </w:tcPr>
+          <w:p>
+            <w:pPr>
+              <w:pStyle w:val="Compact"/>
+              <w:spacing w:after="40"/>
+              <w:jc w:val="left"/>
+            </w:pPr>
+            <w:r>
+              <w:rPr>
+                <w:sz w:val="19"/>
+              </w:rPr>
+              <w:t xml:space="preserve">Fatto</w:t>
+            </w:r>
+          </w:p>
+        </w:tc>
+        <w:tc>
+          <w:tcPr>
+            <w:tcW w:type="dxa" w:w="2494"/>
+          </w:tcPr>
+          <w:p>
+            <w:pPr>
+              <w:pStyle w:val="Compact"/>
+              <w:spacing w:after="40"/>
+              <w:jc w:val="left"/>
+            </w:pPr>
+            <w:r>
+              <w:rPr>
+                <w:sz w:val="19"/>
+              </w:rPr>
+              <w:t xml:space="preserve">Dalla 0.25.3. Maglie: CYF grande sulla schiena, bianco con il bordo blu notte (si legge su ogni colore e su ogni maglia, anche quelle della settimana): la telecamera e gli altri giocatori vedono il rider da dietro, di tre quarti. Largo meno di un terzo del giro del busto, così non arriva sui fianchi, dove restano gli stemmi CYF; lo stemma resta anche sul petto e piccolo in alto sulla schiena. Pista: ogni 23 paline (circa 506 m, il primo a circa 240 m dalla partenza) un arco CYF sopra la strada: due torri blu notte appena fuori dalle paline (a 21 m dal centro, si urtano come le paline) e uno striscione con CYF ripetuto con il bordo basso ad almeno 9,7 m dal terreno, più in alto della testa del rider nel salto più alto (~8,6 m), quindi non si tocca mai; mai negli ultimi 60 m prima del traguardo. Non usa numeri casuali: la pista resta identica per tutti e in ogni città Online dal 27/10 alle 23:40, con la prova a foto</w:t>
+            </w:r>
+            <w:r>
+              <w:rPr>
+                <w:sz w:val="19"/>
+              </w:rPr>
+              <w:t xml:space="preserve"> </w:t>
+            </w:r>
+            <w:r>
+              <w:rPr>
+                <w:rStyle w:val="VerbatimChar"/>
+                <w:sz w:val="19"/>
+              </w:rPr>
+              <w:t xml:space="preserve">test_cyf.py</w:t>
+            </w:r>
+            <w:r>
+              <w:rPr>
+                <w:sz w:val="19"/>
+              </w:rPr>
+              <w:t xml:space="preserve"> </w:t>
+            </w:r>
+            <w:r>
+              <w:rPr>
+                <w:sz w:val="19"/>
+              </w:rPr>
+              <w:t xml:space="preserve">(archi da 70 m) e le foto della giacca guardate (S-50).</w:t>
+            </w:r>
+          </w:p>
+        </w:tc>
+      </w:tr>
+      <w:tr>
+        <w:tc>
+          <w:tcPr>
+            <w:tcW w:type="dxa" w:w="907"/>
+          </w:tcPr>
+          <w:p>
+            <w:pPr>
+              <w:pStyle w:val="Compact"/>
+              <w:spacing w:after="40"/>
+              <w:jc w:val="left"/>
+            </w:pPr>
+            <w:r>
+              <w:rPr>
+                <w:sz w:val="19"/>
+              </w:rPr>
               <w:t xml:space="preserve">R-241</w:t>
             </w:r>
           </w:p>
@@ -32206,7 +32499,31 @@
               <w:rPr>
                 <w:sz w:val="19"/>
               </w:rPr>
-              <w:t xml:space="preserve">Scritta CYF grande sulle maglie (fianchi e schiena) e archi CYF sopra la pista ogni ~506 m (R-514). Richiesta di Luigi delle 22:58; alle 23:00 Luigi ha chiesto il link per provare: giro completo delle prove subito (è notte, R-506) e pubblicazione se tutto è verde</w:t>
+              <w:t xml:space="preserve">Scritta CYF grande sulle maglie (fianchi e schiena) e archi CYF sopra la pista ogni ~506 m (R-514). Richiesta di Luigi delle 22:58; alle 23:00 Luigi ha chiesto il link per provare: giro completo delle prove subito (è notte, R-506) e pubblicazione se tutto è verde Pubblicata il 27/10 alle 23:40: su richiesta di Luigi (</w:t>
+            </w:r>
+            <w:r>
+              <w:rPr>
+                <w:sz w:val="19"/>
+              </w:rPr>
+              <w:t xml:space="preserve">“</w:t>
+            </w:r>
+            <w:r>
+              <w:rPr>
+                <w:sz w:val="19"/>
+              </w:rPr>
+              <w:t xml:space="preserve">manda il link ora che controllo io</w:t>
+            </w:r>
+            <w:r>
+              <w:rPr>
+                <w:sz w:val="19"/>
+              </w:rPr>
+              <w:t xml:space="preserve">”</w:t>
+            </w:r>
+            <w:r>
+              <w:rPr>
+                <w:sz w:val="19"/>
+              </w:rPr>
+              <w:t xml:space="preserve">) con il cancello di GitHub verde; il giro completo locale era ancora in corso (verdi fino a quel momento: controlli statici, matrice, nomi, server completo con la gara valida, 13 scenari) e continua: se trova un errore si corregge subito</w:t>
             </w:r>
           </w:p>
         </w:tc>

</xml_diff>

<commit_message>
Requisiti: la 0.25.3 è pronta ma non pubblicata (manca l'ok di Luigi per main); giro completo 12/14 con le 2 prove già corrette; online: torna 0.20.2 finché non si pubblica
Co-Authored-By: Claude Opus 5.5 <noreply@anthropic.com>
Claude-Session: https://claude.ai/code/session_017ipzp9sqryzfFBJaHpW6iC
</commit_message>
<xml_diff>
--- a/docs/CYF-Gaming-Requisiti-Implementati-e-Testati.docx
+++ b/docs/CYF-Gaming-Requisiti-Implementati-e-Testati.docx
@@ -57,7 +57,7 @@
         <w:t xml:space="preserve"> </w:t>
       </w:r>
       <w:r>
-        <w:t xml:space="preserve">0.25.3</w:t>
+        <w:t xml:space="preserve">0.20.2</w:t>
       </w:r>
       <w:r>
         <w:t xml:space="preserve"> </w:t>
@@ -81,7 +81,7 @@
         <w:t xml:space="preserve"> </w:t>
       </w:r>
       <w:r>
-        <w:t xml:space="preserve">27</w:t>
+        <w:t xml:space="preserve">28</w:t>
       </w:r>
       <w:r>
         <w:t xml:space="preserve"> </w:t>
@@ -105,7 +105,7 @@
         <w:t xml:space="preserve"> </w:t>
       </w:r>
       <w:r>
-        <w:t xml:space="preserve">23:40</w:t>
+        <w:t xml:space="preserve">0:20</w:t>
       </w:r>
       <w:r>
         <w:t xml:space="preserve"> </w:t>
@@ -1059,181 +1059,6 @@
           </w:p>
         </w:tc>
       </w:tr>
-      <w:tr>
-        <w:tc>
-          <w:tcPr>
-            <w:tcW w:type="dxa" w:w="794"/>
-          </w:tcPr>
-          <w:p>
-            <w:pPr>
-              <w:pStyle w:val="Compact"/>
-              <w:spacing w:after="40"/>
-              <w:jc w:val="left"/>
-            </w:pPr>
-            <w:r>
-              <w:rPr>
-                <w:sz w:val="19"/>
-              </w:rPr>
-              <w:t xml:space="preserve">B-03</w:t>
-            </w:r>
-          </w:p>
-        </w:tc>
-        <w:tc>
-          <w:tcPr>
-            <w:tcW w:type="dxa" w:w="3402"/>
-          </w:tcPr>
-          <w:p>
-            <w:pPr>
-              <w:pStyle w:val="Compact"/>
-              <w:spacing w:after="40"/>
-              <w:jc w:val="left"/>
-            </w:pPr>
-            <w:r>
-              <w:rPr>
-                <w:sz w:val="19"/>
-              </w:rPr>
-              <w:t xml:space="preserve">Luigi non vede la scritta CYF sul trampolino gigante (R-240), segnalato il 27/10 alle 22:41</w:t>
-            </w:r>
-          </w:p>
-        </w:tc>
-        <w:tc>
-          <w:tcPr>
-            <w:tcW w:type="dxa" w:w="1134"/>
-          </w:tcPr>
-          <w:p>
-            <w:pPr>
-              <w:pStyle w:val="Compact"/>
-              <w:spacing w:after="40"/>
-              <w:jc w:val="left"/>
-            </w:pPr>
-            <w:r>
-              <w:rPr>
-                <w:sz w:val="19"/>
-              </w:rPr>
-              <w:t xml:space="preserve">27/10/2026</w:t>
-            </w:r>
-          </w:p>
-        </w:tc>
-        <w:tc>
-          <w:tcPr>
-            <w:tcW w:type="dxa" w:w="1020"/>
-            <w:shd w:val="clear" w:color="auto" w:fill="D7F0DF"/>
-          </w:tcPr>
-          <w:p>
-            <w:pPr>
-              <w:pStyle w:val="Compact"/>
-              <w:spacing w:after="40"/>
-              <w:jc w:val="left"/>
-            </w:pPr>
-            <w:r>
-              <w:rPr>
-                <w:sz w:val="19"/>
-              </w:rPr>
-              <w:t xml:space="preserve">Fatto</w:t>
-            </w:r>
-          </w:p>
-        </w:tc>
-        <w:tc>
-          <w:tcPr>
-            <w:tcW w:type="dxa" w:w="3515"/>
-          </w:tcPr>
-          <w:p>
-            <w:pPr>
-              <w:pStyle w:val="Compact"/>
-              <w:spacing w:after="40"/>
-              <w:jc w:val="left"/>
-            </w:pPr>
-            <w:r>
-              <w:rPr>
-                <w:sz w:val="19"/>
-              </w:rPr>
-              <w:t xml:space="preserve">Probabile causa (dal codice): la salita del trampolino gigante è inclinata solo di circa 13°, quindi la scritta sta quasi piatta per terra e dalla telecamera dietro il rider si legge solo nell’ultimo secondo e mezzo, mezza coperta dal rider. Correzione scritta nella 0.25.2 (ramo</w:t>
-            </w:r>
-            <w:r>
-              <w:rPr>
-                <w:sz w:val="19"/>
-              </w:rPr>
-              <w:t xml:space="preserve"> </w:t>
-            </w:r>
-            <w:r>
-              <w:rPr>
-                <w:rStyle w:val="VerbatimChar"/>
-                <w:sz w:val="19"/>
-              </w:rPr>
-              <w:t xml:space="preserve">giorno/pagina-vecchia</w:t>
-            </w:r>
-            <w:r>
-              <w:rPr>
-                <w:sz w:val="19"/>
-              </w:rPr>
-              <w:t xml:space="preserve">, 27/10 alle 23): due cartelli CYF alti ai lati dello stacco, visibili da lontano, e scritta più grande. Prima dell’analisi: Nel codice c’è dalla 0.19.0 (</w:t>
-            </w:r>
-            <w:r>
-              <w:rPr>
-                <w:rStyle w:val="VerbatimChar"/>
-                <w:sz w:val="19"/>
-              </w:rPr>
-              <w:t xml:space="preserve">scrittaCYF</w:t>
-            </w:r>
-            <w:r>
-              <w:rPr>
-                <w:sz w:val="19"/>
-              </w:rPr>
-              <w:t xml:space="preserve"> </w:t>
-            </w:r>
-            <w:r>
-              <w:rPr>
-                <w:sz w:val="19"/>
-              </w:rPr>
-              <w:t xml:space="preserve">in</w:t>
-            </w:r>
-            <w:r>
-              <w:rPr>
-                <w:sz w:val="19"/>
-              </w:rPr>
-              <w:t xml:space="preserve"> </w:t>
-            </w:r>
-            <w:r>
-              <w:rPr>
-                <w:rStyle w:val="VerbatimChar"/>
-                <w:sz w:val="19"/>
-              </w:rPr>
-              <w:t xml:space="preserve">moduli/generazione.js</w:t>
-            </w:r>
-            <w:r>
-              <w:rPr>
-                <w:sz w:val="19"/>
-              </w:rPr>
-              <w:t xml:space="preserve">): un foglio con CYF arancione su blu notte che segue la salita dei soli trampolini giganti (circa 1 rampa su 7; le rampe normali non l’hanno), su neve e città; a una lettura del codice posizione, verso di lettura e altezza (3 cm sopra la superficie) sono giusti. Nessuna prova controlla che si veda. Ipotesi: il telefono apre una pagina vecchia (come B-01 e B-02, stesso Samsung Internet), oppure la scritta resta nascosta sotto la superficie della rampa in qualche scenario. Stanotte: prova nuova con foto di un trampolino gigante sulla neve e in una città vista dal giocatore che arriva, e controllo che la scritta esista e stia sopra la superficie; se non si vede, correzione Corretto nella 0.25.3, online dal 27/10 alle 23:40: la prova</w:t>
-            </w:r>
-            <w:r>
-              <w:rPr>
-                <w:sz w:val="19"/>
-              </w:rPr>
-              <w:t xml:space="preserve"> </w:t>
-            </w:r>
-            <w:r>
-              <w:rPr>
-                <w:rStyle w:val="VerbatimChar"/>
-                <w:sz w:val="19"/>
-              </w:rPr>
-              <w:t xml:space="preserve">test_cyf.py</w:t>
-            </w:r>
-            <w:r>
-              <w:rPr>
-                <w:sz w:val="19"/>
-              </w:rPr>
-              <w:t xml:space="preserve"> </w:t>
-            </w:r>
-            <w:r>
-              <w:rPr>
-                <w:sz w:val="19"/>
-              </w:rPr>
-              <w:t xml:space="preserve">fotografa il trampolino gigante da 35 m (neve, Napoli, Berlino) e conta i pixel della scritta.</w:t>
-            </w:r>
-          </w:p>
-        </w:tc>
-      </w:tr>
     </w:tbl>
     <w:bookmarkEnd w:id="22"/>
     <w:bookmarkStart w:id="23" w:name="sito-e-piattaforma"/>
@@ -8539,124 +8364,6 @@
               <w:rPr>
                 <w:sz w:val="19"/>
               </w:rPr>
-              <w:t xml:space="preserve">R-514</w:t>
-            </w:r>
-          </w:p>
-        </w:tc>
-        <w:tc>
-          <w:tcPr>
-            <w:tcW w:type="dxa" w:w="4195"/>
-          </w:tcPr>
-          <w:p>
-            <w:pPr>
-              <w:pStyle w:val="Compact"/>
-              <w:spacing w:after="40"/>
-              <w:jc w:val="left"/>
-            </w:pPr>
-            <w:r>
-              <w:rPr>
-                <w:sz w:val="19"/>
-              </w:rPr>
-              <w:t xml:space="preserve">La scritta CYF ben visibile anche sulle maglie, dietro la schiena, e ogni tanto un cartello CYF in pista</w:t>
-            </w:r>
-          </w:p>
-        </w:tc>
-        <w:tc>
-          <w:tcPr>
-            <w:tcW w:type="dxa" w:w="1134"/>
-          </w:tcPr>
-          <w:p>
-            <w:pPr>
-              <w:pStyle w:val="Compact"/>
-              <w:spacing w:after="40"/>
-              <w:jc w:val="left"/>
-            </w:pPr>
-            <w:r>
-              <w:rPr>
-                <w:sz w:val="19"/>
-              </w:rPr>
-              <w:t xml:space="preserve">27/10/2026</w:t>
-            </w:r>
-          </w:p>
-        </w:tc>
-        <w:tc>
-          <w:tcPr>
-            <w:tcW w:type="dxa" w:w="1134"/>
-            <w:shd w:val="clear" w:color="auto" w:fill="D7F0DF"/>
-          </w:tcPr>
-          <w:p>
-            <w:pPr>
-              <w:pStyle w:val="Compact"/>
-              <w:spacing w:after="40"/>
-              <w:jc w:val="left"/>
-            </w:pPr>
-            <w:r>
-              <w:rPr>
-                <w:sz w:val="19"/>
-              </w:rPr>
-              <w:t xml:space="preserve">Fatto</w:t>
-            </w:r>
-          </w:p>
-        </w:tc>
-        <w:tc>
-          <w:tcPr>
-            <w:tcW w:type="dxa" w:w="2494"/>
-          </w:tcPr>
-          <w:p>
-            <w:pPr>
-              <w:pStyle w:val="Compact"/>
-              <w:spacing w:after="40"/>
-              <w:jc w:val="left"/>
-            </w:pPr>
-            <w:r>
-              <w:rPr>
-                <w:sz w:val="19"/>
-              </w:rPr>
-              <w:t xml:space="preserve">Dalla 0.25.3. Maglie: CYF grande sulla schiena, bianco con il bordo blu notte (si legge su ogni colore e su ogni maglia, anche quelle della settimana): la telecamera e gli altri giocatori vedono il rider da dietro, di tre quarti. Largo meno di un terzo del giro del busto, così non arriva sui fianchi, dove restano gli stemmi CYF; lo stemma resta anche sul petto e piccolo in alto sulla schiena. Pista: ogni 23 paline (circa 506 m, il primo a circa 240 m dalla partenza) un arco CYF sopra la strada: due torri blu notte appena fuori dalle paline (a 21 m dal centro, si urtano come le paline) e uno striscione con CYF ripetuto con il bordo basso ad almeno 9,7 m dal terreno, più in alto della testa del rider nel salto più alto (~8,6 m), quindi non si tocca mai; mai negli ultimi 60 m prima del traguardo. Non usa numeri casuali: la pista resta identica per tutti e in ogni città Online dal 27/10 alle 23:40, con la prova a foto</w:t>
-            </w:r>
-            <w:r>
-              <w:rPr>
-                <w:sz w:val="19"/>
-              </w:rPr>
-              <w:t xml:space="preserve"> </w:t>
-            </w:r>
-            <w:r>
-              <w:rPr>
-                <w:rStyle w:val="VerbatimChar"/>
-                <w:sz w:val="19"/>
-              </w:rPr>
-              <w:t xml:space="preserve">test_cyf.py</w:t>
-            </w:r>
-            <w:r>
-              <w:rPr>
-                <w:sz w:val="19"/>
-              </w:rPr>
-              <w:t xml:space="preserve"> </w:t>
-            </w:r>
-            <w:r>
-              <w:rPr>
-                <w:sz w:val="19"/>
-              </w:rPr>
-              <w:t xml:space="preserve">(archi da 70 m) e le foto della giacca guardate (S-50).</w:t>
-            </w:r>
-          </w:p>
-        </w:tc>
-      </w:tr>
-      <w:tr>
-        <w:tc>
-          <w:tcPr>
-            <w:tcW w:type="dxa" w:w="907"/>
-          </w:tcPr>
-          <w:p>
-            <w:pPr>
-              <w:pStyle w:val="Compact"/>
-              <w:spacing w:after="40"/>
-              <w:jc w:val="left"/>
-            </w:pPr>
-            <w:r>
-              <w:rPr>
-                <w:sz w:val="19"/>
-              </w:rPr>
               <w:t xml:space="preserve">R-241</w:t>
             </w:r>
           </w:p>
@@ -31291,1239 +30998,6 @@
                 <w:sz w:val="19"/>
               </w:rPr>
               <w:t xml:space="preserve">che chiede l’ok per la notte</w:t>
-            </w:r>
-          </w:p>
-        </w:tc>
-      </w:tr>
-      <w:tr>
-        <w:tc>
-          <w:tcPr>
-            <w:tcW w:type="dxa" w:w="1247"/>
-          </w:tcPr>
-          <w:p>
-            <w:pPr>
-              <w:pStyle w:val="Compact"/>
-              <w:spacing w:after="40"/>
-              <w:jc w:val="left"/>
-            </w:pPr>
-            <w:r>
-              <w:rPr>
-                <w:sz w:val="19"/>
-              </w:rPr>
-              <w:t xml:space="preserve">0.21.0</w:t>
-            </w:r>
-          </w:p>
-        </w:tc>
-        <w:tc>
-          <w:tcPr>
-            <w:tcW w:type="dxa" w:w="1361"/>
-          </w:tcPr>
-          <w:p>
-            <w:pPr>
-              <w:pStyle w:val="Compact"/>
-              <w:spacing w:after="40"/>
-              <w:jc w:val="left"/>
-            </w:pPr>
-            <w:r>
-              <w:rPr>
-                <w:sz w:val="19"/>
-              </w:rPr>
-              <w:t xml:space="preserve">27/10/2026</w:t>
-            </w:r>
-          </w:p>
-        </w:tc>
-        <w:tc>
-          <w:tcPr>
-            <w:tcW w:type="dxa" w:w="7257"/>
-          </w:tcPr>
-          <w:p>
-            <w:pPr>
-              <w:pStyle w:val="Compact"/>
-              <w:spacing w:after="40"/>
-              <w:jc w:val="left"/>
-            </w:pPr>
-            <w:r>
-              <w:rPr>
-                <w:sz w:val="19"/>
-              </w:rPr>
-              <w:t xml:space="preserve">(Scritta di giorno sul ramo</w:t>
-            </w:r>
-            <w:r>
-              <w:rPr>
-                <w:sz w:val="19"/>
-              </w:rPr>
-              <w:t xml:space="preserve"> </w:t>
-            </w:r>
-            <w:r>
-              <w:rPr>
-                <w:rStyle w:val="VerbatimChar"/>
-                <w:sz w:val="19"/>
-              </w:rPr>
-              <w:t xml:space="preserve">giorno/batti-missioni</w:t>
-            </w:r>
-            <w:r>
-              <w:rPr>
-                <w:sz w:val="19"/>
-              </w:rPr>
-              <w:t xml:space="preserve">; online dopo le prove del turno di notte.)</w:t>
-            </w:r>
-            <w:r>
-              <w:rPr>
-                <w:sz w:val="19"/>
-              </w:rPr>
-              <w:t xml:space="preserve"> </w:t>
-            </w:r>
-            <w:r>
-              <w:rPr>
-                <w:sz w:val="19"/>
-              </w:rPr>
-              <w:t xml:space="preserve">“</w:t>
-            </w:r>
-            <w:r>
-              <w:rPr>
-                <w:sz w:val="19"/>
-              </w:rPr>
-              <w:t xml:space="preserve">Batti il mio tempo</w:t>
-            </w:r>
-            <w:r>
-              <w:rPr>
-                <w:sz w:val="19"/>
-              </w:rPr>
-              <w:t xml:space="preserve">”</w:t>
-            </w:r>
-            <w:r>
-              <w:rPr>
-                <w:sz w:val="19"/>
-              </w:rPr>
-              <w:t xml:space="preserve"> </w:t>
-            </w:r>
-            <w:r>
-              <w:rPr>
-                <w:sz w:val="19"/>
-              </w:rPr>
-              <w:t xml:space="preserve">(R-236, S-44): link della pista del giorno con il tempo da battere, riquadro</w:t>
-            </w:r>
-            <w:r>
-              <w:rPr>
-                <w:sz w:val="19"/>
-              </w:rPr>
-              <w:t xml:space="preserve"> </w:t>
-            </w:r>
-            <w:r>
-              <w:rPr>
-                <w:sz w:val="19"/>
-              </w:rPr>
-              <w:t xml:space="preserve">“</w:t>
-            </w:r>
-            <w:r>
-              <w:rPr>
-                <w:sz w:val="19"/>
-              </w:rPr>
-              <w:t xml:space="preserve">ti sfida</w:t>
-            </w:r>
-            <w:r>
-              <w:rPr>
-                <w:sz w:val="19"/>
-              </w:rPr>
-              <w:t xml:space="preserve">”</w:t>
-            </w:r>
-            <w:r>
-              <w:rPr>
-                <w:sz w:val="19"/>
-              </w:rPr>
-              <w:t xml:space="preserve"> </w:t>
-            </w:r>
-            <w:r>
-              <w:rPr>
-                <w:sz w:val="19"/>
-              </w:rPr>
-              <w:t xml:space="preserve">nel menu, distacco stimato in gara, esito a fine gara, piste dei giorni passati rifatte dal link senza classifica, immagine del risultato 1080×1080 da condividere o salvare (D-05), misura</w:t>
-            </w:r>
-            <w:r>
-              <w:rPr>
-                <w:sz w:val="19"/>
-              </w:rPr>
-              <w:t xml:space="preserve"> </w:t>
-            </w:r>
-            <w:r>
-              <w:rPr>
-                <w:rStyle w:val="VerbatimChar"/>
-                <w:sz w:val="19"/>
-              </w:rPr>
-              <w:t xml:space="preserve">batti_gare</w:t>
-            </w:r>
-            <w:r>
-              <w:rPr>
-                <w:sz w:val="19"/>
-              </w:rPr>
-              <w:t xml:space="preserve">. Missioni (R-243, S-45): 3 obiettivi alla volta nel menu, stelle, avanzamento nel profilo. Moduli nuovi</w:t>
-            </w:r>
-            <w:r>
-              <w:rPr>
-                <w:sz w:val="19"/>
-              </w:rPr>
-              <w:t xml:space="preserve"> </w:t>
-            </w:r>
-            <w:r>
-              <w:rPr>
-                <w:rStyle w:val="VerbatimChar"/>
-                <w:sz w:val="19"/>
-              </w:rPr>
-              <w:t xml:space="preserve">moduli/sfida.js</w:t>
-            </w:r>
-            <w:r>
-              <w:rPr>
-                <w:sz w:val="19"/>
-              </w:rPr>
-              <w:t xml:space="preserve"> </w:t>
-            </w:r>
-            <w:r>
-              <w:rPr>
-                <w:sz w:val="19"/>
-              </w:rPr>
-              <w:t xml:space="preserve">e</w:t>
-            </w:r>
-            <w:r>
-              <w:rPr>
-                <w:sz w:val="19"/>
-              </w:rPr>
-              <w:t xml:space="preserve"> </w:t>
-            </w:r>
-            <w:r>
-              <w:rPr>
-                <w:rStyle w:val="VerbatimChar"/>
-                <w:sz w:val="19"/>
-              </w:rPr>
-              <w:t xml:space="preserve">moduli/missioni.js</w:t>
-            </w:r>
-          </w:p>
-        </w:tc>
-      </w:tr>
-      <w:tr>
-        <w:tc>
-          <w:tcPr>
-            <w:tcW w:type="dxa" w:w="1247"/>
-          </w:tcPr>
-          <w:p>
-            <w:pPr>
-              <w:pStyle w:val="Compact"/>
-              <w:spacing w:after="40"/>
-              <w:jc w:val="left"/>
-            </w:pPr>
-            <w:r>
-              <w:rPr>
-                <w:sz w:val="19"/>
-              </w:rPr>
-              <w:t xml:space="preserve">0.22.0</w:t>
-            </w:r>
-          </w:p>
-        </w:tc>
-        <w:tc>
-          <w:tcPr>
-            <w:tcW w:type="dxa" w:w="1361"/>
-          </w:tcPr>
-          <w:p>
-            <w:pPr>
-              <w:pStyle w:val="Compact"/>
-              <w:spacing w:after="40"/>
-              <w:jc w:val="left"/>
-            </w:pPr>
-            <w:r>
-              <w:rPr>
-                <w:sz w:val="19"/>
-              </w:rPr>
-              <w:t xml:space="preserve">27/10/2026</w:t>
-            </w:r>
-          </w:p>
-        </w:tc>
-        <w:tc>
-          <w:tcPr>
-            <w:tcW w:type="dxa" w:w="7257"/>
-          </w:tcPr>
-          <w:p>
-            <w:pPr>
-              <w:pStyle w:val="Compact"/>
-              <w:spacing w:after="40"/>
-              <w:jc w:val="left"/>
-            </w:pPr>
-            <w:r>
-              <w:rPr>
-                <w:sz w:val="19"/>
-              </w:rPr>
-              <w:t xml:space="preserve">(Scritta di giorno sul ramo</w:t>
-            </w:r>
-            <w:r>
-              <w:rPr>
-                <w:sz w:val="19"/>
-              </w:rPr>
-              <w:t xml:space="preserve"> </w:t>
-            </w:r>
-            <w:r>
-              <w:rPr>
-                <w:rStyle w:val="VerbatimChar"/>
-                <w:sz w:val="19"/>
-              </w:rPr>
-              <w:t xml:space="preserve">giorno/portale-settimana</w:t>
-            </w:r>
-            <w:r>
-              <w:rPr>
-                <w:sz w:val="19"/>
-              </w:rPr>
-              <w:t xml:space="preserve">; online dopo le prove del turno di notte.) Pronti per i portali di giochi (R-244, S-46, da F-15): modalità portale con</w:t>
-            </w:r>
-            <w:r>
-              <w:rPr>
-                <w:sz w:val="19"/>
-              </w:rPr>
-              <w:t xml:space="preserve"> </w:t>
-            </w:r>
-            <w:r>
-              <w:rPr>
-                <w:rStyle w:val="VerbatimChar"/>
-                <w:sz w:val="19"/>
-              </w:rPr>
-              <w:t xml:space="preserve">?portale=crazygames</w:t>
-            </w:r>
-            <w:r>
-              <w:rPr>
-                <w:sz w:val="19"/>
-              </w:rPr>
-              <w:t xml:space="preserve"> </w:t>
-            </w:r>
-            <w:r>
-              <w:rPr>
-                <w:sz w:val="19"/>
-              </w:rPr>
-              <w:t xml:space="preserve">(niente donazioni, niente link esterni, codice al posto del link nella stanza, testi senza link), casella</w:t>
-            </w:r>
-            <w:r>
-              <w:rPr>
-                <w:sz w:val="19"/>
-              </w:rPr>
-              <w:t xml:space="preserve"> </w:t>
-            </w:r>
-            <w:r>
-              <w:rPr>
-                <w:sz w:val="19"/>
-              </w:rPr>
-              <w:t xml:space="preserve">“</w:t>
-            </w:r>
-            <w:r>
-              <w:rPr>
-                <w:sz w:val="19"/>
-              </w:rPr>
-              <w:t xml:space="preserve">Messaggi vocali</w:t>
-            </w:r>
-            <w:r>
-              <w:rPr>
-                <w:sz w:val="19"/>
-              </w:rPr>
-              <w:t xml:space="preserve">”</w:t>
-            </w:r>
-            <w:r>
-              <w:rPr>
-                <w:sz w:val="19"/>
-              </w:rPr>
-              <w:t xml:space="preserve"> </w:t>
-            </w:r>
-            <w:r>
-              <w:rPr>
-                <w:sz w:val="19"/>
-              </w:rPr>
-              <w:t xml:space="preserve">nel menu per spegnere i vocali (spenti sul portale), audio che riparte al tocco su iPhone, niente lente sul testo toccando la pista. Nuovo modulo</w:t>
-            </w:r>
-            <w:r>
-              <w:rPr>
-                <w:sz w:val="19"/>
-              </w:rPr>
-              <w:t xml:space="preserve"> </w:t>
-            </w:r>
-            <w:r>
-              <w:rPr>
-                <w:rStyle w:val="VerbatimChar"/>
-                <w:sz w:val="19"/>
-              </w:rPr>
-              <w:t xml:space="preserve">moduli/portale.js</w:t>
-            </w:r>
-          </w:p>
-        </w:tc>
-      </w:tr>
-      <w:tr>
-        <w:tc>
-          <w:tcPr>
-            <w:tcW w:type="dxa" w:w="1247"/>
-          </w:tcPr>
-          <w:p>
-            <w:pPr>
-              <w:pStyle w:val="Compact"/>
-              <w:spacing w:after="40"/>
-              <w:jc w:val="left"/>
-            </w:pPr>
-            <w:r>
-              <w:rPr>
-                <w:sz w:val="19"/>
-              </w:rPr>
-              <w:t xml:space="preserve">0.23.0</w:t>
-            </w:r>
-          </w:p>
-        </w:tc>
-        <w:tc>
-          <w:tcPr>
-            <w:tcW w:type="dxa" w:w="1361"/>
-          </w:tcPr>
-          <w:p>
-            <w:pPr>
-              <w:pStyle w:val="Compact"/>
-              <w:spacing w:after="40"/>
-              <w:jc w:val="left"/>
-            </w:pPr>
-            <w:r>
-              <w:rPr>
-                <w:sz w:val="19"/>
-              </w:rPr>
-              <w:t xml:space="preserve">27/10/2026</w:t>
-            </w:r>
-          </w:p>
-        </w:tc>
-        <w:tc>
-          <w:tcPr>
-            <w:tcW w:type="dxa" w:w="7257"/>
-          </w:tcPr>
-          <w:p>
-            <w:pPr>
-              <w:pStyle w:val="Compact"/>
-              <w:spacing w:after="40"/>
-              <w:jc w:val="left"/>
-            </w:pPr>
-            <w:r>
-              <w:rPr>
-                <w:sz w:val="19"/>
-              </w:rPr>
-              <w:t xml:space="preserve">(Stesso ramo.) Città della settimana con la maglia esclusiva (R-245, S-47): riquadro nel menu con la città, la scadenza e</w:t>
-            </w:r>
-            <w:r>
-              <w:rPr>
-                <w:sz w:val="19"/>
-              </w:rPr>
-              <w:t xml:space="preserve"> </w:t>
-            </w:r>
-            <w:r>
-              <w:rPr>
-                <w:sz w:val="19"/>
-              </w:rPr>
-              <w:t xml:space="preserve">“</w:t>
-            </w:r>
-            <w:r>
-              <w:rPr>
-                <w:sz w:val="19"/>
-              </w:rPr>
-              <w:t xml:space="preserve">Corri a …</w:t>
-            </w:r>
-            <w:r>
-              <w:rPr>
-                <w:sz w:val="19"/>
-              </w:rPr>
-              <w:t xml:space="preserve">”</w:t>
-            </w:r>
-            <w:r>
-              <w:rPr>
-                <w:sz w:val="19"/>
-              </w:rPr>
-              <w:t xml:space="preserve">; il server assegna la maglia a chi finisce una gara in quella città e la ricorda; gruppo</w:t>
-            </w:r>
-            <w:r>
-              <w:rPr>
-                <w:sz w:val="19"/>
-              </w:rPr>
-              <w:t xml:space="preserve"> </w:t>
-            </w:r>
-            <w:r>
-              <w:rPr>
-                <w:sz w:val="19"/>
-              </w:rPr>
-              <w:t xml:space="preserve">“</w:t>
-            </w:r>
-            <w:r>
-              <w:rPr>
-                <w:sz w:val="19"/>
-              </w:rPr>
-              <w:t xml:space="preserve">Maglie della settimana</w:t>
-            </w:r>
-            <w:r>
-              <w:rPr>
-                <w:sz w:val="19"/>
-              </w:rPr>
-              <w:t xml:space="preserve">”</w:t>
-            </w:r>
-            <w:r>
-              <w:rPr>
-                <w:sz w:val="19"/>
-              </w:rPr>
-              <w:t xml:space="preserve"> </w:t>
-            </w:r>
-            <w:r>
-              <w:rPr>
-                <w:sz w:val="19"/>
-              </w:rPr>
-              <w:t xml:space="preserve">nel personaggio; misure</w:t>
-            </w:r>
-            <w:r>
-              <w:rPr>
-                <w:sz w:val="19"/>
-              </w:rPr>
-              <w:t xml:space="preserve"> </w:t>
-            </w:r>
-            <w:r>
-              <w:rPr>
-                <w:rStyle w:val="VerbatimChar"/>
-                <w:sz w:val="19"/>
-              </w:rPr>
-              <w:t xml:space="preserve">settimana_gare</w:t>
-            </w:r>
-            <w:r>
-              <w:rPr>
-                <w:sz w:val="19"/>
-              </w:rPr>
-              <w:t xml:space="preserve"> </w:t>
-            </w:r>
-            <w:r>
-              <w:rPr>
-                <w:sz w:val="19"/>
-              </w:rPr>
-              <w:t xml:space="preserve">e</w:t>
-            </w:r>
-            <w:r>
-              <w:rPr>
-                <w:sz w:val="19"/>
-              </w:rPr>
-              <w:t xml:space="preserve"> </w:t>
-            </w:r>
-            <w:r>
-              <w:rPr>
-                <w:rStyle w:val="VerbatimChar"/>
-                <w:sz w:val="19"/>
-              </w:rPr>
-              <w:t xml:space="preserve">settimana_premi</w:t>
-            </w:r>
-            <w:r>
-              <w:rPr>
-                <w:sz w:val="19"/>
-              </w:rPr>
-              <w:t xml:space="preserve">. Nuovi</w:t>
-            </w:r>
-            <w:r>
-              <w:rPr>
-                <w:sz w:val="19"/>
-              </w:rPr>
-              <w:t xml:space="preserve"> </w:t>
-            </w:r>
-            <w:r>
-              <w:rPr>
-                <w:rStyle w:val="VerbatimChar"/>
-                <w:sz w:val="19"/>
-              </w:rPr>
-              <w:t xml:space="preserve">shared/calendario.js</w:t>
-            </w:r>
-            <w:r>
-              <w:rPr>
-                <w:sz w:val="19"/>
-              </w:rPr>
-              <w:t xml:space="preserve"> </w:t>
-            </w:r>
-            <w:r>
-              <w:rPr>
-                <w:sz w:val="19"/>
-              </w:rPr>
-              <w:t xml:space="preserve">(settimana → città, usato da gioco e server),</w:t>
-            </w:r>
-            <w:r>
-              <w:rPr>
-                <w:sz w:val="19"/>
-              </w:rPr>
-              <w:t xml:space="preserve"> </w:t>
-            </w:r>
-            <w:r>
-              <w:rPr>
-                <w:rStyle w:val="VerbatimChar"/>
-                <w:sz w:val="19"/>
-              </w:rPr>
-              <w:t xml:space="preserve">moduli/settimana.js</w:t>
-            </w:r>
-            <w:r>
-              <w:rPr>
-                <w:sz w:val="19"/>
-              </w:rPr>
-              <w:t xml:space="preserve">,</w:t>
-            </w:r>
-            <w:r>
-              <w:rPr>
-                <w:sz w:val="19"/>
-              </w:rPr>
-              <w:t xml:space="preserve"> </w:t>
-            </w:r>
-            <w:r>
-              <w:rPr>
-                <w:rStyle w:val="VerbatimChar"/>
-                <w:sz w:val="19"/>
-              </w:rPr>
-              <w:t xml:space="preserve">src/settimana.mjs</w:t>
-            </w:r>
-            <w:r>
-              <w:rPr>
-                <w:sz w:val="19"/>
-              </w:rPr>
-              <w:t xml:space="preserve">; tabella</w:t>
-            </w:r>
-            <w:r>
-              <w:rPr>
-                <w:sz w:val="19"/>
-              </w:rPr>
-              <w:t xml:space="preserve"> </w:t>
-            </w:r>
-            <w:r>
-              <w:rPr>
-                <w:rStyle w:val="VerbatimChar"/>
-                <w:sz w:val="19"/>
-              </w:rPr>
-              <w:t xml:space="preserve">premi</w:t>
-            </w:r>
-            <w:r>
-              <w:rPr>
-                <w:sz w:val="19"/>
-              </w:rPr>
-              <w:t xml:space="preserve"> </w:t>
-            </w:r>
-            <w:r>
-              <w:rPr>
-                <w:sz w:val="19"/>
-              </w:rPr>
-              <w:t xml:space="preserve">nella classifica</w:t>
-            </w:r>
-          </w:p>
-        </w:tc>
-      </w:tr>
-      <w:tr>
-        <w:tc>
-          <w:tcPr>
-            <w:tcW w:type="dxa" w:w="1247"/>
-          </w:tcPr>
-          <w:p>
-            <w:pPr>
-              <w:pStyle w:val="Compact"/>
-              <w:spacing w:after="40"/>
-              <w:jc w:val="left"/>
-            </w:pPr>
-            <w:r>
-              <w:rPr>
-                <w:sz w:val="19"/>
-              </w:rPr>
-              <w:t xml:space="preserve">0.24.0</w:t>
-            </w:r>
-          </w:p>
-        </w:tc>
-        <w:tc>
-          <w:tcPr>
-            <w:tcW w:type="dxa" w:w="1361"/>
-          </w:tcPr>
-          <w:p>
-            <w:pPr>
-              <w:pStyle w:val="Compact"/>
-              <w:spacing w:after="40"/>
-              <w:jc w:val="left"/>
-            </w:pPr>
-            <w:r>
-              <w:rPr>
-                <w:sz w:val="19"/>
-              </w:rPr>
-              <w:t xml:space="preserve">27/10/2026</w:t>
-            </w:r>
-          </w:p>
-        </w:tc>
-        <w:tc>
-          <w:tcPr>
-            <w:tcW w:type="dxa" w:w="7257"/>
-          </w:tcPr>
-          <w:p>
-            <w:pPr>
-              <w:pStyle w:val="Compact"/>
-              <w:spacing w:after="40"/>
-              <w:jc w:val="left"/>
-            </w:pPr>
-            <w:r>
-              <w:rPr>
-                <w:sz w:val="19"/>
-              </w:rPr>
-              <w:t xml:space="preserve">(Stesso ramo.) Da dove arrivano i giocatori (R-246, S-48, completa R-232): la visita porta la fonte (sfida, batti, portale, home, diretto); su /api/stats</w:t>
-            </w:r>
-            <w:r>
-              <w:rPr>
-                <w:sz w:val="19"/>
-              </w:rPr>
-              <w:t xml:space="preserve"> </w:t>
-            </w:r>
-            <w:r>
-              <w:rPr>
-                <w:rStyle w:val="VerbatimChar"/>
-                <w:sz w:val="19"/>
-              </w:rPr>
-              <w:t xml:space="preserve">visit_&lt;fonte&gt;</w:t>
-            </w:r>
-            <w:r>
-              <w:rPr>
-                <w:sz w:val="19"/>
-              </w:rPr>
-              <w:t xml:space="preserve">, su /api/ritorni i ritorni per fonte</w:t>
-            </w:r>
-          </w:p>
-        </w:tc>
-      </w:tr>
-      <w:tr>
-        <w:tc>
-          <w:tcPr>
-            <w:tcW w:type="dxa" w:w="1247"/>
-          </w:tcPr>
-          <w:p>
-            <w:pPr>
-              <w:pStyle w:val="Compact"/>
-              <w:spacing w:after="40"/>
-              <w:jc w:val="left"/>
-            </w:pPr>
-            <w:r>
-              <w:rPr>
-                <w:sz w:val="19"/>
-              </w:rPr>
-              <w:t xml:space="preserve">0.25.0</w:t>
-            </w:r>
-          </w:p>
-        </w:tc>
-        <w:tc>
-          <w:tcPr>
-            <w:tcW w:type="dxa" w:w="1361"/>
-          </w:tcPr>
-          <w:p>
-            <w:pPr>
-              <w:pStyle w:val="Compact"/>
-              <w:spacing w:after="40"/>
-              <w:jc w:val="left"/>
-            </w:pPr>
-            <w:r>
-              <w:rPr>
-                <w:sz w:val="19"/>
-              </w:rPr>
-              <w:t xml:space="preserve">27/10/2026</w:t>
-            </w:r>
-          </w:p>
-        </w:tc>
-        <w:tc>
-          <w:tcPr>
-            <w:tcW w:type="dxa" w:w="7257"/>
-          </w:tcPr>
-          <w:p>
-            <w:pPr>
-              <w:pStyle w:val="Compact"/>
-              <w:spacing w:after="40"/>
-              <w:jc w:val="left"/>
-            </w:pPr>
-            <w:r>
-              <w:rPr>
-                <w:sz w:val="19"/>
-              </w:rPr>
-              <w:t xml:space="preserve">(Stesso ramo.) Gran Premio delle 21 (R-247, S-49): gara ad appuntamento fisso nella città della settimana, sale</w:t>
-            </w:r>
-            <w:r>
-              <w:rPr>
-                <w:sz w:val="19"/>
-              </w:rPr>
-              <w:t xml:space="preserve"> </w:t>
-            </w:r>
-            <w:r>
-              <w:rPr>
-                <w:rStyle w:val="VerbatimChar"/>
-                <w:sz w:val="19"/>
-              </w:rPr>
-              <w:t xml:space="preserve">GP01</w:t>
-            </w:r>
-            <w:r>
-              <w:rPr>
-                <w:sz w:val="19"/>
-              </w:rPr>
-              <w:t xml:space="preserve">…</w:t>
-            </w:r>
-            <w:r>
-              <w:rPr>
-                <w:rStyle w:val="VerbatimChar"/>
-                <w:sz w:val="19"/>
-              </w:rPr>
-              <w:t xml:space="preserve">GP08</w:t>
-            </w:r>
-            <w:r>
-              <w:rPr>
-                <w:sz w:val="19"/>
-              </w:rPr>
-              <w:t xml:space="preserve"> </w:t>
-            </w:r>
-            <w:r>
-              <w:rPr>
-                <w:sz w:val="19"/>
-              </w:rPr>
-              <w:t xml:space="preserve">che partono insieme all’ora fissa con la stessa pista, riquadro nel menu con il conto alla rovescia, classifica della sera;</w:t>
-            </w:r>
-            <w:r>
-              <w:rPr>
-                <w:sz w:val="19"/>
-              </w:rPr>
-              <w:t xml:space="preserve"> </w:t>
-            </w:r>
-            <w:r>
-              <w:rPr>
-                <w:rStyle w:val="VerbatimChar"/>
-                <w:sz w:val="19"/>
-              </w:rPr>
-              <w:t xml:space="preserve">/api/gp</w:t>
-            </w:r>
-            <w:r>
-              <w:rPr>
-                <w:sz w:val="19"/>
-              </w:rPr>
-              <w:t xml:space="preserve">,</w:t>
-            </w:r>
-            <w:r>
-              <w:rPr>
-                <w:sz w:val="19"/>
-              </w:rPr>
-              <w:t xml:space="preserve"> </w:t>
-            </w:r>
-            <w:r>
-              <w:rPr>
-                <w:rStyle w:val="VerbatimChar"/>
-                <w:sz w:val="19"/>
-              </w:rPr>
-              <w:t xml:space="preserve">/api/quick?gp=1</w:t>
-            </w:r>
-            <w:r>
-              <w:rPr>
-                <w:sz w:val="19"/>
-              </w:rPr>
-              <w:t xml:space="preserve">; misure</w:t>
-            </w:r>
-            <w:r>
-              <w:rPr>
-                <w:sz w:val="19"/>
-              </w:rPr>
-              <w:t xml:space="preserve"> </w:t>
-            </w:r>
-            <w:r>
-              <w:rPr>
-                <w:rStyle w:val="VerbatimChar"/>
-                <w:sz w:val="19"/>
-              </w:rPr>
-              <w:t xml:space="preserve">gp_persone</w:t>
-            </w:r>
-            <w:r>
-              <w:rPr>
-                <w:sz w:val="19"/>
-              </w:rPr>
-              <w:t xml:space="preserve">,</w:t>
-            </w:r>
-            <w:r>
-              <w:rPr>
-                <w:sz w:val="19"/>
-              </w:rPr>
-              <w:t xml:space="preserve"> </w:t>
-            </w:r>
-            <w:r>
-              <w:rPr>
-                <w:rStyle w:val="VerbatimChar"/>
-                <w:sz w:val="19"/>
-              </w:rPr>
-              <w:t xml:space="preserve">gp_sale</w:t>
-            </w:r>
-            <w:r>
-              <w:rPr>
-                <w:sz w:val="19"/>
-              </w:rPr>
-              <w:t xml:space="preserve">. Nuovi</w:t>
-            </w:r>
-            <w:r>
-              <w:rPr>
-                <w:sz w:val="19"/>
-              </w:rPr>
-              <w:t xml:space="preserve"> </w:t>
-            </w:r>
-            <w:r>
-              <w:rPr>
-                <w:rStyle w:val="VerbatimChar"/>
-                <w:sz w:val="19"/>
-              </w:rPr>
-              <w:t xml:space="preserve">src/granpremio.mjs</w:t>
-            </w:r>
-            <w:r>
-              <w:rPr>
-                <w:sz w:val="19"/>
-              </w:rPr>
-              <w:t xml:space="preserve"> </w:t>
-            </w:r>
-            <w:r>
-              <w:rPr>
-                <w:sz w:val="19"/>
-              </w:rPr>
-              <w:t xml:space="preserve">e</w:t>
-            </w:r>
-            <w:r>
-              <w:rPr>
-                <w:sz w:val="19"/>
-              </w:rPr>
-              <w:t xml:space="preserve"> </w:t>
-            </w:r>
-            <w:r>
-              <w:rPr>
-                <w:rStyle w:val="VerbatimChar"/>
-                <w:sz w:val="19"/>
-              </w:rPr>
-              <w:t xml:space="preserve">moduli/granpremio.js</w:t>
-            </w:r>
-            <w:r>
-              <w:rPr>
-                <w:sz w:val="19"/>
-              </w:rPr>
-              <w:t xml:space="preserve">. Idee F-16…F-19 dal confronto della sera</w:t>
-            </w:r>
-          </w:p>
-        </w:tc>
-      </w:tr>
-      <w:tr>
-        <w:tc>
-          <w:tcPr>
-            <w:tcW w:type="dxa" w:w="1247"/>
-          </w:tcPr>
-          <w:p>
-            <w:pPr>
-              <w:pStyle w:val="Compact"/>
-              <w:spacing w:after="40"/>
-              <w:jc w:val="left"/>
-            </w:pPr>
-            <w:r>
-              <w:rPr>
-                <w:sz w:val="19"/>
-              </w:rPr>
-              <w:t xml:space="preserve">0.25.1</w:t>
-            </w:r>
-          </w:p>
-        </w:tc>
-        <w:tc>
-          <w:tcPr>
-            <w:tcW w:type="dxa" w:w="1361"/>
-          </w:tcPr>
-          <w:p>
-            <w:pPr>
-              <w:pStyle w:val="Compact"/>
-              <w:spacing w:after="40"/>
-              <w:jc w:val="left"/>
-            </w:pPr>
-            <w:r>
-              <w:rPr>
-                <w:sz w:val="19"/>
-              </w:rPr>
-              <w:t xml:space="preserve">27/10/2026</w:t>
-            </w:r>
-          </w:p>
-        </w:tc>
-        <w:tc>
-          <w:tcPr>
-            <w:tcW w:type="dxa" w:w="7257"/>
-          </w:tcPr>
-          <w:p>
-            <w:pPr>
-              <w:pStyle w:val="Compact"/>
-              <w:spacing w:after="40"/>
-              <w:jc w:val="left"/>
-            </w:pPr>
-            <w:r>
-              <w:rPr>
-                <w:sz w:val="19"/>
-              </w:rPr>
-              <w:t xml:space="preserve">(Ramo</w:t>
-            </w:r>
-            <w:r>
-              <w:rPr>
-                <w:sz w:val="19"/>
-              </w:rPr>
-              <w:t xml:space="preserve"> </w:t>
-            </w:r>
-            <w:r>
-              <w:rPr>
-                <w:rStyle w:val="VerbatimChar"/>
-                <w:sz w:val="19"/>
-              </w:rPr>
-              <w:t xml:space="preserve">giorno/pagina-vecchia</w:t>
-            </w:r>
-            <w:r>
-              <w:rPr>
-                <w:sz w:val="19"/>
-              </w:rPr>
-              <w:t xml:space="preserve">, parte da</w:t>
-            </w:r>
-            <w:r>
-              <w:rPr>
-                <w:sz w:val="19"/>
-              </w:rPr>
-              <w:t xml:space="preserve"> </w:t>
-            </w:r>
-            <w:r>
-              <w:rPr>
-                <w:rStyle w:val="VerbatimChar"/>
-                <w:sz w:val="19"/>
-              </w:rPr>
-              <w:t xml:space="preserve">giorno/portale-settimana</w:t>
-            </w:r>
-            <w:r>
-              <w:rPr>
-                <w:sz w:val="19"/>
-              </w:rPr>
-              <w:t xml:space="preserve">; scritta di giorno senza prove, R-506.) Correzione dell’unico errore nuovo dai telefoni del 27/10 (R-011):</w:t>
-            </w:r>
-            <w:r>
-              <w:rPr>
-                <w:sz w:val="19"/>
-              </w:rPr>
-              <w:t xml:space="preserve"> </w:t>
-            </w:r>
-            <w:r>
-              <w:rPr>
-                <w:rStyle w:val="VerbatimChar"/>
-                <w:sz w:val="19"/>
-              </w:rPr>
-              <w:t xml:space="preserve">Cannot read properties of undefined (reading 'GEOMETRIA')</w:t>
-            </w:r>
-            <w:r>
-              <w:rPr>
-                <w:sz w:val="19"/>
-              </w:rPr>
-              <w:t xml:space="preserve"> </w:t>
-            </w:r>
-            <w:r>
-              <w:rPr>
-                <w:sz w:val="19"/>
-              </w:rPr>
-              <w:t xml:space="preserve">in</w:t>
-            </w:r>
-            <w:r>
-              <w:rPr>
-                <w:sz w:val="19"/>
-              </w:rPr>
-              <w:t xml:space="preserve"> </w:t>
-            </w:r>
-            <w:r>
-              <w:rPr>
-                <w:rStyle w:val="VerbatimChar"/>
-                <w:sz w:val="19"/>
-              </w:rPr>
-              <w:t xml:space="preserve">sfondi.js</w:t>
-            </w:r>
-            <w:r>
-              <w:rPr>
-                <w:sz w:val="19"/>
-              </w:rPr>
-              <w:t xml:space="preserve"> </w:t>
-            </w:r>
-            <w:r>
-              <w:rPr>
-                <w:sz w:val="19"/>
-              </w:rPr>
-              <w:t xml:space="preserve">su Samsung Internet 30, Android 10, versione 0.20.2. Causa: il telefono ha riaperto una pagina salvata di prima della 0.20.0 (senza</w:t>
-            </w:r>
-            <w:r>
-              <w:rPr>
-                <w:sz w:val="19"/>
-              </w:rPr>
-              <w:t xml:space="preserve"> </w:t>
-            </w:r>
-            <w:r>
-              <w:rPr>
-                <w:rStyle w:val="VerbatimChar"/>
-                <w:sz w:val="19"/>
-              </w:rPr>
-              <w:t xml:space="preserve">panorami.js</w:t>
-            </w:r>
-            <w:r>
-              <w:rPr>
-                <w:sz w:val="19"/>
-              </w:rPr>
-              <w:t xml:space="preserve"> </w:t>
-            </w:r>
-            <w:r>
-              <w:rPr>
-                <w:sz w:val="19"/>
-              </w:rPr>
-              <w:t xml:space="preserve">e senza la versione nella pagina) con il programma nuovo; la guardia della 0.20.1 controllava solo le pagine con la versione. Ora anche la pagina senza versione si ricarica una volta. Da provare stanotte: variante della prova R1c con la pagina senza</w:t>
-            </w:r>
-            <w:r>
-              <w:rPr>
-                <w:sz w:val="19"/>
-              </w:rPr>
-              <w:t xml:space="preserve"> </w:t>
-            </w:r>
-            <w:r>
-              <w:rPr>
-                <w:rStyle w:val="VerbatimChar"/>
-                <w:sz w:val="19"/>
-              </w:rPr>
-              <w:t xml:space="preserve">&lt;meta name="cyf-versione"&gt;</w:t>
-            </w:r>
-          </w:p>
-        </w:tc>
-      </w:tr>
-      <w:tr>
-        <w:tc>
-          <w:tcPr>
-            <w:tcW w:type="dxa" w:w="1247"/>
-          </w:tcPr>
-          <w:p>
-            <w:pPr>
-              <w:pStyle w:val="Compact"/>
-              <w:spacing w:after="40"/>
-              <w:jc w:val="left"/>
-            </w:pPr>
-            <w:r>
-              <w:rPr>
-                <w:sz w:val="19"/>
-              </w:rPr>
-              <w:t xml:space="preserve">0.25.2</w:t>
-            </w:r>
-          </w:p>
-        </w:tc>
-        <w:tc>
-          <w:tcPr>
-            <w:tcW w:type="dxa" w:w="1361"/>
-          </w:tcPr>
-          <w:p>
-            <w:pPr>
-              <w:pStyle w:val="Compact"/>
-              <w:spacing w:after="40"/>
-              <w:jc w:val="left"/>
-            </w:pPr>
-            <w:r>
-              <w:rPr>
-                <w:sz w:val="19"/>
-              </w:rPr>
-              <w:t xml:space="preserve">27/10/2026</w:t>
-            </w:r>
-          </w:p>
-        </w:tc>
-        <w:tc>
-          <w:tcPr>
-            <w:tcW w:type="dxa" w:w="7257"/>
-          </w:tcPr>
-          <w:p>
-            <w:pPr>
-              <w:pStyle w:val="Compact"/>
-              <w:spacing w:after="40"/>
-              <w:jc w:val="left"/>
-            </w:pPr>
-            <w:r>
-              <w:rPr>
-                <w:sz w:val="19"/>
-              </w:rPr>
-              <w:t xml:space="preserve">(Stesso ramo</w:t>
-            </w:r>
-            <w:r>
-              <w:rPr>
-                <w:sz w:val="19"/>
-              </w:rPr>
-              <w:t xml:space="preserve"> </w:t>
-            </w:r>
-            <w:r>
-              <w:rPr>
-                <w:rStyle w:val="VerbatimChar"/>
-                <w:sz w:val="19"/>
-              </w:rPr>
-              <w:t xml:space="preserve">giorno/pagina-vecchia</w:t>
-            </w:r>
-            <w:r>
-              <w:rPr>
-                <w:sz w:val="19"/>
-              </w:rPr>
-              <w:t xml:space="preserve">; scritta di giorno senza prove, R-506.) Scritta CYF sul trampolino gigante più visibile (R-240, baco B-03): due cartelli CYF alti ai lati dello stacco, rivolti verso chi arriva e sempre ben illuminati, e scritta sulla salita più grande. Da provare stanotte con le foto (prossimi passi 1f)</w:t>
-            </w:r>
-          </w:p>
-        </w:tc>
-      </w:tr>
-      <w:tr>
-        <w:tc>
-          <w:tcPr>
-            <w:tcW w:type="dxa" w:w="1247"/>
-          </w:tcPr>
-          <w:p>
-            <w:pPr>
-              <w:pStyle w:val="Compact"/>
-              <w:spacing w:after="40"/>
-              <w:jc w:val="left"/>
-            </w:pPr>
-            <w:r>
-              <w:rPr>
-                <w:sz w:val="19"/>
-              </w:rPr>
-              <w:t xml:space="preserve">0.25.3</w:t>
-            </w:r>
-          </w:p>
-        </w:tc>
-        <w:tc>
-          <w:tcPr>
-            <w:tcW w:type="dxa" w:w="1361"/>
-          </w:tcPr>
-          <w:p>
-            <w:pPr>
-              <w:pStyle w:val="Compact"/>
-              <w:spacing w:after="40"/>
-              <w:jc w:val="left"/>
-            </w:pPr>
-            <w:r>
-              <w:rPr>
-                <w:sz w:val="19"/>
-              </w:rPr>
-              <w:t xml:space="preserve">27/10/2026</w:t>
-            </w:r>
-          </w:p>
-        </w:tc>
-        <w:tc>
-          <w:tcPr>
-            <w:tcW w:type="dxa" w:w="7257"/>
-          </w:tcPr>
-          <w:p>
-            <w:pPr>
-              <w:pStyle w:val="Compact"/>
-              <w:spacing w:after="40"/>
-              <w:jc w:val="left"/>
-            </w:pPr>
-            <w:r>
-              <w:rPr>
-                <w:sz w:val="19"/>
-              </w:rPr>
-              <w:t xml:space="preserve">Scritta CYF grande sulle maglie (fianchi e schiena) e archi CYF sopra la pista ogni ~506 m (R-514). Richiesta di Luigi delle 22:58; alle 23:00 Luigi ha chiesto il link per provare: giro completo delle prove subito (è notte, R-506) e pubblicazione se tutto è verde Pubblicata il 27/10 alle 23:40: su richiesta di Luigi (</w:t>
-            </w:r>
-            <w:r>
-              <w:rPr>
-                <w:sz w:val="19"/>
-              </w:rPr>
-              <w:t xml:space="preserve">“</w:t>
-            </w:r>
-            <w:r>
-              <w:rPr>
-                <w:sz w:val="19"/>
-              </w:rPr>
-              <w:t xml:space="preserve">manda il link ora che controllo io</w:t>
-            </w:r>
-            <w:r>
-              <w:rPr>
-                <w:sz w:val="19"/>
-              </w:rPr>
-              <w:t xml:space="preserve">”</w:t>
-            </w:r>
-            <w:r>
-              <w:rPr>
-                <w:sz w:val="19"/>
-              </w:rPr>
-              <w:t xml:space="preserve">) con il cancello di GitHub verde; il giro completo locale era ancora in corso (verdi fino a quel momento: controlli statici, matrice, nomi, server completo con la gara valida, 13 scenari) e continua: se trova un errore si corregge subito</w:t>
             </w:r>
           </w:p>
         </w:tc>

</xml_diff>

<commit_message>
R-516: i due Word si leggono da GitHub con due link fissi, anche a PC spento (strada A scelta da Luigi)
Co-Authored-By: Claude Opus 5.5 <noreply@anthropic.com>
Claude-Session: https://claude.ai/code/session_017ipzp9sqryzfFBJaHpW6iC
</commit_message>
<xml_diff>
--- a/docs/CYF-Gaming-Requisiti-Implementati-e-Testati.docx
+++ b/docs/CYF-Gaming-Requisiti-Implementati-e-Testati.docx
@@ -12434,6 +12434,112 @@
                 <w:sz w:val="19"/>
               </w:rPr>
               <w:t xml:space="preserve">(parte dall’ultimo ramo del giorno non ancora pubblicato), prima i requisiti poi il codice, senza prove e senza pubblicare (R-506), per circa 50 minuti; poi il confronto con le altre app (R-508). Il turno di notte dell’1:30 (R-503) prova, corregge e pubblica, e non scrive funzioni nuove</w:t>
+            </w:r>
+          </w:p>
+        </w:tc>
+      </w:tr>
+      <w:tr>
+        <w:tc>
+          <w:tcPr>
+            <w:tcW w:type="dxa" w:w="907"/>
+          </w:tcPr>
+          <w:p>
+            <w:pPr>
+              <w:pStyle w:val="Compact"/>
+              <w:spacing w:after="40"/>
+              <w:jc w:val="left"/>
+            </w:pPr>
+            <w:r>
+              <w:rPr>
+                <w:sz w:val="19"/>
+              </w:rPr>
+              <w:t xml:space="preserve">R-516</w:t>
+            </w:r>
+          </w:p>
+        </w:tc>
+        <w:tc>
+          <w:tcPr>
+            <w:tcW w:type="dxa" w:w="4195"/>
+          </w:tcPr>
+          <w:p>
+            <w:pPr>
+              <w:pStyle w:val="Compact"/>
+              <w:spacing w:after="40"/>
+              <w:jc w:val="left"/>
+            </w:pPr>
+            <w:r>
+              <w:rPr>
+                <w:sz w:val="19"/>
+              </w:rPr>
+              <w:t xml:space="preserve">Il PC acceso non deve servire: richieste dal telefono, modifiche e documenti anche a PC spento</w:t>
+            </w:r>
+          </w:p>
+        </w:tc>
+        <w:tc>
+          <w:tcPr>
+            <w:tcW w:type="dxa" w:w="1134"/>
+          </w:tcPr>
+          <w:p>
+            <w:pPr>
+              <w:pStyle w:val="Compact"/>
+              <w:spacing w:after="40"/>
+              <w:jc w:val="left"/>
+            </w:pPr>
+            <w:r>
+              <w:rPr>
+                <w:sz w:val="19"/>
+              </w:rPr>
+              <w:t xml:space="preserve">28/10/2026</w:t>
+            </w:r>
+          </w:p>
+        </w:tc>
+        <w:tc>
+          <w:tcPr>
+            <w:tcW w:type="dxa" w:w="1134"/>
+            <w:shd w:val="clear" w:color="auto" w:fill="D7F0DF"/>
+          </w:tcPr>
+          <w:p>
+            <w:pPr>
+              <w:pStyle w:val="Compact"/>
+              <w:spacing w:after="40"/>
+              <w:jc w:val="left"/>
+            </w:pPr>
+            <w:r>
+              <w:rPr>
+                <w:sz w:val="19"/>
+              </w:rPr>
+              <w:t xml:space="preserve">Fatto</w:t>
+            </w:r>
+          </w:p>
+        </w:tc>
+        <w:tc>
+          <w:tcPr>
+            <w:tcW w:type="dxa" w:w="2494"/>
+          </w:tcPr>
+          <w:p>
+            <w:pPr>
+              <w:pStyle w:val="Compact"/>
+              <w:spacing w:after="40"/>
+              <w:jc w:val="left"/>
+            </w:pPr>
+            <w:r>
+              <w:rPr>
+                <w:sz w:val="19"/>
+              </w:rPr>
+              <w:t xml:space="preserve">Codice, prove, pubblicazione e attività pianificate girano nel cloud. L’unica cosa che passava dal PC era la copia dei Word nella cartella Drive: scelta di Luigi del 28/10 (strada A) è leggerli da GitHub, dove il turno di notte li aggiorna a ogni pubblicazione, con due link fissi in testa ai Prossimi passi (</w:t>
+            </w:r>
+            <w:r>
+              <w:rPr>
+                <w:rStyle w:val="VerbatimChar"/>
+                <w:sz w:val="19"/>
+              </w:rPr>
+              <w:t xml:space="preserve">https://raw.githubusercontent.com/benedettadavinci-beep/cyf-gaming/main/docs/…</w:t>
+            </w:r>
+            <w:r>
+              <w:rPr>
+                <w:sz w:val="19"/>
+              </w:rPr>
+              <w:t xml:space="preserve">, repository pubblico). La cartella Drive resta una copia fatta da una chat quando il PC è acceso. Scartata la strada B (caricarli su Drive dal cloud): il connettore crea un file nuovo ogni volta (link che cambia) e il file passa intero nella conversazione</w:t>
             </w:r>
           </w:p>
         </w:tc>

</xml_diff>

<commit_message>
0.26.0: sfondo al livello 2 (R-513, prima parte) e qualità automatica con fps veri (A-14) — scritta di giorno senza prove
- moduli/cielo.js (nuovo): cielo con sole e due strati di nuvole in movimento, direzione del sole unica; ?cielo=fermo per le foto
- panorami.dipingiPiani: cartolina in due piani (monti lontani a parte), ricetta della Neve
- sfondi.js: piano lontano con la telecamera, città ferma sull'asse della strada, suolo sfumato; ha/mostra/segui
- moduli/qualita.js (nuovo): alta/media/bassa dal dispositivo, discesa sotto i 28 fps, invio a /api/fps
- server: /api/fps e contatori fps_*/q_* in /api/stats
- REQUISITI.md, MODULI.md, Word rigenerati; versione 0.26.0 in pagina, config e package

Co-Authored-By: Claude Fable 5.1 <noreply@anthropic.com>
Claude-Session: https://claude.ai/code/session_01Xy4XssfGoeVBNm22jEPhae
</commit_message>
<xml_diff>
--- a/docs/CYF-Gaming-Requisiti-Implementati-e-Testati.docx
+++ b/docs/CYF-Gaming-Requisiti-Implementati-e-Testati.docx
@@ -105,13 +105,79 @@
         <w:t xml:space="preserve"> </w:t>
       </w:r>
       <w:r>
-        <w:t xml:space="preserve">5:00</w:t>
+        <w:t xml:space="preserve">10:00</w:t>
       </w:r>
       <w:r>
         <w:t xml:space="preserve"> </w:t>
       </w:r>
       <w:r>
         <w:t xml:space="preserve">(turno</w:t>
+      </w:r>
+      <w:r>
+        <w:t xml:space="preserve"> </w:t>
+      </w:r>
+      <w:r>
+        <w:t xml:space="preserve">della</w:t>
+      </w:r>
+      <w:r>
+        <w:t xml:space="preserve"> </w:t>
+      </w:r>
+      <w:r>
+        <w:t xml:space="preserve">mattina:</w:t>
+      </w:r>
+      <w:r>
+        <w:t xml:space="preserve"> </w:t>
+      </w:r>
+      <w:r>
+        <w:t xml:space="preserve">0.26.0</w:t>
+      </w:r>
+      <w:r>
+        <w:t xml:space="preserve"> </w:t>
+      </w:r>
+      <w:r>
+        <w:t xml:space="preserve">scritta</w:t>
+      </w:r>
+      <w:r>
+        <w:t xml:space="preserve"> </w:t>
+      </w:r>
+      <w:r>
+        <w:t xml:space="preserve">sul</w:t>
+      </w:r>
+      <w:r>
+        <w:t xml:space="preserve"> </w:t>
+      </w:r>
+      <w:r>
+        <w:t xml:space="preserve">ramo</w:t>
+      </w:r>
+      <w:r>
+        <w:t xml:space="preserve"> </w:t>
+      </w:r>
+      <w:r>
+        <w:t xml:space="preserve">giorno/2026-10-28-mattina,</w:t>
+      </w:r>
+      <w:r>
+        <w:t xml:space="preserve"> </w:t>
+      </w:r>
+      <w:r>
+        <w:t xml:space="preserve">la</w:t>
+      </w:r>
+      <w:r>
+        <w:t xml:space="preserve"> </w:t>
+      </w:r>
+      <w:r>
+        <w:t xml:space="preserve">prova</w:t>
+      </w:r>
+      <w:r>
+        <w:t xml:space="preserve"> </w:t>
+      </w:r>
+      <w:r>
+        <w:t xml:space="preserve">il</w:t>
+      </w:r>
+      <w:r>
+        <w:t xml:space="preserve"> </w:t>
+      </w:r>
+      <w:r>
+        <w:t xml:space="preserve">turno</w:t>
       </w:r>
       <w:r>
         <w:t xml:space="preserve"> </w:t>

</xml_diff>

<commit_message>
Simulazione di carico con 50 giocatori (tools/verifica/simulazione.mjs): il server regge, baco B-04 sull'ingresso nella sala online; REQUISITI sezione 14 e Word rigenerati
Co-Authored-By: Claude Fable 5.1 <noreply@anthropic.com>
Claude-Session: https://claude.ai/code/session_01Xy4XsqXMWCwy8MM5SKFww8
</commit_message>
<xml_diff>
--- a/docs/CYF-Gaming-Requisiti-Implementati-e-Testati.docx
+++ b/docs/CYF-Gaming-Requisiti-Implementati-e-Testati.docx
@@ -105,37 +105,169 @@
         <w:t xml:space="preserve"> </w:t>
       </w:r>
       <w:r>
-        <w:t xml:space="preserve">10:00</w:t>
+        <w:t xml:space="preserve">19:30</w:t>
       </w:r>
       <w:r>
         <w:t xml:space="preserve"> </w:t>
       </w:r>
       <w:r>
-        <w:t xml:space="preserve">(turno</w:t>
+        <w:t xml:space="preserve">(simulazione</w:t>
       </w:r>
       <w:r>
         <w:t xml:space="preserve"> </w:t>
       </w:r>
       <w:r>
+        <w:t xml:space="preserve">di</w:t>
+      </w:r>
+      <w:r>
+        <w:t xml:space="preserve"> </w:t>
+      </w:r>
+      <w:r>
+        <w:t xml:space="preserve">carico</w:t>
+      </w:r>
+      <w:r>
+        <w:t xml:space="preserve"> </w:t>
+      </w:r>
+      <w:r>
+        <w:t xml:space="preserve">con</w:t>
+      </w:r>
+      <w:r>
+        <w:t xml:space="preserve"> </w:t>
+      </w:r>
+      <w:r>
+        <w:t xml:space="preserve">50</w:t>
+      </w:r>
+      <w:r>
+        <w:t xml:space="preserve"> </w:t>
+      </w:r>
+      <w:r>
+        <w:t xml:space="preserve">giocatori:</w:t>
+      </w:r>
+      <w:r>
+        <w:t xml:space="preserve"> </w:t>
+      </w:r>
+      <w:r>
+        <w:t xml:space="preserve">il</w:t>
+      </w:r>
+      <w:r>
+        <w:t xml:space="preserve"> </w:t>
+      </w:r>
+      <w:r>
+        <w:t xml:space="preserve">server</w:t>
+      </w:r>
+      <w:r>
+        <w:t xml:space="preserve"> </w:t>
+      </w:r>
+      <w:r>
+        <w:t xml:space="preserve">regge,</w:t>
+      </w:r>
+      <w:r>
+        <w:t xml:space="preserve"> </w:t>
+      </w:r>
+      <w:r>
+        <w:t xml:space="preserve">un</w:t>
+      </w:r>
+      <w:r>
+        <w:t xml:space="preserve"> </w:t>
+      </w:r>
+      <w:r>
+        <w:t xml:space="preserve">baco</w:t>
+      </w:r>
+      <w:r>
+        <w:t xml:space="preserve"> </w:t>
+      </w:r>
+      <w:r>
+        <w:t xml:space="preserve">nuovo</w:t>
+      </w:r>
+      <w:r>
+        <w:t xml:space="preserve"> </w:t>
+      </w:r>
+      <w:r>
+        <w:t xml:space="preserve">B-04</w:t>
+      </w:r>
+      <w:r>
+        <w:t xml:space="preserve"> </w:t>
+      </w:r>
+      <w:r>
+        <w:t xml:space="preserve">sull’ingresso</w:t>
+      </w:r>
+      <w:r>
+        <w:t xml:space="preserve"> </w:t>
+      </w:r>
+      <w:r>
+        <w:t xml:space="preserve">nella</w:t>
+      </w:r>
+      <w:r>
+        <w:t xml:space="preserve"> </w:t>
+      </w:r>
+      <w:r>
+        <w:t xml:space="preserve">sala</w:t>
+      </w:r>
+      <w:r>
+        <w:t xml:space="preserve"> </w:t>
+      </w:r>
+      <w:r>
+        <w:t xml:space="preserve">online;</w:t>
+      </w:r>
+      <w:r>
+        <w:t xml:space="preserve"> </w:t>
+      </w:r>
+      <w:r>
+        <w:t xml:space="preserve">alle</w:t>
+      </w:r>
+      <w:r>
+        <w:t xml:space="preserve"> </w:t>
+      </w:r>
+      <w:r>
+        <w:t xml:space="preserve">10</w:t>
+      </w:r>
+      <w:r>
+        <w:t xml:space="preserve"> </w:t>
+      </w:r>
+      <w:r>
+        <w:t xml:space="preserve">il</w:t>
+      </w:r>
+      <w:r>
+        <w:t xml:space="preserve"> </w:t>
+      </w:r>
+      <w:r>
+        <w:t xml:space="preserve">turno</w:t>
+      </w:r>
+      <w:r>
+        <w:t xml:space="preserve"> </w:t>
+      </w:r>
+      <w:r>
         <w:t xml:space="preserve">della</w:t>
       </w:r>
       <w:r>
         <w:t xml:space="preserve"> </w:t>
       </w:r>
       <w:r>
-        <w:t xml:space="preserve">mattina:</w:t>
+        <w:t xml:space="preserve">mattina</w:t>
       </w:r>
       <w:r>
         <w:t xml:space="preserve"> </w:t>
       </w:r>
       <w:r>
+        <w:t xml:space="preserve">ha</w:t>
+      </w:r>
+      <w:r>
+        <w:t xml:space="preserve"> </w:t>
+      </w:r>
+      <w:r>
+        <w:t xml:space="preserve">scritto</w:t>
+      </w:r>
+      <w:r>
+        <w:t xml:space="preserve"> </w:t>
+      </w:r>
+      <w:r>
+        <w:t xml:space="preserve">la</w:t>
+      </w:r>
+      <w:r>
+        <w:t xml:space="preserve"> </w:t>
+      </w:r>
+      <w:r>
         <w:t xml:space="preserve">0.26.0</w:t>
-      </w:r>
-      <w:r>
-        <w:t xml:space="preserve"> </w:t>
-      </w:r>
-      <w:r>
-        <w:t xml:space="preserve">scritta</w:t>
       </w:r>
       <w:r>
         <w:t xml:space="preserve"> </w:t>
@@ -31777,7 +31909,862 @@
       </w:tr>
     </w:tbl>
     <w:bookmarkEnd w:id="59"/>
-    <w:bookmarkStart w:id="60" w:name="storico-delle-versioni"/>
+    <w:bookmarkStart w:id="60" w:name="X5c781273cfb381f4e2b0a0f41f1ddc4d243d73e"/>
+    <w:p>
+      <w:pPr>
+        <w:pStyle w:val="Heading1"/>
+      </w:pPr>
+      <w:r>
+        <w:t xml:space="preserve">14. Simulazione di carico del 28 ottobre 2026 (50 giocatori insieme)</w:t>
+      </w:r>
+    </w:p>
+    <w:p>
+      <w:pPr>
+        <w:pStyle w:val="FirstParagraph"/>
+      </w:pPr>
+      <w:r>
+        <w:t xml:space="preserve">Chiesta da Luigi il 28/10 alle 18:57 (</w:t>
+      </w:r>
+      <w:r>
+        <w:t xml:space="preserve">“</w:t>
+      </w:r>
+      <w:r>
+        <w:t xml:space="preserve">fai simulazione con 50 concorrenti in diverse gare per vedere che succede</w:t>
+      </w:r>
+      <w:r>
+        <w:t xml:space="preserve">”</w:t>
+      </w:r>
+      <w:r>
+        <w:t xml:space="preserve">). Strumento nuovo</w:t>
+      </w:r>
+      <w:r>
+        <w:t xml:space="preserve"> </w:t>
+      </w:r>
+      <w:r>
+        <w:rPr>
+          <w:rStyle w:val="VerbatimChar"/>
+        </w:rPr>
+        <w:t xml:space="preserve">tools/verifica/simulazione.mjs</w:t>
+      </w:r>
+      <w:r>
+        <w:t xml:space="preserve">: 50 client che seguono il protocollo vero (</w:t>
+      </w:r>
+      <w:r>
+        <w:rPr>
+          <w:rStyle w:val="VerbatimChar"/>
+        </w:rPr>
+        <w:t xml:space="preserve">hello</w:t>
+      </w:r>
+      <w:r>
+        <w:t xml:space="preserve">, Parti, caricato, posizioni 10 volte al secondo, arrivo) contro il server locale</w:t>
+      </w:r>
+      <w:r>
+        <w:t xml:space="preserve"> </w:t>
+      </w:r>
+      <w:r>
+        <w:rPr>
+          <w:rStyle w:val="VerbatimChar"/>
+        </w:rPr>
+        <w:t xml:space="preserve">wrangler dev</w:t>
+      </w:r>
+      <w:r>
+        <w:t xml:space="preserve">, con l’attesa della sfida accorciata a 10 s. Il server locale non è la rete di Cloudflare: i numeri dicono che la logica regge, non quanto è veloce la rete vera (dove ogni stanza è un Durable Object a sé, quindi le sale non si rallentano tra loro). Ogni giocatore corre a una velocità diversa (arrivi tra 179 e 235 s), uno corre più veloce del limite fisico (143 s su un minimo di 175).</w:t>
+      </w:r>
+    </w:p>
+    <w:tbl>
+      <w:tblPr>
+        <w:tblStyle w:val="Table"/>
+        <w:tblLook w:firstRow="1" w:lastRow="0" w:firstColumn="0" w:lastColumn="0" w:noHBand="0" w:noVBand="0" w:val="0020"/>
+        <w:jc w:val="start"/>
+        <w:tblBorders>
+          <w:top w:val="single" w:sz="4" w:color="B8C4D2"/>
+          <w:left w:val="single" w:sz="4" w:color="B8C4D2"/>
+          <w:bottom w:val="single" w:sz="4" w:color="B8C4D2"/>
+          <w:right w:val="single" w:sz="4" w:color="B8C4D2"/>
+          <w:insideH w:val="single" w:sz="4" w:color="B8C4D2"/>
+          <w:insideV w:val="single" w:sz="4" w:color="B8C4D2"/>
+        </w:tblBorders>
+        <w:tblW w:w="9865" w:type="dxa"/>
+        <w:tblLayout w:type="fixed"/>
+      </w:tblPr>
+      <w:tblGrid>
+        <w:gridCol w:w="793"/>
+        <w:gridCol w:w="6010"/>
+        <w:gridCol w:w="1247"/>
+        <w:gridCol w:w="1814"/>
+      </w:tblGrid>
+      <w:tr>
+        <w:trPr>
+          <w:tblHeader w:val="true"/>
+        </w:trPr>
+        <w:tc>
+          <w:tcPr>
+            <w:tcW w:type="dxa" w:w="794"/>
+            <w:shd w:val="clear" w:color="auto" w:fill="13233A"/>
+          </w:tcPr>
+          <w:p>
+            <w:pPr>
+              <w:pStyle w:val="Compact"/>
+              <w:spacing w:after="40"/>
+              <w:jc w:val="left"/>
+            </w:pPr>
+            <w:r>
+              <w:rPr>
+                <w:b/>
+                <w:color w:val="FFFFFF"/>
+                <w:sz w:val="19"/>
+              </w:rPr>
+              <w:t xml:space="preserve">Gara</w:t>
+            </w:r>
+          </w:p>
+        </w:tc>
+        <w:tc>
+          <w:tcPr>
+            <w:tcW w:type="dxa" w:w="6009"/>
+            <w:shd w:val="clear" w:color="auto" w:fill="13233A"/>
+          </w:tcPr>
+          <w:p>
+            <w:pPr>
+              <w:pStyle w:val="Compact"/>
+              <w:spacing w:after="40"/>
+              <w:jc w:val="left"/>
+            </w:pPr>
+            <w:r>
+              <w:rPr>
+                <w:b/>
+                <w:color w:val="FFFFFF"/>
+                <w:sz w:val="19"/>
+              </w:rPr>
+              <w:t xml:space="preserve">Che cosa</w:t>
+            </w:r>
+          </w:p>
+        </w:tc>
+        <w:tc>
+          <w:tcPr>
+            <w:tcW w:type="dxa" w:w="1247"/>
+            <w:shd w:val="clear" w:color="auto" w:fill="13233A"/>
+          </w:tcPr>
+          <w:p>
+            <w:pPr>
+              <w:pStyle w:val="Compact"/>
+              <w:spacing w:after="40"/>
+              <w:jc w:val="left"/>
+            </w:pPr>
+            <w:r>
+              <w:rPr>
+                <w:b/>
+                <w:color w:val="FFFFFF"/>
+                <w:sz w:val="19"/>
+              </w:rPr>
+              <w:t xml:space="preserve">Esito</w:t>
+            </w:r>
+          </w:p>
+        </w:tc>
+        <w:tc>
+          <w:tcPr>
+            <w:tcW w:type="dxa" w:w="1814"/>
+            <w:shd w:val="clear" w:color="auto" w:fill="13233A"/>
+          </w:tcPr>
+          <w:p>
+            <w:pPr>
+              <w:pStyle w:val="Compact"/>
+              <w:spacing w:after="40"/>
+              <w:jc w:val="left"/>
+            </w:pPr>
+            <w:r>
+              <w:rPr>
+                <w:b/>
+                <w:color w:val="FFFFFF"/>
+                <w:sz w:val="19"/>
+              </w:rPr>
+              <w:t xml:space="preserve">Numeri</w:t>
+            </w:r>
+          </w:p>
+        </w:tc>
+      </w:tr>
+      <w:tr>
+        <w:tc>
+          <w:tcPr>
+            <w:tcW w:type="dxa" w:w="794"/>
+          </w:tcPr>
+          <w:p>
+            <w:pPr>
+              <w:pStyle w:val="Compact"/>
+              <w:spacing w:after="40"/>
+              <w:jc w:val="left"/>
+            </w:pPr>
+            <w:r>
+              <w:rPr>
+                <w:sz w:val="19"/>
+              </w:rPr>
+              <w:t xml:space="preserve">A · 7 sfide (6 da 7 e 1 da 8)</w:t>
+            </w:r>
+          </w:p>
+        </w:tc>
+        <w:tc>
+          <w:tcPr>
+            <w:tcW w:type="dxa" w:w="6009"/>
+          </w:tcPr>
+          <w:p>
+            <w:pPr>
+              <w:pStyle w:val="Compact"/>
+              <w:spacing w:after="40"/>
+              <w:jc w:val="left"/>
+            </w:pPr>
+            <w:r>
+              <w:rPr>
+                <w:sz w:val="19"/>
+              </w:rPr>
+              <w:t xml:space="preserve">50 collegati insieme, un 9° sulla sala piena,</w:t>
+            </w:r>
+            <w:r>
+              <w:rPr>
+                <w:sz w:val="19"/>
+              </w:rPr>
+              <w:t xml:space="preserve"> </w:t>
+            </w:r>
+            <w:r>
+              <w:rPr>
+                <w:sz w:val="19"/>
+              </w:rPr>
+              <w:t xml:space="preserve">“</w:t>
+            </w:r>
+            <w:r>
+              <w:rPr>
+                <w:sz w:val="19"/>
+              </w:rPr>
+              <w:t xml:space="preserve">Parti</w:t>
+            </w:r>
+            <w:r>
+              <w:rPr>
+                <w:sz w:val="19"/>
+              </w:rPr>
+              <w:t xml:space="preserve">”</w:t>
+            </w:r>
+            <w:r>
+              <w:rPr>
+                <w:sz w:val="19"/>
+              </w:rPr>
+              <w:t xml:space="preserve"> </w:t>
+            </w:r>
+            <w:r>
+              <w:rPr>
+                <w:sz w:val="19"/>
+              </w:rPr>
+              <w:t xml:space="preserve">in tutte le sale, gara completa</w:t>
+            </w:r>
+          </w:p>
+        </w:tc>
+        <w:tc>
+          <w:tcPr>
+            <w:tcW w:type="dxa" w:w="1247"/>
+            <w:shd w:val="clear" w:color="auto" w:fill="D7F0DF"/>
+          </w:tcPr>
+          <w:p>
+            <w:pPr>
+              <w:pStyle w:val="Compact"/>
+              <w:spacing w:after="40"/>
+              <w:jc w:val="left"/>
+            </w:pPr>
+            <w:r>
+              <w:rPr>
+                <w:sz w:val="19"/>
+              </w:rPr>
+              <w:t xml:space="preserve">✓</w:t>
+            </w:r>
+          </w:p>
+        </w:tc>
+        <w:tc>
+          <w:tcPr>
+            <w:tcW w:type="dxa" w:w="1814"/>
+          </w:tcPr>
+          <w:p>
+            <w:pPr>
+              <w:pStyle w:val="Compact"/>
+              <w:spacing w:after="40"/>
+              <w:jc w:val="left"/>
+            </w:pPr>
+            <w:r>
+              <w:rPr>
+                <w:sz w:val="19"/>
+              </w:rPr>
+              <w:t xml:space="preserve">Accolti 50/50 in 315 ms; 9° respinto con</w:t>
+            </w:r>
+            <w:r>
+              <w:rPr>
+                <w:sz w:val="19"/>
+              </w:rPr>
+              <w:t xml:space="preserve"> </w:t>
+            </w:r>
+            <w:r>
+              <w:rPr>
+                <w:rStyle w:val="VerbatimChar"/>
+                <w:sz w:val="19"/>
+              </w:rPr>
+              <w:t xml:space="preserve">full</w:t>
+            </w:r>
+            <w:r>
+              <w:rPr>
+                <w:sz w:val="19"/>
+              </w:rPr>
+              <w:t xml:space="preserve">; conto alla rovescia a 50/50 in 42 ms; via a 50/50; 7 sale finite, risultati a 50/50; 100.806 posizioni inviate (419/s), 620.662 inoltrate su 620.662 attese (100 %); ritardo di inoltro mediana 17 ms, 90 % 34 ms, 99 % 55 ms, massimo 215 ms; 0 connessioni cadute; risultati 28-72 ms dopo l’ultimo arrivo di ogni sala; imbroglione</w:t>
+            </w:r>
+            <w:r>
+              <w:rPr>
+                <w:sz w:val="19"/>
+              </w:rPr>
+              <w:t xml:space="preserve"> </w:t>
+            </w:r>
+            <w:r>
+              <w:rPr>
+                <w:sz w:val="19"/>
+              </w:rPr>
+              <w:t xml:space="preserve">“</w:t>
+            </w:r>
+            <w:r>
+              <w:rPr>
+                <w:sz w:val="19"/>
+              </w:rPr>
+              <w:t xml:space="preserve">non arrivato</w:t>
+            </w:r>
+            <w:r>
+              <w:rPr>
+                <w:sz w:val="19"/>
+              </w:rPr>
+              <w:t xml:space="preserve">”</w:t>
+            </w:r>
+            <w:r>
+              <w:rPr>
+                <w:sz w:val="19"/>
+              </w:rPr>
+              <w:t xml:space="preserve">; punti al 1° 220; maglia della settimana assegnata (Roma); classifica generale con i primi 20 tempi; misure</w:t>
+            </w:r>
+            <w:r>
+              <w:rPr>
+                <w:sz w:val="19"/>
+              </w:rPr>
+              <w:t xml:space="preserve"> </w:t>
+            </w:r>
+            <w:r>
+              <w:rPr>
+                <w:rStyle w:val="VerbatimChar"/>
+                <w:sz w:val="19"/>
+              </w:rPr>
+              <w:t xml:space="preserve">races_started +7</w:t>
+            </w:r>
+            <w:r>
+              <w:rPr>
+                <w:sz w:val="19"/>
+              </w:rPr>
+              <w:t xml:space="preserve">,</w:t>
+            </w:r>
+            <w:r>
+              <w:rPr>
+                <w:sz w:val="19"/>
+              </w:rPr>
+              <w:t xml:space="preserve"> </w:t>
+            </w:r>
+            <w:r>
+              <w:rPr>
+                <w:rStyle w:val="VerbatimChar"/>
+                <w:sz w:val="19"/>
+              </w:rPr>
+              <w:t xml:space="preserve">races_finished +7</w:t>
+            </w:r>
+            <w:r>
+              <w:rPr>
+                <w:sz w:val="19"/>
+              </w:rPr>
+              <w:t xml:space="preserve">,</w:t>
+            </w:r>
+            <w:r>
+              <w:rPr>
+                <w:sz w:val="19"/>
+              </w:rPr>
+              <w:t xml:space="preserve"> </w:t>
+            </w:r>
+            <w:r>
+              <w:rPr>
+                <w:rStyle w:val="VerbatimChar"/>
+                <w:sz w:val="19"/>
+              </w:rPr>
+              <w:t xml:space="preserve">racers +50</w:t>
+            </w:r>
+            <w:r>
+              <w:rPr>
+                <w:sz w:val="19"/>
+              </w:rPr>
+              <w:t xml:space="preserve">,</w:t>
+            </w:r>
+            <w:r>
+              <w:rPr>
+                <w:sz w:val="19"/>
+              </w:rPr>
+              <w:t xml:space="preserve"> </w:t>
+            </w:r>
+            <w:r>
+              <w:rPr>
+                <w:rStyle w:val="VerbatimChar"/>
+                <w:sz w:val="19"/>
+              </w:rPr>
+              <w:t xml:space="preserve">pts_n +50</w:t>
+            </w:r>
+            <w:r>
+              <w:rPr>
+                <w:sz w:val="19"/>
+              </w:rPr>
+              <w:t xml:space="preserve">,</w:t>
+            </w:r>
+            <w:r>
+              <w:rPr>
+                <w:sz w:val="19"/>
+              </w:rPr>
+              <w:t xml:space="preserve"> </w:t>
+            </w:r>
+            <w:r>
+              <w:rPr>
+                <w:rStyle w:val="VerbatimChar"/>
+                <w:sz w:val="19"/>
+              </w:rPr>
+              <w:t xml:space="preserve">settimana_gare +49</w:t>
+            </w:r>
+          </w:p>
+        </w:tc>
+      </w:tr>
+      <w:tr>
+        <w:tc>
+          <w:tcPr>
+            <w:tcW w:type="dxa" w:w="794"/>
+          </w:tcPr>
+          <w:p>
+            <w:pPr>
+              <w:pStyle w:val="Compact"/>
+              <w:spacing w:after="40"/>
+              <w:jc w:val="left"/>
+            </w:pPr>
+            <w:r>
+              <w:rPr>
+                <w:sz w:val="19"/>
+              </w:rPr>
+              <w:t xml:space="preserve">B · sala online, 50 nello stesso istante</w:t>
+            </w:r>
+          </w:p>
+        </w:tc>
+        <w:tc>
+          <w:tcPr>
+            <w:tcW w:type="dxa" w:w="6009"/>
+          </w:tcPr>
+          <w:p>
+            <w:pPr>
+              <w:pStyle w:val="Compact"/>
+              <w:spacing w:after="40"/>
+              <w:jc w:val="left"/>
+            </w:pPr>
+            <w:r>
+              <w:rPr>
+                <w:sz w:val="19"/>
+              </w:rPr>
+              <w:t xml:space="preserve">50</w:t>
+            </w:r>
+            <w:r>
+              <w:rPr>
+                <w:sz w:val="19"/>
+              </w:rPr>
+              <w:t xml:space="preserve"> </w:t>
+            </w:r>
+            <w:r>
+              <w:rPr>
+                <w:rStyle w:val="VerbatimChar"/>
+                <w:sz w:val="19"/>
+              </w:rPr>
+              <w:t xml:space="preserve">/api/quick</w:t>
+            </w:r>
+            <w:r>
+              <w:rPr>
+                <w:sz w:val="19"/>
+              </w:rPr>
+              <w:t xml:space="preserve"> </w:t>
+            </w:r>
+            <w:r>
+              <w:rPr>
+                <w:sz w:val="19"/>
+              </w:rPr>
+              <w:t xml:space="preserve">insieme, poi</w:t>
+            </w:r>
+            <w:r>
+              <w:rPr>
+                <w:sz w:val="19"/>
+              </w:rPr>
+              <w:t xml:space="preserve"> </w:t>
+            </w:r>
+            <w:r>
+              <w:rPr>
+                <w:rStyle w:val="VerbatimChar"/>
+                <w:sz w:val="19"/>
+              </w:rPr>
+              <w:t xml:space="preserve">hello</w:t>
+            </w:r>
+            <w:r>
+              <w:rPr>
+                <w:sz w:val="19"/>
+              </w:rPr>
+              <w:t xml:space="preserve">; chi riceve</w:t>
+            </w:r>
+            <w:r>
+              <w:rPr>
+                <w:sz w:val="19"/>
+              </w:rPr>
+              <w:t xml:space="preserve"> </w:t>
+            </w:r>
+            <w:r>
+              <w:rPr>
+                <w:rStyle w:val="VerbatimChar"/>
+                <w:sz w:val="19"/>
+              </w:rPr>
+              <w:t xml:space="preserve">full</w:t>
+            </w:r>
+            <w:r>
+              <w:rPr>
+                <w:sz w:val="19"/>
+              </w:rPr>
+              <w:t xml:space="preserve"> </w:t>
+            </w:r>
+            <w:r>
+              <w:rPr>
+                <w:sz w:val="19"/>
+              </w:rPr>
+              <w:t xml:space="preserve">riprova una volta</w:t>
+            </w:r>
+          </w:p>
+        </w:tc>
+        <w:tc>
+          <w:tcPr>
+            <w:tcW w:type="dxa" w:w="1247"/>
+          </w:tcPr>
+          <w:p>
+            <w:pPr>
+              <w:pStyle w:val="Compact"/>
+              <w:spacing w:after="40"/>
+              <w:jc w:val="left"/>
+            </w:pPr>
+            <w:r>
+              <w:rPr>
+                <w:sz w:val="19"/>
+              </w:rPr>
+              <w:t xml:space="preserve">✗ → B-04</w:t>
+            </w:r>
+          </w:p>
+        </w:tc>
+        <w:tc>
+          <w:tcPr>
+            <w:tcW w:type="dxa" w:w="1814"/>
+          </w:tcPr>
+          <w:p>
+            <w:pPr>
+              <w:pStyle w:val="Compact"/>
+              <w:spacing w:after="40"/>
+              <w:jc w:val="left"/>
+            </w:pPr>
+            <w:r>
+              <w:rPr>
+                <w:rStyle w:val="VerbatimChar"/>
+                <w:sz w:val="19"/>
+              </w:rPr>
+              <w:t xml:space="preserve">/api/quick</w:t>
+            </w:r>
+            <w:r>
+              <w:rPr>
+                <w:sz w:val="19"/>
+              </w:rPr>
+              <w:t xml:space="preserve"> </w:t>
+            </w:r>
+            <w:r>
+              <w:rPr>
+                <w:sz w:val="19"/>
+              </w:rPr>
+              <w:t xml:space="preserve">risponde ONLINE1 a tutti i 50; 42 respinti al primo tentativo, 32 entrano al secondo (ONLINE2…ONLINE5), 10 restano fuori; i 40 dentro corrono: partenza automatica a 40/40, 100 % delle posizioni (556.500), ritardo mediana 15 ms, 99 % 55 ms, massimo 165 ms; 5 sale finite con i risultati a tutti</w:t>
+            </w:r>
+          </w:p>
+        </w:tc>
+      </w:tr>
+      <w:tr>
+        <w:tc>
+          <w:tcPr>
+            <w:tcW w:type="dxa" w:w="794"/>
+          </w:tcPr>
+          <w:p>
+            <w:pPr>
+              <w:pStyle w:val="Compact"/>
+              <w:spacing w:after="40"/>
+              <w:jc w:val="left"/>
+            </w:pPr>
+            <w:r>
+              <w:rPr>
+                <w:sz w:val="19"/>
+              </w:rPr>
+              <w:t xml:space="preserve">B2 · sala online, un arrivo ogni 300 ms (50 in 15 s)</w:t>
+            </w:r>
+          </w:p>
+        </w:tc>
+        <w:tc>
+          <w:tcPr>
+            <w:tcW w:type="dxa" w:w="6009"/>
+          </w:tcPr>
+          <w:p>
+            <w:pPr>
+              <w:pStyle w:val="Compact"/>
+              <w:spacing w:after="40"/>
+              <w:jc w:val="left"/>
+            </w:pPr>
+            <w:r>
+              <w:rPr>
+                <w:sz w:val="19"/>
+              </w:rPr>
+              <w:t xml:space="preserve">Solo l’ingresso</w:t>
+            </w:r>
+          </w:p>
+        </w:tc>
+        <w:tc>
+          <w:tcPr>
+            <w:tcW w:type="dxa" w:w="1247"/>
+            <w:shd w:val="clear" w:color="auto" w:fill="D7F0DF"/>
+          </w:tcPr>
+          <w:p>
+            <w:pPr>
+              <w:pStyle w:val="Compact"/>
+              <w:spacing w:after="40"/>
+              <w:jc w:val="left"/>
+            </w:pPr>
+            <w:r>
+              <w:rPr>
+                <w:sz w:val="19"/>
+              </w:rPr>
+              <w:t xml:space="preserve">✓</w:t>
+            </w:r>
+          </w:p>
+        </w:tc>
+        <w:tc>
+          <w:tcPr>
+            <w:tcW w:type="dxa" w:w="1814"/>
+          </w:tcPr>
+          <w:p>
+            <w:pPr>
+              <w:pStyle w:val="Compact"/>
+              <w:spacing w:after="40"/>
+              <w:jc w:val="left"/>
+            </w:pPr>
+            <w:r>
+              <w:rPr>
+                <w:sz w:val="19"/>
+              </w:rPr>
+              <w:t xml:space="preserve">ONLINE1…ONLINE6 da 8, ONLINE7 da 2; 0 respinti</w:t>
+            </w:r>
+          </w:p>
+        </w:tc>
+      </w:tr>
+      <w:tr>
+        <w:tc>
+          <w:tcPr>
+            <w:tcW w:type="dxa" w:w="794"/>
+          </w:tcPr>
+          <w:p>
+            <w:pPr>
+              <w:pStyle w:val="Compact"/>
+              <w:spacing w:after="40"/>
+              <w:jc w:val="left"/>
+            </w:pPr>
+            <w:r>
+              <w:rPr>
+                <w:sz w:val="19"/>
+              </w:rPr>
+              <w:t xml:space="preserve">B3 · sala online, un arrivo ogni 100 ms (50 in 5 s)</w:t>
+            </w:r>
+          </w:p>
+        </w:tc>
+        <w:tc>
+          <w:tcPr>
+            <w:tcW w:type="dxa" w:w="6009"/>
+          </w:tcPr>
+          <w:p>
+            <w:pPr>
+              <w:pStyle w:val="Compact"/>
+              <w:spacing w:after="40"/>
+              <w:jc w:val="left"/>
+            </w:pPr>
+            <w:r>
+              <w:rPr>
+                <w:sz w:val="19"/>
+              </w:rPr>
+              <w:t xml:space="preserve">Solo l’ingresso</w:t>
+            </w:r>
+          </w:p>
+        </w:tc>
+        <w:tc>
+          <w:tcPr>
+            <w:tcW w:type="dxa" w:w="1247"/>
+            <w:shd w:val="clear" w:color="auto" w:fill="D7F0DF"/>
+          </w:tcPr>
+          <w:p>
+            <w:pPr>
+              <w:pStyle w:val="Compact"/>
+              <w:spacing w:after="40"/>
+              <w:jc w:val="left"/>
+            </w:pPr>
+            <w:r>
+              <w:rPr>
+                <w:sz w:val="19"/>
+              </w:rPr>
+              <w:t xml:space="preserve">✓</w:t>
+            </w:r>
+          </w:p>
+        </w:tc>
+        <w:tc>
+          <w:tcPr>
+            <w:tcW w:type="dxa" w:w="1814"/>
+          </w:tcPr>
+          <w:p>
+            <w:pPr>
+              <w:pStyle w:val="Compact"/>
+              <w:spacing w:after="40"/>
+              <w:jc w:val="left"/>
+            </w:pPr>
+            <w:r>
+              <w:rPr>
+                <w:sz w:val="19"/>
+              </w:rPr>
+              <w:t xml:space="preserve">Come B2: 0 respinti</w:t>
+            </w:r>
+          </w:p>
+        </w:tc>
+      </w:tr>
+      <w:tr>
+        <w:tc>
+          <w:tcPr>
+            <w:tcW w:type="dxa" w:w="794"/>
+          </w:tcPr>
+          <w:p>
+            <w:pPr>
+              <w:pStyle w:val="Compact"/>
+              <w:spacing w:after="40"/>
+              <w:jc w:val="left"/>
+            </w:pPr>
+            <w:r>
+              <w:rPr>
+                <w:sz w:val="19"/>
+              </w:rPr>
+              <w:t xml:space="preserve">Server locale</w:t>
+            </w:r>
+          </w:p>
+        </w:tc>
+        <w:tc>
+          <w:tcPr>
+            <w:tcW w:type="dxa" w:w="6009"/>
+          </w:tcPr>
+          <w:p>
+            <w:pPr>
+              <w:pStyle w:val="Compact"/>
+              <w:spacing w:after="40"/>
+              <w:jc w:val="left"/>
+            </w:pPr>
+            <w:r>
+              <w:rPr>
+                <w:sz w:val="19"/>
+              </w:rPr>
+              <w:t xml:space="preserve">Memoria e processore di</w:t>
+            </w:r>
+            <w:r>
+              <w:rPr>
+                <w:sz w:val="19"/>
+              </w:rPr>
+              <w:t xml:space="preserve"> </w:t>
+            </w:r>
+            <w:r>
+              <w:rPr>
+                <w:rStyle w:val="VerbatimChar"/>
+                <w:sz w:val="19"/>
+              </w:rPr>
+              <w:t xml:space="preserve">workerd</w:t>
+            </w:r>
+            <w:r>
+              <w:rPr>
+                <w:sz w:val="19"/>
+              </w:rPr>
+              <w:t xml:space="preserve"> </w:t>
+            </w:r>
+            <w:r>
+              <w:rPr>
+                <w:sz w:val="19"/>
+              </w:rPr>
+              <w:t xml:space="preserve">durante le gare</w:t>
+            </w:r>
+          </w:p>
+        </w:tc>
+        <w:tc>
+          <w:tcPr>
+            <w:tcW w:type="dxa" w:w="1247"/>
+          </w:tcPr>
+          <w:p>
+            <w:pPr>
+              <w:pStyle w:val="Compact"/>
+              <w:spacing w:after="40"/>
+              <w:jc w:val="left"/>
+            </w:pPr>
+            <w:r>
+              <w:rPr>
+                <w:sz w:val="19"/>
+              </w:rPr>
+              <w:t xml:space="preserve">✓ (da tenere d’occhio)</w:t>
+            </w:r>
+          </w:p>
+        </w:tc>
+        <w:tc>
+          <w:tcPr>
+            <w:tcW w:type="dxa" w:w="1814"/>
+          </w:tcPr>
+          <w:p>
+            <w:pPr>
+              <w:pStyle w:val="Compact"/>
+              <w:spacing w:after="40"/>
+              <w:jc w:val="left"/>
+            </w:pPr>
+            <w:r>
+              <w:rPr>
+                <w:sz w:val="19"/>
+              </w:rPr>
+              <w:t xml:space="preserve">Processore in media 17 % nella gara A; memoria da 224 MB a 616 MB tra la prima e la terza gara (il server locale tiene tutto in un processo solo; online ogni stanza ha il suo limite di 128 MB e si spegne da sola quando è vuota)</w:t>
+            </w:r>
+          </w:p>
+        </w:tc>
+      </w:tr>
+    </w:tbl>
+    <w:p>
+      <w:pPr>
+        <w:pStyle w:val="BodyText"/>
+      </w:pPr>
+      <w:r>
+        <w:t xml:space="preserve">Che cosa dice: con 50 persone in 7 gare il server non perde messaggi e non rallenta; il limite di 8 per sala, il tempo misurato dal server e il controllo dell’arrivo troppo veloce funzionano anche sotto carico. L’unico punto debole è l’ingresso nella sala online quando molte persone premono</w:t>
+      </w:r>
+      <w:r>
+        <w:t xml:space="preserve"> </w:t>
+      </w:r>
+      <w:r>
+        <w:t xml:space="preserve">“</w:t>
+      </w:r>
+      <w:r>
+        <w:t xml:space="preserve">Online</w:t>
+      </w:r>
+      <w:r>
+        <w:t xml:space="preserve">”</w:t>
+      </w:r>
+      <w:r>
+        <w:t xml:space="preserve"> </w:t>
+      </w:r>
+      <w:r>
+        <w:t xml:space="preserve">nello stesso istante (B-04). Il prossimo passo utile, quando ci saranno giocatori veri, è ripetere la simulazione contro il sito online (serve la riga 1d) per misurare i ritardi della rete vera.</w:t>
+      </w:r>
+    </w:p>
+    <w:bookmarkEnd w:id="60"/>
+    <w:bookmarkStart w:id="61" w:name="storico-delle-versioni"/>
     <w:p>
       <w:pPr>
         <w:pStyle w:val="Heading1"/>
@@ -36112,7 +37099,7 @@
         </w:tc>
       </w:tr>
     </w:tbl>
-    <w:bookmarkEnd w:id="60"/>
+    <w:bookmarkEnd w:id="61"/>
     <w:sectPr>
       <w:pgMar w:left="1020" w:right="1020" w:top="1020" w:bottom="1020"/>
     </w:sectPr>

</xml_diff>

<commit_message>
0.25.6: riquadro pubblicitario nei momenti di attesa (R-517, S-52) con il modulo pubblicita.js e l'interruttore in config.js, spento per tutti; ?pubblicita=prova per vederlo
Co-Authored-By: Claude Fable 5.1 <noreply@anthropic.com>
Claude-Session: https://claude.ai/code/session_01Xy4XsqXMWCwy8MM5SKFww8
</commit_message>
<xml_diff>
--- a/docs/CYF-Gaming-Requisiti-Implementati-e-Testati.docx
+++ b/docs/CYF-Gaming-Requisiti-Implementati-e-Testati.docx
@@ -57,7 +57,7 @@
         <w:t xml:space="preserve"> </w:t>
       </w:r>
       <w:r>
-        <w:t xml:space="preserve">0.25.5</w:t>
+        <w:t xml:space="preserve">0.25.6</w:t>
       </w:r>
       <w:r>
         <w:t xml:space="preserve"> </w:t>
@@ -105,19 +105,151 @@
         <w:t xml:space="preserve"> </w:t>
       </w:r>
       <w:r>
-        <w:t xml:space="preserve">5:00</w:t>
+        <w:t xml:space="preserve">20:30</w:t>
       </w:r>
       <w:r>
         <w:t xml:space="preserve"> </w:t>
       </w:r>
       <w:r>
-        <w:t xml:space="preserve">(turno</w:t>
+        <w:t xml:space="preserve">(riquadro</w:t>
       </w:r>
       <w:r>
         <w:t xml:space="preserve"> </w:t>
       </w:r>
       <w:r>
+        <w:t xml:space="preserve">pubblicitario</w:t>
+      </w:r>
+      <w:r>
+        <w:t xml:space="preserve"> </w:t>
+      </w:r>
+      <w:r>
+        <w:t xml:space="preserve">nei</w:t>
+      </w:r>
+      <w:r>
+        <w:t xml:space="preserve"> </w:t>
+      </w:r>
+      <w:r>
+        <w:t xml:space="preserve">momenti</w:t>
+      </w:r>
+      <w:r>
+        <w:t xml:space="preserve"> </w:t>
+      </w:r>
+      <w:r>
         <w:t xml:space="preserve">di</w:t>
+      </w:r>
+      <w:r>
+        <w:t xml:space="preserve"> </w:t>
+      </w:r>
+      <w:r>
+        <w:t xml:space="preserve">attesa,</w:t>
+      </w:r>
+      <w:r>
+        <w:t xml:space="preserve"> </w:t>
+      </w:r>
+      <w:r>
+        <w:t xml:space="preserve">R-517,</w:t>
+      </w:r>
+      <w:r>
+        <w:t xml:space="preserve"> </w:t>
+      </w:r>
+      <w:r>
+        <w:t xml:space="preserve">pubblicato</w:t>
+      </w:r>
+      <w:r>
+        <w:t xml:space="preserve"> </w:t>
+      </w:r>
+      <w:r>
+        <w:t xml:space="preserve">su</w:t>
+      </w:r>
+      <w:r>
+        <w:t xml:space="preserve"> </w:t>
+      </w:r>
+      <w:r>
+        <w:t xml:space="preserve">richiesta</w:t>
+      </w:r>
+      <w:r>
+        <w:t xml:space="preserve"> </w:t>
+      </w:r>
+      <w:r>
+        <w:t xml:space="preserve">di</w:t>
+      </w:r>
+      <w:r>
+        <w:t xml:space="preserve"> </w:t>
+      </w:r>
+      <w:r>
+        <w:t xml:space="preserve">Luigi;</w:t>
+      </w:r>
+      <w:r>
+        <w:t xml:space="preserve"> </w:t>
+      </w:r>
+      <w:r>
+        <w:t xml:space="preserve">la</w:t>
+      </w:r>
+      <w:r>
+        <w:t xml:space="preserve"> </w:t>
+      </w:r>
+      <w:r>
+        <w:t xml:space="preserve">0.26.0</w:t>
+      </w:r>
+      <w:r>
+        <w:t xml:space="preserve"> </w:t>
+      </w:r>
+      <w:r>
+        <w:t xml:space="preserve">scritta</w:t>
+      </w:r>
+      <w:r>
+        <w:t xml:space="preserve"> </w:t>
+      </w:r>
+      <w:r>
+        <w:t xml:space="preserve">alle</w:t>
+      </w:r>
+      <w:r>
+        <w:t xml:space="preserve"> </w:t>
+      </w:r>
+      <w:r>
+        <w:t xml:space="preserve">10</w:t>
+      </w:r>
+      <w:r>
+        <w:t xml:space="preserve"> </w:t>
+      </w:r>
+      <w:r>
+        <w:t xml:space="preserve">sul</w:t>
+      </w:r>
+      <w:r>
+        <w:t xml:space="preserve"> </w:t>
+      </w:r>
+      <w:r>
+        <w:t xml:space="preserve">ramo</w:t>
+      </w:r>
+      <w:r>
+        <w:t xml:space="preserve"> </w:t>
+      </w:r>
+      <w:r>
+        <w:t xml:space="preserve">giorno/2026-10-28-mattina</w:t>
+      </w:r>
+      <w:r>
+        <w:t xml:space="preserve"> </w:t>
+      </w:r>
+      <w:r>
+        <w:t xml:space="preserve">aspetta</w:t>
+      </w:r>
+      <w:r>
+        <w:t xml:space="preserve"> </w:t>
+      </w:r>
+      <w:r>
+        <w:t xml:space="preserve">le</w:t>
+      </w:r>
+      <w:r>
+        <w:t xml:space="preserve"> </w:t>
+      </w:r>
+      <w:r>
+        <w:t xml:space="preserve">prove</w:t>
+      </w:r>
+      <w:r>
+        <w:t xml:space="preserve"> </w:t>
+      </w:r>
+      <w:r>
+        <w:t xml:space="preserve">della</w:t>
       </w:r>
       <w:r>
         <w:t xml:space="preserve"> </w:t>
@@ -2387,6 +2519,539 @@
               <w:rPr>
                 <w:sz w:val="19"/>
               </w:rPr>
+              <w:t xml:space="preserve">R-517</w:t>
+            </w:r>
+          </w:p>
+        </w:tc>
+        <w:tc>
+          <w:tcPr>
+            <w:tcW w:type="dxa" w:w="4195"/>
+          </w:tcPr>
+          <w:p>
+            <w:pPr>
+              <w:pStyle w:val="Compact"/>
+              <w:spacing w:after="40"/>
+              <w:jc w:val="left"/>
+            </w:pPr>
+            <w:r>
+              <w:rPr>
+                <w:bCs/>
+                <w:b/>
+                <w:sz w:val="19"/>
+              </w:rPr>
+              <w:t xml:space="preserve">Riquadro pubblicitario nei momenti di attesa</w:t>
+            </w:r>
+            <w:r>
+              <w:rPr>
+                <w:sz w:val="19"/>
+              </w:rPr>
+              <w:t xml:space="preserve"> </w:t>
+            </w:r>
+            <w:r>
+              <w:rPr>
+                <w:sz w:val="19"/>
+              </w:rPr>
+              <w:t xml:space="preserve">(decisione di Luigi del 28/10 sera:</w:t>
+            </w:r>
+            <w:r>
+              <w:rPr>
+                <w:sz w:val="19"/>
+              </w:rPr>
+              <w:t xml:space="preserve"> </w:t>
+            </w:r>
+            <w:r>
+              <w:rPr>
+                <w:sz w:val="19"/>
+              </w:rPr>
+              <w:t xml:space="preserve">“</w:t>
+            </w:r>
+            <w:r>
+              <w:rPr>
+                <w:sz w:val="19"/>
+              </w:rPr>
+              <w:t xml:space="preserve">mettiamo un piccolo popup durante il countdown</w:t>
+            </w:r>
+            <w:r>
+              <w:rPr>
+                <w:sz w:val="19"/>
+              </w:rPr>
+              <w:t xml:space="preserve">”</w:t>
+            </w:r>
+            <w:r>
+              <w:rPr>
+                <w:sz w:val="19"/>
+              </w:rPr>
+              <w:t xml:space="preserve">;</w:t>
+            </w:r>
+            <w:r>
+              <w:rPr>
+                <w:sz w:val="19"/>
+              </w:rPr>
+              <w:t xml:space="preserve"> </w:t>
+            </w:r>
+            <w:r>
+              <w:rPr>
+                <w:sz w:val="19"/>
+              </w:rPr>
+              <w:t xml:space="preserve">“</w:t>
+            </w:r>
+            <w:r>
+              <w:rPr>
+                <w:sz w:val="19"/>
+              </w:rPr>
+              <w:t xml:space="preserve">parte quando c’è un’attesa e dura al 5, al 4, al 3 si toglie, il 3, 2, 1 pulito</w:t>
+            </w:r>
+            <w:r>
+              <w:rPr>
+                <w:sz w:val="19"/>
+              </w:rPr>
+              <w:t xml:space="preserve">”</w:t>
+            </w:r>
+            <w:r>
+              <w:rPr>
+                <w:sz w:val="19"/>
+              </w:rPr>
+              <w:t xml:space="preserve">): un riquadro piccolo (300×100, in un angolo, con la scritta</w:t>
+            </w:r>
+            <w:r>
+              <w:rPr>
+                <w:sz w:val="19"/>
+              </w:rPr>
+              <w:t xml:space="preserve"> </w:t>
+            </w:r>
+            <w:r>
+              <w:rPr>
+                <w:sz w:val="19"/>
+              </w:rPr>
+              <w:t xml:space="preserve">“</w:t>
+            </w:r>
+            <w:r>
+              <w:rPr>
+                <w:sz w:val="19"/>
+              </w:rPr>
+              <w:t xml:space="preserve">Pubblicità</w:t>
+            </w:r>
+            <w:r>
+              <w:rPr>
+                <w:sz w:val="19"/>
+              </w:rPr>
+              <w:t xml:space="preserve">”</w:t>
+            </w:r>
+            <w:r>
+              <w:rPr>
+                <w:sz w:val="19"/>
+              </w:rPr>
+              <w:t xml:space="preserve"> </w:t>
+            </w:r>
+            <w:r>
+              <w:rPr>
+                <w:sz w:val="19"/>
+              </w:rPr>
+              <w:t xml:space="preserve">e la ✕ per chiuderlo) nella sala d’attesa prima del via, con il 5 e il 4 del conto alla rovescia, poi sparisce; nella stanza online o del Gran Premio che aspetta la partenza automatica; nella schermata dei risultati. Mai durante il 3-2-1 e la gara (il via è sincronizzato dal server per tutti: un annuncio che distrae uno solo falsa la gara), mai nel menu, mai alla prima gara della visita, non più di uno al minuto. Chi serve l’annuncio si sceglie in</w:t>
+            </w:r>
+            <w:r>
+              <w:rPr>
+                <w:sz w:val="19"/>
+              </w:rPr>
+              <w:t xml:space="preserve"> </w:t>
+            </w:r>
+            <w:r>
+              <w:rPr>
+                <w:rStyle w:val="VerbatimChar"/>
+                <w:sz w:val="19"/>
+              </w:rPr>
+              <w:t xml:space="preserve">config.js</w:t>
+            </w:r>
+            <w:r>
+              <w:rPr>
+                <w:sz w:val="19"/>
+              </w:rPr>
+              <w:t xml:space="preserve"> </w:t>
+            </w:r>
+            <w:r>
+              <w:rPr>
+                <w:sz w:val="19"/>
+              </w:rPr>
+              <w:t xml:space="preserve">(nessuno, prova, Google AdSense) o con</w:t>
+            </w:r>
+            <w:r>
+              <w:rPr>
+                <w:sz w:val="19"/>
+              </w:rPr>
+              <w:t xml:space="preserve"> </w:t>
+            </w:r>
+            <w:r>
+              <w:rPr>
+                <w:rStyle w:val="VerbatimChar"/>
+                <w:sz w:val="19"/>
+              </w:rPr>
+              <w:t xml:space="preserve">?pubblicita=…</w:t>
+            </w:r>
+            <w:r>
+              <w:rPr>
+                <w:sz w:val="19"/>
+              </w:rPr>
+              <w:t xml:space="preserve">; sul portale solo l’SDK del portale, altrimenti niente (CrazyGames vieta annunci di terzi; nel Basic Launch sono spenti). Spento per tutti finché Luigi non apre AdSense e non c’è il consenso (R-518)</w:t>
+            </w:r>
+          </w:p>
+        </w:tc>
+        <w:tc>
+          <w:tcPr>
+            <w:tcW w:type="dxa" w:w="1134"/>
+          </w:tcPr>
+          <w:p>
+            <w:pPr>
+              <w:pStyle w:val="Compact"/>
+              <w:spacing w:after="40"/>
+              <w:jc w:val="left"/>
+            </w:pPr>
+            <w:r>
+              <w:rPr>
+                <w:sz w:val="19"/>
+              </w:rPr>
+              <w:t xml:space="preserve">28/10/2026</w:t>
+            </w:r>
+          </w:p>
+        </w:tc>
+        <w:tc>
+          <w:tcPr>
+            <w:tcW w:type="dxa" w:w="1134"/>
+            <w:shd w:val="clear" w:color="auto" w:fill="D7F0DF"/>
+          </w:tcPr>
+          <w:p>
+            <w:pPr>
+              <w:pStyle w:val="Compact"/>
+              <w:spacing w:after="40"/>
+              <w:jc w:val="left"/>
+            </w:pPr>
+            <w:r>
+              <w:rPr>
+                <w:sz w:val="19"/>
+              </w:rPr>
+              <w:t xml:space="preserve">Fatto</w:t>
+            </w:r>
+          </w:p>
+        </w:tc>
+        <w:tc>
+          <w:tcPr>
+            <w:tcW w:type="dxa" w:w="2494"/>
+          </w:tcPr>
+          <w:p>
+            <w:pPr>
+              <w:pStyle w:val="Compact"/>
+              <w:spacing w:after="40"/>
+              <w:jc w:val="left"/>
+            </w:pPr>
+            <w:r>
+              <w:rPr>
+                <w:sz w:val="19"/>
+              </w:rPr>
+              <w:t xml:space="preserve">0.25.6, modulo</w:t>
+            </w:r>
+            <w:r>
+              <w:rPr>
+                <w:sz w:val="19"/>
+              </w:rPr>
+              <w:t xml:space="preserve"> </w:t>
+            </w:r>
+            <w:r>
+              <w:rPr>
+                <w:rStyle w:val="VerbatimChar"/>
+                <w:sz w:val="19"/>
+              </w:rPr>
+              <w:t xml:space="preserve">moduli/pubblicita.js</w:t>
+            </w:r>
+            <w:r>
+              <w:rPr>
+                <w:sz w:val="19"/>
+              </w:rPr>
+              <w:t xml:space="preserve"> </w:t>
+            </w:r>
+            <w:r>
+              <w:rPr>
+                <w:sz w:val="19"/>
+              </w:rPr>
+              <w:t xml:space="preserve">(PN.pubblicita),</w:t>
+            </w:r>
+            <w:r>
+              <w:rPr>
+                <w:sz w:val="19"/>
+              </w:rPr>
+              <w:t xml:space="preserve"> </w:t>
+            </w:r>
+            <w:r>
+              <w:rPr>
+                <w:rStyle w:val="VerbatimChar"/>
+                <w:sz w:val="19"/>
+              </w:rPr>
+              <w:t xml:space="preserve">config.js</w:t>
+            </w:r>
+            <w:r>
+              <w:rPr>
+                <w:sz w:val="19"/>
+              </w:rPr>
+              <w:t xml:space="preserve"> </w:t>
+            </w:r>
+            <w:r>
+              <w:rPr>
+                <w:sz w:val="19"/>
+              </w:rPr>
+              <w:t xml:space="preserve">→</w:t>
+            </w:r>
+            <w:r>
+              <w:rPr>
+                <w:sz w:val="19"/>
+              </w:rPr>
+              <w:t xml:space="preserve"> </w:t>
+            </w:r>
+            <w:r>
+              <w:rPr>
+                <w:rStyle w:val="VerbatimChar"/>
+                <w:sz w:val="19"/>
+              </w:rPr>
+              <w:t xml:space="preserve">pubblicita: { fornitore, client, slot, ogniS }</w:t>
+            </w:r>
+            <w:r>
+              <w:rPr>
+                <w:sz w:val="19"/>
+              </w:rPr>
+              <w:t xml:space="preserve">, contenitori</w:t>
+            </w:r>
+            <w:r>
+              <w:rPr>
+                <w:sz w:val="19"/>
+              </w:rPr>
+              <w:t xml:space="preserve"> </w:t>
+            </w:r>
+            <w:r>
+              <w:rPr>
+                <w:rStyle w:val="VerbatimChar"/>
+                <w:sz w:val="19"/>
+              </w:rPr>
+              <w:t xml:space="preserve">#lobbyAd</w:t>
+            </w:r>
+            <w:r>
+              <w:rPr>
+                <w:sz w:val="19"/>
+              </w:rPr>
+              <w:t xml:space="preserve"> </w:t>
+            </w:r>
+            <w:r>
+              <w:rPr>
+                <w:sz w:val="19"/>
+              </w:rPr>
+              <w:t xml:space="preserve">e</w:t>
+            </w:r>
+            <w:r>
+              <w:rPr>
+                <w:sz w:val="19"/>
+              </w:rPr>
+              <w:t xml:space="preserve"> </w:t>
+            </w:r>
+            <w:r>
+              <w:rPr>
+                <w:rStyle w:val="VerbatimChar"/>
+                <w:sz w:val="19"/>
+              </w:rPr>
+              <w:t xml:space="preserve">#resAd</w:t>
+            </w:r>
+            <w:r>
+              <w:rPr>
+                <w:sz w:val="19"/>
+              </w:rPr>
+              <w:t xml:space="preserve"> </w:t>
+            </w:r>
+            <w:r>
+              <w:rPr>
+                <w:sz w:val="19"/>
+              </w:rPr>
+              <w:t xml:space="preserve">nei pannelli, agganci in</w:t>
+            </w:r>
+            <w:r>
+              <w:rPr>
+                <w:sz w:val="19"/>
+              </w:rPr>
+              <w:t xml:space="preserve"> </w:t>
+            </w:r>
+            <w:r>
+              <w:rPr>
+                <w:rStyle w:val="VerbatimChar"/>
+                <w:sz w:val="19"/>
+              </w:rPr>
+              <w:t xml:space="preserve">game.js</w:t>
+            </w:r>
+            <w:r>
+              <w:rPr>
+                <w:sz w:val="19"/>
+              </w:rPr>
+              <w:t xml:space="preserve"> </w:t>
+            </w:r>
+            <w:r>
+              <w:rPr>
+                <w:sz w:val="19"/>
+              </w:rPr>
+              <w:t xml:space="preserve">(attesa, conto alla rovescia, stanza, risultati, menu), testi</w:t>
+            </w:r>
+            <w:r>
+              <w:rPr>
+                <w:sz w:val="19"/>
+              </w:rPr>
+              <w:t xml:space="preserve"> </w:t>
+            </w:r>
+            <w:r>
+              <w:rPr>
+                <w:rStyle w:val="VerbatimChar"/>
+                <w:sz w:val="19"/>
+              </w:rPr>
+              <w:t xml:space="preserve">ad*</w:t>
+            </w:r>
+            <w:r>
+              <w:rPr>
+                <w:sz w:val="19"/>
+              </w:rPr>
+              <w:t xml:space="preserve"> </w:t>
+            </w:r>
+            <w:r>
+              <w:rPr>
+                <w:sz w:val="19"/>
+              </w:rPr>
+              <w:t xml:space="preserve">in 4 lingue, diagnosi</w:t>
+            </w:r>
+            <w:r>
+              <w:rPr>
+                <w:sz w:val="19"/>
+              </w:rPr>
+              <w:t xml:space="preserve"> </w:t>
+            </w:r>
+            <w:r>
+              <w:rPr>
+                <w:rStyle w:val="VerbatimChar"/>
+                <w:sz w:val="19"/>
+              </w:rPr>
+              <w:t xml:space="preserve">pubblicita</w:t>
+            </w:r>
+            <w:r>
+              <w:rPr>
+                <w:sz w:val="19"/>
+              </w:rPr>
+              <w:t xml:space="preserve">. Pubblicata la sera del 28/10 su richiesta di Luigi (</w:t>
+            </w:r>
+            <w:r>
+              <w:rPr>
+                <w:sz w:val="19"/>
+              </w:rPr>
+              <w:t xml:space="preserve">“</w:t>
+            </w:r>
+            <w:r>
+              <w:rPr>
+                <w:sz w:val="19"/>
+              </w:rPr>
+              <w:t xml:space="preserve">fallo ora</w:t>
+            </w:r>
+            <w:r>
+              <w:rPr>
+                <w:sz w:val="19"/>
+              </w:rPr>
+              <w:t xml:space="preserve">”</w:t>
+            </w:r>
+            <w:r>
+              <w:rPr>
+                <w:sz w:val="19"/>
+              </w:rPr>
+              <w:t xml:space="preserve">), cancello verde. Prova da aggiungere di notte: con</w:t>
+            </w:r>
+            <w:r>
+              <w:rPr>
+                <w:sz w:val="19"/>
+              </w:rPr>
+              <w:t xml:space="preserve"> </w:t>
+            </w:r>
+            <w:r>
+              <w:rPr>
+                <w:rStyle w:val="VerbatimChar"/>
+                <w:sz w:val="19"/>
+              </w:rPr>
+              <w:t xml:space="preserve">?pubblicita=prova</w:t>
+            </w:r>
+            <w:r>
+              <w:rPr>
+                <w:sz w:val="19"/>
+              </w:rPr>
+              <w:t xml:space="preserve"> </w:t>
+            </w:r>
+            <w:r>
+              <w:rPr>
+                <w:sz w:val="19"/>
+              </w:rPr>
+              <w:t xml:space="preserve">il riquadro c’è nell’attesa, c’è con il 4, non c’è con il 3 e in gara, c’è nei risultati, non c’è nel menu; senza il parametro non esiste; con</w:t>
+            </w:r>
+            <w:r>
+              <w:rPr>
+                <w:sz w:val="19"/>
+              </w:rPr>
+              <w:t xml:space="preserve"> </w:t>
+            </w:r>
+            <w:r>
+              <w:rPr>
+                <w:rStyle w:val="VerbatimChar"/>
+                <w:sz w:val="19"/>
+              </w:rPr>
+              <w:t xml:space="preserve">?portale=crazygames</w:t>
+            </w:r>
+            <w:r>
+              <w:rPr>
+                <w:sz w:val="19"/>
+              </w:rPr>
+              <w:t xml:space="preserve"> </w:t>
+            </w:r>
+            <w:r>
+              <w:rPr>
+                <w:sz w:val="19"/>
+              </w:rPr>
+              <w:t xml:space="preserve">non esiste. Consigli di Claude sui formati: video a scelta (</w:t>
+            </w:r>
+            <w:r>
+              <w:rPr>
+                <w:sz w:val="19"/>
+              </w:rPr>
+              <w:t xml:space="preserve">“</w:t>
+            </w:r>
+            <w:r>
+              <w:rPr>
+                <w:sz w:val="19"/>
+              </w:rPr>
+              <w:t xml:space="preserve">guarda un video → maglia esclusiva</w:t>
+            </w:r>
+            <w:r>
+              <w:rPr>
+                <w:sz w:val="19"/>
+              </w:rPr>
+              <w:t xml:space="preserve">”</w:t>
+            </w:r>
+            <w:r>
+              <w:rPr>
+                <w:sz w:val="19"/>
+              </w:rPr>
+              <w:t xml:space="preserve">) come fonte principale, annunci forzati al massimo uno tra una gara e l’altra, niente banner in pista (F-20)</w:t>
+            </w:r>
+          </w:p>
+        </w:tc>
+      </w:tr>
+      <w:tr>
+        <w:tc>
+          <w:tcPr>
+            <w:tcW w:type="dxa" w:w="907"/>
+          </w:tcPr>
+          <w:p>
+            <w:pPr>
+              <w:pStyle w:val="Compact"/>
+              <w:spacing w:after="40"/>
+              <w:jc w:val="left"/>
+            </w:pPr>
+            <w:r>
+              <w:rPr>
+                <w:sz w:val="19"/>
+              </w:rPr>
               <w:t xml:space="preserve">R-011</w:t>
             </w:r>
           </w:p>
@@ -35935,6 +36600,186 @@
                 <w:sz w:val="19"/>
               </w:rPr>
               <w:t xml:space="preserve">; portale; riquadri settimana e Gran Premio) e prova R1d (pagina senza versione, B-02). Giro completo: 16 prove, tutte verdi. B-02 e B-03 chiusi. Nota: dal cloud di notte il dominio del sito non era consentito, quindi errori dei telefoni e misure non letti (riga 1d dei prossimi passi)</w:t>
+            </w:r>
+          </w:p>
+        </w:tc>
+      </w:tr>
+      <w:tr>
+        <w:tc>
+          <w:tcPr>
+            <w:tcW w:type="dxa" w:w="1247"/>
+          </w:tcPr>
+          <w:p>
+            <w:pPr>
+              <w:pStyle w:val="Compact"/>
+              <w:spacing w:after="40"/>
+              <w:jc w:val="left"/>
+            </w:pPr>
+            <w:r>
+              <w:rPr>
+                <w:sz w:val="19"/>
+              </w:rPr>
+              <w:t xml:space="preserve">0.25.6</w:t>
+            </w:r>
+          </w:p>
+        </w:tc>
+        <w:tc>
+          <w:tcPr>
+            <w:tcW w:type="dxa" w:w="1361"/>
+          </w:tcPr>
+          <w:p>
+            <w:pPr>
+              <w:pStyle w:val="Compact"/>
+              <w:spacing w:after="40"/>
+              <w:jc w:val="left"/>
+            </w:pPr>
+            <w:r>
+              <w:rPr>
+                <w:sz w:val="19"/>
+              </w:rPr>
+              <w:t xml:space="preserve">28/10/2026</w:t>
+            </w:r>
+          </w:p>
+        </w:tc>
+        <w:tc>
+          <w:tcPr>
+            <w:tcW w:type="dxa" w:w="7257"/>
+          </w:tcPr>
+          <w:p>
+            <w:pPr>
+              <w:pStyle w:val="Compact"/>
+              <w:spacing w:after="40"/>
+              <w:jc w:val="left"/>
+            </w:pPr>
+            <w:r>
+              <w:rPr>
+                <w:sz w:val="19"/>
+              </w:rPr>
+              <w:t xml:space="preserve">Sera, su richiesta di Luigi (</w:t>
+            </w:r>
+            <w:r>
+              <w:rPr>
+                <w:sz w:val="19"/>
+              </w:rPr>
+              <w:t xml:space="preserve">“</w:t>
+            </w:r>
+            <w:r>
+              <w:rPr>
+                <w:sz w:val="19"/>
+              </w:rPr>
+              <w:t xml:space="preserve">fallo ora che lo provo in serata</w:t>
+            </w:r>
+            <w:r>
+              <w:rPr>
+                <w:sz w:val="19"/>
+              </w:rPr>
+              <w:t xml:space="preserve">”</w:t>
+            </w:r>
+            <w:r>
+              <w:rPr>
+                <w:sz w:val="19"/>
+              </w:rPr>
+              <w:t xml:space="preserve">): riquadro pubblicitario nei momenti di attesa (R-517, S-52) con il modulo</w:t>
+            </w:r>
+            <w:r>
+              <w:rPr>
+                <w:sz w:val="19"/>
+              </w:rPr>
+              <w:t xml:space="preserve"> </w:t>
+            </w:r>
+            <w:r>
+              <w:rPr>
+                <w:rStyle w:val="VerbatimChar"/>
+                <w:sz w:val="19"/>
+              </w:rPr>
+              <w:t xml:space="preserve">pubblicita.js</w:t>
+            </w:r>
+            <w:r>
+              <w:rPr>
+                <w:sz w:val="19"/>
+              </w:rPr>
+              <w:t xml:space="preserve"> </w:t>
+            </w:r>
+            <w:r>
+              <w:rPr>
+                <w:sz w:val="19"/>
+              </w:rPr>
+              <w:t xml:space="preserve">e l’interruttore in</w:t>
+            </w:r>
+            <w:r>
+              <w:rPr>
+                <w:sz w:val="19"/>
+              </w:rPr>
+              <w:t xml:space="preserve"> </w:t>
+            </w:r>
+            <w:r>
+              <w:rPr>
+                <w:rStyle w:val="VerbatimChar"/>
+                <w:sz w:val="19"/>
+              </w:rPr>
+              <w:t xml:space="preserve">config.js</w:t>
+            </w:r>
+            <w:r>
+              <w:rPr>
+                <w:sz w:val="19"/>
+              </w:rPr>
+              <w:t xml:space="preserve"> </w:t>
+            </w:r>
+            <w:r>
+              <w:rPr>
+                <w:sz w:val="19"/>
+              </w:rPr>
+              <w:t xml:space="preserve">(spento per tutti;</w:t>
+            </w:r>
+            <w:r>
+              <w:rPr>
+                <w:sz w:val="19"/>
+              </w:rPr>
+              <w:t xml:space="preserve"> </w:t>
+            </w:r>
+            <w:r>
+              <w:rPr>
+                <w:rStyle w:val="VerbatimChar"/>
+                <w:sz w:val="19"/>
+              </w:rPr>
+              <w:t xml:space="preserve">?pubblicita=prova</w:t>
+            </w:r>
+            <w:r>
+              <w:rPr>
+                <w:sz w:val="19"/>
+              </w:rPr>
+              <w:t xml:space="preserve"> </w:t>
+            </w:r>
+            <w:r>
+              <w:rPr>
+                <w:sz w:val="19"/>
+              </w:rPr>
+              <w:t xml:space="preserve">per vederlo); contenitori nella stanza e nei risultati; testi in 4 lingue. Pubblicata da</w:t>
+            </w:r>
+            <w:r>
+              <w:rPr>
+                <w:sz w:val="19"/>
+              </w:rPr>
+              <w:t xml:space="preserve"> </w:t>
+            </w:r>
+            <w:r>
+              <w:rPr>
+                <w:rStyle w:val="VerbatimChar"/>
+                <w:sz w:val="19"/>
+              </w:rPr>
+              <w:t xml:space="preserve">main</w:t>
+            </w:r>
+            <w:r>
+              <w:rPr>
+                <w:sz w:val="19"/>
+              </w:rPr>
+              <w:t xml:space="preserve"> </w:t>
+            </w:r>
+            <w:r>
+              <w:rPr>
+                <w:sz w:val="19"/>
+              </w:rPr>
+              <w:t xml:space="preserve">con il cancello verde, senza la 0.26.0 che aspetta le prove della notte</w:t>
             </w:r>
           </w:p>
         </w:tc>

</xml_diff>

<commit_message>
0.25.7: riquadro di prova della pubblicità con un cagnolino disegnato che saltella (R-517)
Co-Authored-By: Claude Fable 5.1 <noreply@anthropic.com>
Claude-Session: https://claude.ai/code/session_01Xy4XsqXMWCwy8MM5SKFww8
</commit_message>
<xml_diff>
--- a/docs/CYF-Gaming-Requisiti-Implementati-e-Testati.docx
+++ b/docs/CYF-Gaming-Requisiti-Implementati-e-Testati.docx
@@ -57,7 +57,7 @@
         <w:t xml:space="preserve"> </w:t>
       </w:r>
       <w:r>
-        <w:t xml:space="preserve">0.25.6</w:t>
+        <w:t xml:space="preserve">0.25.7</w:t>
       </w:r>
       <w:r>
         <w:t xml:space="preserve"> </w:t>
@@ -105,7 +105,7 @@
         <w:t xml:space="preserve"> </w:t>
       </w:r>
       <w:r>
-        <w:t xml:space="preserve">20:30</w:t>
+        <w:t xml:space="preserve">20:20</w:t>
       </w:r>
       <w:r>
         <w:t xml:space="preserve"> </w:t>
@@ -36780,6 +36780,141 @@
                 <w:sz w:val="19"/>
               </w:rPr>
               <w:t xml:space="preserve">con il cancello verde, senza la 0.26.0 che aspetta le prove della notte</w:t>
+            </w:r>
+          </w:p>
+        </w:tc>
+      </w:tr>
+      <w:tr>
+        <w:tc>
+          <w:tcPr>
+            <w:tcW w:type="dxa" w:w="1247"/>
+          </w:tcPr>
+          <w:p>
+            <w:pPr>
+              <w:pStyle w:val="Compact"/>
+              <w:spacing w:after="40"/>
+              <w:jc w:val="left"/>
+            </w:pPr>
+            <w:r>
+              <w:rPr>
+                <w:sz w:val="19"/>
+              </w:rPr>
+              <w:t xml:space="preserve">0.25.7</w:t>
+            </w:r>
+          </w:p>
+        </w:tc>
+        <w:tc>
+          <w:tcPr>
+            <w:tcW w:type="dxa" w:w="1361"/>
+          </w:tcPr>
+          <w:p>
+            <w:pPr>
+              <w:pStyle w:val="Compact"/>
+              <w:spacing w:after="40"/>
+              <w:jc w:val="left"/>
+            </w:pPr>
+            <w:r>
+              <w:rPr>
+                <w:sz w:val="19"/>
+              </w:rPr>
+              <w:t xml:space="preserve">28/10/2026</w:t>
+            </w:r>
+          </w:p>
+        </w:tc>
+        <w:tc>
+          <w:tcPr>
+            <w:tcW w:type="dxa" w:w="7257"/>
+          </w:tcPr>
+          <w:p>
+            <w:pPr>
+              <w:pStyle w:val="Compact"/>
+              <w:spacing w:after="40"/>
+              <w:jc w:val="left"/>
+            </w:pPr>
+            <w:r>
+              <w:rPr>
+                <w:sz w:val="19"/>
+              </w:rPr>
+              <w:t xml:space="preserve">Riquadro di prova della pubblicità (R-517) con un cagnolino disegnato che saltella (richiesta di Luigi delle 20:09,</w:t>
+            </w:r>
+            <w:r>
+              <w:rPr>
+                <w:sz w:val="19"/>
+              </w:rPr>
+              <w:t xml:space="preserve"> </w:t>
+            </w:r>
+            <w:r>
+              <w:rPr>
+                <w:sz w:val="19"/>
+              </w:rPr>
+              <w:t xml:space="preserve">“</w:t>
+            </w:r>
+            <w:r>
+              <w:rPr>
+                <w:sz w:val="19"/>
+              </w:rPr>
+              <w:t xml:space="preserve">giusto per vedere come è venuto</w:t>
+            </w:r>
+            <w:r>
+              <w:rPr>
+                <w:sz w:val="19"/>
+              </w:rPr>
+              <w:t xml:space="preserve">”</w:t>
+            </w:r>
+            <w:r>
+              <w:rPr>
+                <w:sz w:val="19"/>
+              </w:rPr>
+              <w:t xml:space="preserve">): disegno originale in SVG dentro</w:t>
+            </w:r>
+            <w:r>
+              <w:rPr>
+                <w:sz w:val="19"/>
+              </w:rPr>
+              <w:t xml:space="preserve"> </w:t>
+            </w:r>
+            <w:r>
+              <w:rPr>
+                <w:rStyle w:val="VerbatimChar"/>
+                <w:sz w:val="19"/>
+              </w:rPr>
+              <w:t xml:space="preserve">pubblicita.js</w:t>
+            </w:r>
+            <w:r>
+              <w:rPr>
+                <w:sz w:val="19"/>
+              </w:rPr>
+              <w:t xml:space="preserve">, animazione in CSS (salto, coda, orecchio), ferma con</w:t>
+            </w:r>
+            <w:r>
+              <w:rPr>
+                <w:sz w:val="19"/>
+              </w:rPr>
+              <w:t xml:space="preserve"> </w:t>
+            </w:r>
+            <w:r>
+              <w:rPr>
+                <w:sz w:val="19"/>
+              </w:rPr>
+              <w:t xml:space="preserve">“</w:t>
+            </w:r>
+            <w:r>
+              <w:rPr>
+                <w:sz w:val="19"/>
+              </w:rPr>
+              <w:t xml:space="preserve">riduci il movimento</w:t>
+            </w:r>
+            <w:r>
+              <w:rPr>
+                <w:sz w:val="19"/>
+              </w:rPr>
+              <w:t xml:space="preserve">”</w:t>
+            </w:r>
+            <w:r>
+              <w:rPr>
+                <w:sz w:val="19"/>
+              </w:rPr>
+              <w:t xml:space="preserve">. Pubblicata subito dopo la 0.25.6</w:t>
             </w:r>
           </w:p>
         </w:tc>

</xml_diff>

<commit_message>
0.26.1: classifica dal vivo e posizione anche in allenamento con gli avversari (B-05, prima parte di R-519) e corridoio di atterraggio libero dopo ogni rampa (B-06) — scritta di sera senza prove
Co-Authored-By: Claude Fable 5.1 <noreply@anthropic.com>
Claude-Session: https://claude.ai/code/session_01Xy4Xst1hNvzcJUvJEXamAD
</commit_message>
<xml_diff>
--- a/docs/CYF-Gaming-Requisiti-Implementati-e-Testati.docx
+++ b/docs/CYF-Gaming-Requisiti-Implementati-e-Testati.docx
@@ -105,157 +105,289 @@
         <w:t xml:space="preserve"> </w:t>
       </w:r>
       <w:r>
-        <w:t xml:space="preserve">20:20</w:t>
+        <w:t xml:space="preserve">23:00</w:t>
       </w:r>
       <w:r>
         <w:t xml:space="preserve"> </w:t>
       </w:r>
       <w:r>
-        <w:t xml:space="preserve">(riquadro</w:t>
+        <w:t xml:space="preserve">(sera:</w:t>
       </w:r>
       <w:r>
         <w:t xml:space="preserve"> </w:t>
       </w:r>
       <w:r>
-        <w:t xml:space="preserve">pubblicitario</w:t>
+        <w:t xml:space="preserve">due</w:t>
       </w:r>
       <w:r>
         <w:t xml:space="preserve"> </w:t>
       </w:r>
       <w:r>
-        <w:t xml:space="preserve">nei</w:t>
+        <w:t xml:space="preserve">bachi</w:t>
       </w:r>
       <w:r>
         <w:t xml:space="preserve"> </w:t>
       </w:r>
       <w:r>
-        <w:t xml:space="preserve">momenti</w:t>
+        <w:t xml:space="preserve">di</w:t>
       </w:r>
       <w:r>
         <w:t xml:space="preserve"> </w:t>
       </w:r>
       <w:r>
+        <w:t xml:space="preserve">Luigi,</w:t>
+      </w:r>
+      <w:r>
+        <w:t xml:space="preserve"> </w:t>
+      </w:r>
+      <w:r>
+        <w:t xml:space="preserve">B-05</w:t>
+      </w:r>
+      <w:r>
+        <w:t xml:space="preserve"> </w:t>
+      </w:r>
+      <w:r>
+        <w:t xml:space="preserve">classifica</w:t>
+      </w:r>
+      <w:r>
+        <w:t xml:space="preserve"> </w:t>
+      </w:r>
+      <w:r>
+        <w:t xml:space="preserve">in</w:t>
+      </w:r>
+      <w:r>
+        <w:t xml:space="preserve"> </w:t>
+      </w:r>
+      <w:r>
+        <w:t xml:space="preserve">allenamento</w:t>
+      </w:r>
+      <w:r>
+        <w:t xml:space="preserve"> </w:t>
+      </w:r>
+      <w:r>
+        <w:t xml:space="preserve">e</w:t>
+      </w:r>
+      <w:r>
+        <w:t xml:space="preserve"> </w:t>
+      </w:r>
+      <w:r>
+        <w:t xml:space="preserve">B-06</w:t>
+      </w:r>
+      <w:r>
+        <w:t xml:space="preserve"> </w:t>
+      </w:r>
+      <w:r>
+        <w:t xml:space="preserve">alberi</w:t>
+      </w:r>
+      <w:r>
+        <w:t xml:space="preserve"> </w:t>
+      </w:r>
+      <w:r>
+        <w:t xml:space="preserve">davanti</w:t>
+      </w:r>
+      <w:r>
+        <w:t xml:space="preserve"> </w:t>
+      </w:r>
+      <w:r>
+        <w:t xml:space="preserve">ai</w:t>
+      </w:r>
+      <w:r>
+        <w:t xml:space="preserve"> </w:t>
+      </w:r>
+      <w:r>
+        <w:t xml:space="preserve">trampolini,</w:t>
+      </w:r>
+      <w:r>
+        <w:t xml:space="preserve"> </w:t>
+      </w:r>
+      <w:r>
+        <w:t xml:space="preserve">corretti</w:t>
+      </w:r>
+      <w:r>
+        <w:t xml:space="preserve"> </w:t>
+      </w:r>
+      <w:r>
+        <w:t xml:space="preserve">nella</w:t>
+      </w:r>
+      <w:r>
+        <w:t xml:space="preserve"> </w:t>
+      </w:r>
+      <w:r>
+        <w:t xml:space="preserve">0.26.1</w:t>
+      </w:r>
+      <w:r>
+        <w:t xml:space="preserve"> </w:t>
+      </w:r>
+      <w:r>
+        <w:t xml:space="preserve">sul</w:t>
+      </w:r>
+      <w:r>
+        <w:t xml:space="preserve"> </w:t>
+      </w:r>
+      <w:r>
+        <w:t xml:space="preserve">ramo</w:t>
+      </w:r>
+      <w:r>
+        <w:t xml:space="preserve"> </w:t>
+      </w:r>
+      <w:r>
+        <w:t xml:space="preserve">giorno/2026-10-28-sera,</w:t>
+      </w:r>
+      <w:r>
+        <w:t xml:space="preserve"> </w:t>
+      </w:r>
+      <w:r>
+        <w:t xml:space="preserve">che</w:t>
+      </w:r>
+      <w:r>
+        <w:t xml:space="preserve"> </w:t>
+      </w:r>
+      <w:r>
+        <w:t xml:space="preserve">contiene</w:t>
+      </w:r>
+      <w:r>
+        <w:t xml:space="preserve"> </w:t>
+      </w:r>
+      <w:r>
+        <w:t xml:space="preserve">anche</w:t>
+      </w:r>
+      <w:r>
+        <w:t xml:space="preserve"> </w:t>
+      </w:r>
+      <w:r>
+        <w:t xml:space="preserve">la</w:t>
+      </w:r>
+      <w:r>
+        <w:t xml:space="preserve"> </w:t>
+      </w:r>
+      <w:r>
+        <w:t xml:space="preserve">0.26.0</w:t>
+      </w:r>
+      <w:r>
+        <w:t xml:space="preserve"> </w:t>
+      </w:r>
+      <w:r>
+        <w:t xml:space="preserve">della</w:t>
+      </w:r>
+      <w:r>
+        <w:t xml:space="preserve"> </w:t>
+      </w:r>
+      <w:r>
+        <w:t xml:space="preserve">mattina</w:t>
+      </w:r>
+      <w:r>
+        <w:t xml:space="preserve"> </w:t>
+      </w:r>
+      <w:r>
+        <w:t xml:space="preserve">e</w:t>
+      </w:r>
+      <w:r>
+        <w:t xml:space="preserve"> </w:t>
+      </w:r>
+      <w:r>
+        <w:t xml:space="preserve">la</w:t>
+      </w:r>
+      <w:r>
+        <w:t xml:space="preserve"> </w:t>
+      </w:r>
+      <w:r>
+        <w:t xml:space="preserve">pubblicità</w:t>
+      </w:r>
+      <w:r>
+        <w:t xml:space="preserve"> </w:t>
+      </w:r>
+      <w:r>
+        <w:t xml:space="preserve">della</w:t>
+      </w:r>
+      <w:r>
+        <w:t xml:space="preserve"> </w:t>
+      </w:r>
+      <w:r>
+        <w:t xml:space="preserve">0.25.6-0.25.7;</w:t>
+      </w:r>
+      <w:r>
+        <w:t xml:space="preserve"> </w:t>
+      </w:r>
+      <w:r>
+        <w:t xml:space="preserve">nuovo</w:t>
+      </w:r>
+      <w:r>
+        <w:t xml:space="preserve"> </w:t>
+      </w:r>
+      <w:r>
+        <w:t xml:space="preserve">requisito</w:t>
+      </w:r>
+      <w:r>
+        <w:t xml:space="preserve"> </w:t>
+      </w:r>
+      <w:r>
+        <w:t xml:space="preserve">R-519,</w:t>
+      </w:r>
+      <w:r>
+        <w:t xml:space="preserve"> </w:t>
+      </w:r>
+      <w:r>
+        <w:t xml:space="preserve">allenamento</w:t>
+      </w:r>
+      <w:r>
+        <w:t xml:space="preserve"> </w:t>
+      </w:r>
+      <w:r>
+        <w:t xml:space="preserve">uguale</w:t>
+      </w:r>
+      <w:r>
+        <w:t xml:space="preserve"> </w:t>
+      </w:r>
+      <w:r>
+        <w:t xml:space="preserve">alla</w:t>
+      </w:r>
+      <w:r>
+        <w:t xml:space="preserve"> </w:t>
+      </w:r>
+      <w:r>
+        <w:t xml:space="preserve">gara;</w:t>
+      </w:r>
+      <w:r>
+        <w:t xml:space="preserve"> </w:t>
+      </w:r>
+      <w:r>
+        <w:t xml:space="preserve">il</w:t>
+      </w:r>
+      <w:r>
+        <w:t xml:space="preserve"> </w:t>
+      </w:r>
+      <w:r>
+        <w:t xml:space="preserve">turno</w:t>
+      </w:r>
+      <w:r>
+        <w:t xml:space="preserve"> </w:t>
+      </w:r>
+      <w:r>
         <w:t xml:space="preserve">di</w:t>
       </w:r>
       <w:r>
         <w:t xml:space="preserve"> </w:t>
       </w:r>
       <w:r>
-        <w:t xml:space="preserve">attesa,</w:t>
+        <w:t xml:space="preserve">notte</w:t>
       </w:r>
       <w:r>
         <w:t xml:space="preserve"> </w:t>
       </w:r>
       <w:r>
-        <w:t xml:space="preserve">R-517,</w:t>
+        <w:t xml:space="preserve">prova</w:t>
       </w:r>
       <w:r>
         <w:t xml:space="preserve"> </w:t>
       </w:r>
       <w:r>
-        <w:t xml:space="preserve">pubblicato</w:t>
+        <w:t xml:space="preserve">e</w:t>
       </w:r>
       <w:r>
         <w:t xml:space="preserve"> </w:t>
       </w:r>
       <w:r>
-        <w:t xml:space="preserve">su</w:t>
-      </w:r>
-      <w:r>
-        <w:t xml:space="preserve"> </w:t>
-      </w:r>
-      <w:r>
-        <w:t xml:space="preserve">richiesta</w:t>
-      </w:r>
-      <w:r>
-        <w:t xml:space="preserve"> </w:t>
-      </w:r>
-      <w:r>
-        <w:t xml:space="preserve">di</w:t>
-      </w:r>
-      <w:r>
-        <w:t xml:space="preserve"> </w:t>
-      </w:r>
-      <w:r>
-        <w:t xml:space="preserve">Luigi;</w:t>
-      </w:r>
-      <w:r>
-        <w:t xml:space="preserve"> </w:t>
-      </w:r>
-      <w:r>
-        <w:t xml:space="preserve">la</w:t>
-      </w:r>
-      <w:r>
-        <w:t xml:space="preserve"> </w:t>
-      </w:r>
-      <w:r>
-        <w:t xml:space="preserve">0.26.0</w:t>
-      </w:r>
-      <w:r>
-        <w:t xml:space="preserve"> </w:t>
-      </w:r>
-      <w:r>
-        <w:t xml:space="preserve">scritta</w:t>
-      </w:r>
-      <w:r>
-        <w:t xml:space="preserve"> </w:t>
-      </w:r>
-      <w:r>
-        <w:t xml:space="preserve">alle</w:t>
-      </w:r>
-      <w:r>
-        <w:t xml:space="preserve"> </w:t>
-      </w:r>
-      <w:r>
-        <w:t xml:space="preserve">10</w:t>
-      </w:r>
-      <w:r>
-        <w:t xml:space="preserve"> </w:t>
-      </w:r>
-      <w:r>
-        <w:t xml:space="preserve">sul</w:t>
-      </w:r>
-      <w:r>
-        <w:t xml:space="preserve"> </w:t>
-      </w:r>
-      <w:r>
-        <w:t xml:space="preserve">ramo</w:t>
-      </w:r>
-      <w:r>
-        <w:t xml:space="preserve"> </w:t>
-      </w:r>
-      <w:r>
-        <w:t xml:space="preserve">giorno/2026-10-28-mattina</w:t>
-      </w:r>
-      <w:r>
-        <w:t xml:space="preserve"> </w:t>
-      </w:r>
-      <w:r>
-        <w:t xml:space="preserve">aspetta</w:t>
-      </w:r>
-      <w:r>
-        <w:t xml:space="preserve"> </w:t>
-      </w:r>
-      <w:r>
-        <w:t xml:space="preserve">le</w:t>
-      </w:r>
-      <w:r>
-        <w:t xml:space="preserve"> </w:t>
-      </w:r>
-      <w:r>
-        <w:t xml:space="preserve">prove</w:t>
-      </w:r>
-      <w:r>
-        <w:t xml:space="preserve"> </w:t>
-      </w:r>
-      <w:r>
-        <w:t xml:space="preserve">della</w:t>
-      </w:r>
-      <w:r>
-        <w:t xml:space="preserve"> </w:t>
-      </w:r>
-      <w:r>
-        <w:t xml:space="preserve">notte)</w:t>
+        <w:t xml:space="preserve">pubblica)</w:t>
       </w:r>
       <w:r>
         <w:t xml:space="preserve"> </w:t>
@@ -13103,6 +13235,112 @@
           </w:p>
         </w:tc>
       </w:tr>
+      <w:tr>
+        <w:tc>
+          <w:tcPr>
+            <w:tcW w:type="dxa" w:w="907"/>
+          </w:tcPr>
+          <w:p>
+            <w:pPr>
+              <w:pStyle w:val="Compact"/>
+              <w:spacing w:after="40"/>
+              <w:jc w:val="left"/>
+            </w:pPr>
+            <w:r>
+              <w:rPr>
+                <w:sz w:val="19"/>
+              </w:rPr>
+              <w:t xml:space="preserve">R-516</w:t>
+            </w:r>
+          </w:p>
+        </w:tc>
+        <w:tc>
+          <w:tcPr>
+            <w:tcW w:type="dxa" w:w="4195"/>
+          </w:tcPr>
+          <w:p>
+            <w:pPr>
+              <w:pStyle w:val="Compact"/>
+              <w:spacing w:after="40"/>
+              <w:jc w:val="left"/>
+            </w:pPr>
+            <w:r>
+              <w:rPr>
+                <w:sz w:val="19"/>
+              </w:rPr>
+              <w:t xml:space="preserve">Il PC acceso non deve servire: richieste dal telefono, modifiche e documenti anche a PC spento</w:t>
+            </w:r>
+          </w:p>
+        </w:tc>
+        <w:tc>
+          <w:tcPr>
+            <w:tcW w:type="dxa" w:w="1134"/>
+          </w:tcPr>
+          <w:p>
+            <w:pPr>
+              <w:pStyle w:val="Compact"/>
+              <w:spacing w:after="40"/>
+              <w:jc w:val="left"/>
+            </w:pPr>
+            <w:r>
+              <w:rPr>
+                <w:sz w:val="19"/>
+              </w:rPr>
+              <w:t xml:space="preserve">28/10/2026</w:t>
+            </w:r>
+          </w:p>
+        </w:tc>
+        <w:tc>
+          <w:tcPr>
+            <w:tcW w:type="dxa" w:w="1134"/>
+            <w:shd w:val="clear" w:color="auto" w:fill="D7F0DF"/>
+          </w:tcPr>
+          <w:p>
+            <w:pPr>
+              <w:pStyle w:val="Compact"/>
+              <w:spacing w:after="40"/>
+              <w:jc w:val="left"/>
+            </w:pPr>
+            <w:r>
+              <w:rPr>
+                <w:sz w:val="19"/>
+              </w:rPr>
+              <w:t xml:space="preserve">Fatto</w:t>
+            </w:r>
+          </w:p>
+        </w:tc>
+        <w:tc>
+          <w:tcPr>
+            <w:tcW w:type="dxa" w:w="2494"/>
+          </w:tcPr>
+          <w:p>
+            <w:pPr>
+              <w:pStyle w:val="Compact"/>
+              <w:spacing w:after="40"/>
+              <w:jc w:val="left"/>
+            </w:pPr>
+            <w:r>
+              <w:rPr>
+                <w:sz w:val="19"/>
+              </w:rPr>
+              <w:t xml:space="preserve">Codice, prove, pubblicazione e attività pianificate girano nel cloud. L’unica cosa che passava dal PC era la copia dei Word nella cartella Drive: scelta di Luigi del 28/10 (strada A) è leggerli da GitHub, dove il turno di notte li aggiorna a ogni pubblicazione, con due link fissi in testa ai Prossimi passi (</w:t>
+            </w:r>
+            <w:r>
+              <w:rPr>
+                <w:rStyle w:val="VerbatimChar"/>
+                <w:sz w:val="19"/>
+              </w:rPr>
+              <w:t xml:space="preserve">https://raw.githubusercontent.com/benedettadavinci-beep/cyf-gaming/main/docs/…</w:t>
+            </w:r>
+            <w:r>
+              <w:rPr>
+                <w:sz w:val="19"/>
+              </w:rPr>
+              <w:t xml:space="preserve">, repository pubblico). La cartella Drive resta una copia fatta da una chat quando il PC è acceso. Scartata la strada B (caricarli su Drive dal cloud): il connettore crea un file nuovo ogni volta (link che cambia) e il file passa intero nella conversazione</w:t>
+            </w:r>
+          </w:p>
+        </w:tc>
+      </w:tr>
     </w:tbl>
     <w:bookmarkEnd w:id="28"/>
     <w:bookmarkStart w:id="29" w:name="scelte-fatte-da-claude"/>
@@ -32270,7 +32508,862 @@
       </w:tr>
     </w:tbl>
     <w:bookmarkEnd w:id="59"/>
-    <w:bookmarkStart w:id="60" w:name="storico-delle-versioni"/>
+    <w:bookmarkStart w:id="60" w:name="X5c781273cfb381f4e2b0a0f41f1ddc4d243d73e"/>
+    <w:p>
+      <w:pPr>
+        <w:pStyle w:val="Heading1"/>
+      </w:pPr>
+      <w:r>
+        <w:t xml:space="preserve">14. Simulazione di carico del 28 ottobre 2026 (50 giocatori insieme)</w:t>
+      </w:r>
+    </w:p>
+    <w:p>
+      <w:pPr>
+        <w:pStyle w:val="FirstParagraph"/>
+      </w:pPr>
+      <w:r>
+        <w:t xml:space="preserve">Chiesta da Luigi il 28/10 alle 18:57 (</w:t>
+      </w:r>
+      <w:r>
+        <w:t xml:space="preserve">“</w:t>
+      </w:r>
+      <w:r>
+        <w:t xml:space="preserve">fai simulazione con 50 concorrenti in diverse gare per vedere che succede</w:t>
+      </w:r>
+      <w:r>
+        <w:t xml:space="preserve">”</w:t>
+      </w:r>
+      <w:r>
+        <w:t xml:space="preserve">). Strumento nuovo</w:t>
+      </w:r>
+      <w:r>
+        <w:t xml:space="preserve"> </w:t>
+      </w:r>
+      <w:r>
+        <w:rPr>
+          <w:rStyle w:val="VerbatimChar"/>
+        </w:rPr>
+        <w:t xml:space="preserve">tools/verifica/simulazione.mjs</w:t>
+      </w:r>
+      <w:r>
+        <w:t xml:space="preserve">: 50 client che seguono il protocollo vero (</w:t>
+      </w:r>
+      <w:r>
+        <w:rPr>
+          <w:rStyle w:val="VerbatimChar"/>
+        </w:rPr>
+        <w:t xml:space="preserve">hello</w:t>
+      </w:r>
+      <w:r>
+        <w:t xml:space="preserve">, Parti, caricato, posizioni 10 volte al secondo, arrivo) contro il server locale</w:t>
+      </w:r>
+      <w:r>
+        <w:t xml:space="preserve"> </w:t>
+      </w:r>
+      <w:r>
+        <w:rPr>
+          <w:rStyle w:val="VerbatimChar"/>
+        </w:rPr>
+        <w:t xml:space="preserve">wrangler dev</w:t>
+      </w:r>
+      <w:r>
+        <w:t xml:space="preserve">, con l’attesa della sfida accorciata a 10 s. Il server locale non è la rete di Cloudflare: i numeri dicono che la logica regge, non quanto è veloce la rete vera (dove ogni stanza è un Durable Object a sé, quindi le sale non si rallentano tra loro). Ogni giocatore corre a una velocità diversa (arrivi tra 179 e 235 s), uno corre più veloce del limite fisico (143 s su un minimo di 175).</w:t>
+      </w:r>
+    </w:p>
+    <w:tbl>
+      <w:tblPr>
+        <w:tblStyle w:val="Table"/>
+        <w:tblLook w:firstRow="1" w:lastRow="0" w:firstColumn="0" w:lastColumn="0" w:noHBand="0" w:noVBand="0" w:val="0020"/>
+        <w:jc w:val="start"/>
+        <w:tblBorders>
+          <w:top w:val="single" w:sz="4" w:color="B8C4D2"/>
+          <w:left w:val="single" w:sz="4" w:color="B8C4D2"/>
+          <w:bottom w:val="single" w:sz="4" w:color="B8C4D2"/>
+          <w:right w:val="single" w:sz="4" w:color="B8C4D2"/>
+          <w:insideH w:val="single" w:sz="4" w:color="B8C4D2"/>
+          <w:insideV w:val="single" w:sz="4" w:color="B8C4D2"/>
+        </w:tblBorders>
+        <w:tblW w:w="9865" w:type="dxa"/>
+        <w:tblLayout w:type="fixed"/>
+      </w:tblPr>
+      <w:tblGrid>
+        <w:gridCol w:w="793"/>
+        <w:gridCol w:w="6010"/>
+        <w:gridCol w:w="1247"/>
+        <w:gridCol w:w="1814"/>
+      </w:tblGrid>
+      <w:tr>
+        <w:trPr>
+          <w:tblHeader w:val="true"/>
+        </w:trPr>
+        <w:tc>
+          <w:tcPr>
+            <w:tcW w:type="dxa" w:w="794"/>
+            <w:shd w:val="clear" w:color="auto" w:fill="13233A"/>
+          </w:tcPr>
+          <w:p>
+            <w:pPr>
+              <w:pStyle w:val="Compact"/>
+              <w:spacing w:after="40"/>
+              <w:jc w:val="left"/>
+            </w:pPr>
+            <w:r>
+              <w:rPr>
+                <w:b/>
+                <w:color w:val="FFFFFF"/>
+                <w:sz w:val="19"/>
+              </w:rPr>
+              <w:t xml:space="preserve">Gara</w:t>
+            </w:r>
+          </w:p>
+        </w:tc>
+        <w:tc>
+          <w:tcPr>
+            <w:tcW w:type="dxa" w:w="6009"/>
+            <w:shd w:val="clear" w:color="auto" w:fill="13233A"/>
+          </w:tcPr>
+          <w:p>
+            <w:pPr>
+              <w:pStyle w:val="Compact"/>
+              <w:spacing w:after="40"/>
+              <w:jc w:val="left"/>
+            </w:pPr>
+            <w:r>
+              <w:rPr>
+                <w:b/>
+                <w:color w:val="FFFFFF"/>
+                <w:sz w:val="19"/>
+              </w:rPr>
+              <w:t xml:space="preserve">Che cosa</w:t>
+            </w:r>
+          </w:p>
+        </w:tc>
+        <w:tc>
+          <w:tcPr>
+            <w:tcW w:type="dxa" w:w="1247"/>
+            <w:shd w:val="clear" w:color="auto" w:fill="13233A"/>
+          </w:tcPr>
+          <w:p>
+            <w:pPr>
+              <w:pStyle w:val="Compact"/>
+              <w:spacing w:after="40"/>
+              <w:jc w:val="left"/>
+            </w:pPr>
+            <w:r>
+              <w:rPr>
+                <w:b/>
+                <w:color w:val="FFFFFF"/>
+                <w:sz w:val="19"/>
+              </w:rPr>
+              <w:t xml:space="preserve">Esito</w:t>
+            </w:r>
+          </w:p>
+        </w:tc>
+        <w:tc>
+          <w:tcPr>
+            <w:tcW w:type="dxa" w:w="1814"/>
+            <w:shd w:val="clear" w:color="auto" w:fill="13233A"/>
+          </w:tcPr>
+          <w:p>
+            <w:pPr>
+              <w:pStyle w:val="Compact"/>
+              <w:spacing w:after="40"/>
+              <w:jc w:val="left"/>
+            </w:pPr>
+            <w:r>
+              <w:rPr>
+                <w:b/>
+                <w:color w:val="FFFFFF"/>
+                <w:sz w:val="19"/>
+              </w:rPr>
+              <w:t xml:space="preserve">Numeri</w:t>
+            </w:r>
+          </w:p>
+        </w:tc>
+      </w:tr>
+      <w:tr>
+        <w:tc>
+          <w:tcPr>
+            <w:tcW w:type="dxa" w:w="794"/>
+          </w:tcPr>
+          <w:p>
+            <w:pPr>
+              <w:pStyle w:val="Compact"/>
+              <w:spacing w:after="40"/>
+              <w:jc w:val="left"/>
+            </w:pPr>
+            <w:r>
+              <w:rPr>
+                <w:sz w:val="19"/>
+              </w:rPr>
+              <w:t xml:space="preserve">A · 7 sfide (6 da 7 e 1 da 8)</w:t>
+            </w:r>
+          </w:p>
+        </w:tc>
+        <w:tc>
+          <w:tcPr>
+            <w:tcW w:type="dxa" w:w="6009"/>
+          </w:tcPr>
+          <w:p>
+            <w:pPr>
+              <w:pStyle w:val="Compact"/>
+              <w:spacing w:after="40"/>
+              <w:jc w:val="left"/>
+            </w:pPr>
+            <w:r>
+              <w:rPr>
+                <w:sz w:val="19"/>
+              </w:rPr>
+              <w:t xml:space="preserve">50 collegati insieme, un 9° sulla sala piena,</w:t>
+            </w:r>
+            <w:r>
+              <w:rPr>
+                <w:sz w:val="19"/>
+              </w:rPr>
+              <w:t xml:space="preserve"> </w:t>
+            </w:r>
+            <w:r>
+              <w:rPr>
+                <w:sz w:val="19"/>
+              </w:rPr>
+              <w:t xml:space="preserve">“</w:t>
+            </w:r>
+            <w:r>
+              <w:rPr>
+                <w:sz w:val="19"/>
+              </w:rPr>
+              <w:t xml:space="preserve">Parti</w:t>
+            </w:r>
+            <w:r>
+              <w:rPr>
+                <w:sz w:val="19"/>
+              </w:rPr>
+              <w:t xml:space="preserve">”</w:t>
+            </w:r>
+            <w:r>
+              <w:rPr>
+                <w:sz w:val="19"/>
+              </w:rPr>
+              <w:t xml:space="preserve"> </w:t>
+            </w:r>
+            <w:r>
+              <w:rPr>
+                <w:sz w:val="19"/>
+              </w:rPr>
+              <w:t xml:space="preserve">in tutte le sale, gara completa</w:t>
+            </w:r>
+          </w:p>
+        </w:tc>
+        <w:tc>
+          <w:tcPr>
+            <w:tcW w:type="dxa" w:w="1247"/>
+            <w:shd w:val="clear" w:color="auto" w:fill="D7F0DF"/>
+          </w:tcPr>
+          <w:p>
+            <w:pPr>
+              <w:pStyle w:val="Compact"/>
+              <w:spacing w:after="40"/>
+              <w:jc w:val="left"/>
+            </w:pPr>
+            <w:r>
+              <w:rPr>
+                <w:sz w:val="19"/>
+              </w:rPr>
+              <w:t xml:space="preserve">✓</w:t>
+            </w:r>
+          </w:p>
+        </w:tc>
+        <w:tc>
+          <w:tcPr>
+            <w:tcW w:type="dxa" w:w="1814"/>
+          </w:tcPr>
+          <w:p>
+            <w:pPr>
+              <w:pStyle w:val="Compact"/>
+              <w:spacing w:after="40"/>
+              <w:jc w:val="left"/>
+            </w:pPr>
+            <w:r>
+              <w:rPr>
+                <w:sz w:val="19"/>
+              </w:rPr>
+              <w:t xml:space="preserve">Accolti 50/50 in 315 ms; 9° respinto con</w:t>
+            </w:r>
+            <w:r>
+              <w:rPr>
+                <w:sz w:val="19"/>
+              </w:rPr>
+              <w:t xml:space="preserve"> </w:t>
+            </w:r>
+            <w:r>
+              <w:rPr>
+                <w:rStyle w:val="VerbatimChar"/>
+                <w:sz w:val="19"/>
+              </w:rPr>
+              <w:t xml:space="preserve">full</w:t>
+            </w:r>
+            <w:r>
+              <w:rPr>
+                <w:sz w:val="19"/>
+              </w:rPr>
+              <w:t xml:space="preserve">; conto alla rovescia a 50/50 in 42 ms; via a 50/50; 7 sale finite, risultati a 50/50; 100.806 posizioni inviate (419/s), 620.662 inoltrate su 620.662 attese (100 %); ritardo di inoltro mediana 17 ms, 90 % 34 ms, 99 % 55 ms, massimo 215 ms; 0 connessioni cadute; risultati 28-72 ms dopo l’ultimo arrivo di ogni sala; imbroglione</w:t>
+            </w:r>
+            <w:r>
+              <w:rPr>
+                <w:sz w:val="19"/>
+              </w:rPr>
+              <w:t xml:space="preserve"> </w:t>
+            </w:r>
+            <w:r>
+              <w:rPr>
+                <w:sz w:val="19"/>
+              </w:rPr>
+              <w:t xml:space="preserve">“</w:t>
+            </w:r>
+            <w:r>
+              <w:rPr>
+                <w:sz w:val="19"/>
+              </w:rPr>
+              <w:t xml:space="preserve">non arrivato</w:t>
+            </w:r>
+            <w:r>
+              <w:rPr>
+                <w:sz w:val="19"/>
+              </w:rPr>
+              <w:t xml:space="preserve">”</w:t>
+            </w:r>
+            <w:r>
+              <w:rPr>
+                <w:sz w:val="19"/>
+              </w:rPr>
+              <w:t xml:space="preserve">; punti al 1° 220; maglia della settimana assegnata (Roma); classifica generale con i primi 20 tempi; misure</w:t>
+            </w:r>
+            <w:r>
+              <w:rPr>
+                <w:sz w:val="19"/>
+              </w:rPr>
+              <w:t xml:space="preserve"> </w:t>
+            </w:r>
+            <w:r>
+              <w:rPr>
+                <w:rStyle w:val="VerbatimChar"/>
+                <w:sz w:val="19"/>
+              </w:rPr>
+              <w:t xml:space="preserve">races_started +7</w:t>
+            </w:r>
+            <w:r>
+              <w:rPr>
+                <w:sz w:val="19"/>
+              </w:rPr>
+              <w:t xml:space="preserve">,</w:t>
+            </w:r>
+            <w:r>
+              <w:rPr>
+                <w:sz w:val="19"/>
+              </w:rPr>
+              <w:t xml:space="preserve"> </w:t>
+            </w:r>
+            <w:r>
+              <w:rPr>
+                <w:rStyle w:val="VerbatimChar"/>
+                <w:sz w:val="19"/>
+              </w:rPr>
+              <w:t xml:space="preserve">races_finished +7</w:t>
+            </w:r>
+            <w:r>
+              <w:rPr>
+                <w:sz w:val="19"/>
+              </w:rPr>
+              <w:t xml:space="preserve">,</w:t>
+            </w:r>
+            <w:r>
+              <w:rPr>
+                <w:sz w:val="19"/>
+              </w:rPr>
+              <w:t xml:space="preserve"> </w:t>
+            </w:r>
+            <w:r>
+              <w:rPr>
+                <w:rStyle w:val="VerbatimChar"/>
+                <w:sz w:val="19"/>
+              </w:rPr>
+              <w:t xml:space="preserve">racers +50</w:t>
+            </w:r>
+            <w:r>
+              <w:rPr>
+                <w:sz w:val="19"/>
+              </w:rPr>
+              <w:t xml:space="preserve">,</w:t>
+            </w:r>
+            <w:r>
+              <w:rPr>
+                <w:sz w:val="19"/>
+              </w:rPr>
+              <w:t xml:space="preserve"> </w:t>
+            </w:r>
+            <w:r>
+              <w:rPr>
+                <w:rStyle w:val="VerbatimChar"/>
+                <w:sz w:val="19"/>
+              </w:rPr>
+              <w:t xml:space="preserve">pts_n +50</w:t>
+            </w:r>
+            <w:r>
+              <w:rPr>
+                <w:sz w:val="19"/>
+              </w:rPr>
+              <w:t xml:space="preserve">,</w:t>
+            </w:r>
+            <w:r>
+              <w:rPr>
+                <w:sz w:val="19"/>
+              </w:rPr>
+              <w:t xml:space="preserve"> </w:t>
+            </w:r>
+            <w:r>
+              <w:rPr>
+                <w:rStyle w:val="VerbatimChar"/>
+                <w:sz w:val="19"/>
+              </w:rPr>
+              <w:t xml:space="preserve">settimana_gare +49</w:t>
+            </w:r>
+          </w:p>
+        </w:tc>
+      </w:tr>
+      <w:tr>
+        <w:tc>
+          <w:tcPr>
+            <w:tcW w:type="dxa" w:w="794"/>
+          </w:tcPr>
+          <w:p>
+            <w:pPr>
+              <w:pStyle w:val="Compact"/>
+              <w:spacing w:after="40"/>
+              <w:jc w:val="left"/>
+            </w:pPr>
+            <w:r>
+              <w:rPr>
+                <w:sz w:val="19"/>
+              </w:rPr>
+              <w:t xml:space="preserve">B · sala online, 50 nello stesso istante</w:t>
+            </w:r>
+          </w:p>
+        </w:tc>
+        <w:tc>
+          <w:tcPr>
+            <w:tcW w:type="dxa" w:w="6009"/>
+          </w:tcPr>
+          <w:p>
+            <w:pPr>
+              <w:pStyle w:val="Compact"/>
+              <w:spacing w:after="40"/>
+              <w:jc w:val="left"/>
+            </w:pPr>
+            <w:r>
+              <w:rPr>
+                <w:sz w:val="19"/>
+              </w:rPr>
+              <w:t xml:space="preserve">50</w:t>
+            </w:r>
+            <w:r>
+              <w:rPr>
+                <w:sz w:val="19"/>
+              </w:rPr>
+              <w:t xml:space="preserve"> </w:t>
+            </w:r>
+            <w:r>
+              <w:rPr>
+                <w:rStyle w:val="VerbatimChar"/>
+                <w:sz w:val="19"/>
+              </w:rPr>
+              <w:t xml:space="preserve">/api/quick</w:t>
+            </w:r>
+            <w:r>
+              <w:rPr>
+                <w:sz w:val="19"/>
+              </w:rPr>
+              <w:t xml:space="preserve"> </w:t>
+            </w:r>
+            <w:r>
+              <w:rPr>
+                <w:sz w:val="19"/>
+              </w:rPr>
+              <w:t xml:space="preserve">insieme, poi</w:t>
+            </w:r>
+            <w:r>
+              <w:rPr>
+                <w:sz w:val="19"/>
+              </w:rPr>
+              <w:t xml:space="preserve"> </w:t>
+            </w:r>
+            <w:r>
+              <w:rPr>
+                <w:rStyle w:val="VerbatimChar"/>
+                <w:sz w:val="19"/>
+              </w:rPr>
+              <w:t xml:space="preserve">hello</w:t>
+            </w:r>
+            <w:r>
+              <w:rPr>
+                <w:sz w:val="19"/>
+              </w:rPr>
+              <w:t xml:space="preserve">; chi riceve</w:t>
+            </w:r>
+            <w:r>
+              <w:rPr>
+                <w:sz w:val="19"/>
+              </w:rPr>
+              <w:t xml:space="preserve"> </w:t>
+            </w:r>
+            <w:r>
+              <w:rPr>
+                <w:rStyle w:val="VerbatimChar"/>
+                <w:sz w:val="19"/>
+              </w:rPr>
+              <w:t xml:space="preserve">full</w:t>
+            </w:r>
+            <w:r>
+              <w:rPr>
+                <w:sz w:val="19"/>
+              </w:rPr>
+              <w:t xml:space="preserve"> </w:t>
+            </w:r>
+            <w:r>
+              <w:rPr>
+                <w:sz w:val="19"/>
+              </w:rPr>
+              <w:t xml:space="preserve">riprova una volta</w:t>
+            </w:r>
+          </w:p>
+        </w:tc>
+        <w:tc>
+          <w:tcPr>
+            <w:tcW w:type="dxa" w:w="1247"/>
+          </w:tcPr>
+          <w:p>
+            <w:pPr>
+              <w:pStyle w:val="Compact"/>
+              <w:spacing w:after="40"/>
+              <w:jc w:val="left"/>
+            </w:pPr>
+            <w:r>
+              <w:rPr>
+                <w:sz w:val="19"/>
+              </w:rPr>
+              <w:t xml:space="preserve">✗ → B-04</w:t>
+            </w:r>
+          </w:p>
+        </w:tc>
+        <w:tc>
+          <w:tcPr>
+            <w:tcW w:type="dxa" w:w="1814"/>
+          </w:tcPr>
+          <w:p>
+            <w:pPr>
+              <w:pStyle w:val="Compact"/>
+              <w:spacing w:after="40"/>
+              <w:jc w:val="left"/>
+            </w:pPr>
+            <w:r>
+              <w:rPr>
+                <w:rStyle w:val="VerbatimChar"/>
+                <w:sz w:val="19"/>
+              </w:rPr>
+              <w:t xml:space="preserve">/api/quick</w:t>
+            </w:r>
+            <w:r>
+              <w:rPr>
+                <w:sz w:val="19"/>
+              </w:rPr>
+              <w:t xml:space="preserve"> </w:t>
+            </w:r>
+            <w:r>
+              <w:rPr>
+                <w:sz w:val="19"/>
+              </w:rPr>
+              <w:t xml:space="preserve">risponde ONLINE1 a tutti i 50; 42 respinti al primo tentativo, 32 entrano al secondo (ONLINE2…ONLINE5), 10 restano fuori; i 40 dentro corrono: partenza automatica a 40/40, 100 % delle posizioni (556.500), ritardo mediana 15 ms, 99 % 55 ms, massimo 165 ms; 5 sale finite con i risultati a tutti</w:t>
+            </w:r>
+          </w:p>
+        </w:tc>
+      </w:tr>
+      <w:tr>
+        <w:tc>
+          <w:tcPr>
+            <w:tcW w:type="dxa" w:w="794"/>
+          </w:tcPr>
+          <w:p>
+            <w:pPr>
+              <w:pStyle w:val="Compact"/>
+              <w:spacing w:after="40"/>
+              <w:jc w:val="left"/>
+            </w:pPr>
+            <w:r>
+              <w:rPr>
+                <w:sz w:val="19"/>
+              </w:rPr>
+              <w:t xml:space="preserve">B2 · sala online, un arrivo ogni 300 ms (50 in 15 s)</w:t>
+            </w:r>
+          </w:p>
+        </w:tc>
+        <w:tc>
+          <w:tcPr>
+            <w:tcW w:type="dxa" w:w="6009"/>
+          </w:tcPr>
+          <w:p>
+            <w:pPr>
+              <w:pStyle w:val="Compact"/>
+              <w:spacing w:after="40"/>
+              <w:jc w:val="left"/>
+            </w:pPr>
+            <w:r>
+              <w:rPr>
+                <w:sz w:val="19"/>
+              </w:rPr>
+              <w:t xml:space="preserve">Solo l’ingresso</w:t>
+            </w:r>
+          </w:p>
+        </w:tc>
+        <w:tc>
+          <w:tcPr>
+            <w:tcW w:type="dxa" w:w="1247"/>
+            <w:shd w:val="clear" w:color="auto" w:fill="D7F0DF"/>
+          </w:tcPr>
+          <w:p>
+            <w:pPr>
+              <w:pStyle w:val="Compact"/>
+              <w:spacing w:after="40"/>
+              <w:jc w:val="left"/>
+            </w:pPr>
+            <w:r>
+              <w:rPr>
+                <w:sz w:val="19"/>
+              </w:rPr>
+              <w:t xml:space="preserve">✓</w:t>
+            </w:r>
+          </w:p>
+        </w:tc>
+        <w:tc>
+          <w:tcPr>
+            <w:tcW w:type="dxa" w:w="1814"/>
+          </w:tcPr>
+          <w:p>
+            <w:pPr>
+              <w:pStyle w:val="Compact"/>
+              <w:spacing w:after="40"/>
+              <w:jc w:val="left"/>
+            </w:pPr>
+            <w:r>
+              <w:rPr>
+                <w:sz w:val="19"/>
+              </w:rPr>
+              <w:t xml:space="preserve">ONLINE1…ONLINE6 da 8, ONLINE7 da 2; 0 respinti</w:t>
+            </w:r>
+          </w:p>
+        </w:tc>
+      </w:tr>
+      <w:tr>
+        <w:tc>
+          <w:tcPr>
+            <w:tcW w:type="dxa" w:w="794"/>
+          </w:tcPr>
+          <w:p>
+            <w:pPr>
+              <w:pStyle w:val="Compact"/>
+              <w:spacing w:after="40"/>
+              <w:jc w:val="left"/>
+            </w:pPr>
+            <w:r>
+              <w:rPr>
+                <w:sz w:val="19"/>
+              </w:rPr>
+              <w:t xml:space="preserve">B3 · sala online, un arrivo ogni 100 ms (50 in 5 s)</w:t>
+            </w:r>
+          </w:p>
+        </w:tc>
+        <w:tc>
+          <w:tcPr>
+            <w:tcW w:type="dxa" w:w="6009"/>
+          </w:tcPr>
+          <w:p>
+            <w:pPr>
+              <w:pStyle w:val="Compact"/>
+              <w:spacing w:after="40"/>
+              <w:jc w:val="left"/>
+            </w:pPr>
+            <w:r>
+              <w:rPr>
+                <w:sz w:val="19"/>
+              </w:rPr>
+              <w:t xml:space="preserve">Solo l’ingresso</w:t>
+            </w:r>
+          </w:p>
+        </w:tc>
+        <w:tc>
+          <w:tcPr>
+            <w:tcW w:type="dxa" w:w="1247"/>
+            <w:shd w:val="clear" w:color="auto" w:fill="D7F0DF"/>
+          </w:tcPr>
+          <w:p>
+            <w:pPr>
+              <w:pStyle w:val="Compact"/>
+              <w:spacing w:after="40"/>
+              <w:jc w:val="left"/>
+            </w:pPr>
+            <w:r>
+              <w:rPr>
+                <w:sz w:val="19"/>
+              </w:rPr>
+              <w:t xml:space="preserve">✓</w:t>
+            </w:r>
+          </w:p>
+        </w:tc>
+        <w:tc>
+          <w:tcPr>
+            <w:tcW w:type="dxa" w:w="1814"/>
+          </w:tcPr>
+          <w:p>
+            <w:pPr>
+              <w:pStyle w:val="Compact"/>
+              <w:spacing w:after="40"/>
+              <w:jc w:val="left"/>
+            </w:pPr>
+            <w:r>
+              <w:rPr>
+                <w:sz w:val="19"/>
+              </w:rPr>
+              <w:t xml:space="preserve">Come B2: 0 respinti</w:t>
+            </w:r>
+          </w:p>
+        </w:tc>
+      </w:tr>
+      <w:tr>
+        <w:tc>
+          <w:tcPr>
+            <w:tcW w:type="dxa" w:w="794"/>
+          </w:tcPr>
+          <w:p>
+            <w:pPr>
+              <w:pStyle w:val="Compact"/>
+              <w:spacing w:after="40"/>
+              <w:jc w:val="left"/>
+            </w:pPr>
+            <w:r>
+              <w:rPr>
+                <w:sz w:val="19"/>
+              </w:rPr>
+              <w:t xml:space="preserve">Server locale</w:t>
+            </w:r>
+          </w:p>
+        </w:tc>
+        <w:tc>
+          <w:tcPr>
+            <w:tcW w:type="dxa" w:w="6009"/>
+          </w:tcPr>
+          <w:p>
+            <w:pPr>
+              <w:pStyle w:val="Compact"/>
+              <w:spacing w:after="40"/>
+              <w:jc w:val="left"/>
+            </w:pPr>
+            <w:r>
+              <w:rPr>
+                <w:sz w:val="19"/>
+              </w:rPr>
+              <w:t xml:space="preserve">Memoria e processore di</w:t>
+            </w:r>
+            <w:r>
+              <w:rPr>
+                <w:sz w:val="19"/>
+              </w:rPr>
+              <w:t xml:space="preserve"> </w:t>
+            </w:r>
+            <w:r>
+              <w:rPr>
+                <w:rStyle w:val="VerbatimChar"/>
+                <w:sz w:val="19"/>
+              </w:rPr>
+              <w:t xml:space="preserve">workerd</w:t>
+            </w:r>
+            <w:r>
+              <w:rPr>
+                <w:sz w:val="19"/>
+              </w:rPr>
+              <w:t xml:space="preserve"> </w:t>
+            </w:r>
+            <w:r>
+              <w:rPr>
+                <w:sz w:val="19"/>
+              </w:rPr>
+              <w:t xml:space="preserve">durante le gare</w:t>
+            </w:r>
+          </w:p>
+        </w:tc>
+        <w:tc>
+          <w:tcPr>
+            <w:tcW w:type="dxa" w:w="1247"/>
+          </w:tcPr>
+          <w:p>
+            <w:pPr>
+              <w:pStyle w:val="Compact"/>
+              <w:spacing w:after="40"/>
+              <w:jc w:val="left"/>
+            </w:pPr>
+            <w:r>
+              <w:rPr>
+                <w:sz w:val="19"/>
+              </w:rPr>
+              <w:t xml:space="preserve">✓ (da tenere d’occhio)</w:t>
+            </w:r>
+          </w:p>
+        </w:tc>
+        <w:tc>
+          <w:tcPr>
+            <w:tcW w:type="dxa" w:w="1814"/>
+          </w:tcPr>
+          <w:p>
+            <w:pPr>
+              <w:pStyle w:val="Compact"/>
+              <w:spacing w:after="40"/>
+              <w:jc w:val="left"/>
+            </w:pPr>
+            <w:r>
+              <w:rPr>
+                <w:sz w:val="19"/>
+              </w:rPr>
+              <w:t xml:space="preserve">Processore in media 17 % nella gara A; memoria da 224 MB a 616 MB tra la prima e la terza gara (il server locale tiene tutto in un processo solo; online ogni stanza ha il suo limite di 128 MB e si spegne da sola quando è vuota)</w:t>
+            </w:r>
+          </w:p>
+        </w:tc>
+      </w:tr>
+    </w:tbl>
+    <w:p>
+      <w:pPr>
+        <w:pStyle w:val="BodyText"/>
+      </w:pPr>
+      <w:r>
+        <w:t xml:space="preserve">Che cosa dice: con 50 persone in 7 gare il server non perde messaggi e non rallenta; il limite di 8 per sala, il tempo misurato dal server e il controllo dell’arrivo troppo veloce funzionano anche sotto carico. L’unico punto debole è l’ingresso nella sala online quando molte persone premono</w:t>
+      </w:r>
+      <w:r>
+        <w:t xml:space="preserve"> </w:t>
+      </w:r>
+      <w:r>
+        <w:t xml:space="preserve">“</w:t>
+      </w:r>
+      <w:r>
+        <w:t xml:space="preserve">Online</w:t>
+      </w:r>
+      <w:r>
+        <w:t xml:space="preserve">”</w:t>
+      </w:r>
+      <w:r>
+        <w:t xml:space="preserve"> </w:t>
+      </w:r>
+      <w:r>
+        <w:t xml:space="preserve">nello stesso istante (B-04). Il prossimo passo utile, quando ci saranno giocatori veri, è ripetere la simulazione contro il sito online (serve la riga 1d) per misurare i ritardi della rete vera.</w:t>
+      </w:r>
+    </w:p>
+    <w:bookmarkEnd w:id="60"/>
+    <w:bookmarkStart w:id="61" w:name="storico-delle-versioni"/>
     <w:p>
       <w:pPr>
         <w:pStyle w:val="Heading1"/>
@@ -36920,7 +38013,7 @@
         </w:tc>
       </w:tr>
     </w:tbl>
-    <w:bookmarkEnd w:id="60"/>
+    <w:bookmarkEnd w:id="61"/>
     <w:sectPr>
       <w:pgMar w:left="1020" w:right="1020" w:top="1020" w:bottom="1020"/>
     </w:sectPr>

</xml_diff>

<commit_message>
Regole: dal 29/10 turno unico di notte (verifica, poi implementazione e confronto app), R-512/R-503/R-508
</commit_message>
<xml_diff>
--- a/docs/CYF-Gaming-Requisiti-Implementati-e-Testati.docx
+++ b/docs/CYF-Gaming-Requisiti-Implementati-e-Testati.docx
@@ -850,13 +850,13 @@
           <w:bCs/>
           <w:b/>
         </w:rPr>
-        <w:t xml:space="preserve">La notte si verifica, il pomeriggio alle 17 si implementa</w:t>
+        <w:t xml:space="preserve">Dal 29/10 tutto si fa di notte in un turno unico</w:t>
       </w:r>
       <w:r>
         <w:t xml:space="preserve"> </w:t>
       </w:r>
       <w:r>
-        <w:t xml:space="preserve">(decisione di Luigi del 27/10 sera, R-512). Il turno di notte parte all’1:30 (decisione di Luigi del 27/10; prima 23:07), fa il giro completo, corregge tutti gli errori che le prove e i telefoni dei giocatori mostrano, e pubblica solo se tutto è verde. Il lavoro del giorno sta sui rami</w:t>
+        <w:t xml:space="preserve">(decisione di Luigi del 28/10 alle 22:50, R-512): prima verifica e pubblicazione, poi implementazione e confronto con le altre app. Il turno di notte parte all’1:30 (decisione di Luigi del 27/10; prima 23:07), fa il giro completo, corregge tutti gli errori che le prove e i telefoni dei giocatori mostrano, e pubblica solo se tutto è verde. Il lavoro del giorno sta sui rami</w:t>
       </w:r>
       <w:r>
         <w:t xml:space="preserve"> </w:t>
@@ -960,28 +960,28 @@
           <w:bCs/>
           <w:b/>
         </w:rPr>
-        <w:t xml:space="preserve">Ogni giorno alle 17 l’implementazione (R-512) e verso le 18 il confronto con le altre app</w:t>
+        <w:t xml:space="preserve">Implementazione (R-512) e confronto con le altre app (R-508) dentro il turno di notte</w:t>
+      </w:r>
+      <w:r>
+        <w:t xml:space="preserve">, dopo la pubblicazione: l’attività separata</w:t>
       </w:r>
       <w:r>
         <w:t xml:space="preserve"> </w:t>
       </w:r>
       <w:r>
-        <w:t xml:space="preserve">e cosa manca (R-508), nella stessa attività</w:t>
+        <w:t xml:space="preserve">“</w:t>
+      </w:r>
+      <w:r>
+        <w:t xml:space="preserve">Implementation</w:t>
+      </w:r>
+      <w:r>
+        <w:t xml:space="preserve">”</w:t>
       </w:r>
       <w:r>
         <w:t xml:space="preserve"> </w:t>
       </w:r>
       <w:r>
-        <w:t xml:space="preserve">“</w:t>
-      </w:r>
-      <w:r>
-        <w:t xml:space="preserve">Implementation</w:t>
-      </w:r>
-      <w:r>
-        <w:t xml:space="preserve">”</w:t>
-      </w:r>
-      <w:r>
-        <w:t xml:space="preserve">.</w:t>
+        <w:t xml:space="preserve">(alle 17, poi alle 9) è spenta dal 28/10 sera.</w:t>
       </w:r>
     </w:p>
     <w:p>
@@ -11783,7 +11783,7 @@
               <w:rPr>
                 <w:sz w:val="19"/>
               </w:rPr>
-              <w:t xml:space="preserve">) ogni notte all’1:30 ora italiana (decisione di Luigi del 27/10; prima 21:33, poi 22:59, poi 23:07): giro completo delle prove (A-05), errori dai telefoni, correzione di ogni errore, pubblicazione con tutto verde, rapporto con le misure. Dal 27/10 sera</w:t>
+              <w:t xml:space="preserve">) ogni notte all’1:30 ora italiana (decisione di Luigi del 27/10; prima 21:33, poi 22:59, poi 23:07): giro completo delle prove (A-05), errori dai telefoni, correzione di ogni errore, pubblicazione con tutto verde, rapporto con le misure. Dal 27/10 sera al 28/10 solo verifica (R-512).</w:t>
             </w:r>
             <w:r>
               <w:rPr>
@@ -11797,19 +11797,19 @@
                 <w:b/>
                 <w:sz w:val="19"/>
               </w:rPr>
-              <w:t xml:space="preserve">solo verifica</w:t>
-            </w:r>
-            <w:r>
-              <w:rPr>
-                <w:sz w:val="19"/>
-              </w:rPr>
-              <w:t xml:space="preserve"> </w:t>
-            </w:r>
-            <w:r>
-              <w:rPr>
-                <w:sz w:val="19"/>
-              </w:rPr>
-              <w:t xml:space="preserve">(R-512): niente funzioni nuove, che scrive l’attività delle 17; con il tempo che resta (fino alle 6:30) aggiunge le prove che mancano per il codice scritto di giorno</w:t>
+              <w:t xml:space="preserve">Dal 29/10 turno unico</w:t>
+            </w:r>
+            <w:r>
+              <w:rPr>
+                <w:sz w:val="19"/>
+              </w:rPr>
+              <w:t xml:space="preserve"> </w:t>
+            </w:r>
+            <w:r>
+              <w:rPr>
+                <w:sz w:val="19"/>
+              </w:rPr>
+              <w:t xml:space="preserve">(decisione di Luigi del 28/10 alle 22:50): parte A verifica e pubblicazione (entro le 4 circa), parte B implementazione (circa 50 minuti, provata e pubblicata nella stessa notte se restano almeno 75 minuti alle 6:30), parte C confronto con le altre app (massimo 20 minuti); si ferma entro le 6:30</w:t>
             </w:r>
           </w:p>
         </w:tc>
@@ -12561,7 +12561,7 @@
               <w:rPr>
                 <w:sz w:val="19"/>
               </w:rPr>
-              <w:t xml:space="preserve">), con notifica sul telefono. Dal 27/10 sera è l’attività</w:t>
+              <w:t xml:space="preserve">), con notifica sul telefono. Dal 27/10 sera era l’attività</w:t>
             </w:r>
             <w:r>
               <w:rPr>
@@ -12597,7 +12597,57 @@
               <w:rPr>
                 <w:sz w:val="19"/>
               </w:rPr>
-              <w:t xml:space="preserve">(R-512): alle 17 prima implementa, poi verso le 18 fa il confronto</w:t>
+              <w:t xml:space="preserve">(alle 17, dal 28/10 alle 9).</w:t>
+            </w:r>
+            <w:r>
+              <w:rPr>
+                <w:sz w:val="19"/>
+              </w:rPr>
+              <w:t xml:space="preserve"> </w:t>
+            </w:r>
+            <w:r>
+              <w:rPr>
+                <w:bCs/>
+                <w:b/>
+                <w:sz w:val="19"/>
+              </w:rPr>
+              <w:t xml:space="preserve">Dal 29/10 è la parte C del turno di notte</w:t>
+            </w:r>
+            <w:r>
+              <w:rPr>
+                <w:sz w:val="19"/>
+              </w:rPr>
+              <w:t xml:space="preserve"> </w:t>
+            </w:r>
+            <w:r>
+              <w:rPr>
+                <w:sz w:val="19"/>
+              </w:rPr>
+              <w:t xml:space="preserve">(R-512): dopo l’implementazione, massimo 20 minuti; le proposte nuove entrano in REQUISITI.md come</w:t>
+            </w:r>
+            <w:r>
+              <w:rPr>
+                <w:sz w:val="19"/>
+              </w:rPr>
+              <w:t xml:space="preserve"> </w:t>
+            </w:r>
+            <w:r>
+              <w:rPr>
+                <w:sz w:val="19"/>
+              </w:rPr>
+              <w:t xml:space="preserve">“</w:t>
+            </w:r>
+            <w:r>
+              <w:rPr>
+                <w:sz w:val="19"/>
+              </w:rPr>
+              <w:t xml:space="preserve">Da confermare</w:t>
+            </w:r>
+            <w:r>
+              <w:rPr>
+                <w:sz w:val="19"/>
+              </w:rPr>
+              <w:t xml:space="preserve">”</w:t>
             </w:r>
           </w:p>
         </w:tc>
@@ -13018,7 +13068,21 @@
               <w:rPr>
                 <w:sz w:val="19"/>
               </w:rPr>
-              <w:t xml:space="preserve">La notte si fa la verifica, il pomeriggio alle 5 l’implementazione</w:t>
+              <w:t xml:space="preserve">La notte si fa la verifica, il pomeriggio alle 5 l’implementazione;</w:t>
+            </w:r>
+            <w:r>
+              <w:rPr>
+                <w:sz w:val="19"/>
+              </w:rPr>
+              <w:t xml:space="preserve"> </w:t>
+            </w:r>
+            <w:r>
+              <w:rPr>
+                <w:bCs/>
+                <w:b/>
+                <w:sz w:val="19"/>
+              </w:rPr>
+              <w:t xml:space="preserve">dal 28/10 sera: tutto di notte, in un turno unico</w:t>
             </w:r>
           </w:p>
         </w:tc>
@@ -13036,7 +13100,7 @@
               <w:rPr>
                 <w:sz w:val="19"/>
               </w:rPr>
-              <w:t xml:space="preserve">27/10/2026</w:t>
+              <w:t xml:space="preserve">27/10/2026, aggiornato 28/10</w:t>
             </w:r>
           </w:p>
         </w:tc>
@@ -13071,9 +13135,42 @@
             </w:pPr>
             <w:r>
               <w:rPr>
-                <w:sz w:val="19"/>
-              </w:rPr>
-              <w:t xml:space="preserve">Attività pianificata</w:t>
+                <w:bCs/>
+                <w:b/>
+                <w:sz w:val="19"/>
+              </w:rPr>
+              <w:t xml:space="preserve">Dal 29/10</w:t>
+            </w:r>
+            <w:r>
+              <w:rPr>
+                <w:sz w:val="19"/>
+              </w:rPr>
+              <w:t xml:space="preserve"> </w:t>
+            </w:r>
+            <w:r>
+              <w:rPr>
+                <w:sz w:val="19"/>
+              </w:rPr>
+              <w:t xml:space="preserve">(decisione di Luigi del 28/10 alle 22:50) l’implementazione è la parte B del turno di notte dell’1:30 (R-503): dopo verifica e pubblicazione, ramo</w:t>
+            </w:r>
+            <w:r>
+              <w:rPr>
+                <w:sz w:val="19"/>
+              </w:rPr>
+              <w:t xml:space="preserve"> </w:t>
+            </w:r>
+            <w:r>
+              <w:rPr>
+                <w:rStyle w:val="VerbatimChar"/>
+                <w:sz w:val="19"/>
+              </w:rPr>
+              <w:t xml:space="preserve">giorno/&lt;data&gt;-notte</w:t>
+            </w:r>
+            <w:r>
+              <w:rPr>
+                <w:sz w:val="19"/>
+              </w:rPr>
+              <w:t xml:space="preserve">, stesse priorità di prima (bachi, righe</w:t>
             </w:r>
             <w:r>
               <w:rPr>
@@ -13091,6 +13188,72 @@
               <w:rPr>
                 <w:sz w:val="19"/>
               </w:rPr>
+              <w:t xml:space="preserve">Sì</w:t>
+            </w:r>
+            <w:r>
+              <w:rPr>
+                <w:sz w:val="19"/>
+              </w:rPr>
+              <w:t xml:space="preserve">”</w:t>
+            </w:r>
+            <w:r>
+              <w:rPr>
+                <w:sz w:val="19"/>
+              </w:rPr>
+              <w:t xml:space="preserve">, Da fare approvati), provata e pubblicata nella stessa notte se restano almeno 75 minuti alle 6:30, altrimenti la notte dopo; poi il confronto con le altre app (parte C). L’attività</w:t>
+            </w:r>
+            <w:r>
+              <w:rPr>
+                <w:sz w:val="19"/>
+              </w:rPr>
+              <w:t xml:space="preserve"> </w:t>
+            </w:r>
+            <w:r>
+              <w:rPr>
+                <w:sz w:val="19"/>
+              </w:rPr>
+              <w:t xml:space="preserve">“</w:t>
+            </w:r>
+            <w:r>
+              <w:rPr>
+                <w:sz w:val="19"/>
+              </w:rPr>
+              <w:t xml:space="preserve">Implementation</w:t>
+            </w:r>
+            <w:r>
+              <w:rPr>
+                <w:sz w:val="19"/>
+              </w:rPr>
+              <w:t xml:space="preserve">”</w:t>
+            </w:r>
+            <w:r>
+              <w:rPr>
+                <w:sz w:val="19"/>
+              </w:rPr>
+              <w:t xml:space="preserve"> </w:t>
+            </w:r>
+            <w:r>
+              <w:rPr>
+                <w:sz w:val="19"/>
+              </w:rPr>
+              <w:t xml:space="preserve">è spenta (non cancellata). Prima: attività pianificata</w:t>
+            </w:r>
+            <w:r>
+              <w:rPr>
+                <w:sz w:val="19"/>
+              </w:rPr>
+              <w:t xml:space="preserve"> </w:t>
+            </w:r>
+            <w:r>
+              <w:rPr>
+                <w:sz w:val="19"/>
+              </w:rPr>
+              <w:t xml:space="preserve">“</w:t>
+            </w:r>
+            <w:r>
+              <w:rPr>
+                <w:sz w:val="19"/>
+              </w:rPr>
               <w:t xml:space="preserve">CYF Gaming – Implementation 17:00 (bachi, requisiti, confronto app)</w:t>
             </w:r>
             <w:r>
@@ -13109,7 +13272,7 @@
               <w:rPr>
                 <w:sz w:val="19"/>
               </w:rPr>
-              <w:t xml:space="preserve">ogni giorno alle 16:59: prende il Word «CYF Gaming Requisiti da Implementare o Bachi» (cioè REQUISITI.md) e implementa per priorità: prima i bachi aperti (sezione</w:t>
+              <w:t xml:space="preserve">ogni giorno alle 16:59 (dal 28/10 alle 8:59): prende il Word «CYF Gaming Requisiti da Implementare o Bachi» (cioè REQUISITI.md) e implementa per priorità: prima i bachi aperti (sezione</w:t>
             </w:r>
             <w:r>
               <w:rPr>

</xml_diff>

<commit_message>
Requisiti R-520 (banana 1.500), R-521 (bomba 50), R-522 (immuni a banana e bananone lanciati curvando o in aria), R-523 (rotellina su = frena, giù = accelera), scelta S-54 (bananone); righe 0a-0c per Implementation; regole: Implementation 1:00, Verifica 9:30
Co-Authored-By: Claude Opus 5.5 <noreply@anthropic.com>
Claude-Session: https://claude.ai/code/session_01Xy4XsrTVMEY6TkwueCdYSa
</commit_message>
<xml_diff>
--- a/docs/CYF-Gaming-Requisiti-Implementati-e-Testati.docx
+++ b/docs/CYF-Gaming-Requisiti-Implementati-e-Testati.docx
@@ -105,7 +105,7 @@
         <w:t xml:space="preserve"> </w:t>
       </w:r>
       <w:r>
-        <w:t xml:space="preserve">23:00</w:t>
+        <w:t xml:space="preserve">23:55</w:t>
       </w:r>
       <w:r>
         <w:t xml:space="preserve"> </w:t>
@@ -117,277 +117,343 @@
         <w:t xml:space="preserve"> </w:t>
       </w:r>
       <w:r>
-        <w:t xml:space="preserve">due</w:t>
+        <w:t xml:space="preserve">tre</w:t>
       </w:r>
       <w:r>
         <w:t xml:space="preserve"> </w:t>
       </w:r>
       <w:r>
-        <w:t xml:space="preserve">bachi</w:t>
+        <w:t xml:space="preserve">requisiti</w:t>
       </w:r>
       <w:r>
         <w:t xml:space="preserve"> </w:t>
       </w:r>
       <w:r>
+        <w:t xml:space="preserve">nuovi</w:t>
+      </w:r>
+      <w:r>
+        <w:t xml:space="preserve"> </w:t>
+      </w:r>
+      <w:r>
         <w:t xml:space="preserve">di</w:t>
       </w:r>
       <w:r>
         <w:t xml:space="preserve"> </w:t>
       </w:r>
       <w:r>
-        <w:t xml:space="preserve">Luigi,</w:t>
+        <w:t xml:space="preserve">Luigi</w:t>
       </w:r>
       <w:r>
         <w:t xml:space="preserve"> </w:t>
       </w:r>
       <w:r>
+        <w:t xml:space="preserve">da</w:t>
+      </w:r>
+      <w:r>
+        <w:t xml:space="preserve"> </w:t>
+      </w:r>
+      <w:r>
+        <w:t xml:space="preserve">scrivere</w:t>
+      </w:r>
+      <w:r>
+        <w:t xml:space="preserve"> </w:t>
+      </w:r>
+      <w:r>
+        <w:t xml:space="preserve">stanotte</w:t>
+      </w:r>
+      <w:r>
+        <w:t xml:space="preserve"> </w:t>
+      </w:r>
+      <w:r>
+        <w:t xml:space="preserve">e</w:t>
+      </w:r>
+      <w:r>
+        <w:t xml:space="preserve"> </w:t>
+      </w:r>
+      <w:r>
+        <w:t xml:space="preserve">provare</w:t>
+      </w:r>
+      <w:r>
+        <w:t xml:space="preserve"> </w:t>
+      </w:r>
+      <w:r>
+        <w:t xml:space="preserve">domattina,</w:t>
+      </w:r>
+      <w:r>
+        <w:t xml:space="preserve"> </w:t>
+      </w:r>
+      <w:r>
+        <w:t xml:space="preserve">R-520</w:t>
+      </w:r>
+      <w:r>
+        <w:t xml:space="preserve"> </w:t>
+      </w:r>
+      <w:r>
+        <w:t xml:space="preserve">banana</w:t>
+      </w:r>
+      <w:r>
+        <w:t xml:space="preserve"> </w:t>
+      </w:r>
+      <w:r>
+        <w:t xml:space="preserve">1.500</w:t>
+      </w:r>
+      <w:r>
+        <w:t xml:space="preserve"> </w:t>
+      </w:r>
+      <w:r>
+        <w:t xml:space="preserve">punti,</w:t>
+      </w:r>
+      <w:r>
+        <w:t xml:space="preserve"> </w:t>
+      </w:r>
+      <w:r>
+        <w:t xml:space="preserve">R-521</w:t>
+      </w:r>
+      <w:r>
+        <w:t xml:space="preserve"> </w:t>
+      </w:r>
+      <w:r>
+        <w:t xml:space="preserve">bomba</w:t>
+      </w:r>
+      <w:r>
+        <w:t xml:space="preserve"> </w:t>
+      </w:r>
+      <w:r>
+        <w:t xml:space="preserve">50</w:t>
+      </w:r>
+      <w:r>
+        <w:t xml:space="preserve"> </w:t>
+      </w:r>
+      <w:r>
+        <w:t xml:space="preserve">punti,</w:t>
+      </w:r>
+      <w:r>
+        <w:t xml:space="preserve"> </w:t>
+      </w:r>
+      <w:r>
+        <w:t xml:space="preserve">R-522</w:t>
+      </w:r>
+      <w:r>
+        <w:t xml:space="preserve"> </w:t>
+      </w:r>
+      <w:r>
+        <w:t xml:space="preserve">immuni</w:t>
+      </w:r>
+      <w:r>
+        <w:t xml:space="preserve"> </w:t>
+      </w:r>
+      <w:r>
+        <w:t xml:space="preserve">a</w:t>
+      </w:r>
+      <w:r>
+        <w:t xml:space="preserve"> </w:t>
+      </w:r>
+      <w:r>
+        <w:t xml:space="preserve">banana</w:t>
+      </w:r>
+      <w:r>
+        <w:t xml:space="preserve"> </w:t>
+      </w:r>
+      <w:r>
+        <w:t xml:space="preserve">e</w:t>
+      </w:r>
+      <w:r>
+        <w:t xml:space="preserve"> </w:t>
+      </w:r>
+      <w:r>
+        <w:t xml:space="preserve">bananone</w:t>
+      </w:r>
+      <w:r>
+        <w:t xml:space="preserve"> </w:t>
+      </w:r>
+      <w:r>
+        <w:t xml:space="preserve">lanciati</w:t>
+      </w:r>
+      <w:r>
+        <w:t xml:space="preserve"> </w:t>
+      </w:r>
+      <w:r>
+        <w:t xml:space="preserve">curvando</w:t>
+      </w:r>
+      <w:r>
+        <w:t xml:space="preserve"> </w:t>
+      </w:r>
+      <w:r>
+        <w:t xml:space="preserve">o</w:t>
+      </w:r>
+      <w:r>
+        <w:t xml:space="preserve"> </w:t>
+      </w:r>
+      <w:r>
+        <w:t xml:space="preserve">in</w:t>
+      </w:r>
+      <w:r>
+        <w:t xml:space="preserve"> </w:t>
+      </w:r>
+      <w:r>
+        <w:t xml:space="preserve">aria,</w:t>
+      </w:r>
+      <w:r>
+        <w:t xml:space="preserve"> </w:t>
+      </w:r>
+      <w:r>
+        <w:t xml:space="preserve">più</w:t>
+      </w:r>
+      <w:r>
+        <w:t xml:space="preserve"> </w:t>
+      </w:r>
+      <w:r>
+        <w:t xml:space="preserve">R-523</w:t>
+      </w:r>
+      <w:r>
+        <w:t xml:space="preserve"> </w:t>
+      </w:r>
+      <w:r>
+        <w:t xml:space="preserve">rotellina</w:t>
+      </w:r>
+      <w:r>
+        <w:t xml:space="preserve"> </w:t>
+      </w:r>
+      <w:r>
+        <w:t xml:space="preserve">del</w:t>
+      </w:r>
+      <w:r>
+        <w:t xml:space="preserve"> </w:t>
+      </w:r>
+      <w:r>
+        <w:t xml:space="preserve">telefono</w:t>
+      </w:r>
+      <w:r>
+        <w:t xml:space="preserve"> </w:t>
+      </w:r>
+      <w:r>
+        <w:t xml:space="preserve">su</w:t>
+      </w:r>
+      <w:r>
+        <w:t xml:space="preserve"> </w:t>
+      </w:r>
+      <w:r>
+        <w:t xml:space="preserve">=</w:t>
+      </w:r>
+      <w:r>
+        <w:t xml:space="preserve"> </w:t>
+      </w:r>
+      <w:r>
+        <w:t xml:space="preserve">frena,</w:t>
+      </w:r>
+      <w:r>
+        <w:t xml:space="preserve"> </w:t>
+      </w:r>
+      <w:r>
+        <w:t xml:space="preserve">giù</w:t>
+      </w:r>
+      <w:r>
+        <w:t xml:space="preserve"> </w:t>
+      </w:r>
+      <w:r>
+        <w:t xml:space="preserve">=</w:t>
+      </w:r>
+      <w:r>
+        <w:t xml:space="preserve"> </w:t>
+      </w:r>
+      <w:r>
+        <w:t xml:space="preserve">accelera;</w:t>
+      </w:r>
+      <w:r>
+        <w:t xml:space="preserve"> </w:t>
+      </w:r>
+      <w:r>
+        <w:t xml:space="preserve">prima,</w:t>
+      </w:r>
+      <w:r>
+        <w:t xml:space="preserve"> </w:t>
+      </w:r>
+      <w:r>
         <w:t xml:space="preserve">B-05</w:t>
       </w:r>
       <w:r>
         <w:t xml:space="preserve"> </w:t>
       </w:r>
       <w:r>
-        <w:t xml:space="preserve">classifica</w:t>
+        <w:t xml:space="preserve">e</w:t>
       </w:r>
       <w:r>
         <w:t xml:space="preserve"> </w:t>
       </w:r>
       <w:r>
-        <w:t xml:space="preserve">in</w:t>
+        <w:t xml:space="preserve">B-06</w:t>
       </w:r>
       <w:r>
         <w:t xml:space="preserve"> </w:t>
       </w:r>
       <w:r>
-        <w:t xml:space="preserve">allenamento</w:t>
+        <w:t xml:space="preserve">nella</w:t>
       </w:r>
       <w:r>
         <w:t xml:space="preserve"> </w:t>
       </w:r>
       <w:r>
+        <w:t xml:space="preserve">0.26.1</w:t>
+      </w:r>
+      <w:r>
+        <w:t xml:space="preserve"> </w:t>
+      </w:r>
+      <w:r>
+        <w:t xml:space="preserve">sul</w:t>
+      </w:r>
+      <w:r>
+        <w:t xml:space="preserve"> </w:t>
+      </w:r>
+      <w:r>
+        <w:t xml:space="preserve">ramo</w:t>
+      </w:r>
+      <w:r>
+        <w:t xml:space="preserve"> </w:t>
+      </w:r>
+      <w:r>
+        <w:t xml:space="preserve">giorno/2026-10-28-sera,</w:t>
+      </w:r>
+      <w:r>
+        <w:t xml:space="preserve"> </w:t>
+      </w:r>
+      <w:r>
+        <w:t xml:space="preserve">con</w:t>
+      </w:r>
+      <w:r>
+        <w:t xml:space="preserve"> </w:t>
+      </w:r>
+      <w:r>
+        <w:t xml:space="preserve">la</w:t>
+      </w:r>
+      <w:r>
+        <w:t xml:space="preserve"> </w:t>
+      </w:r>
+      <w:r>
+        <w:t xml:space="preserve">0.26.0</w:t>
+      </w:r>
+      <w:r>
+        <w:t xml:space="preserve"> </w:t>
+      </w:r>
+      <w:r>
         <w:t xml:space="preserve">e</w:t>
       </w:r>
       <w:r>
         <w:t xml:space="preserve"> </w:t>
       </w:r>
       <w:r>
-        <w:t xml:space="preserve">B-06</w:t>
+        <w:t xml:space="preserve">la</w:t>
       </w:r>
       <w:r>
         <w:t xml:space="preserve"> </w:t>
       </w:r>
       <w:r>
-        <w:t xml:space="preserve">alberi</w:t>
+        <w:t xml:space="preserve">pubblicità</w:t>
       </w:r>
       <w:r>
         <w:t xml:space="preserve"> </w:t>
       </w:r>
       <w:r>
-        <w:t xml:space="preserve">davanti</w:t>
-      </w:r>
-      <w:r>
-        <w:t xml:space="preserve"> </w:t>
-      </w:r>
-      <w:r>
-        <w:t xml:space="preserve">ai</w:t>
-      </w:r>
-      <w:r>
-        <w:t xml:space="preserve"> </w:t>
-      </w:r>
-      <w:r>
-        <w:t xml:space="preserve">trampolini,</w:t>
-      </w:r>
-      <w:r>
-        <w:t xml:space="preserve"> </w:t>
-      </w:r>
-      <w:r>
-        <w:t xml:space="preserve">corretti</w:t>
-      </w:r>
-      <w:r>
-        <w:t xml:space="preserve"> </w:t>
-      </w:r>
-      <w:r>
-        <w:t xml:space="preserve">nella</w:t>
-      </w:r>
-      <w:r>
-        <w:t xml:space="preserve"> </w:t>
-      </w:r>
-      <w:r>
-        <w:t xml:space="preserve">0.26.1</w:t>
-      </w:r>
-      <w:r>
-        <w:t xml:space="preserve"> </w:t>
-      </w:r>
-      <w:r>
-        <w:t xml:space="preserve">sul</w:t>
-      </w:r>
-      <w:r>
-        <w:t xml:space="preserve"> </w:t>
-      </w:r>
-      <w:r>
-        <w:t xml:space="preserve">ramo</w:t>
-      </w:r>
-      <w:r>
-        <w:t xml:space="preserve"> </w:t>
-      </w:r>
-      <w:r>
-        <w:t xml:space="preserve">giorno/2026-10-28-sera,</w:t>
-      </w:r>
-      <w:r>
-        <w:t xml:space="preserve"> </w:t>
-      </w:r>
-      <w:r>
-        <w:t xml:space="preserve">che</w:t>
-      </w:r>
-      <w:r>
-        <w:t xml:space="preserve"> </w:t>
-      </w:r>
-      <w:r>
-        <w:t xml:space="preserve">contiene</w:t>
-      </w:r>
-      <w:r>
-        <w:t xml:space="preserve"> </w:t>
-      </w:r>
-      <w:r>
-        <w:t xml:space="preserve">anche</w:t>
-      </w:r>
-      <w:r>
-        <w:t xml:space="preserve"> </w:t>
-      </w:r>
-      <w:r>
-        <w:t xml:space="preserve">la</w:t>
-      </w:r>
-      <w:r>
-        <w:t xml:space="preserve"> </w:t>
-      </w:r>
-      <w:r>
-        <w:t xml:space="preserve">0.26.0</w:t>
-      </w:r>
-      <w:r>
-        <w:t xml:space="preserve"> </w:t>
-      </w:r>
-      <w:r>
-        <w:t xml:space="preserve">della</w:t>
-      </w:r>
-      <w:r>
-        <w:t xml:space="preserve"> </w:t>
-      </w:r>
-      <w:r>
-        <w:t xml:space="preserve">mattina</w:t>
-      </w:r>
-      <w:r>
-        <w:t xml:space="preserve"> </w:t>
-      </w:r>
-      <w:r>
-        <w:t xml:space="preserve">e</w:t>
-      </w:r>
-      <w:r>
-        <w:t xml:space="preserve"> </w:t>
-      </w:r>
-      <w:r>
-        <w:t xml:space="preserve">la</w:t>
-      </w:r>
-      <w:r>
-        <w:t xml:space="preserve"> </w:t>
-      </w:r>
-      <w:r>
-        <w:t xml:space="preserve">pubblicità</w:t>
-      </w:r>
-      <w:r>
-        <w:t xml:space="preserve"> </w:t>
-      </w:r>
-      <w:r>
-        <w:t xml:space="preserve">della</w:t>
-      </w:r>
-      <w:r>
-        <w:t xml:space="preserve"> </w:t>
-      </w:r>
-      <w:r>
-        <w:t xml:space="preserve">0.25.6-0.25.7;</w:t>
-      </w:r>
-      <w:r>
-        <w:t xml:space="preserve"> </w:t>
-      </w:r>
-      <w:r>
-        <w:t xml:space="preserve">nuovo</w:t>
-      </w:r>
-      <w:r>
-        <w:t xml:space="preserve"> </w:t>
-      </w:r>
-      <w:r>
-        <w:t xml:space="preserve">requisito</w:t>
-      </w:r>
-      <w:r>
-        <w:t xml:space="preserve"> </w:t>
-      </w:r>
-      <w:r>
-        <w:t xml:space="preserve">R-519,</w:t>
-      </w:r>
-      <w:r>
-        <w:t xml:space="preserve"> </w:t>
-      </w:r>
-      <w:r>
-        <w:t xml:space="preserve">allenamento</w:t>
-      </w:r>
-      <w:r>
-        <w:t xml:space="preserve"> </w:t>
-      </w:r>
-      <w:r>
-        <w:t xml:space="preserve">uguale</w:t>
-      </w:r>
-      <w:r>
-        <w:t xml:space="preserve"> </w:t>
-      </w:r>
-      <w:r>
-        <w:t xml:space="preserve">alla</w:t>
-      </w:r>
-      <w:r>
-        <w:t xml:space="preserve"> </w:t>
-      </w:r>
-      <w:r>
-        <w:t xml:space="preserve">gara;</w:t>
-      </w:r>
-      <w:r>
-        <w:t xml:space="preserve"> </w:t>
-      </w:r>
-      <w:r>
-        <w:t xml:space="preserve">il</w:t>
-      </w:r>
-      <w:r>
-        <w:t xml:space="preserve"> </w:t>
-      </w:r>
-      <w:r>
-        <w:t xml:space="preserve">turno</w:t>
-      </w:r>
-      <w:r>
-        <w:t xml:space="preserve"> </w:t>
-      </w:r>
-      <w:r>
-        <w:t xml:space="preserve">di</w:t>
-      </w:r>
-      <w:r>
-        <w:t xml:space="preserve"> </w:t>
-      </w:r>
-      <w:r>
-        <w:t xml:space="preserve">notte</w:t>
-      </w:r>
-      <w:r>
-        <w:t xml:space="preserve"> </w:t>
-      </w:r>
-      <w:r>
-        <w:t xml:space="preserve">prova</w:t>
-      </w:r>
-      <w:r>
-        <w:t xml:space="preserve"> </w:t>
-      </w:r>
-      <w:r>
-        <w:t xml:space="preserve">e</w:t>
-      </w:r>
-      <w:r>
-        <w:t xml:space="preserve"> </w:t>
-      </w:r>
-      <w:r>
-        <w:t xml:space="preserve">pubblica)</w:t>
+        <w:t xml:space="preserve">0.25.6-0.25.7)</w:t>
       </w:r>
       <w:r>
         <w:t xml:space="preserve"> </w:t>
@@ -850,13 +916,29 @@
           <w:bCs/>
           <w:b/>
         </w:rPr>
-        <w:t xml:space="preserve">Dal 29/10 tutto si fa di notte in un turno unico</w:t>
+        <w:t xml:space="preserve">Dal 29/10 due attività</w:t>
       </w:r>
       <w:r>
         <w:t xml:space="preserve"> </w:t>
       </w:r>
       <w:r>
-        <w:t xml:space="preserve">(decisione di Luigi del 28/10 alle 22:50, R-512): prima verifica e pubblicazione, poi implementazione e confronto con le altre app. Il turno di notte parte all’1:30 (decisione di Luigi del 27/10; prima 23:07), fa il giro completo, corregge tutti gli errori che le prove e i telefoni dei giocatori mostrano, e pubblica solo se tutto è verde. Il lavoro del giorno sta sui rami</w:t>
+        <w:t xml:space="preserve">(decisione di Luigi del 28/10 alle 23:15, R-512): Implementation all’1:00 scrive il codice nuovo senza prove; la</w:t>
+      </w:r>
+      <w:r>
+        <w:t xml:space="preserve"> </w:t>
+      </w:r>
+      <w:r>
+        <w:rPr>
+          <w:bCs/>
+          <w:b/>
+        </w:rPr>
+        <w:t xml:space="preserve">Verifica alle 9:30</w:t>
+      </w:r>
+      <w:r>
+        <w:t xml:space="preserve"> </w:t>
+      </w:r>
+      <w:r>
+        <w:t xml:space="preserve">è l’unica che lancia le prove: fa il giro completo, corregge tutti gli errori che le prove e i telefoni dei giocatori mostrano, e pubblica solo se tutto è verde ed entro le 14:30 (dopo, la versione online resta ferma per la sera e per il Gran Premio delle 21). Il lavoro del giorno sta sui rami</w:t>
       </w:r>
       <w:r>
         <w:t xml:space="preserve"> </w:t>
@@ -960,28 +1042,13 @@
           <w:bCs/>
           <w:b/>
         </w:rPr>
-        <w:t xml:space="preserve">Implementazione (R-512) e confronto con le altre app (R-508) dentro il turno di notte</w:t>
-      </w:r>
-      <w:r>
-        <w:t xml:space="preserve">, dopo la pubblicazione: l’attività separata</w:t>
+        <w:t xml:space="preserve">Implementazione all’1:00 (R-512), verifica alle 9:30 (R-503), confronto con le altre app dopo la pubblicazione, entro le 15 (R-508).</w:t>
       </w:r>
       <w:r>
         <w:t xml:space="preserve"> </w:t>
       </w:r>
       <w:r>
-        <w:t xml:space="preserve">“</w:t>
-      </w:r>
-      <w:r>
-        <w:t xml:space="preserve">Implementation</w:t>
-      </w:r>
-      <w:r>
-        <w:t xml:space="preserve">”</w:t>
-      </w:r>
-      <w:r>
-        <w:t xml:space="preserve"> </w:t>
-      </w:r>
-      <w:r>
-        <w:t xml:space="preserve">(alle 17, poi alle 9) è spenta dal 28/10 sera.</w:t>
+        <w:t xml:space="preserve">Prima (fino al 28/10): Implementation alle 17, poi alle 9, poi un turno unico di notte all’1:30.</w:t>
       </w:r>
     </w:p>
     <w:p>
@@ -4871,6 +4938,32 @@
               </w:rPr>
               <w:t xml:space="preserve">Banana 50 punti (tasto B), bomba 150 (tasto N), bananone 1.500 (tasto G, R-231); la banana si lancia (pulsante, tasto B, doppio clic o doppio tocco), la bomba si lascia dietro; chi le tocca cade. Fermo: bomba 4 s, banana 2 s, bananone 4 s (R-223, R-231)</w:t>
             </w:r>
+            <w:r>
+              <w:rPr>
+                <w:sz w:val="19"/>
+              </w:rPr>
+              <w:t xml:space="preserve"> </w:t>
+            </w:r>
+            <w:r>
+              <w:rPr>
+                <w:bCs/>
+                <w:b/>
+                <w:sz w:val="19"/>
+              </w:rPr>
+              <w:t xml:space="preserve">Prezzi nuovi da R-520 e R-521 (0.27.0, da scrivere e provare il 29/10):</w:t>
+            </w:r>
+            <w:r>
+              <w:rPr>
+                <w:sz w:val="19"/>
+              </w:rPr>
+              <w:t xml:space="preserve"> </w:t>
+            </w:r>
+            <w:r>
+              <w:rPr>
+                <w:sz w:val="19"/>
+              </w:rPr>
+              <w:t xml:space="preserve">banana 1.500, bomba 50, bananone S-54</w:t>
+            </w:r>
           </w:p>
         </w:tc>
       </w:tr>
@@ -6652,6 +6745,32 @@
               </w:rPr>
               <w:t xml:space="preserve">Zona in basso a destra; la rotellina compare sotto il dito. Più la sposti di lato, più curvi. ▲ accelera (come freccia giù sulla tastiera), ▼ frena; in aria ◀ ▶ avvitamento, ▲ ▼ salto mortale. Provato: stessa velocità della tastiera (21 m/s accelerando, 10 m/s frenando)</w:t>
             </w:r>
+            <w:r>
+              <w:rPr>
+                <w:sz w:val="19"/>
+              </w:rPr>
+              <w:t xml:space="preserve"> </w:t>
+            </w:r>
+            <w:r>
+              <w:rPr>
+                <w:bCs/>
+                <w:b/>
+                <w:sz w:val="19"/>
+              </w:rPr>
+              <w:t xml:space="preserve">Da R-523 (0.27.0, da scrivere e provare il 29/10) al contrario:</w:t>
+            </w:r>
+            <w:r>
+              <w:rPr>
+                <w:sz w:val="19"/>
+              </w:rPr>
+              <w:t xml:space="preserve"> </w:t>
+            </w:r>
+            <w:r>
+              <w:rPr>
+                <w:sz w:val="19"/>
+              </w:rPr>
+              <w:t xml:space="preserve">su frena e il rider si alza un po’, giù accelera e il rider si abbassa, come le frecce della tastiera</w:t>
+            </w:r>
           </w:p>
         </w:tc>
       </w:tr>
@@ -9662,6 +9781,32 @@
                 <w:sz w:val="19"/>
               </w:rPr>
               <w:t xml:space="preserve">. La regola vale per tutti, anche per gli avversari del computer. Come prima, banane, bombe e bananoni appoggiati sulla pista si saltano: in aria non si toccano</w:t>
+            </w:r>
+            <w:r>
+              <w:rPr>
+                <w:sz w:val="19"/>
+              </w:rPr>
+              <w:t xml:space="preserve"> </w:t>
+            </w:r>
+            <w:r>
+              <w:rPr>
+                <w:bCs/>
+                <w:b/>
+                <w:sz w:val="19"/>
+              </w:rPr>
+              <w:t xml:space="preserve">Allargata da R-522 (0.27.0):</w:t>
+            </w:r>
+            <w:r>
+              <w:rPr>
+                <w:sz w:val="19"/>
+              </w:rPr>
+              <w:t xml:space="preserve"> </w:t>
+            </w:r>
+            <w:r>
+              <w:rPr>
+                <w:sz w:val="19"/>
+              </w:rPr>
+              <w:t xml:space="preserve">immuni anche curvando (← o → premuto, rotellina di lato)</w:t>
             </w:r>
           </w:p>
         </w:tc>
@@ -11783,7 +11928,850 @@
               <w:rPr>
                 <w:sz w:val="19"/>
               </w:rPr>
-              <w:t xml:space="preserve">) ogni notte all’1:30 ora italiana (decisione di Luigi del 27/10; prima 21:33, poi 22:59, poi 23:07): giro completo delle prove (A-05), errori dai telefoni, correzione di ogni errore, pubblicazione con tutto verde, rapporto con le misure. Dal 27/10 sera al 28/10 solo verifica (R-512).</w:t>
+              <w:t xml:space="preserve">) ogni notte all’1:30 ora italiana (decisione di Luigi del 27/10; prima 21:33, poi 22:59, poi 23:07): giro completo delle prove (A-05), errori dai telefoni, correzione di ogni errore, pubblicazione con tutto verde, rapporto con le misure. Dal 27/10 sera al 28/10 solo verifica (R-512). **Dal 29/10 (decisione di Luigi del 28/10 alle 23:15) attività</w:t>
+            </w:r>
+            <w:r>
+              <w:rPr>
+                <w:sz w:val="19"/>
+              </w:rPr>
+              <w:t xml:space="preserve"> </w:t>
+            </w:r>
+            <w:r>
+              <w:rPr>
+                <w:sz w:val="19"/>
+              </w:rPr>
+              <w:t xml:space="preserve">“</w:t>
+            </w:r>
+            <w:r>
+              <w:rPr>
+                <w:sz w:val="19"/>
+              </w:rPr>
+              <w:t xml:space="preserve">CYF Gaming – Verifica 09:30 (prove, correzioni, pubblicazione entro le 14:30, poi confronto app)</w:t>
+            </w:r>
+            <w:r>
+              <w:rPr>
+                <w:sz w:val="19"/>
+              </w:rPr>
+              <w:t xml:space="preserve">”</w:t>
+            </w:r>
+            <w:r>
+              <w:rPr>
+                <w:sz w:val="19"/>
+              </w:rPr>
+              <w:t xml:space="preserve"> </w:t>
+            </w:r>
+            <w:r>
+              <w:rPr>
+                <w:sz w:val="19"/>
+              </w:rPr>
+              <w:t xml:space="preserve">ogni giorno alle 9:30, massimo 5 ore: unisce i rami</w:t>
+            </w:r>
+            <w:r>
+              <w:rPr>
+                <w:sz w:val="19"/>
+              </w:rPr>
+              <w:t xml:space="preserve"> </w:t>
+            </w:r>
+            <w:r>
+              <w:rPr>
+                <w:rStyle w:val="VerbatimChar"/>
+                <w:sz w:val="19"/>
+              </w:rPr>
+              <w:t xml:space="preserve">giorno/*</w:t>
+            </w:r>
+            <w:r>
+              <w:rPr>
+                <w:sz w:val="19"/>
+              </w:rPr>
+              <w:t xml:space="preserve">, aggiunge le prove lasciate da Implementation, giro completo, correzioni, pubblicazione solo con tutto verde ed entro le 14:30, poi il confronto con le altre app. Deciso prima e mai partito: turno unico (decisione di Luigi del 28/10 alle 22:50): parte A verifica e pubblicazione (entro le 4 circa), parte B implementazione (circa 50 minuti, provata e pubblicata nella stessa notte se restano almeno 75 minuti alle 6:30), parte C confronto con le altre app (massimo 20 minuti); si ferma entro le 6:30</w:t>
+            </w:r>
+          </w:p>
+        </w:tc>
+      </w:tr>
+      <w:tr>
+        <w:tc>
+          <w:tcPr>
+            <w:tcW w:type="dxa" w:w="907"/>
+          </w:tcPr>
+          <w:p>
+            <w:pPr>
+              <w:pStyle w:val="Compact"/>
+              <w:spacing w:after="40"/>
+              <w:jc w:val="left"/>
+            </w:pPr>
+            <w:r>
+              <w:rPr>
+                <w:sz w:val="19"/>
+              </w:rPr>
+              <w:t xml:space="preserve">R-504</w:t>
+            </w:r>
+          </w:p>
+        </w:tc>
+        <w:tc>
+          <w:tcPr>
+            <w:tcW w:type="dxa" w:w="4195"/>
+          </w:tcPr>
+          <w:p>
+            <w:pPr>
+              <w:pStyle w:val="Compact"/>
+              <w:spacing w:after="40"/>
+              <w:jc w:val="left"/>
+            </w:pPr>
+            <w:r>
+              <w:rPr>
+                <w:sz w:val="19"/>
+              </w:rPr>
+              <w:t xml:space="preserve">Migliorare la descrizione del documento Word e delle tabelle</w:t>
+            </w:r>
+          </w:p>
+        </w:tc>
+        <w:tc>
+          <w:tcPr>
+            <w:tcW w:type="dxa" w:w="1134"/>
+          </w:tcPr>
+          <w:p>
+            <w:pPr>
+              <w:pStyle w:val="Compact"/>
+              <w:spacing w:after="40"/>
+              <w:jc w:val="left"/>
+            </w:pPr>
+            <w:r>
+              <w:rPr>
+                <w:sz w:val="19"/>
+              </w:rPr>
+              <w:t xml:space="preserve">24/10/2026</w:t>
+            </w:r>
+          </w:p>
+        </w:tc>
+        <w:tc>
+          <w:tcPr>
+            <w:tcW w:type="dxa" w:w="1134"/>
+            <w:shd w:val="clear" w:color="auto" w:fill="D7F0DF"/>
+          </w:tcPr>
+          <w:p>
+            <w:pPr>
+              <w:pStyle w:val="Compact"/>
+              <w:spacing w:after="40"/>
+              <w:jc w:val="left"/>
+            </w:pPr>
+            <w:r>
+              <w:rPr>
+                <w:sz w:val="19"/>
+              </w:rPr>
+              <w:t xml:space="preserve">Fatto</w:t>
+            </w:r>
+          </w:p>
+        </w:tc>
+        <w:tc>
+          <w:tcPr>
+            <w:tcW w:type="dxa" w:w="2494"/>
+          </w:tcPr>
+          <w:p>
+            <w:pPr>
+              <w:pStyle w:val="Compact"/>
+              <w:spacing w:after="40"/>
+              <w:jc w:val="left"/>
+            </w:pPr>
+            <w:r>
+              <w:rPr>
+                <w:sz w:val="19"/>
+              </w:rPr>
+              <w:t xml:space="preserve">Introduzione, legenda e colonne riscritte; colonna</w:t>
+            </w:r>
+            <w:r>
+              <w:rPr>
+                <w:sz w:val="19"/>
+              </w:rPr>
+              <w:t xml:space="preserve"> </w:t>
+            </w:r>
+            <w:r>
+              <w:rPr>
+                <w:sz w:val="19"/>
+              </w:rPr>
+              <w:t xml:space="preserve">“</w:t>
+            </w:r>
+            <w:r>
+              <w:rPr>
+                <w:sz w:val="19"/>
+              </w:rPr>
+              <w:t xml:space="preserve">Come funziona oggi</w:t>
+            </w:r>
+            <w:r>
+              <w:rPr>
+                <w:sz w:val="19"/>
+              </w:rPr>
+              <w:t xml:space="preserve">”</w:t>
+            </w:r>
+          </w:p>
+        </w:tc>
+      </w:tr>
+      <w:tr>
+        <w:tc>
+          <w:tcPr>
+            <w:tcW w:type="dxa" w:w="907"/>
+          </w:tcPr>
+          <w:p>
+            <w:pPr>
+              <w:pStyle w:val="Compact"/>
+              <w:spacing w:after="40"/>
+              <w:jc w:val="left"/>
+            </w:pPr>
+            <w:r>
+              <w:rPr>
+                <w:sz w:val="19"/>
+              </w:rPr>
+              <w:t xml:space="preserve">R-505</w:t>
+            </w:r>
+          </w:p>
+        </w:tc>
+        <w:tc>
+          <w:tcPr>
+            <w:tcW w:type="dxa" w:w="4195"/>
+          </w:tcPr>
+          <w:p>
+            <w:pPr>
+              <w:pStyle w:val="Compact"/>
+              <w:spacing w:after="40"/>
+              <w:jc w:val="left"/>
+            </w:pPr>
+            <w:r>
+              <w:rPr>
+                <w:sz w:val="19"/>
+              </w:rPr>
+              <w:t xml:space="preserve">Business plan con aspetti economici e strategia aziendale, in un file separato</w:t>
+            </w:r>
+          </w:p>
+        </w:tc>
+        <w:tc>
+          <w:tcPr>
+            <w:tcW w:type="dxa" w:w="1134"/>
+          </w:tcPr>
+          <w:p>
+            <w:pPr>
+              <w:pStyle w:val="Compact"/>
+              <w:spacing w:after="40"/>
+              <w:jc w:val="left"/>
+            </w:pPr>
+            <w:r>
+              <w:rPr>
+                <w:sz w:val="19"/>
+              </w:rPr>
+              <w:t xml:space="preserve">24/10/2026</w:t>
+            </w:r>
+          </w:p>
+        </w:tc>
+        <w:tc>
+          <w:tcPr>
+            <w:tcW w:type="dxa" w:w="1134"/>
+            <w:shd w:val="clear" w:color="auto" w:fill="D7F0DF"/>
+          </w:tcPr>
+          <w:p>
+            <w:pPr>
+              <w:pStyle w:val="Compact"/>
+              <w:spacing w:after="40"/>
+              <w:jc w:val="left"/>
+            </w:pPr>
+            <w:r>
+              <w:rPr>
+                <w:sz w:val="19"/>
+              </w:rPr>
+              <w:t xml:space="preserve">Fatto</w:t>
+            </w:r>
+          </w:p>
+        </w:tc>
+        <w:tc>
+          <w:tcPr>
+            <w:tcW w:type="dxa" w:w="2494"/>
+          </w:tcPr>
+          <w:p>
+            <w:pPr>
+              <w:pStyle w:val="Compact"/>
+              <w:spacing w:after="40"/>
+              <w:jc w:val="left"/>
+            </w:pPr>
+            <w:r>
+              <w:rPr>
+                <w:sz w:val="19"/>
+              </w:rPr>
+              <w:t xml:space="preserve">CYF-Gaming-business-plan.docx nella cartella sul Desktop</w:t>
+            </w:r>
+          </w:p>
+        </w:tc>
+      </w:tr>
+      <w:tr>
+        <w:tc>
+          <w:tcPr>
+            <w:tcW w:type="dxa" w:w="907"/>
+          </w:tcPr>
+          <w:p>
+            <w:pPr>
+              <w:pStyle w:val="Compact"/>
+              <w:spacing w:after="40"/>
+              <w:jc w:val="left"/>
+            </w:pPr>
+            <w:r>
+              <w:rPr>
+                <w:sz w:val="19"/>
+              </w:rPr>
+              <w:t xml:space="preserve">R-506</w:t>
+            </w:r>
+          </w:p>
+        </w:tc>
+        <w:tc>
+          <w:tcPr>
+            <w:tcW w:type="dxa" w:w="4195"/>
+          </w:tcPr>
+          <w:p>
+            <w:pPr>
+              <w:pStyle w:val="Compact"/>
+              <w:spacing w:after="40"/>
+              <w:jc w:val="left"/>
+            </w:pPr>
+            <w:r>
+              <w:rPr>
+                <w:sz w:val="19"/>
+              </w:rPr>
+              <w:t xml:space="preserve">Nessuna prova di giorno se Luigi non lo chiede chiaramente: le prove si fanno di notte, dopo le 23, sfruttando al massimo la notte; gli errori che il sistema vede vanno corretti (P-02)</w:t>
+            </w:r>
+          </w:p>
+        </w:tc>
+        <w:tc>
+          <w:tcPr>
+            <w:tcW w:type="dxa" w:w="1134"/>
+          </w:tcPr>
+          <w:p>
+            <w:pPr>
+              <w:pStyle w:val="Compact"/>
+              <w:spacing w:after="40"/>
+              <w:jc w:val="left"/>
+            </w:pPr>
+            <w:r>
+              <w:rPr>
+                <w:sz w:val="19"/>
+              </w:rPr>
+              <w:t xml:space="preserve">25/10/2026, aggiornato 26/10</w:t>
+            </w:r>
+          </w:p>
+        </w:tc>
+        <w:tc>
+          <w:tcPr>
+            <w:tcW w:type="dxa" w:w="1134"/>
+            <w:shd w:val="clear" w:color="auto" w:fill="D7F0DF"/>
+          </w:tcPr>
+          <w:p>
+            <w:pPr>
+              <w:pStyle w:val="Compact"/>
+              <w:spacing w:after="40"/>
+              <w:jc w:val="left"/>
+            </w:pPr>
+            <w:r>
+              <w:rPr>
+                <w:sz w:val="19"/>
+              </w:rPr>
+              <w:t xml:space="preserve">Fatto</w:t>
+            </w:r>
+          </w:p>
+        </w:tc>
+        <w:tc>
+          <w:tcPr>
+            <w:tcW w:type="dxa" w:w="2494"/>
+          </w:tcPr>
+          <w:p>
+            <w:pPr>
+              <w:pStyle w:val="Compact"/>
+              <w:spacing w:after="40"/>
+              <w:jc w:val="left"/>
+            </w:pPr>
+            <w:r>
+              <w:rPr>
+                <w:sz w:val="19"/>
+              </w:rPr>
+              <w:t xml:space="preserve">Dal 26/10 sera. Di giorno Claude non lancia prove (né</w:t>
+            </w:r>
+            <w:r>
+              <w:rPr>
+                <w:sz w:val="19"/>
+              </w:rPr>
+              <w:t xml:space="preserve"> </w:t>
+            </w:r>
+            <w:r>
+              <w:rPr>
+                <w:rStyle w:val="VerbatimChar"/>
+                <w:sz w:val="19"/>
+              </w:rPr>
+              <w:t xml:space="preserve">npm test</w:t>
+            </w:r>
+            <w:r>
+              <w:rPr>
+                <w:sz w:val="19"/>
+              </w:rPr>
+              <w:t xml:space="preserve"> </w:t>
+            </w:r>
+            <w:r>
+              <w:rPr>
+                <w:sz w:val="19"/>
+              </w:rPr>
+              <w:t xml:space="preserve">né altre): scrive requisiti e codice su un ramo</w:t>
+            </w:r>
+            <w:r>
+              <w:rPr>
+                <w:sz w:val="19"/>
+              </w:rPr>
+              <w:t xml:space="preserve"> </w:t>
+            </w:r>
+            <w:r>
+              <w:rPr>
+                <w:rStyle w:val="VerbatimChar"/>
+                <w:sz w:val="19"/>
+              </w:rPr>
+              <w:t xml:space="preserve">giorno/&lt;nome&gt;</w:t>
+            </w:r>
+            <w:r>
+              <w:rPr>
+                <w:sz w:val="19"/>
+              </w:rPr>
+              <w:t xml:space="preserve">, dove il cancello di GitHub non parte (</w:t>
+            </w:r>
+            <w:r>
+              <w:rPr>
+                <w:rStyle w:val="VerbatimChar"/>
+                <w:sz w:val="19"/>
+              </w:rPr>
+              <w:t xml:space="preserve">branches-ignore</w:t>
+            </w:r>
+            <w:r>
+              <w:rPr>
+                <w:sz w:val="19"/>
+              </w:rPr>
+              <w:t xml:space="preserve"> </w:t>
+            </w:r>
+            <w:r>
+              <w:rPr>
+                <w:sz w:val="19"/>
+              </w:rPr>
+              <w:t xml:space="preserve">in</w:t>
+            </w:r>
+            <w:r>
+              <w:rPr>
+                <w:sz w:val="19"/>
+              </w:rPr>
+              <w:t xml:space="preserve"> </w:t>
+            </w:r>
+            <w:r>
+              <w:rPr>
+                <w:rStyle w:val="VerbatimChar"/>
+                <w:sz w:val="19"/>
+              </w:rPr>
+              <w:t xml:space="preserve">.github/workflows/cancello.yml</w:t>
+            </w:r>
+            <w:r>
+              <w:rPr>
+                <w:sz w:val="19"/>
+              </w:rPr>
+              <w:t xml:space="preserve">, dalla 0.20.2). Il turno di notte (R-503, dal 27/10 parte all’1:30, fino alle 6:30) unisce i rami, prova, corregge e pubblica: le novità vanno online la mattina dopo. Se Luigi scrive</w:t>
+            </w:r>
+            <w:r>
+              <w:rPr>
+                <w:sz w:val="19"/>
+              </w:rPr>
+              <w:t xml:space="preserve"> </w:t>
+            </w:r>
+            <w:r>
+              <w:rPr>
+                <w:sz w:val="19"/>
+              </w:rPr>
+              <w:t xml:space="preserve">“</w:t>
+            </w:r>
+            <w:r>
+              <w:rPr>
+                <w:sz w:val="19"/>
+              </w:rPr>
+              <w:t xml:space="preserve">pubblica adesso</w:t>
+            </w:r>
+            <w:r>
+              <w:rPr>
+                <w:sz w:val="19"/>
+              </w:rPr>
+              <w:t xml:space="preserve">”</w:t>
+            </w:r>
+            <w:r>
+              <w:rPr>
+                <w:sz w:val="19"/>
+              </w:rPr>
+              <w:t xml:space="preserve"> </w:t>
+            </w:r>
+            <w:r>
+              <w:rPr>
+                <w:sz w:val="19"/>
+              </w:rPr>
+              <w:t xml:space="preserve">o</w:t>
+            </w:r>
+            <w:r>
+              <w:rPr>
+                <w:sz w:val="19"/>
+              </w:rPr>
+              <w:t xml:space="preserve"> </w:t>
+            </w:r>
+            <w:r>
+              <w:rPr>
+                <w:sz w:val="19"/>
+              </w:rPr>
+              <w:t xml:space="preserve">“</w:t>
+            </w:r>
+            <w:r>
+              <w:rPr>
+                <w:sz w:val="19"/>
+              </w:rPr>
+              <w:t xml:space="preserve">fallo ora</w:t>
+            </w:r>
+            <w:r>
+              <w:rPr>
+                <w:sz w:val="19"/>
+              </w:rPr>
+              <w:t xml:space="preserve">”</w:t>
+            </w:r>
+            <w:r>
+              <w:rPr>
+                <w:sz w:val="19"/>
+              </w:rPr>
+              <w:t xml:space="preserve">, si fanno le prove e si pubblica subito (S-42). Fino al 26/10 di giorno girava il cancello rapido</w:t>
+            </w:r>
+          </w:p>
+        </w:tc>
+      </w:tr>
+      <w:tr>
+        <w:tc>
+          <w:tcPr>
+            <w:tcW w:type="dxa" w:w="907"/>
+          </w:tcPr>
+          <w:p>
+            <w:pPr>
+              <w:pStyle w:val="Compact"/>
+              <w:spacing w:after="40"/>
+              <w:jc w:val="left"/>
+            </w:pPr>
+            <w:r>
+              <w:rPr>
+                <w:sz w:val="19"/>
+              </w:rPr>
+              <w:t xml:space="preserve">R-507</w:t>
+            </w:r>
+          </w:p>
+        </w:tc>
+        <w:tc>
+          <w:tcPr>
+            <w:tcW w:type="dxa" w:w="4195"/>
+          </w:tcPr>
+          <w:p>
+            <w:pPr>
+              <w:pStyle w:val="Compact"/>
+              <w:spacing w:after="40"/>
+              <w:jc w:val="left"/>
+            </w:pPr>
+            <w:r>
+              <w:rPr>
+                <w:sz w:val="19"/>
+              </w:rPr>
+              <w:t xml:space="preserve">Nel Word i prossimi passi all’inizio, poi tutto quello che è fatto; il Word si aggiorna da solo a ogni cosa fatta</w:t>
+            </w:r>
+          </w:p>
+        </w:tc>
+        <w:tc>
+          <w:tcPr>
+            <w:tcW w:type="dxa" w:w="1134"/>
+          </w:tcPr>
+          <w:p>
+            <w:pPr>
+              <w:pStyle w:val="Compact"/>
+              <w:spacing w:after="40"/>
+              <w:jc w:val="left"/>
+            </w:pPr>
+            <w:r>
+              <w:rPr>
+                <w:sz w:val="19"/>
+              </w:rPr>
+              <w:t xml:space="preserve">26/10/2026</w:t>
+            </w:r>
+          </w:p>
+        </w:tc>
+        <w:tc>
+          <w:tcPr>
+            <w:tcW w:type="dxa" w:w="1134"/>
+            <w:shd w:val="clear" w:color="auto" w:fill="D7F0DF"/>
+          </w:tcPr>
+          <w:p>
+            <w:pPr>
+              <w:pStyle w:val="Compact"/>
+              <w:spacing w:after="40"/>
+              <w:jc w:val="left"/>
+            </w:pPr>
+            <w:r>
+              <w:rPr>
+                <w:sz w:val="19"/>
+              </w:rPr>
+              <w:t xml:space="preserve">Fatto</w:t>
+            </w:r>
+          </w:p>
+        </w:tc>
+        <w:tc>
+          <w:tcPr>
+            <w:tcW w:type="dxa" w:w="2494"/>
+          </w:tcPr>
+          <w:p>
+            <w:pPr>
+              <w:pStyle w:val="Compact"/>
+              <w:spacing w:after="40"/>
+              <w:jc w:val="left"/>
+            </w:pPr>
+            <w:r>
+              <w:rPr>
+                <w:sz w:val="19"/>
+              </w:rPr>
+              <w:t xml:space="preserve">Dalla 0.20.1: sezioni</w:t>
+            </w:r>
+            <w:r>
+              <w:rPr>
+                <w:sz w:val="19"/>
+              </w:rPr>
+              <w:t xml:space="preserve"> </w:t>
+            </w:r>
+            <w:r>
+              <w:rPr>
+                <w:sz w:val="19"/>
+              </w:rPr>
+              <w:t xml:space="preserve">“</w:t>
+            </w:r>
+            <w:r>
+              <w:rPr>
+                <w:sz w:val="19"/>
+              </w:rPr>
+              <w:t xml:space="preserve">Prossimi passi</w:t>
+            </w:r>
+            <w:r>
+              <w:rPr>
+                <w:sz w:val="19"/>
+              </w:rPr>
+              <w:t xml:space="preserve">”</w:t>
+            </w:r>
+            <w:r>
+              <w:rPr>
+                <w:sz w:val="19"/>
+              </w:rPr>
+              <w:t xml:space="preserve"> </w:t>
+            </w:r>
+            <w:r>
+              <w:rPr>
+                <w:sz w:val="19"/>
+              </w:rPr>
+              <w:t xml:space="preserve">e</w:t>
+            </w:r>
+            <w:r>
+              <w:rPr>
+                <w:sz w:val="19"/>
+              </w:rPr>
+              <w:t xml:space="preserve"> </w:t>
+            </w:r>
+            <w:r>
+              <w:rPr>
+                <w:sz w:val="19"/>
+              </w:rPr>
+              <w:t xml:space="preserve">“</w:t>
+            </w:r>
+            <w:r>
+              <w:rPr>
+                <w:sz w:val="19"/>
+              </w:rPr>
+              <w:t xml:space="preserve">Regole di lavoro</w:t>
+            </w:r>
+            <w:r>
+              <w:rPr>
+                <w:sz w:val="19"/>
+              </w:rPr>
+              <w:t xml:space="preserve">”</w:t>
+            </w:r>
+            <w:r>
+              <w:rPr>
+                <w:sz w:val="19"/>
+              </w:rPr>
+              <w:t xml:space="preserve"> </w:t>
+            </w:r>
+            <w:r>
+              <w:rPr>
+                <w:sz w:val="19"/>
+              </w:rPr>
+              <w:t xml:space="preserve">in testa. Dal 27/10 (R-511) i prossimi passi sono in testa al Word «da Implementare o Bachi» e le regole di lavoro in testa a quello «Implementati e Testati»; i Word sono in</w:t>
+            </w:r>
+            <w:r>
+              <w:rPr>
+                <w:sz w:val="19"/>
+              </w:rPr>
+              <w:t xml:space="preserve"> </w:t>
+            </w:r>
+            <w:r>
+              <w:rPr>
+                <w:rStyle w:val="VerbatimChar"/>
+                <w:sz w:val="19"/>
+              </w:rPr>
+              <w:t xml:space="preserve">docs/</w:t>
+            </w:r>
+            <w:r>
+              <w:rPr>
+                <w:sz w:val="19"/>
+              </w:rPr>
+              <w:t xml:space="preserve">; su Google Drive li copia una chat collegata al PC di casa (l’attività automatica delle 7:13, 13:13 e 19:13 è stata tolta da Luigi il 27/10 sera)</w:t>
+            </w:r>
+          </w:p>
+        </w:tc>
+      </w:tr>
+      <w:tr>
+        <w:tc>
+          <w:tcPr>
+            <w:tcW w:type="dxa" w:w="907"/>
+          </w:tcPr>
+          <w:p>
+            <w:pPr>
+              <w:pStyle w:val="Compact"/>
+              <w:spacing w:after="40"/>
+              <w:jc w:val="left"/>
+            </w:pPr>
+            <w:r>
+              <w:rPr>
+                <w:sz w:val="19"/>
+              </w:rPr>
+              <w:t xml:space="preserve">R-508</w:t>
+            </w:r>
+          </w:p>
+        </w:tc>
+        <w:tc>
+          <w:tcPr>
+            <w:tcW w:type="dxa" w:w="4195"/>
+          </w:tcPr>
+          <w:p>
+            <w:pPr>
+              <w:pStyle w:val="Compact"/>
+              <w:spacing w:after="40"/>
+              <w:jc w:val="left"/>
+            </w:pPr>
+            <w:r>
+              <w:rPr>
+                <w:sz w:val="19"/>
+              </w:rPr>
+              <w:t xml:space="preserve">Verso le 18 un confronto con le altre app e cosa manca per migliorare</w:t>
+            </w:r>
+          </w:p>
+        </w:tc>
+        <w:tc>
+          <w:tcPr>
+            <w:tcW w:type="dxa" w:w="1134"/>
+          </w:tcPr>
+          <w:p>
+            <w:pPr>
+              <w:pStyle w:val="Compact"/>
+              <w:spacing w:after="40"/>
+              <w:jc w:val="left"/>
+            </w:pPr>
+            <w:r>
+              <w:rPr>
+                <w:sz w:val="19"/>
+              </w:rPr>
+              <w:t xml:space="preserve">26/10/2026</w:t>
+            </w:r>
+          </w:p>
+        </w:tc>
+        <w:tc>
+          <w:tcPr>
+            <w:tcW w:type="dxa" w:w="1134"/>
+            <w:shd w:val="clear" w:color="auto" w:fill="D7F0DF"/>
+          </w:tcPr>
+          <w:p>
+            <w:pPr>
+              <w:pStyle w:val="Compact"/>
+              <w:spacing w:after="40"/>
+              <w:jc w:val="left"/>
+            </w:pPr>
+            <w:r>
+              <w:rPr>
+                <w:sz w:val="19"/>
+              </w:rPr>
+              <w:t xml:space="preserve">Fatto</w:t>
+            </w:r>
+          </w:p>
+        </w:tc>
+        <w:tc>
+          <w:tcPr>
+            <w:tcW w:type="dxa" w:w="2494"/>
+          </w:tcPr>
+          <w:p>
+            <w:pPr>
+              <w:pStyle w:val="Compact"/>
+              <w:spacing w:after="40"/>
+              <w:jc w:val="left"/>
+            </w:pPr>
+            <w:r>
+              <w:rPr>
+                <w:sz w:val="19"/>
+              </w:rPr>
+              <w:t xml:space="preserve">Attività pianificata alle 17:59 (</w:t>
+            </w:r>
+            <w:r>
+              <w:rPr>
+                <w:sz w:val="19"/>
+              </w:rPr>
+              <w:t xml:space="preserve">“</w:t>
+            </w:r>
+            <w:r>
+              <w:rPr>
+                <w:sz w:val="19"/>
+              </w:rPr>
+              <w:t xml:space="preserve">Confronto concorrenti CYF Gaming</w:t>
+            </w:r>
+            <w:r>
+              <w:rPr>
+                <w:sz w:val="19"/>
+              </w:rPr>
+              <w:t xml:space="preserve">”</w:t>
+            </w:r>
+            <w:r>
+              <w:rPr>
+                <w:sz w:val="19"/>
+              </w:rPr>
+              <w:t xml:space="preserve">), con notifica sul telefono. Dal 27/10 sera era l’attività</w:t>
+            </w:r>
+            <w:r>
+              <w:rPr>
+                <w:sz w:val="19"/>
+              </w:rPr>
+              <w:t xml:space="preserve"> </w:t>
+            </w:r>
+            <w:r>
+              <w:rPr>
+                <w:sz w:val="19"/>
+              </w:rPr>
+              <w:t xml:space="preserve">“</w:t>
+            </w:r>
+            <w:r>
+              <w:rPr>
+                <w:sz w:val="19"/>
+              </w:rPr>
+              <w:t xml:space="preserve">Implementation</w:t>
+            </w:r>
+            <w:r>
+              <w:rPr>
+                <w:sz w:val="19"/>
+              </w:rPr>
+              <w:t xml:space="preserve">”</w:t>
+            </w:r>
+            <w:r>
+              <w:rPr>
+                <w:sz w:val="19"/>
+              </w:rPr>
+              <w:t xml:space="preserve"> </w:t>
+            </w:r>
+            <w:r>
+              <w:rPr>
+                <w:sz w:val="19"/>
+              </w:rPr>
+              <w:t xml:space="preserve">(alle 17, dal 28/10 alle 9).</w:t>
             </w:r>
             <w:r>
               <w:rPr>
@@ -11797,19 +12785,43 @@
                 <w:b/>
                 <w:sz w:val="19"/>
               </w:rPr>
-              <w:t xml:space="preserve">Dal 29/10 turno unico</w:t>
-            </w:r>
-            <w:r>
-              <w:rPr>
-                <w:sz w:val="19"/>
-              </w:rPr>
-              <w:t xml:space="preserve"> </w:t>
-            </w:r>
-            <w:r>
-              <w:rPr>
-                <w:sz w:val="19"/>
-              </w:rPr>
-              <w:t xml:space="preserve">(decisione di Luigi del 28/10 alle 22:50): parte A verifica e pubblicazione (entro le 4 circa), parte B implementazione (circa 50 minuti, provata e pubblicata nella stessa notte se restano almeno 75 minuti alle 6:30), parte C confronto con le altre app (massimo 20 minuti); si ferma entro le 6:30</w:t>
+              <w:t xml:space="preserve">Dal 29/10 è l’ultima parte della Verifica delle 9:30</w:t>
+            </w:r>
+            <w:r>
+              <w:rPr>
+                <w:sz w:val="19"/>
+              </w:rPr>
+              <w:t xml:space="preserve"> </w:t>
+            </w:r>
+            <w:r>
+              <w:rPr>
+                <w:sz w:val="19"/>
+              </w:rPr>
+              <w:t xml:space="preserve">(R-503, R-512): dopo la pubblicazione, entro le 15, massimo 20 minuti; le proposte nuove entrano in REQUISITI.md come</w:t>
+            </w:r>
+            <w:r>
+              <w:rPr>
+                <w:sz w:val="19"/>
+              </w:rPr>
+              <w:t xml:space="preserve"> </w:t>
+            </w:r>
+            <w:r>
+              <w:rPr>
+                <w:sz w:val="19"/>
+              </w:rPr>
+              <w:t xml:space="preserve">“</w:t>
+            </w:r>
+            <w:r>
+              <w:rPr>
+                <w:sz w:val="19"/>
+              </w:rPr>
+              <w:t xml:space="preserve">Da confermare</w:t>
+            </w:r>
+            <w:r>
+              <w:rPr>
+                <w:sz w:val="19"/>
+              </w:rPr>
+              <w:t xml:space="preserve">”</w:t>
             </w:r>
           </w:p>
         </w:tc>
@@ -11829,7 +12841,7 @@
               <w:rPr>
                 <w:sz w:val="19"/>
               </w:rPr>
-              <w:t xml:space="preserve">R-504</w:t>
+              <w:t xml:space="preserve">R-509</w:t>
             </w:r>
           </w:p>
         </w:tc>
@@ -11847,7 +12859,7 @@
               <w:rPr>
                 <w:sz w:val="19"/>
               </w:rPr>
-              <w:t xml:space="preserve">Migliorare la descrizione del documento Word e delle tabelle</w:t>
+              <w:t xml:space="preserve">All’inizio di ogni attività il tempo che serve e i token</w:t>
             </w:r>
           </w:p>
         </w:tc>
@@ -11865,7 +12877,7 @@
               <w:rPr>
                 <w:sz w:val="19"/>
               </w:rPr>
-              <w:t xml:space="preserve">24/10/2026</w:t>
+              <w:t xml:space="preserve">26/10/2026</w:t>
             </w:r>
           </w:p>
         </w:tc>
@@ -11902,31 +12914,7 @@
               <w:rPr>
                 <w:sz w:val="19"/>
               </w:rPr>
-              <w:t xml:space="preserve">Introduzione, legenda e colonne riscritte; colonna</w:t>
-            </w:r>
-            <w:r>
-              <w:rPr>
-                <w:sz w:val="19"/>
-              </w:rPr>
-              <w:t xml:space="preserve"> </w:t>
-            </w:r>
-            <w:r>
-              <w:rPr>
-                <w:sz w:val="19"/>
-              </w:rPr>
-              <w:t xml:space="preserve">“</w:t>
-            </w:r>
-            <w:r>
-              <w:rPr>
-                <w:sz w:val="19"/>
-              </w:rPr>
-              <w:t xml:space="preserve">Come funziona oggi</w:t>
-            </w:r>
-            <w:r>
-              <w:rPr>
-                <w:sz w:val="19"/>
-              </w:rPr>
-              <w:t xml:space="preserve">”</w:t>
+              <w:t xml:space="preserve">Prima frase di ogni attività: tempo stimato, token rimasti nella sessione e consumo stimato (il consumo esatto non è visibile)</w:t>
             </w:r>
           </w:p>
         </w:tc>
@@ -11946,7 +12934,7 @@
               <w:rPr>
                 <w:sz w:val="19"/>
               </w:rPr>
-              <w:t xml:space="preserve">R-505</w:t>
+              <w:t xml:space="preserve">R-511</w:t>
             </w:r>
           </w:p>
         </w:tc>
@@ -11964,7 +12952,7 @@
               <w:rPr>
                 <w:sz w:val="19"/>
               </w:rPr>
-              <w:t xml:space="preserve">Business plan con aspetti economici e strategia aziendale, in un file separato</w:t>
+              <w:t xml:space="preserve">Su Drive due documenti dei requisiti al posto di uno: «CYF Gaming Requisiti Implementati e Testati» e «CYF Gaming Requisiti da Implementare o Bachi»</w:t>
             </w:r>
           </w:p>
         </w:tc>
@@ -11982,7 +12970,7 @@
               <w:rPr>
                 <w:sz w:val="19"/>
               </w:rPr>
-              <w:t xml:space="preserve">24/10/2026</w:t>
+              <w:t xml:space="preserve">27/10/2026</w:t>
             </w:r>
           </w:p>
         </w:tc>
@@ -12019,7 +13007,204 @@
               <w:rPr>
                 <w:sz w:val="19"/>
               </w:rPr>
-              <w:t xml:space="preserve">CYF-Gaming-business-plan.docx nella cartella sul Desktop</w:t>
+              <w:t xml:space="preserve">Una sola fonte, REQUISITI.md;</w:t>
+            </w:r>
+            <w:r>
+              <w:rPr>
+                <w:sz w:val="19"/>
+              </w:rPr>
+              <w:t xml:space="preserve"> </w:t>
+            </w:r>
+            <w:r>
+              <w:rPr>
+                <w:rStyle w:val="VerbatimChar"/>
+                <w:sz w:val="19"/>
+              </w:rPr>
+              <w:t xml:space="preserve">tools/requisiti_docx.py REQUISITI.md docs/</w:t>
+            </w:r>
+            <w:r>
+              <w:rPr>
+                <w:sz w:val="19"/>
+              </w:rPr>
+              <w:t xml:space="preserve"> </w:t>
+            </w:r>
+            <w:r>
+              <w:rPr>
+                <w:sz w:val="19"/>
+              </w:rPr>
+              <w:t xml:space="preserve">genera i due Word e una riga passa da sola dal secondo al primo quando cambia stato. Nel primo: requisiti Fatto e Controllato, scelte confermate, bachi corretti, verifiche, regole di lavoro e storico fino alla versione online (</w:t>
+            </w:r>
+            <w:r>
+              <w:rPr>
+                <w:rStyle w:val="VerbatimChar"/>
+                <w:sz w:val="19"/>
+              </w:rPr>
+              <w:t xml:space="preserve">online:</w:t>
+            </w:r>
+            <w:r>
+              <w:rPr>
+                <w:sz w:val="19"/>
+              </w:rPr>
+              <w:t xml:space="preserve"> </w:t>
+            </w:r>
+            <w:r>
+              <w:rPr>
+                <w:sz w:val="19"/>
+              </w:rPr>
+              <w:t xml:space="preserve">in testa a REQUISITI.md). Nel secondo: in testa i prossimi passi, poi bachi aperti (sezione</w:t>
+            </w:r>
+            <w:r>
+              <w:rPr>
+                <w:sz w:val="19"/>
+              </w:rPr>
+              <w:t xml:space="preserve"> </w:t>
+            </w:r>
+            <w:r>
+              <w:rPr>
+                <w:sz w:val="19"/>
+              </w:rPr>
+              <w:t xml:space="preserve">“</w:t>
+            </w:r>
+            <w:r>
+              <w:rPr>
+                <w:sz w:val="19"/>
+              </w:rPr>
+              <w:t xml:space="preserve">Bachi</w:t>
+            </w:r>
+            <w:r>
+              <w:rPr>
+                <w:sz w:val="19"/>
+              </w:rPr>
+              <w:t xml:space="preserve">”</w:t>
+            </w:r>
+            <w:r>
+              <w:rPr>
+                <w:sz w:val="19"/>
+              </w:rPr>
+              <w:t xml:space="preserve">, numeri B-xx), requisiti Da fare e In corso, scelte e idee da confermare, cose da fare (sezione 9) e le versioni scritte che aspettano le prove della notte. Il controllo C4 (</w:t>
+            </w:r>
+            <w:r>
+              <w:rPr>
+                <w:rStyle w:val="VerbatimChar"/>
+                <w:sz w:val="19"/>
+              </w:rPr>
+              <w:t xml:space="preserve">controlli.mjs</w:t>
+            </w:r>
+            <w:r>
+              <w:rPr>
+                <w:sz w:val="19"/>
+              </w:rPr>
+              <w:t xml:space="preserve">) verifica che</w:t>
+            </w:r>
+            <w:r>
+              <w:rPr>
+                <w:sz w:val="19"/>
+              </w:rPr>
+              <w:t xml:space="preserve"> </w:t>
+            </w:r>
+            <w:r>
+              <w:rPr>
+                <w:rStyle w:val="VerbatimChar"/>
+                <w:sz w:val="19"/>
+              </w:rPr>
+              <w:t xml:space="preserve">online:</w:t>
+            </w:r>
+            <w:r>
+              <w:rPr>
+                <w:sz w:val="19"/>
+              </w:rPr>
+              <w:t xml:space="preserve"> </w:t>
+            </w:r>
+            <w:r>
+              <w:rPr>
+                <w:sz w:val="19"/>
+              </w:rPr>
+              <w:t xml:space="preserve">sia la versione di</w:t>
+            </w:r>
+            <w:r>
+              <w:rPr>
+                <w:sz w:val="19"/>
+              </w:rPr>
+              <w:t xml:space="preserve"> </w:t>
+            </w:r>
+            <w:r>
+              <w:rPr>
+                <w:rStyle w:val="VerbatimChar"/>
+                <w:sz w:val="19"/>
+              </w:rPr>
+              <w:t xml:space="preserve">config.js</w:t>
+            </w:r>
+            <w:r>
+              <w:rPr>
+                <w:sz w:val="19"/>
+              </w:rPr>
+              <w:t xml:space="preserve"> </w:t>
+            </w:r>
+            <w:r>
+              <w:rPr>
+                <w:sz w:val="19"/>
+              </w:rPr>
+              <w:t xml:space="preserve">sul ramo che si pubblica. Scelte di Luigi del 27/10: nome con</w:t>
+            </w:r>
+            <w:r>
+              <w:rPr>
+                <w:sz w:val="19"/>
+              </w:rPr>
+              <w:t xml:space="preserve"> </w:t>
+            </w:r>
+            <w:r>
+              <w:rPr>
+                <w:sz w:val="19"/>
+              </w:rPr>
+              <w:t xml:space="preserve">“</w:t>
+            </w:r>
+            <w:r>
+              <w:rPr>
+                <w:sz w:val="19"/>
+              </w:rPr>
+              <w:t xml:space="preserve">CYF</w:t>
+            </w:r>
+            <w:r>
+              <w:rPr>
+                <w:sz w:val="19"/>
+              </w:rPr>
+              <w:t xml:space="preserve">”</w:t>
+            </w:r>
+            <w:r>
+              <w:rPr>
+                <w:sz w:val="19"/>
+              </w:rPr>
+              <w:t xml:space="preserve">, nel primo</w:t>
+            </w:r>
+            <w:r>
+              <w:rPr>
+                <w:sz w:val="19"/>
+              </w:rPr>
+              <w:t xml:space="preserve"> </w:t>
+            </w:r>
+            <w:r>
+              <w:rPr>
+                <w:sz w:val="19"/>
+              </w:rPr>
+              <w:t xml:space="preserve">“</w:t>
+            </w:r>
+            <w:r>
+              <w:rPr>
+                <w:sz w:val="19"/>
+              </w:rPr>
+              <w:t xml:space="preserve">Fatto + Controllato</w:t>
+            </w:r>
+            <w:r>
+              <w:rPr>
+                <w:sz w:val="19"/>
+              </w:rPr>
+              <w:t xml:space="preserve">”</w:t>
+            </w:r>
+            <w:r>
+              <w:rPr>
+                <w:sz w:val="19"/>
+              </w:rPr>
+              <w:t xml:space="preserve">, prossimi passi nel secondo e regole nel primo, il vecchio Word unico tolto da Drive (nel cestino di Drive per 30 giorni)</w:t>
             </w:r>
           </w:p>
         </w:tc>
@@ -12039,7 +13224,7 @@
               <w:rPr>
                 <w:sz w:val="19"/>
               </w:rPr>
-              <w:t xml:space="preserve">R-506</w:t>
+              <w:t xml:space="preserve">R-512</w:t>
             </w:r>
           </w:p>
         </w:tc>
@@ -12057,7 +13242,21 @@
               <w:rPr>
                 <w:sz w:val="19"/>
               </w:rPr>
-              <w:t xml:space="preserve">Nessuna prova di giorno se Luigi non lo chiede chiaramente: le prove si fanno di notte, dopo le 23, sfruttando al massimo la notte; gli errori che il sistema vede vanno corretti (P-02)</w:t>
+              <w:t xml:space="preserve">La notte si fa la verifica, il pomeriggio alle 5 l’implementazione;</w:t>
+            </w:r>
+            <w:r>
+              <w:rPr>
+                <w:sz w:val="19"/>
+              </w:rPr>
+              <w:t xml:space="preserve"> </w:t>
+            </w:r>
+            <w:r>
+              <w:rPr>
+                <w:bCs/>
+                <w:b/>
+                <w:sz w:val="19"/>
+              </w:rPr>
+              <w:t xml:space="preserve">dal 29/10: implementazione all’1:00 di notte, verifica con le prove alle 9:30</w:t>
             </w:r>
           </w:p>
         </w:tc>
@@ -12075,7 +13274,7 @@
               <w:rPr>
                 <w:sz w:val="19"/>
               </w:rPr>
-              <w:t xml:space="preserve">25/10/2026, aggiornato 26/10</w:t>
+              <w:t xml:space="preserve">27/10/2026, aggiornato 28/10</w:t>
             </w:r>
           </w:p>
         </w:tc>
@@ -12110,520 +13309,23 @@
             </w:pPr>
             <w:r>
               <w:rPr>
-                <w:sz w:val="19"/>
-              </w:rPr>
-              <w:t xml:space="preserve">Dal 26/10 sera. Di giorno Claude non lancia prove (né</w:t>
-            </w:r>
-            <w:r>
-              <w:rPr>
-                <w:sz w:val="19"/>
-              </w:rPr>
-              <w:t xml:space="preserve"> </w:t>
-            </w:r>
-            <w:r>
-              <w:rPr>
-                <w:rStyle w:val="VerbatimChar"/>
-                <w:sz w:val="19"/>
-              </w:rPr>
-              <w:t xml:space="preserve">npm test</w:t>
-            </w:r>
-            <w:r>
-              <w:rPr>
-                <w:sz w:val="19"/>
-              </w:rPr>
-              <w:t xml:space="preserve"> </w:t>
-            </w:r>
-            <w:r>
-              <w:rPr>
-                <w:sz w:val="19"/>
-              </w:rPr>
-              <w:t xml:space="preserve">né altre): scrive requisiti e codice su un ramo</w:t>
-            </w:r>
-            <w:r>
-              <w:rPr>
-                <w:sz w:val="19"/>
-              </w:rPr>
-              <w:t xml:space="preserve"> </w:t>
-            </w:r>
-            <w:r>
-              <w:rPr>
-                <w:rStyle w:val="VerbatimChar"/>
-                <w:sz w:val="19"/>
-              </w:rPr>
-              <w:t xml:space="preserve">giorno/&lt;nome&gt;</w:t>
-            </w:r>
-            <w:r>
-              <w:rPr>
-                <w:sz w:val="19"/>
-              </w:rPr>
-              <w:t xml:space="preserve">, dove il cancello di GitHub non parte (</w:t>
-            </w:r>
-            <w:r>
-              <w:rPr>
-                <w:rStyle w:val="VerbatimChar"/>
-                <w:sz w:val="19"/>
-              </w:rPr>
-              <w:t xml:space="preserve">branches-ignore</w:t>
-            </w:r>
-            <w:r>
-              <w:rPr>
-                <w:sz w:val="19"/>
-              </w:rPr>
-              <w:t xml:space="preserve"> </w:t>
-            </w:r>
-            <w:r>
-              <w:rPr>
-                <w:sz w:val="19"/>
-              </w:rPr>
-              <w:t xml:space="preserve">in</w:t>
-            </w:r>
-            <w:r>
-              <w:rPr>
-                <w:sz w:val="19"/>
-              </w:rPr>
-              <w:t xml:space="preserve"> </w:t>
-            </w:r>
-            <w:r>
-              <w:rPr>
-                <w:rStyle w:val="VerbatimChar"/>
-                <w:sz w:val="19"/>
-              </w:rPr>
-              <w:t xml:space="preserve">.github/workflows/cancello.yml</w:t>
-            </w:r>
-            <w:r>
-              <w:rPr>
-                <w:sz w:val="19"/>
-              </w:rPr>
-              <w:t xml:space="preserve">, dalla 0.20.2). Il turno di notte (R-503, dal 27/10 parte all’1:30, fino alle 6:30) unisce i rami, prova, corregge e pubblica: le novità vanno online la mattina dopo. Se Luigi scrive</w:t>
-            </w:r>
-            <w:r>
-              <w:rPr>
-                <w:sz w:val="19"/>
-              </w:rPr>
-              <w:t xml:space="preserve"> </w:t>
-            </w:r>
-            <w:r>
-              <w:rPr>
-                <w:sz w:val="19"/>
-              </w:rPr>
-              <w:t xml:space="preserve">“</w:t>
-            </w:r>
-            <w:r>
-              <w:rPr>
-                <w:sz w:val="19"/>
-              </w:rPr>
-              <w:t xml:space="preserve">pubblica adesso</w:t>
-            </w:r>
-            <w:r>
-              <w:rPr>
-                <w:sz w:val="19"/>
-              </w:rPr>
-              <w:t xml:space="preserve">”</w:t>
-            </w:r>
-            <w:r>
-              <w:rPr>
-                <w:sz w:val="19"/>
-              </w:rPr>
-              <w:t xml:space="preserve"> </w:t>
-            </w:r>
-            <w:r>
-              <w:rPr>
-                <w:sz w:val="19"/>
-              </w:rPr>
-              <w:t xml:space="preserve">o</w:t>
-            </w:r>
-            <w:r>
-              <w:rPr>
-                <w:sz w:val="19"/>
-              </w:rPr>
-              <w:t xml:space="preserve"> </w:t>
-            </w:r>
-            <w:r>
-              <w:rPr>
-                <w:sz w:val="19"/>
-              </w:rPr>
-              <w:t xml:space="preserve">“</w:t>
-            </w:r>
-            <w:r>
-              <w:rPr>
-                <w:sz w:val="19"/>
-              </w:rPr>
-              <w:t xml:space="preserve">fallo ora</w:t>
-            </w:r>
-            <w:r>
-              <w:rPr>
-                <w:sz w:val="19"/>
-              </w:rPr>
-              <w:t xml:space="preserve">”</w:t>
-            </w:r>
-            <w:r>
-              <w:rPr>
-                <w:sz w:val="19"/>
-              </w:rPr>
-              <w:t xml:space="preserve">, si fanno le prove e si pubblica subito (S-42). Fino al 26/10 di giorno girava il cancello rapido</w:t>
-            </w:r>
-          </w:p>
-        </w:tc>
-      </w:tr>
-      <w:tr>
-        <w:tc>
-          <w:tcPr>
-            <w:tcW w:type="dxa" w:w="907"/>
-          </w:tcPr>
-          <w:p>
-            <w:pPr>
-              <w:pStyle w:val="Compact"/>
-              <w:spacing w:after="40"/>
-              <w:jc w:val="left"/>
-            </w:pPr>
-            <w:r>
-              <w:rPr>
-                <w:sz w:val="19"/>
-              </w:rPr>
-              <w:t xml:space="preserve">R-507</w:t>
-            </w:r>
-          </w:p>
-        </w:tc>
-        <w:tc>
-          <w:tcPr>
-            <w:tcW w:type="dxa" w:w="4195"/>
-          </w:tcPr>
-          <w:p>
-            <w:pPr>
-              <w:pStyle w:val="Compact"/>
-              <w:spacing w:after="40"/>
-              <w:jc w:val="left"/>
-            </w:pPr>
-            <w:r>
-              <w:rPr>
-                <w:sz w:val="19"/>
-              </w:rPr>
-              <w:t xml:space="preserve">Nel Word i prossimi passi all’inizio, poi tutto quello che è fatto; il Word si aggiorna da solo a ogni cosa fatta</w:t>
-            </w:r>
-          </w:p>
-        </w:tc>
-        <w:tc>
-          <w:tcPr>
-            <w:tcW w:type="dxa" w:w="1134"/>
-          </w:tcPr>
-          <w:p>
-            <w:pPr>
-              <w:pStyle w:val="Compact"/>
-              <w:spacing w:after="40"/>
-              <w:jc w:val="left"/>
-            </w:pPr>
-            <w:r>
-              <w:rPr>
-                <w:sz w:val="19"/>
-              </w:rPr>
-              <w:t xml:space="preserve">26/10/2026</w:t>
-            </w:r>
-          </w:p>
-        </w:tc>
-        <w:tc>
-          <w:tcPr>
-            <w:tcW w:type="dxa" w:w="1134"/>
-            <w:shd w:val="clear" w:color="auto" w:fill="D7F0DF"/>
-          </w:tcPr>
-          <w:p>
-            <w:pPr>
-              <w:pStyle w:val="Compact"/>
-              <w:spacing w:after="40"/>
-              <w:jc w:val="left"/>
-            </w:pPr>
-            <w:r>
-              <w:rPr>
-                <w:sz w:val="19"/>
-              </w:rPr>
-              <w:t xml:space="preserve">Fatto</w:t>
-            </w:r>
-          </w:p>
-        </w:tc>
-        <w:tc>
-          <w:tcPr>
-            <w:tcW w:type="dxa" w:w="2494"/>
-          </w:tcPr>
-          <w:p>
-            <w:pPr>
-              <w:pStyle w:val="Compact"/>
-              <w:spacing w:after="40"/>
-              <w:jc w:val="left"/>
-            </w:pPr>
-            <w:r>
-              <w:rPr>
-                <w:sz w:val="19"/>
-              </w:rPr>
-              <w:t xml:space="preserve">Dalla 0.20.1: sezioni</w:t>
-            </w:r>
-            <w:r>
-              <w:rPr>
-                <w:sz w:val="19"/>
-              </w:rPr>
-              <w:t xml:space="preserve"> </w:t>
-            </w:r>
-            <w:r>
-              <w:rPr>
-                <w:sz w:val="19"/>
-              </w:rPr>
-              <w:t xml:space="preserve">“</w:t>
-            </w:r>
-            <w:r>
-              <w:rPr>
-                <w:sz w:val="19"/>
-              </w:rPr>
-              <w:t xml:space="preserve">Prossimi passi</w:t>
-            </w:r>
-            <w:r>
-              <w:rPr>
-                <w:sz w:val="19"/>
-              </w:rPr>
-              <w:t xml:space="preserve">”</w:t>
-            </w:r>
-            <w:r>
-              <w:rPr>
-                <w:sz w:val="19"/>
-              </w:rPr>
-              <w:t xml:space="preserve"> </w:t>
-            </w:r>
-            <w:r>
-              <w:rPr>
-                <w:sz w:val="19"/>
-              </w:rPr>
-              <w:t xml:space="preserve">e</w:t>
-            </w:r>
-            <w:r>
-              <w:rPr>
-                <w:sz w:val="19"/>
-              </w:rPr>
-              <w:t xml:space="preserve"> </w:t>
-            </w:r>
-            <w:r>
-              <w:rPr>
-                <w:sz w:val="19"/>
-              </w:rPr>
-              <w:t xml:space="preserve">“</w:t>
-            </w:r>
-            <w:r>
-              <w:rPr>
-                <w:sz w:val="19"/>
-              </w:rPr>
-              <w:t xml:space="preserve">Regole di lavoro</w:t>
-            </w:r>
-            <w:r>
-              <w:rPr>
-                <w:sz w:val="19"/>
-              </w:rPr>
-              <w:t xml:space="preserve">”</w:t>
-            </w:r>
-            <w:r>
-              <w:rPr>
-                <w:sz w:val="19"/>
-              </w:rPr>
-              <w:t xml:space="preserve"> </w:t>
-            </w:r>
-            <w:r>
-              <w:rPr>
-                <w:sz w:val="19"/>
-              </w:rPr>
-              <w:t xml:space="preserve">in testa. Dal 27/10 (R-511) i prossimi passi sono in testa al Word «da Implementare o Bachi» e le regole di lavoro in testa a quello «Implementati e Testati»; i Word sono in</w:t>
-            </w:r>
-            <w:r>
-              <w:rPr>
-                <w:sz w:val="19"/>
-              </w:rPr>
-              <w:t xml:space="preserve"> </w:t>
-            </w:r>
-            <w:r>
-              <w:rPr>
-                <w:rStyle w:val="VerbatimChar"/>
-                <w:sz w:val="19"/>
-              </w:rPr>
-              <w:t xml:space="preserve">docs/</w:t>
-            </w:r>
-            <w:r>
-              <w:rPr>
-                <w:sz w:val="19"/>
-              </w:rPr>
-              <w:t xml:space="preserve">; su Google Drive li copia una chat collegata al PC di casa (l’attività automatica delle 7:13, 13:13 e 19:13 è stata tolta da Luigi il 27/10 sera)</w:t>
-            </w:r>
-          </w:p>
-        </w:tc>
-      </w:tr>
-      <w:tr>
-        <w:tc>
-          <w:tcPr>
-            <w:tcW w:type="dxa" w:w="907"/>
-          </w:tcPr>
-          <w:p>
-            <w:pPr>
-              <w:pStyle w:val="Compact"/>
-              <w:spacing w:after="40"/>
-              <w:jc w:val="left"/>
-            </w:pPr>
-            <w:r>
-              <w:rPr>
-                <w:sz w:val="19"/>
-              </w:rPr>
-              <w:t xml:space="preserve">R-508</w:t>
-            </w:r>
-          </w:p>
-        </w:tc>
-        <w:tc>
-          <w:tcPr>
-            <w:tcW w:type="dxa" w:w="4195"/>
-          </w:tcPr>
-          <w:p>
-            <w:pPr>
-              <w:pStyle w:val="Compact"/>
-              <w:spacing w:after="40"/>
-              <w:jc w:val="left"/>
-            </w:pPr>
-            <w:r>
-              <w:rPr>
-                <w:sz w:val="19"/>
-              </w:rPr>
-              <w:t xml:space="preserve">Verso le 18 un confronto con le altre app e cosa manca per migliorare</w:t>
-            </w:r>
-          </w:p>
-        </w:tc>
-        <w:tc>
-          <w:tcPr>
-            <w:tcW w:type="dxa" w:w="1134"/>
-          </w:tcPr>
-          <w:p>
-            <w:pPr>
-              <w:pStyle w:val="Compact"/>
-              <w:spacing w:after="40"/>
-              <w:jc w:val="left"/>
-            </w:pPr>
-            <w:r>
-              <w:rPr>
-                <w:sz w:val="19"/>
-              </w:rPr>
-              <w:t xml:space="preserve">26/10/2026</w:t>
-            </w:r>
-          </w:p>
-        </w:tc>
-        <w:tc>
-          <w:tcPr>
-            <w:tcW w:type="dxa" w:w="1134"/>
-            <w:shd w:val="clear" w:color="auto" w:fill="D7F0DF"/>
-          </w:tcPr>
-          <w:p>
-            <w:pPr>
-              <w:pStyle w:val="Compact"/>
-              <w:spacing w:after="40"/>
-              <w:jc w:val="left"/>
-            </w:pPr>
-            <w:r>
-              <w:rPr>
-                <w:sz w:val="19"/>
-              </w:rPr>
-              <w:t xml:space="preserve">Fatto</w:t>
-            </w:r>
-          </w:p>
-        </w:tc>
-        <w:tc>
-          <w:tcPr>
-            <w:tcW w:type="dxa" w:w="2494"/>
-          </w:tcPr>
-          <w:p>
-            <w:pPr>
-              <w:pStyle w:val="Compact"/>
-              <w:spacing w:after="40"/>
-              <w:jc w:val="left"/>
-            </w:pPr>
-            <w:r>
-              <w:rPr>
-                <w:sz w:val="19"/>
-              </w:rPr>
-              <w:t xml:space="preserve">Attività pianificata alle 17:59 (</w:t>
-            </w:r>
-            <w:r>
-              <w:rPr>
-                <w:sz w:val="19"/>
-              </w:rPr>
-              <w:t xml:space="preserve">“</w:t>
-            </w:r>
-            <w:r>
-              <w:rPr>
-                <w:sz w:val="19"/>
-              </w:rPr>
-              <w:t xml:space="preserve">Confronto concorrenti CYF Gaming</w:t>
-            </w:r>
-            <w:r>
-              <w:rPr>
-                <w:sz w:val="19"/>
-              </w:rPr>
-              <w:t xml:space="preserve">”</w:t>
-            </w:r>
-            <w:r>
-              <w:rPr>
-                <w:sz w:val="19"/>
-              </w:rPr>
-              <w:t xml:space="preserve">), con notifica sul telefono. Dal 27/10 sera era l’attività</w:t>
-            </w:r>
-            <w:r>
-              <w:rPr>
-                <w:sz w:val="19"/>
-              </w:rPr>
-              <w:t xml:space="preserve"> </w:t>
-            </w:r>
-            <w:r>
-              <w:rPr>
-                <w:sz w:val="19"/>
-              </w:rPr>
-              <w:t xml:space="preserve">“</w:t>
-            </w:r>
-            <w:r>
-              <w:rPr>
-                <w:sz w:val="19"/>
-              </w:rPr>
-              <w:t xml:space="preserve">Implementation</w:t>
-            </w:r>
-            <w:r>
-              <w:rPr>
-                <w:sz w:val="19"/>
-              </w:rPr>
-              <w:t xml:space="preserve">”</w:t>
-            </w:r>
-            <w:r>
-              <w:rPr>
-                <w:sz w:val="19"/>
-              </w:rPr>
-              <w:t xml:space="preserve"> </w:t>
-            </w:r>
-            <w:r>
-              <w:rPr>
-                <w:sz w:val="19"/>
-              </w:rPr>
-              <w:t xml:space="preserve">(alle 17, dal 28/10 alle 9).</w:t>
-            </w:r>
-            <w:r>
-              <w:rPr>
-                <w:sz w:val="19"/>
-              </w:rPr>
-              <w:t xml:space="preserve"> </w:t>
-            </w:r>
-            <w:r>
-              <w:rPr>
                 <w:bCs/>
                 <w:b/>
                 <w:sz w:val="19"/>
               </w:rPr>
-              <w:t xml:space="preserve">Dal 29/10 è la parte C del turno di notte</w:t>
-            </w:r>
-            <w:r>
-              <w:rPr>
-                <w:sz w:val="19"/>
-              </w:rPr>
-              <w:t xml:space="preserve"> </w:t>
-            </w:r>
-            <w:r>
-              <w:rPr>
-                <w:sz w:val="19"/>
-              </w:rPr>
-              <w:t xml:space="preserve">(R-512): dopo l’implementazione, massimo 20 minuti; le proposte nuove entrano in REQUISITI.md come</w:t>
+              <w:t xml:space="preserve">Dal 29/10</w:t>
+            </w:r>
+            <w:r>
+              <w:rPr>
+                <w:sz w:val="19"/>
+              </w:rPr>
+              <w:t xml:space="preserve"> </w:t>
+            </w:r>
+            <w:r>
+              <w:rPr>
+                <w:sz w:val="19"/>
+              </w:rPr>
+              <w:t xml:space="preserve">(decisione di Luigi del 28/10 alle 23:15): attività</w:t>
             </w:r>
             <w:r>
               <w:rPr>
@@ -12641,7 +13343,7 @@
               <w:rPr>
                 <w:sz w:val="19"/>
               </w:rPr>
-              <w:t xml:space="preserve">Da confermare</w:t>
+              <w:t xml:space="preserve">CYF Gaming – Implementation 01:00 (bachi, requisiti, codice nuovo, SENZA prove)</w:t>
             </w:r>
             <w:r>
               <w:rPr>
@@ -12649,191 +13351,17 @@
               </w:rPr>
               <w:t xml:space="preserve">”</w:t>
             </w:r>
-          </w:p>
-        </w:tc>
-      </w:tr>
-      <w:tr>
-        <w:tc>
-          <w:tcPr>
-            <w:tcW w:type="dxa" w:w="907"/>
-          </w:tcPr>
-          <w:p>
-            <w:pPr>
-              <w:pStyle w:val="Compact"/>
-              <w:spacing w:after="40"/>
-              <w:jc w:val="left"/>
-            </w:pPr>
-            <w:r>
-              <w:rPr>
-                <w:sz w:val="19"/>
-              </w:rPr>
-              <w:t xml:space="preserve">R-509</w:t>
-            </w:r>
-          </w:p>
-        </w:tc>
-        <w:tc>
-          <w:tcPr>
-            <w:tcW w:type="dxa" w:w="4195"/>
-          </w:tcPr>
-          <w:p>
-            <w:pPr>
-              <w:pStyle w:val="Compact"/>
-              <w:spacing w:after="40"/>
-              <w:jc w:val="left"/>
-            </w:pPr>
-            <w:r>
-              <w:rPr>
-                <w:sz w:val="19"/>
-              </w:rPr>
-              <w:t xml:space="preserve">All’inizio di ogni attività il tempo che serve e i token</w:t>
-            </w:r>
-          </w:p>
-        </w:tc>
-        <w:tc>
-          <w:tcPr>
-            <w:tcW w:type="dxa" w:w="1134"/>
-          </w:tcPr>
-          <w:p>
-            <w:pPr>
-              <w:pStyle w:val="Compact"/>
-              <w:spacing w:after="40"/>
-              <w:jc w:val="left"/>
-            </w:pPr>
-            <w:r>
-              <w:rPr>
-                <w:sz w:val="19"/>
-              </w:rPr>
-              <w:t xml:space="preserve">26/10/2026</w:t>
-            </w:r>
-          </w:p>
-        </w:tc>
-        <w:tc>
-          <w:tcPr>
-            <w:tcW w:type="dxa" w:w="1134"/>
-            <w:shd w:val="clear" w:color="auto" w:fill="D7F0DF"/>
-          </w:tcPr>
-          <w:p>
-            <w:pPr>
-              <w:pStyle w:val="Compact"/>
-              <w:spacing w:after="40"/>
-              <w:jc w:val="left"/>
-            </w:pPr>
-            <w:r>
-              <w:rPr>
-                <w:sz w:val="19"/>
-              </w:rPr>
-              <w:t xml:space="preserve">Fatto</w:t>
-            </w:r>
-          </w:p>
-        </w:tc>
-        <w:tc>
-          <w:tcPr>
-            <w:tcW w:type="dxa" w:w="2494"/>
-          </w:tcPr>
-          <w:p>
-            <w:pPr>
-              <w:pStyle w:val="Compact"/>
-              <w:spacing w:after="40"/>
-              <w:jc w:val="left"/>
-            </w:pPr>
-            <w:r>
-              <w:rPr>
-                <w:sz w:val="19"/>
-              </w:rPr>
-              <w:t xml:space="preserve">Prima frase di ogni attività: tempo stimato, token rimasti nella sessione e consumo stimato (il consumo esatto non è visibile)</w:t>
-            </w:r>
-          </w:p>
-        </w:tc>
-      </w:tr>
-      <w:tr>
-        <w:tc>
-          <w:tcPr>
-            <w:tcW w:type="dxa" w:w="907"/>
-          </w:tcPr>
-          <w:p>
-            <w:pPr>
-              <w:pStyle w:val="Compact"/>
-              <w:spacing w:after="40"/>
-              <w:jc w:val="left"/>
-            </w:pPr>
-            <w:r>
-              <w:rPr>
-                <w:sz w:val="19"/>
-              </w:rPr>
-              <w:t xml:space="preserve">R-511</w:t>
-            </w:r>
-          </w:p>
-        </w:tc>
-        <w:tc>
-          <w:tcPr>
-            <w:tcW w:type="dxa" w:w="4195"/>
-          </w:tcPr>
-          <w:p>
-            <w:pPr>
-              <w:pStyle w:val="Compact"/>
-              <w:spacing w:after="40"/>
-              <w:jc w:val="left"/>
-            </w:pPr>
-            <w:r>
-              <w:rPr>
-                <w:sz w:val="19"/>
-              </w:rPr>
-              <w:t xml:space="preserve">Su Drive due documenti dei requisiti al posto di uno: «CYF Gaming Requisiti Implementati e Testati» e «CYF Gaming Requisiti da Implementare o Bachi»</w:t>
-            </w:r>
-          </w:p>
-        </w:tc>
-        <w:tc>
-          <w:tcPr>
-            <w:tcW w:type="dxa" w:w="1134"/>
-          </w:tcPr>
-          <w:p>
-            <w:pPr>
-              <w:pStyle w:val="Compact"/>
-              <w:spacing w:after="40"/>
-              <w:jc w:val="left"/>
-            </w:pPr>
-            <w:r>
-              <w:rPr>
-                <w:sz w:val="19"/>
-              </w:rPr>
-              <w:t xml:space="preserve">27/10/2026</w:t>
-            </w:r>
-          </w:p>
-        </w:tc>
-        <w:tc>
-          <w:tcPr>
-            <w:tcW w:type="dxa" w:w="1134"/>
-            <w:shd w:val="clear" w:color="auto" w:fill="D7F0DF"/>
-          </w:tcPr>
-          <w:p>
-            <w:pPr>
-              <w:pStyle w:val="Compact"/>
-              <w:spacing w:after="40"/>
-              <w:jc w:val="left"/>
-            </w:pPr>
-            <w:r>
-              <w:rPr>
-                <w:sz w:val="19"/>
-              </w:rPr>
-              <w:t xml:space="preserve">Fatto</w:t>
-            </w:r>
-          </w:p>
-        </w:tc>
-        <w:tc>
-          <w:tcPr>
-            <w:tcW w:type="dxa" w:w="2494"/>
-          </w:tcPr>
-          <w:p>
-            <w:pPr>
-              <w:pStyle w:val="Compact"/>
-              <w:spacing w:after="40"/>
-              <w:jc w:val="left"/>
-            </w:pPr>
-            <w:r>
-              <w:rPr>
-                <w:sz w:val="19"/>
-              </w:rPr>
-              <w:t xml:space="preserve">Una sola fonte, REQUISITI.md;</w:t>
+            <w:r>
+              <w:rPr>
+                <w:sz w:val="19"/>
+              </w:rPr>
+              <w:t xml:space="preserve"> </w:t>
+            </w:r>
+            <w:r>
+              <w:rPr>
+                <w:sz w:val="19"/>
+              </w:rPr>
+              <w:t xml:space="preserve">ogni notte all’1:00, fino alle 5:30: ramo</w:t>
             </w:r>
             <w:r>
               <w:rPr>
@@ -12846,38 +13374,13 @@
                 <w:rStyle w:val="VerbatimChar"/>
                 <w:sz w:val="19"/>
               </w:rPr>
-              <w:t xml:space="preserve">tools/requisiti_docx.py REQUISITI.md docs/</w:t>
-            </w:r>
-            <w:r>
-              <w:rPr>
-                <w:sz w:val="19"/>
-              </w:rPr>
-              <w:t xml:space="preserve"> </w:t>
-            </w:r>
-            <w:r>
-              <w:rPr>
-                <w:sz w:val="19"/>
-              </w:rPr>
-              <w:t xml:space="preserve">genera i due Word e una riga passa da sola dal secondo al primo quando cambia stato. Nel primo: requisiti Fatto e Controllato, scelte confermate, bachi corretti, verifiche, regole di lavoro e storico fino alla versione online (</w:t>
-            </w:r>
-            <w:r>
-              <w:rPr>
-                <w:rStyle w:val="VerbatimChar"/>
-                <w:sz w:val="19"/>
-              </w:rPr>
-              <w:t xml:space="preserve">online:</w:t>
-            </w:r>
-            <w:r>
-              <w:rPr>
-                <w:sz w:val="19"/>
-              </w:rPr>
-              <w:t xml:space="preserve"> </w:t>
-            </w:r>
-            <w:r>
-              <w:rPr>
-                <w:sz w:val="19"/>
-              </w:rPr>
-              <w:t xml:space="preserve">in testa a REQUISITI.md). Nel secondo: in testa i prossimi passi, poi bachi aperti (sezione</w:t>
+              <w:t xml:space="preserve">giorno/&lt;data&gt;-notte</w:t>
+            </w:r>
+            <w:r>
+              <w:rPr>
+                <w:sz w:val="19"/>
+              </w:rPr>
+              <w:t xml:space="preserve">, bachi, righe</w:t>
             </w:r>
             <w:r>
               <w:rPr>
@@ -12895,7 +13398,7 @@
               <w:rPr>
                 <w:sz w:val="19"/>
               </w:rPr>
-              <w:t xml:space="preserve">Bachi</w:t>
+              <w:t xml:space="preserve">Sì</w:t>
             </w:r>
             <w:r>
               <w:rPr>
@@ -12907,70 +13410,7 @@
               <w:rPr>
                 <w:sz w:val="19"/>
               </w:rPr>
-              <w:t xml:space="preserve">, numeri B-xx), requisiti Da fare e In corso, scelte e idee da confermare, cose da fare (sezione 9) e le versioni scritte che aspettano le prove della notte. Il controllo C4 (</w:t>
-            </w:r>
-            <w:r>
-              <w:rPr>
-                <w:rStyle w:val="VerbatimChar"/>
-                <w:sz w:val="19"/>
-              </w:rPr>
-              <w:t xml:space="preserve">controlli.mjs</w:t>
-            </w:r>
-            <w:r>
-              <w:rPr>
-                <w:sz w:val="19"/>
-              </w:rPr>
-              <w:t xml:space="preserve">) verifica che</w:t>
-            </w:r>
-            <w:r>
-              <w:rPr>
-                <w:sz w:val="19"/>
-              </w:rPr>
-              <w:t xml:space="preserve"> </w:t>
-            </w:r>
-            <w:r>
-              <w:rPr>
-                <w:rStyle w:val="VerbatimChar"/>
-                <w:sz w:val="19"/>
-              </w:rPr>
-              <w:t xml:space="preserve">online:</w:t>
-            </w:r>
-            <w:r>
-              <w:rPr>
-                <w:sz w:val="19"/>
-              </w:rPr>
-              <w:t xml:space="preserve"> </w:t>
-            </w:r>
-            <w:r>
-              <w:rPr>
-                <w:sz w:val="19"/>
-              </w:rPr>
-              <w:t xml:space="preserve">sia la versione di</w:t>
-            </w:r>
-            <w:r>
-              <w:rPr>
-                <w:sz w:val="19"/>
-              </w:rPr>
-              <w:t xml:space="preserve"> </w:t>
-            </w:r>
-            <w:r>
-              <w:rPr>
-                <w:rStyle w:val="VerbatimChar"/>
-                <w:sz w:val="19"/>
-              </w:rPr>
-              <w:t xml:space="preserve">config.js</w:t>
-            </w:r>
-            <w:r>
-              <w:rPr>
-                <w:sz w:val="19"/>
-              </w:rPr>
-              <w:t xml:space="preserve"> </w:t>
-            </w:r>
-            <w:r>
-              <w:rPr>
-                <w:sz w:val="19"/>
-              </w:rPr>
-              <w:t xml:space="preserve">sul ramo che si pubblica. Scelte di Luigi del 27/10: nome con</w:t>
+              <w:t xml:space="preserve">, Da fare approvati, solo controlli statici, prove precise lasciate nei prossimi passi; attività</w:t>
             </w:r>
             <w:r>
               <w:rPr>
@@ -12988,7 +13428,7 @@
               <w:rPr>
                 <w:sz w:val="19"/>
               </w:rPr>
-              <w:t xml:space="preserve">CYF</w:t>
+              <w:t xml:space="preserve">CYF Gaming – Verifica 09:30</w:t>
             </w:r>
             <w:r>
               <w:rPr>
@@ -13000,158 +13440,13 @@
               <w:rPr>
                 <w:sz w:val="19"/>
               </w:rPr>
-              <w:t xml:space="preserve">, nel primo</w:t>
-            </w:r>
-            <w:r>
-              <w:rPr>
-                <w:sz w:val="19"/>
-              </w:rPr>
-              <w:t xml:space="preserve"> </w:t>
-            </w:r>
-            <w:r>
-              <w:rPr>
-                <w:sz w:val="19"/>
-              </w:rPr>
-              <w:t xml:space="preserve">“</w:t>
-            </w:r>
-            <w:r>
-              <w:rPr>
-                <w:sz w:val="19"/>
-              </w:rPr>
-              <w:t xml:space="preserve">Fatto + Controllato</w:t>
-            </w:r>
-            <w:r>
-              <w:rPr>
-                <w:sz w:val="19"/>
-              </w:rPr>
-              <w:t xml:space="preserve">”</w:t>
-            </w:r>
-            <w:r>
-              <w:rPr>
-                <w:sz w:val="19"/>
-              </w:rPr>
-              <w:t xml:space="preserve">, prossimi passi nel secondo e regole nel primo, il vecchio Word unico tolto da Drive (nel cestino di Drive per 30 giorni)</w:t>
-            </w:r>
-          </w:p>
-        </w:tc>
-      </w:tr>
-      <w:tr>
-        <w:tc>
-          <w:tcPr>
-            <w:tcW w:type="dxa" w:w="907"/>
-          </w:tcPr>
-          <w:p>
-            <w:pPr>
-              <w:pStyle w:val="Compact"/>
-              <w:spacing w:after="40"/>
-              <w:jc w:val="left"/>
-            </w:pPr>
-            <w:r>
-              <w:rPr>
-                <w:sz w:val="19"/>
-              </w:rPr>
-              <w:t xml:space="preserve">R-512</w:t>
-            </w:r>
-          </w:p>
-        </w:tc>
-        <w:tc>
-          <w:tcPr>
-            <w:tcW w:type="dxa" w:w="4195"/>
-          </w:tcPr>
-          <w:p>
-            <w:pPr>
-              <w:pStyle w:val="Compact"/>
-              <w:spacing w:after="40"/>
-              <w:jc w:val="left"/>
-            </w:pPr>
-            <w:r>
-              <w:rPr>
-                <w:sz w:val="19"/>
-              </w:rPr>
-              <w:t xml:space="preserve">La notte si fa la verifica, il pomeriggio alle 5 l’implementazione;</w:t>
-            </w:r>
-            <w:r>
-              <w:rPr>
-                <w:sz w:val="19"/>
-              </w:rPr>
-              <w:t xml:space="preserve"> </w:t>
-            </w:r>
-            <w:r>
-              <w:rPr>
-                <w:bCs/>
-                <w:b/>
-                <w:sz w:val="19"/>
-              </w:rPr>
-              <w:t xml:space="preserve">dal 28/10 sera: tutto di notte, in un turno unico</w:t>
-            </w:r>
-          </w:p>
-        </w:tc>
-        <w:tc>
-          <w:tcPr>
-            <w:tcW w:type="dxa" w:w="1134"/>
-          </w:tcPr>
-          <w:p>
-            <w:pPr>
-              <w:pStyle w:val="Compact"/>
-              <w:spacing w:after="40"/>
-              <w:jc w:val="left"/>
-            </w:pPr>
-            <w:r>
-              <w:rPr>
-                <w:sz w:val="19"/>
-              </w:rPr>
-              <w:t xml:space="preserve">27/10/2026, aggiornato 28/10</w:t>
-            </w:r>
-          </w:p>
-        </w:tc>
-        <w:tc>
-          <w:tcPr>
-            <w:tcW w:type="dxa" w:w="1134"/>
-            <w:shd w:val="clear" w:color="auto" w:fill="D7F0DF"/>
-          </w:tcPr>
-          <w:p>
-            <w:pPr>
-              <w:pStyle w:val="Compact"/>
-              <w:spacing w:after="40"/>
-              <w:jc w:val="left"/>
-            </w:pPr>
-            <w:r>
-              <w:rPr>
-                <w:sz w:val="19"/>
-              </w:rPr>
-              <w:t xml:space="preserve">Fatto</w:t>
-            </w:r>
-          </w:p>
-        </w:tc>
-        <w:tc>
-          <w:tcPr>
-            <w:tcW w:type="dxa" w:w="2494"/>
-          </w:tcPr>
-          <w:p>
-            <w:pPr>
-              <w:pStyle w:val="Compact"/>
-              <w:spacing w:after="40"/>
-              <w:jc w:val="left"/>
-            </w:pPr>
-            <w:r>
-              <w:rPr>
-                <w:bCs/>
-                <w:b/>
-                <w:sz w:val="19"/>
-              </w:rPr>
-              <w:t xml:space="preserve">Dal 29/10</w:t>
-            </w:r>
-            <w:r>
-              <w:rPr>
-                <w:sz w:val="19"/>
-              </w:rPr>
-              <w:t xml:space="preserve"> </w:t>
-            </w:r>
-            <w:r>
-              <w:rPr>
-                <w:sz w:val="19"/>
-              </w:rPr>
-              <w:t xml:space="preserve">(decisione di Luigi del 28/10 alle 22:50) l’implementazione è la parte B del turno di notte dell’1:30 (R-503): dopo verifica e pubblicazione, ramo</w:t>
+              <w:t xml:space="preserve"> </w:t>
+            </w:r>
+            <w:r>
+              <w:rPr>
+                <w:sz w:val="19"/>
+              </w:rPr>
+              <w:t xml:space="preserve">(R-503) prova, corregge e pubblica entro le 14:30, poi il confronto con le altre app. Per poco (decisione del 28/10 alle 22:50) l’implementazione è la parte B del turno di notte dell’1:30 (R-503): dopo verifica e pubblicazione, ramo</w:t>
             </w:r>
             <w:r>
               <w:rPr>

</xml_diff>

<commit_message>
0.26.2: baco B-04, posto prenotato nella sala online e del Gran Premio (src/sale.mjs, prenota in stanza.mjs, /api/quick?id=) e nuovi tentativi automatici nel gioco se la sala è piena (moduli/sala.js) — Implementation dell'1:00, senza prove
Co-Authored-By: Claude Fable 5.1 <noreply@anthropic.com>
Claude-Session: https://claude.ai/code/session_01Xy4XstPL8Mfcy49jRPwYXw
</commit_message>
<xml_diff>
--- a/docs/CYF-Gaming-Requisiti-Implementati-e-Testati.docx
+++ b/docs/CYF-Gaming-Requisiti-Implementati-e-Testati.docx
@@ -81,7 +81,7 @@
         <w:t xml:space="preserve"> </w:t>
       </w:r>
       <w:r>
-        <w:t xml:space="preserve">28</w:t>
+        <w:t xml:space="preserve">29</w:t>
       </w:r>
       <w:r>
         <w:t xml:space="preserve"> </w:t>
@@ -93,25 +93,73 @@
         <w:t xml:space="preserve"> </w:t>
       </w:r>
       <w:r>
-        <w:t xml:space="preserve">2026,</w:t>
+        <w:t xml:space="preserve">2026</w:t>
       </w:r>
       <w:r>
         <w:t xml:space="preserve"> </w:t>
       </w:r>
       <w:r>
-        <w:t xml:space="preserve">ore</w:t>
+        <w:t xml:space="preserve">(Implementation</w:t>
       </w:r>
       <w:r>
         <w:t xml:space="preserve"> </w:t>
       </w:r>
       <w:r>
-        <w:t xml:space="preserve">23:55</w:t>
+        <w:t xml:space="preserve">dell’1:00:</w:t>
       </w:r>
       <w:r>
         <w:t xml:space="preserve"> </w:t>
       </w:r>
       <w:r>
-        <w:t xml:space="preserve">(sera:</w:t>
+        <w:t xml:space="preserve">B-04</w:t>
+      </w:r>
+      <w:r>
+        <w:t xml:space="preserve"> </w:t>
+      </w:r>
+      <w:r>
+        <w:t xml:space="preserve">nella</w:t>
+      </w:r>
+      <w:r>
+        <w:t xml:space="preserve"> </w:t>
+      </w:r>
+      <w:r>
+        <w:t xml:space="preserve">0.26.2</w:t>
+      </w:r>
+      <w:r>
+        <w:t xml:space="preserve"> </w:t>
+      </w:r>
+      <w:r>
+        <w:t xml:space="preserve">sul</w:t>
+      </w:r>
+      <w:r>
+        <w:t xml:space="preserve"> </w:t>
+      </w:r>
+      <w:r>
+        <w:t xml:space="preserve">ramo</w:t>
+      </w:r>
+      <w:r>
+        <w:t xml:space="preserve"> </w:t>
+      </w:r>
+      <w:r>
+        <w:t xml:space="preserve">giorno/2026-10-29-notte;</w:t>
+      </w:r>
+      <w:r>
+        <w:t xml:space="preserve"> </w:t>
+      </w:r>
+      <w:r>
+        <w:t xml:space="preserve">sera</w:t>
+      </w:r>
+      <w:r>
+        <w:t xml:space="preserve"> </w:t>
+      </w:r>
+      <w:r>
+        <w:t xml:space="preserve">del</w:t>
+      </w:r>
+      <w:r>
+        <w:t xml:space="preserve"> </w:t>
+      </w:r>
+      <w:r>
+        <w:t xml:space="preserve">28/10:</w:t>
       </w:r>
       <w:r>
         <w:t xml:space="preserve"> </w:t>

</xml_diff>

<commit_message>
0.27.0: prezzi nuovi (R-520 banana 1.500, R-521 bomba 50, S-54 bananone 1.500 fisso) in COSTI, pulsanti e testi delle 4 lingue; fasce delle misure con numeri fissi — Implementation dell'1:00, senza prove
Co-Authored-By: Claude Fable 5.1 <noreply@anthropic.com>
Claude-Session: https://claude.ai/code/session_01Xy4XstPL8Mfcy49jRPwYXw
</commit_message>
<xml_diff>
--- a/docs/CYF-Gaming-Requisiti-Implementati-e-Testati.docx
+++ b/docs/CYF-Gaming-Requisiti-Implementati-e-Testati.docx
@@ -124,6 +124,42 @@
       </w:r>
       <w:r>
         <w:t xml:space="preserve">0.26.2</w:t>
+      </w:r>
+      <w:r>
+        <w:t xml:space="preserve"> </w:t>
+      </w:r>
+      <w:r>
+        <w:t xml:space="preserve">e</w:t>
+      </w:r>
+      <w:r>
+        <w:t xml:space="preserve"> </w:t>
+      </w:r>
+      <w:r>
+        <w:t xml:space="preserve">prezzi</w:t>
+      </w:r>
+      <w:r>
+        <w:t xml:space="preserve"> </w:t>
+      </w:r>
+      <w:r>
+        <w:t xml:space="preserve">nuovi</w:t>
+      </w:r>
+      <w:r>
+        <w:t xml:space="preserve"> </w:t>
+      </w:r>
+      <w:r>
+        <w:t xml:space="preserve">R-520/R-521</w:t>
+      </w:r>
+      <w:r>
+        <w:t xml:space="preserve"> </w:t>
+      </w:r>
+      <w:r>
+        <w:t xml:space="preserve">nella</w:t>
+      </w:r>
+      <w:r>
+        <w:t xml:space="preserve"> </w:t>
+      </w:r>
+      <w:r>
+        <w:t xml:space="preserve">0.27.0</w:t>
       </w:r>
       <w:r>
         <w:t xml:space="preserve"> </w:t>
@@ -4998,19 +5034,19 @@
                 <w:b/>
                 <w:sz w:val="19"/>
               </w:rPr>
-              <w:t xml:space="preserve">Prezzi nuovi da R-520 e R-521 (0.27.0, da scrivere e provare il 29/10):</w:t>
-            </w:r>
-            <w:r>
-              <w:rPr>
-                <w:sz w:val="19"/>
-              </w:rPr>
-              <w:t xml:space="preserve"> </w:t>
-            </w:r>
-            <w:r>
-              <w:rPr>
-                <w:sz w:val="19"/>
-              </w:rPr>
-              <w:t xml:space="preserve">banana 1.500, bomba 50, bananone S-54</w:t>
+              <w:t xml:space="preserve">Prezzi nuovi da R-520 e R-521 (0.27.0, scritta il 29/10 all’1:00, da provare alle 9:30):</w:t>
+            </w:r>
+            <w:r>
+              <w:rPr>
+                <w:sz w:val="19"/>
+              </w:rPr>
+              <w:t xml:space="preserve"> </w:t>
+            </w:r>
+            <w:r>
+              <w:rPr>
+                <w:sz w:val="19"/>
+              </w:rPr>
+              <w:t xml:space="preserve">banana 1.500, bomba 50, bananone 1.500 (S-54, ripiego)</w:t>
             </w:r>
           </w:p>
         </w:tc>
@@ -9442,7 +9478,7 @@
               <w:rPr>
                 <w:sz w:val="19"/>
               </w:rPr>
-              <w:t xml:space="preserve">Costa 1.500 punti (10 × 150 della bomba: il costo è calcolato da quello della bomba). Si lancia come la banana, dal pulsante 🍌 grande con scritto 1500 (accanto a banana e bomba, anche sul telefono) o dal tasto G: il rider fa il gesto del braccio e una banana grande il doppio vola fino al giocatore più vicino davanti, a qualunque distanza, che resta fermo 4 s; tutti vedono il gesto e il bananone in volo. Se davanti non c’è nessuno cade sulla pista 30 m più avanti e ferma 4 s chi ci passa sopra (si prende più facilmente di una banana, perché è più grande). Con meno di 1.500 punti il pulsante dice quanti punti servono. Chi lancia riceve il messaggio quando colpisce. Scelte S-37</w:t>
+              <w:t xml:space="preserve">Costa 1.500 punti (fino alla 0.26.x 10 × 150 della bomba, calcolato da quello della bomba; dalla 0.27.0 numero fisso, S-54, perché la bomba è scesa a 50 con R-521). Si lancia come la banana, dal pulsante 🍌 grande con scritto 1500 (accanto a banana e bomba, anche sul telefono) o dal tasto G: il rider fa il gesto del braccio e una banana grande il doppio vola fino al giocatore più vicino davanti, a qualunque distanza, che resta fermo 4 s; tutti vedono il gesto e il bananone in volo. Se davanti non c’è nessuno cade sulla pista 30 m più avanti e ferma 4 s chi ci passa sopra (si prende più facilmente di una banana, perché è più grande). Con meno di 1.500 punti il pulsante dice quanti punti servono. Chi lancia riceve il messaggio quando colpisce. Scelte S-37</w:t>
             </w:r>
           </w:p>
         </w:tc>

</xml_diff>

<commit_message>
0.27.0: immuni a banana e bananone lanciati curvando o in aria (R-522): stato.sterza in game.js, b.sterzo e schivata in bot.js, testo dodgedSteer in 4 lingue — Implementation dell'1:00, senza prove
Co-Authored-By: Claude Fable 5.1 <noreply@anthropic.com>
Claude-Session: https://claude.ai/code/session_01Xy4XstPL8Mfcy49jRPwYXw
</commit_message>
<xml_diff>
--- a/docs/CYF-Gaming-Requisiti-Implementati-e-Testati.docx
+++ b/docs/CYF-Gaming-Requisiti-Implementati-e-Testati.docx
@@ -148,6 +148,36 @@
       </w:r>
       <w:r>
         <w:t xml:space="preserve">R-520/R-521</w:t>
+      </w:r>
+      <w:r>
+        <w:t xml:space="preserve"> </w:t>
+      </w:r>
+      <w:r>
+        <w:t xml:space="preserve">con</w:t>
+      </w:r>
+      <w:r>
+        <w:t xml:space="preserve"> </w:t>
+      </w:r>
+      <w:r>
+        <w:t xml:space="preserve">l’immunità</w:t>
+      </w:r>
+      <w:r>
+        <w:t xml:space="preserve"> </w:t>
+      </w:r>
+      <w:r>
+        <w:t xml:space="preserve">in</w:t>
+      </w:r>
+      <w:r>
+        <w:t xml:space="preserve"> </w:t>
+      </w:r>
+      <w:r>
+        <w:t xml:space="preserve">curva</w:t>
+      </w:r>
+      <w:r>
+        <w:t xml:space="preserve"> </w:t>
+      </w:r>
+      <w:r>
+        <w:t xml:space="preserve">R-522</w:t>
       </w:r>
       <w:r>
         <w:t xml:space="preserve"> </w:t>
@@ -9834,7 +9864,7 @@
               <w:rPr>
                 <w:sz w:val="19"/>
               </w:rPr>
-              <w:t xml:space="preserve">Dalla 0.19.0. Quando la banana o il bananone lanciati arrivano, chi è in aria (salto, rampa, trampolino) non cade e non si ferma; compare</w:t>
+              <w:t xml:space="preserve">Dalla 0.19.0 (dalla 0.27.0 allargata da R-522: anche chi sta curvando schiva). Quando la banana o il bananone lanciati arrivano, chi è in aria (salto, rampa, trampolino) non cade e non si ferma; compare</w:t>
             </w:r>
             <w:r>
               <w:rPr>

</xml_diff>

<commit_message>
0.27.0: rotellina del telefono come la tastiera (R-523, chiude S-20): giù = accelera e il rider si abbassa, su = frena e il rider si alza un po'; stessi salti mortali delle frecce; testi in 4 lingue — Implementation dell'1:00, senza prove
Co-Authored-By: Claude Fable 5.1 <noreply@anthropic.com>
Claude-Session: https://claude.ai/code/session_01Xy4XstPL8Mfcy49jRPwYXw
</commit_message>
<xml_diff>
--- a/docs/CYF-Gaming-Requisiti-Implementati-e-Testati.docx
+++ b/docs/CYF-Gaming-Requisiti-Implementati-e-Testati.docx
@@ -178,6 +178,48 @@
       </w:r>
       <w:r>
         <w:t xml:space="preserve">R-522</w:t>
+      </w:r>
+      <w:r>
+        <w:t xml:space="preserve"> </w:t>
+      </w:r>
+      <w:r>
+        <w:t xml:space="preserve">e</w:t>
+      </w:r>
+      <w:r>
+        <w:t xml:space="preserve"> </w:t>
+      </w:r>
+      <w:r>
+        <w:t xml:space="preserve">la</w:t>
+      </w:r>
+      <w:r>
+        <w:t xml:space="preserve"> </w:t>
+      </w:r>
+      <w:r>
+        <w:t xml:space="preserve">rotellina</w:t>
+      </w:r>
+      <w:r>
+        <w:t xml:space="preserve"> </w:t>
+      </w:r>
+      <w:r>
+        <w:t xml:space="preserve">come</w:t>
+      </w:r>
+      <w:r>
+        <w:t xml:space="preserve"> </w:t>
+      </w:r>
+      <w:r>
+        <w:t xml:space="preserve">la</w:t>
+      </w:r>
+      <w:r>
+        <w:t xml:space="preserve"> </w:t>
+      </w:r>
+      <w:r>
+        <w:t xml:space="preserve">tastiera</w:t>
+      </w:r>
+      <w:r>
+        <w:t xml:space="preserve"> </w:t>
+      </w:r>
+      <w:r>
+        <w:t xml:space="preserve">R-523</w:t>
       </w:r>
       <w:r>
         <w:t xml:space="preserve"> </w:t>
@@ -6857,7 +6899,27 @@
               <w:rPr>
                 <w:sz w:val="19"/>
               </w:rPr>
-              <w:t xml:space="preserve">Zona in basso a destra; la rotellina compare sotto il dito. Più la sposti di lato, più curvi. ▲ accelera (come freccia giù sulla tastiera), ▼ frena; in aria ◀ ▶ avvitamento, ▲ ▼ salto mortale. Provato: stessa velocità della tastiera (21 m/s accelerando, 10 m/s frenando)</w:t>
+              <w:t xml:space="preserve">Zona in basso a destra; la rotellina compare sotto il dito. Più la sposti di lato, più curvi. Fino alla 0.26.x ▲ accelerava e ▼ frenava;</w:t>
+            </w:r>
+            <w:r>
+              <w:rPr>
+                <w:sz w:val="19"/>
+              </w:rPr>
+              <w:t xml:space="preserve"> </w:t>
+            </w:r>
+            <w:r>
+              <w:rPr>
+                <w:bCs/>
+                <w:b/>
+                <w:sz w:val="19"/>
+              </w:rPr>
+              <w:t xml:space="preserve">dalla 0.27.0 (R-523) ▼ accelera (il rider si abbassa) e ▲ frena (il rider si alza un po’), come le frecce della tastiera</w:t>
+            </w:r>
+            <w:r>
+              <w:rPr>
+                <w:sz w:val="19"/>
+              </w:rPr>
+              <w:t xml:space="preserve">; in aria ◀ ▶ avvitamento, ▲ ▼ salto mortale. Provato: stessa velocità della tastiera (21 m/s accelerando, 10 m/s frenando)</w:t>
             </w:r>
             <w:r>
               <w:rPr>

</xml_diff>

<commit_message>
0.28.0: allenamento uguale alla gara, seconda parte (R-519, S-53 di ripiego senza vite): gara vera sul dispositivo contro 3 avversari del computer con il server finto moduli/gara_locale.js; regole di fine gara condivise in shared/gara.js (server e gioco); testi in 4 lingue — Implementation dell'1:00, senza prove
Co-Authored-By: Claude Fable 5.1 <noreply@anthropic.com>
Claude-Session: https://claude.ai/code/session_01Xy4XstPL8Mfcy49jRPwYXw
</commit_message>
<xml_diff>
--- a/docs/CYF-Gaming-Requisiti-Implementati-e-Testati.docx
+++ b/docs/CYF-Gaming-Requisiti-Implementati-e-Testati.docx
@@ -231,7 +231,49 @@
         <w:t xml:space="preserve"> </w:t>
       </w:r>
       <w:r>
-        <w:t xml:space="preserve">0.27.0</w:t>
+        <w:t xml:space="preserve">0.27.0,</w:t>
+      </w:r>
+      <w:r>
+        <w:t xml:space="preserve"> </w:t>
+      </w:r>
+      <w:r>
+        <w:t xml:space="preserve">allenamento</w:t>
+      </w:r>
+      <w:r>
+        <w:t xml:space="preserve"> </w:t>
+      </w:r>
+      <w:r>
+        <w:t xml:space="preserve">uguale</w:t>
+      </w:r>
+      <w:r>
+        <w:t xml:space="preserve"> </w:t>
+      </w:r>
+      <w:r>
+        <w:t xml:space="preserve">alla</w:t>
+      </w:r>
+      <w:r>
+        <w:t xml:space="preserve"> </w:t>
+      </w:r>
+      <w:r>
+        <w:t xml:space="preserve">gara</w:t>
+      </w:r>
+      <w:r>
+        <w:t xml:space="preserve"> </w:t>
+      </w:r>
+      <w:r>
+        <w:t xml:space="preserve">R-519</w:t>
+      </w:r>
+      <w:r>
+        <w:t xml:space="preserve"> </w:t>
+      </w:r>
+      <w:r>
+        <w:t xml:space="preserve">nella</w:t>
+      </w:r>
+      <w:r>
+        <w:t xml:space="preserve"> </w:t>
+      </w:r>
+      <w:r>
+        <w:t xml:space="preserve">0.28.0</w:t>
       </w:r>
       <w:r>
         <w:t xml:space="preserve"> </w:t>

</xml_diff>

<commit_message>
0.29.0: uccelli lontani nel cielo (cielo.js) e acqua che luccica sul suolo lontano delle città sul mare (sfondi.js, PAN.acqua) — resto del punto 6 di R-513, riga 1; fermi con ?cielo=fermo — Implementation dell'1:00, senza prove
Co-Authored-By: Claude Fable 5.1 <noreply@anthropic.com>
Claude-Session: https://claude.ai/code/session_01Xy4XstPL8Mfcy49jRPwYXw
</commit_message>
<xml_diff>
--- a/docs/CYF-Gaming-Requisiti-Implementati-e-Testati.docx
+++ b/docs/CYF-Gaming-Requisiti-Implementati-e-Testati.docx
@@ -273,7 +273,55 @@
         <w:t xml:space="preserve"> </w:t>
       </w:r>
       <w:r>
-        <w:t xml:space="preserve">0.28.0</w:t>
+        <w:t xml:space="preserve">0.28.0,</w:t>
+      </w:r>
+      <w:r>
+        <w:t xml:space="preserve"> </w:t>
+      </w:r>
+      <w:r>
+        <w:t xml:space="preserve">uccelli</w:t>
+      </w:r>
+      <w:r>
+        <w:t xml:space="preserve"> </w:t>
+      </w:r>
+      <w:r>
+        <w:t xml:space="preserve">e</w:t>
+      </w:r>
+      <w:r>
+        <w:t xml:space="preserve"> </w:t>
+      </w:r>
+      <w:r>
+        <w:t xml:space="preserve">acqua</w:t>
+      </w:r>
+      <w:r>
+        <w:t xml:space="preserve"> </w:t>
+      </w:r>
+      <w:r>
+        <w:t xml:space="preserve">che</w:t>
+      </w:r>
+      <w:r>
+        <w:t xml:space="preserve"> </w:t>
+      </w:r>
+      <w:r>
+        <w:t xml:space="preserve">luccica</w:t>
+      </w:r>
+      <w:r>
+        <w:t xml:space="preserve"> </w:t>
+      </w:r>
+      <w:r>
+        <w:t xml:space="preserve">R-513</w:t>
+      </w:r>
+      <w:r>
+        <w:t xml:space="preserve"> </w:t>
+      </w:r>
+      <w:r>
+        <w:t xml:space="preserve">nella</w:t>
+      </w:r>
+      <w:r>
+        <w:t xml:space="preserve"> </w:t>
+      </w:r>
+      <w:r>
+        <w:t xml:space="preserve">0.29.0</w:t>
       </w:r>
       <w:r>
         <w:t xml:space="preserve"> </w:t>

</xml_diff>